<commit_message>
drop screenshots from the report, keep it to the written steps and the video
</commit_message>
<xml_diff>
--- a/report/CSFCL-IA2-2026-005-Forensic-Report.docx
+++ b/report/CSFCL-IA2-2026-005-Forensic-Report.docx
@@ -11,7 +11,7 @@
           <w:noProof/>
         </w:rPr>
         <w:drawing>
-          <wp:inline distT="0" distB="0" distL="0" distR="0" wp14:anchorId="3110AC24" wp14:editId="67A8ACAE">
+          <wp:inline distT="0" distB="0" distL="0" distR="0" wp14:anchorId="6445E1F8" wp14:editId="67FAD025">
             <wp:extent cx="3840480" cy="1131230"/>
             <wp:effectExtent l="0" t="0" r="0" b="0"/>
             <wp:docPr id="1" name="Picture 1"/>
@@ -302,7 +302,7 @@
       <w:r>
         <w:fldChar w:fldCharType="separate"/>
       </w:r>
-      <w:hyperlink w:anchor="_Toc241498906" w:history="1">
+      <w:hyperlink w:anchor="_Toc241584699" w:history="1">
         <w:r>
           <w:rPr>
             <w:rStyle w:val="Hyperlink"/>
@@ -329,7 +329,7 @@
             <w:noProof/>
             <w:webHidden/>
           </w:rPr>
-          <w:instrText xml:space="preserve"> PAGEREF _Toc241498906 \h </w:instrText>
+          <w:instrText xml:space="preserve"> PAGEREF _Toc241584699 \h </w:instrText>
         </w:r>
         <w:r>
           <w:rPr>
@@ -370,7 +370,7 @@
           <w:noProof/>
         </w:rPr>
       </w:pPr>
-      <w:hyperlink w:anchor="_Toc241498907" w:history="1">
+      <w:hyperlink w:anchor="_Toc241584700" w:history="1">
         <w:r>
           <w:rPr>
             <w:rStyle w:val="Hyperlink"/>
@@ -397,7 +397,7 @@
             <w:noProof/>
             <w:webHidden/>
           </w:rPr>
-          <w:instrText xml:space="preserve"> PAGEREF _Toc241498907 \h </w:instrText>
+          <w:instrText xml:space="preserve"> PAGEREF _Toc241584700 \h </w:instrText>
         </w:r>
         <w:r>
           <w:rPr>
@@ -438,7 +438,7 @@
           <w:noProof/>
         </w:rPr>
       </w:pPr>
-      <w:hyperlink w:anchor="_Toc241498908" w:history="1">
+      <w:hyperlink w:anchor="_Toc241584701" w:history="1">
         <w:r>
           <w:rPr>
             <w:rStyle w:val="Hyperlink"/>
@@ -465,7 +465,7 @@
             <w:noProof/>
             <w:webHidden/>
           </w:rPr>
-          <w:instrText xml:space="preserve"> PAGEREF _Toc241498908 \h </w:instrText>
+          <w:instrText xml:space="preserve"> PAGEREF _Toc241584701 \h </w:instrText>
         </w:r>
         <w:r>
           <w:rPr>
@@ -506,7 +506,7 @@
           <w:noProof/>
         </w:rPr>
       </w:pPr>
-      <w:hyperlink w:anchor="_Toc241498909" w:history="1">
+      <w:hyperlink w:anchor="_Toc241584702" w:history="1">
         <w:r>
           <w:rPr>
             <w:rStyle w:val="Hyperlink"/>
@@ -533,7 +533,7 @@
             <w:noProof/>
             <w:webHidden/>
           </w:rPr>
-          <w:instrText xml:space="preserve"> PAGEREF _Toc241498909 \h </w:instrText>
+          <w:instrText xml:space="preserve"> PAGEREF _Toc241584702 \h </w:instrText>
         </w:r>
         <w:r>
           <w:rPr>
@@ -574,7 +574,7 @@
           <w:noProof/>
         </w:rPr>
       </w:pPr>
-      <w:hyperlink w:anchor="_Toc241498910" w:history="1">
+      <w:hyperlink w:anchor="_Toc241584703" w:history="1">
         <w:r>
           <w:rPr>
             <w:rStyle w:val="Hyperlink"/>
@@ -601,7 +601,7 @@
             <w:noProof/>
             <w:webHidden/>
           </w:rPr>
-          <w:instrText xml:space="preserve"> PAGEREF _Toc241498910 \h </w:instrText>
+          <w:instrText xml:space="preserve"> PAGEREF _Toc241584703 \h </w:instrText>
         </w:r>
         <w:r>
           <w:rPr>
@@ -642,7 +642,7 @@
           <w:noProof/>
         </w:rPr>
       </w:pPr>
-      <w:hyperlink w:anchor="_Toc241498911" w:history="1">
+      <w:hyperlink w:anchor="_Toc241584704" w:history="1">
         <w:r>
           <w:rPr>
             <w:rStyle w:val="Hyperlink"/>
@@ -669,7 +669,7 @@
             <w:noProof/>
             <w:webHidden/>
           </w:rPr>
-          <w:instrText xml:space="preserve"> PAGEREF _Toc241498911 \h </w:instrText>
+          <w:instrText xml:space="preserve"> PAGEREF _Toc241584704 \h </w:instrText>
         </w:r>
         <w:r>
           <w:rPr>
@@ -710,7 +710,7 @@
           <w:noProof/>
         </w:rPr>
       </w:pPr>
-      <w:hyperlink w:anchor="_Toc241498912" w:history="1">
+      <w:hyperlink w:anchor="_Toc241584705" w:history="1">
         <w:r>
           <w:rPr>
             <w:rStyle w:val="Hyperlink"/>
@@ -737,7 +737,7 @@
             <w:noProof/>
             <w:webHidden/>
           </w:rPr>
-          <w:instrText xml:space="preserve"> PAGEREF _Toc241498912 \h </w:instrText>
+          <w:instrText xml:space="preserve"> PAGEREF _Toc241584705 \h </w:instrText>
         </w:r>
         <w:r>
           <w:rPr>
@@ -778,7 +778,7 @@
           <w:noProof/>
         </w:rPr>
       </w:pPr>
-      <w:hyperlink w:anchor="_Toc241498913" w:history="1">
+      <w:hyperlink w:anchor="_Toc241584706" w:history="1">
         <w:r>
           <w:rPr>
             <w:rStyle w:val="Hyperlink"/>
@@ -805,7 +805,7 @@
             <w:noProof/>
             <w:webHidden/>
           </w:rPr>
-          <w:instrText xml:space="preserve"> PAGEREF _Toc241498913 \h </w:instrText>
+          <w:instrText xml:space="preserve"> PAGEREF _Toc241584706 \h </w:instrText>
         </w:r>
         <w:r>
           <w:rPr>
@@ -846,7 +846,7 @@
           <w:noProof/>
         </w:rPr>
       </w:pPr>
-      <w:hyperlink w:anchor="_Toc241498914" w:history="1">
+      <w:hyperlink w:anchor="_Toc241584707" w:history="1">
         <w:r>
           <w:rPr>
             <w:rStyle w:val="Hyperlink"/>
@@ -873,7 +873,7 @@
             <w:noProof/>
             <w:webHidden/>
           </w:rPr>
-          <w:instrText xml:space="preserve"> PAGEREF _Toc241498914 \h </w:instrText>
+          <w:instrText xml:space="preserve"> PAGEREF _Toc241584707 \h </w:instrText>
         </w:r>
         <w:r>
           <w:rPr>
@@ -914,7 +914,7 @@
           <w:noProof/>
         </w:rPr>
       </w:pPr>
-      <w:hyperlink w:anchor="_Toc241498915" w:history="1">
+      <w:hyperlink w:anchor="_Toc241584708" w:history="1">
         <w:r>
           <w:rPr>
             <w:rStyle w:val="Hyperlink"/>
@@ -941,7 +941,7 @@
             <w:noProof/>
             <w:webHidden/>
           </w:rPr>
-          <w:instrText xml:space="preserve"> PAGEREF _Toc241498915 \h </w:instrText>
+          <w:instrText xml:space="preserve"> PAGEREF _Toc241584708 \h </w:instrText>
         </w:r>
         <w:r>
           <w:rPr>
@@ -982,7 +982,7 @@
           <w:noProof/>
         </w:rPr>
       </w:pPr>
-      <w:hyperlink w:anchor="_Toc241498916" w:history="1">
+      <w:hyperlink w:anchor="_Toc241584709" w:history="1">
         <w:r>
           <w:rPr>
             <w:rStyle w:val="Hyperlink"/>
@@ -1009,7 +1009,7 @@
             <w:noProof/>
             <w:webHidden/>
           </w:rPr>
-          <w:instrText xml:space="preserve"> PAGEREF _Toc241498916 \h </w:instrText>
+          <w:instrText xml:space="preserve"> PAGEREF _Toc241584709 \h </w:instrText>
         </w:r>
         <w:r>
           <w:rPr>
@@ -1050,7 +1050,7 @@
           <w:noProof/>
         </w:rPr>
       </w:pPr>
-      <w:hyperlink w:anchor="_Toc241498917" w:history="1">
+      <w:hyperlink w:anchor="_Toc241584710" w:history="1">
         <w:r>
           <w:rPr>
             <w:rStyle w:val="Hyperlink"/>
@@ -1077,7 +1077,7 @@
             <w:noProof/>
             <w:webHidden/>
           </w:rPr>
-          <w:instrText xml:space="preserve"> PAGEREF _Toc241498917 \h </w:instrText>
+          <w:instrText xml:space="preserve"> PAGEREF _Toc241584710 \h </w:instrText>
         </w:r>
         <w:r>
           <w:rPr>
@@ -1118,7 +1118,7 @@
           <w:noProof/>
         </w:rPr>
       </w:pPr>
-      <w:hyperlink w:anchor="_Toc241498918" w:history="1">
+      <w:hyperlink w:anchor="_Toc241584711" w:history="1">
         <w:r>
           <w:rPr>
             <w:rStyle w:val="Hyperlink"/>
@@ -1145,7 +1145,7 @@
             <w:noProof/>
             <w:webHidden/>
           </w:rPr>
-          <w:instrText xml:space="preserve"> PAGEREF _Toc241498918 \h </w:instrText>
+          <w:instrText xml:space="preserve"> PAGEREF _Toc241584711 \h </w:instrText>
         </w:r>
         <w:r>
           <w:rPr>
@@ -1186,7 +1186,7 @@
           <w:noProof/>
         </w:rPr>
       </w:pPr>
-      <w:hyperlink w:anchor="_Toc241498919" w:history="1">
+      <w:hyperlink w:anchor="_Toc241584712" w:history="1">
         <w:r>
           <w:rPr>
             <w:rStyle w:val="Hyperlink"/>
@@ -1213,7 +1213,7 @@
             <w:noProof/>
             <w:webHidden/>
           </w:rPr>
-          <w:instrText xml:space="preserve"> PAGEREF _Toc241498919 \h </w:instrText>
+          <w:instrText xml:space="preserve"> PAGEREF _Toc241584712 \h </w:instrText>
         </w:r>
         <w:r>
           <w:rPr>
@@ -1254,7 +1254,7 @@
           <w:noProof/>
         </w:rPr>
       </w:pPr>
-      <w:hyperlink w:anchor="_Toc241498920" w:history="1">
+      <w:hyperlink w:anchor="_Toc241584713" w:history="1">
         <w:r>
           <w:rPr>
             <w:rStyle w:val="Hyperlink"/>
@@ -1281,7 +1281,7 @@
             <w:noProof/>
             <w:webHidden/>
           </w:rPr>
-          <w:instrText xml:space="preserve"> PAGEREF _Toc241498920 \h </w:instrText>
+          <w:instrText xml:space="preserve"> PAGEREF _Toc241584713 \h </w:instrText>
         </w:r>
         <w:r>
           <w:rPr>
@@ -1322,7 +1322,7 @@
           <w:noProof/>
         </w:rPr>
       </w:pPr>
-      <w:hyperlink w:anchor="_Toc241498921" w:history="1">
+      <w:hyperlink w:anchor="_Toc241584714" w:history="1">
         <w:r>
           <w:rPr>
             <w:rStyle w:val="Hyperlink"/>
@@ -1349,7 +1349,7 @@
             <w:noProof/>
             <w:webHidden/>
           </w:rPr>
-          <w:instrText xml:space="preserve"> PAGEREF _Toc241498921 \h </w:instrText>
+          <w:instrText xml:space="preserve"> PAGEREF _Toc241584714 \h </w:instrText>
         </w:r>
         <w:r>
           <w:rPr>
@@ -1390,7 +1390,7 @@
           <w:noProof/>
         </w:rPr>
       </w:pPr>
-      <w:hyperlink w:anchor="_Toc241498922" w:history="1">
+      <w:hyperlink w:anchor="_Toc241584715" w:history="1">
         <w:r>
           <w:rPr>
             <w:rStyle w:val="Hyperlink"/>
@@ -1417,7 +1417,7 @@
             <w:noProof/>
             <w:webHidden/>
           </w:rPr>
-          <w:instrText xml:space="preserve"> PAGEREF _Toc241498922 \h </w:instrText>
+          <w:instrText xml:space="preserve"> PAGEREF _Toc241584715 \h </w:instrText>
         </w:r>
         <w:r>
           <w:rPr>
@@ -1437,7 +1437,7 @@
             <w:noProof/>
             <w:webHidden/>
           </w:rPr>
-          <w:t>17</w:t>
+          <w:t>16</w:t>
         </w:r>
         <w:r>
           <w:rPr>
@@ -1458,7 +1458,7 @@
           <w:noProof/>
         </w:rPr>
       </w:pPr>
-      <w:hyperlink w:anchor="_Toc241498923" w:history="1">
+      <w:hyperlink w:anchor="_Toc241584716" w:history="1">
         <w:r>
           <w:rPr>
             <w:rStyle w:val="Hyperlink"/>
@@ -1485,7 +1485,7 @@
             <w:noProof/>
             <w:webHidden/>
           </w:rPr>
-          <w:instrText xml:space="preserve"> PAGEREF _Toc241498923 \h </w:instrText>
+          <w:instrText xml:space="preserve"> PAGEREF _Toc241584716 \h </w:instrText>
         </w:r>
         <w:r>
           <w:rPr>
@@ -1526,7 +1526,7 @@
           <w:noProof/>
         </w:rPr>
       </w:pPr>
-      <w:hyperlink w:anchor="_Toc241498924" w:history="1">
+      <w:hyperlink w:anchor="_Toc241584717" w:history="1">
         <w:r>
           <w:rPr>
             <w:rStyle w:val="Hyperlink"/>
@@ -1553,7 +1553,75 @@
             <w:noProof/>
             <w:webHidden/>
           </w:rPr>
-          <w:instrText xml:space="preserve"> PAGEREF _Toc241498924 \h </w:instrText>
+          <w:instrText xml:space="preserve"> PAGEREF _Toc241584717 \h </w:instrText>
+        </w:r>
+        <w:r>
+          <w:rPr>
+            <w:noProof/>
+            <w:webHidden/>
+          </w:rPr>
+        </w:r>
+        <w:r>
+          <w:rPr>
+            <w:noProof/>
+            <w:webHidden/>
+          </w:rPr>
+          <w:fldChar w:fldCharType="separate"/>
+        </w:r>
+        <w:r>
+          <w:rPr>
+            <w:noProof/>
+            <w:webHidden/>
+          </w:rPr>
+          <w:t>17</w:t>
+        </w:r>
+        <w:r>
+          <w:rPr>
+            <w:noProof/>
+            <w:webHidden/>
+          </w:rPr>
+          <w:fldChar w:fldCharType="end"/>
+        </w:r>
+      </w:hyperlink>
+    </w:p>
+    <w:p>
+      <w:pPr>
+        <w:pStyle w:val="TOC2"/>
+        <w:tabs>
+          <w:tab w:val="right" w:leader="dot" w:pos="9019"/>
+        </w:tabs>
+        <w:rPr>
+          <w:noProof/>
+        </w:rPr>
+      </w:pPr>
+      <w:hyperlink w:anchor="_Toc241584718" w:history="1">
+        <w:r>
+          <w:rPr>
+            <w:rStyle w:val="Hyperlink"/>
+            <w:noProof/>
+          </w:rPr>
+          <w:t>Activity 2: hash verification</w:t>
+        </w:r>
+        <w:r>
+          <w:rPr>
+            <w:noProof/>
+            <w:webHidden/>
+          </w:rPr>
+          <w:tab/>
+        </w:r>
+        <w:r>
+          <w:rPr>
+            <w:noProof/>
+            <w:webHidden/>
+          </w:rPr>
+          <w:fldChar w:fldCharType="begin"/>
+        </w:r>
+        <w:r>
+          <w:rPr>
+            <w:noProof/>
+            <w:webHidden/>
+          </w:rPr>
+          <w:instrText xml:space="preserve"> PAGEREF _Toc241584718 \h </w:instrText>
         </w:r>
         <w:r>
           <w:rPr>
@@ -1594,75 +1662,7 @@
           <w:noProof/>
         </w:rPr>
       </w:pPr>
-      <w:hyperlink w:anchor="_Toc241498925" w:history="1">
-        <w:r>
-          <w:rPr>
-            <w:rStyle w:val="Hyperlink"/>
-            <w:noProof/>
-          </w:rPr>
-          <w:t>Activity 2: hash verification</w:t>
-        </w:r>
-        <w:r>
-          <w:rPr>
-            <w:noProof/>
-            <w:webHidden/>
-          </w:rPr>
-          <w:tab/>
-        </w:r>
-        <w:r>
-          <w:rPr>
-            <w:noProof/>
-            <w:webHidden/>
-          </w:rPr>
-          <w:fldChar w:fldCharType="begin"/>
-        </w:r>
-        <w:r>
-          <w:rPr>
-            <w:noProof/>
-            <w:webHidden/>
-          </w:rPr>
-          <w:instrText xml:space="preserve"> PAGEREF _Toc241498925 \h </w:instrText>
-        </w:r>
-        <w:r>
-          <w:rPr>
-            <w:noProof/>
-            <w:webHidden/>
-          </w:rPr>
-        </w:r>
-        <w:r>
-          <w:rPr>
-            <w:noProof/>
-            <w:webHidden/>
-          </w:rPr>
-          <w:fldChar w:fldCharType="separate"/>
-        </w:r>
-        <w:r>
-          <w:rPr>
-            <w:noProof/>
-            <w:webHidden/>
-          </w:rPr>
-          <w:t>18</w:t>
-        </w:r>
-        <w:r>
-          <w:rPr>
-            <w:noProof/>
-            <w:webHidden/>
-          </w:rPr>
-          <w:fldChar w:fldCharType="end"/>
-        </w:r>
-      </w:hyperlink>
-    </w:p>
-    <w:p>
-      <w:pPr>
-        <w:pStyle w:val="TOC2"/>
-        <w:tabs>
-          <w:tab w:val="right" w:leader="dot" w:pos="9019"/>
-        </w:tabs>
-        <w:rPr>
-          <w:noProof/>
-        </w:rPr>
-      </w:pPr>
-      <w:hyperlink w:anchor="_Toc241498926" w:history="1">
+      <w:hyperlink w:anchor="_Toc241584719" w:history="1">
         <w:r>
           <w:rPr>
             <w:rStyle w:val="Hyperlink"/>
@@ -1689,7 +1689,7 @@
             <w:noProof/>
             <w:webHidden/>
           </w:rPr>
-          <w:instrText xml:space="preserve"> PAGEREF _Toc241498926 \h </w:instrText>
+          <w:instrText xml:space="preserve"> PAGEREF _Toc241584719 \h </w:instrText>
         </w:r>
         <w:r>
           <w:rPr>
@@ -1730,7 +1730,7 @@
           <w:noProof/>
         </w:rPr>
       </w:pPr>
-      <w:hyperlink w:anchor="_Toc241498927" w:history="1">
+      <w:hyperlink w:anchor="_Toc241584720" w:history="1">
         <w:r>
           <w:rPr>
             <w:rStyle w:val="Hyperlink"/>
@@ -1757,7 +1757,7 @@
             <w:noProof/>
             <w:webHidden/>
           </w:rPr>
-          <w:instrText xml:space="preserve"> PAGEREF _Toc241498927 \h </w:instrText>
+          <w:instrText xml:space="preserve"> PAGEREF _Toc241584720 \h </w:instrText>
         </w:r>
         <w:r>
           <w:rPr>
@@ -1798,7 +1798,7 @@
           <w:noProof/>
         </w:rPr>
       </w:pPr>
-      <w:hyperlink w:anchor="_Toc241498928" w:history="1">
+      <w:hyperlink w:anchor="_Toc241584721" w:history="1">
         <w:r>
           <w:rPr>
             <w:rStyle w:val="Hyperlink"/>
@@ -1825,7 +1825,7 @@
             <w:noProof/>
             <w:webHidden/>
           </w:rPr>
-          <w:instrText xml:space="preserve"> PAGEREF _Toc241498928 \h </w:instrText>
+          <w:instrText xml:space="preserve"> PAGEREF _Toc241584721 \h </w:instrText>
         </w:r>
         <w:r>
           <w:rPr>
@@ -1866,7 +1866,7 @@
           <w:noProof/>
         </w:rPr>
       </w:pPr>
-      <w:hyperlink w:anchor="_Toc241498929" w:history="1">
+      <w:hyperlink w:anchor="_Toc241584722" w:history="1">
         <w:r>
           <w:rPr>
             <w:rStyle w:val="Hyperlink"/>
@@ -1893,7 +1893,7 @@
             <w:noProof/>
             <w:webHidden/>
           </w:rPr>
-          <w:instrText xml:space="preserve"> PAGEREF _Toc241498929 \h </w:instrText>
+          <w:instrText xml:space="preserve"> PAGEREF _Toc241584722 \h </w:instrText>
         </w:r>
         <w:r>
           <w:rPr>
@@ -1934,7 +1934,7 @@
           <w:noProof/>
         </w:rPr>
       </w:pPr>
-      <w:hyperlink w:anchor="_Toc241498930" w:history="1">
+      <w:hyperlink w:anchor="_Toc241584723" w:history="1">
         <w:r>
           <w:rPr>
             <w:rStyle w:val="Hyperlink"/>
@@ -1961,7 +1961,7 @@
             <w:noProof/>
             <w:webHidden/>
           </w:rPr>
-          <w:instrText xml:space="preserve"> PAGEREF _Toc241498930 \h </w:instrText>
+          <w:instrText xml:space="preserve"> PAGEREF _Toc241584723 \h </w:instrText>
         </w:r>
         <w:r>
           <w:rPr>
@@ -2002,7 +2002,7 @@
           <w:noProof/>
         </w:rPr>
       </w:pPr>
-      <w:hyperlink w:anchor="_Toc241498931" w:history="1">
+      <w:hyperlink w:anchor="_Toc241584724" w:history="1">
         <w:r>
           <w:rPr>
             <w:rStyle w:val="Hyperlink"/>
@@ -2029,7 +2029,7 @@
             <w:noProof/>
             <w:webHidden/>
           </w:rPr>
-          <w:instrText xml:space="preserve"> PAGEREF _Toc241498931 \h </w:instrText>
+          <w:instrText xml:space="preserve"> PAGEREF _Toc241584724 \h </w:instrText>
         </w:r>
         <w:r>
           <w:rPr>
@@ -2070,7 +2070,7 @@
           <w:noProof/>
         </w:rPr>
       </w:pPr>
-      <w:hyperlink w:anchor="_Toc241498932" w:history="1">
+      <w:hyperlink w:anchor="_Toc241584725" w:history="1">
         <w:r>
           <w:rPr>
             <w:rStyle w:val="Hyperlink"/>
@@ -2097,7 +2097,7 @@
             <w:noProof/>
             <w:webHidden/>
           </w:rPr>
-          <w:instrText xml:space="preserve"> PAGEREF _Toc241498932 \h </w:instrText>
+          <w:instrText xml:space="preserve"> PAGEREF _Toc241584725 \h </w:instrText>
         </w:r>
         <w:r>
           <w:rPr>
@@ -2138,7 +2138,7 @@
           <w:noProof/>
         </w:rPr>
       </w:pPr>
-      <w:hyperlink w:anchor="_Toc241498933" w:history="1">
+      <w:hyperlink w:anchor="_Toc241584726" w:history="1">
         <w:r>
           <w:rPr>
             <w:rStyle w:val="Hyperlink"/>
@@ -2165,7 +2165,7 @@
             <w:noProof/>
             <w:webHidden/>
           </w:rPr>
-          <w:instrText xml:space="preserve"> PAGEREF _Toc241498933 \h </w:instrText>
+          <w:instrText xml:space="preserve"> PAGEREF _Toc241584726 \h </w:instrText>
         </w:r>
         <w:r>
           <w:rPr>
@@ -2206,7 +2206,7 @@
           <w:noProof/>
         </w:rPr>
       </w:pPr>
-      <w:hyperlink w:anchor="_Toc241498934" w:history="1">
+      <w:hyperlink w:anchor="_Toc241584727" w:history="1">
         <w:r>
           <w:rPr>
             <w:rStyle w:val="Hyperlink"/>
@@ -2233,7 +2233,7 @@
             <w:noProof/>
             <w:webHidden/>
           </w:rPr>
-          <w:instrText xml:space="preserve"> PAGEREF _Toc241498934 \h </w:instrText>
+          <w:instrText xml:space="preserve"> PAGEREF _Toc241584727 \h </w:instrText>
         </w:r>
         <w:r>
           <w:rPr>
@@ -2274,7 +2274,7 @@
           <w:noProof/>
         </w:rPr>
       </w:pPr>
-      <w:hyperlink w:anchor="_Toc241498935" w:history="1">
+      <w:hyperlink w:anchor="_Toc241584728" w:history="1">
         <w:r>
           <w:rPr>
             <w:rStyle w:val="Hyperlink"/>
@@ -2301,7 +2301,7 @@
             <w:noProof/>
             <w:webHidden/>
           </w:rPr>
-          <w:instrText xml:space="preserve"> PAGEREF _Toc241498935 \h </w:instrText>
+          <w:instrText xml:space="preserve"> PAGEREF _Toc241584728 \h </w:instrText>
         </w:r>
         <w:r>
           <w:rPr>
@@ -2342,7 +2342,7 @@
           <w:noProof/>
         </w:rPr>
       </w:pPr>
-      <w:hyperlink w:anchor="_Toc241498936" w:history="1">
+      <w:hyperlink w:anchor="_Toc241584729" w:history="1">
         <w:r>
           <w:rPr>
             <w:rStyle w:val="Hyperlink"/>
@@ -2369,7 +2369,7 @@
             <w:noProof/>
             <w:webHidden/>
           </w:rPr>
-          <w:instrText xml:space="preserve"> PAGEREF _Toc241498936 \h </w:instrText>
+          <w:instrText xml:space="preserve"> PAGEREF _Toc241584729 \h </w:instrText>
         </w:r>
         <w:r>
           <w:rPr>
@@ -2410,7 +2410,7 @@
           <w:noProof/>
         </w:rPr>
       </w:pPr>
-      <w:hyperlink w:anchor="_Toc241498937" w:history="1">
+      <w:hyperlink w:anchor="_Toc241584730" w:history="1">
         <w:r>
           <w:rPr>
             <w:rStyle w:val="Hyperlink"/>
@@ -2437,7 +2437,7 @@
             <w:noProof/>
             <w:webHidden/>
           </w:rPr>
-          <w:instrText xml:space="preserve"> PAGEREF _Toc241498937 \h </w:instrText>
+          <w:instrText xml:space="preserve"> PAGEREF _Toc241584730 \h </w:instrText>
         </w:r>
         <w:r>
           <w:rPr>
@@ -2478,7 +2478,7 @@
           <w:noProof/>
         </w:rPr>
       </w:pPr>
-      <w:hyperlink w:anchor="_Toc241498938" w:history="1">
+      <w:hyperlink w:anchor="_Toc241584731" w:history="1">
         <w:r>
           <w:rPr>
             <w:rStyle w:val="Hyperlink"/>
@@ -2505,7 +2505,7 @@
             <w:noProof/>
             <w:webHidden/>
           </w:rPr>
-          <w:instrText xml:space="preserve"> PAGEREF _Toc241498938 \h </w:instrText>
+          <w:instrText xml:space="preserve"> PAGEREF _Toc241584731 \h </w:instrText>
         </w:r>
         <w:r>
           <w:rPr>
@@ -2546,7 +2546,7 @@
           <w:noProof/>
         </w:rPr>
       </w:pPr>
-      <w:hyperlink w:anchor="_Toc241498939" w:history="1">
+      <w:hyperlink w:anchor="_Toc241584732" w:history="1">
         <w:r>
           <w:rPr>
             <w:rStyle w:val="Hyperlink"/>
@@ -2573,7 +2573,7 @@
             <w:noProof/>
             <w:webHidden/>
           </w:rPr>
-          <w:instrText xml:space="preserve"> PAGEREF _Toc241498939 \h </w:instrText>
+          <w:instrText xml:space="preserve"> PAGEREF _Toc241584732 \h </w:instrText>
         </w:r>
         <w:r>
           <w:rPr>
@@ -2614,7 +2614,7 @@
           <w:noProof/>
         </w:rPr>
       </w:pPr>
-      <w:hyperlink w:anchor="_Toc241498940" w:history="1">
+      <w:hyperlink w:anchor="_Toc241584733" w:history="1">
         <w:r>
           <w:rPr>
             <w:rStyle w:val="Hyperlink"/>
@@ -2641,7 +2641,7 @@
             <w:noProof/>
             <w:webHidden/>
           </w:rPr>
-          <w:instrText xml:space="preserve"> PAGEREF _Toc241498940 \h </w:instrText>
+          <w:instrText xml:space="preserve"> PAGEREF _Toc241584733 \h </w:instrText>
         </w:r>
         <w:r>
           <w:rPr>
@@ -2682,7 +2682,7 @@
           <w:noProof/>
         </w:rPr>
       </w:pPr>
-      <w:hyperlink w:anchor="_Toc241498941" w:history="1">
+      <w:hyperlink w:anchor="_Toc241584734" w:history="1">
         <w:r>
           <w:rPr>
             <w:rStyle w:val="Hyperlink"/>
@@ -2709,7 +2709,7 @@
             <w:noProof/>
             <w:webHidden/>
           </w:rPr>
-          <w:instrText xml:space="preserve"> PAGEREF _Toc241498941 \h </w:instrText>
+          <w:instrText xml:space="preserve"> PAGEREF _Toc241584734 \h </w:instrText>
         </w:r>
         <w:r>
           <w:rPr>
@@ -2750,7 +2750,7 @@
           <w:noProof/>
         </w:rPr>
       </w:pPr>
-      <w:hyperlink w:anchor="_Toc241498942" w:history="1">
+      <w:hyperlink w:anchor="_Toc241584735" w:history="1">
         <w:r>
           <w:rPr>
             <w:rStyle w:val="Hyperlink"/>
@@ -2777,7 +2777,7 @@
             <w:noProof/>
             <w:webHidden/>
           </w:rPr>
-          <w:instrText xml:space="preserve"> PAGEREF _Toc241498942 \h </w:instrText>
+          <w:instrText xml:space="preserve"> PAGEREF _Toc241584735 \h </w:instrText>
         </w:r>
         <w:r>
           <w:rPr>
@@ -2818,7 +2818,7 @@
           <w:noProof/>
         </w:rPr>
       </w:pPr>
-      <w:hyperlink w:anchor="_Toc241498943" w:history="1">
+      <w:hyperlink w:anchor="_Toc241584736" w:history="1">
         <w:r>
           <w:rPr>
             <w:rStyle w:val="Hyperlink"/>
@@ -2845,7 +2845,7 @@
             <w:noProof/>
             <w:webHidden/>
           </w:rPr>
-          <w:instrText xml:space="preserve"> PAGEREF _Toc241498943 \h </w:instrText>
+          <w:instrText xml:space="preserve"> PAGEREF _Toc241584736 \h </w:instrText>
         </w:r>
         <w:r>
           <w:rPr>
@@ -2886,7 +2886,7 @@
           <w:noProof/>
         </w:rPr>
       </w:pPr>
-      <w:hyperlink w:anchor="_Toc241498944" w:history="1">
+      <w:hyperlink w:anchor="_Toc241584737" w:history="1">
         <w:r>
           <w:rPr>
             <w:rStyle w:val="Hyperlink"/>
@@ -2913,7 +2913,7 @@
             <w:noProof/>
             <w:webHidden/>
           </w:rPr>
-          <w:instrText xml:space="preserve"> PAGEREF _Toc241498944 \h </w:instrText>
+          <w:instrText xml:space="preserve"> PAGEREF _Toc241584737 \h </w:instrText>
         </w:r>
         <w:r>
           <w:rPr>
@@ -2954,7 +2954,7 @@
           <w:noProof/>
         </w:rPr>
       </w:pPr>
-      <w:hyperlink w:anchor="_Toc241498945" w:history="1">
+      <w:hyperlink w:anchor="_Toc241584738" w:history="1">
         <w:r>
           <w:rPr>
             <w:rStyle w:val="Hyperlink"/>
@@ -2981,7 +2981,7 @@
             <w:noProof/>
             <w:webHidden/>
           </w:rPr>
-          <w:instrText xml:space="preserve"> PAGEREF _Toc241498945 \h </w:instrText>
+          <w:instrText xml:space="preserve"> PAGEREF _Toc241584738 \h </w:instrText>
         </w:r>
         <w:r>
           <w:rPr>
@@ -3029,7 +3029,7 @@
       <w:pPr>
         <w:pStyle w:val="Heading1"/>
       </w:pPr>
-      <w:bookmarkStart w:id="0" w:name="_Toc241498906"/>
+      <w:bookmarkStart w:id="0" w:name="_Toc241584699"/>
       <w:r>
         <w:lastRenderedPageBreak/>
         <w:t>Case details</w:t>
@@ -3522,14 +3522,14 @@
     <w:p/>
     <w:p>
       <w:r>
-        <w:t>We start with the case itself: who Equifax is, how the attackers got in, what they took and what happened to the company afterwards (section 1). Section 2 shows how we rebuilt the evidence and walks through the demonstration one command at a time, with a screenshot for each. Section 3 answers the thirteen activities on the IA2 activity sheet, and section 4 looks at how Indian law would treat the same facts. The final findings, the limits of this work and our sources come last.</w:t>
+        <w:t>We start with the case itself: who Equifax is, how the attackers got in, what they took and what happened to the company afterwards (section 1). Section 2 shows how we rebuilt the evidence and walks through the demonstration one command at a time. Section 3 answers the thirteen activities on the IA2 activity sheet, and section 4 looks at how Indian law would treat the same facts. The final findings, the limits of this work and our sources come last.</w:t>
       </w:r>
     </w:p>
     <w:p>
       <w:pPr>
         <w:pStyle w:val="Heading1"/>
       </w:pPr>
-      <w:bookmarkStart w:id="1" w:name="_Toc241498907"/>
+      <w:bookmarkStart w:id="1" w:name="_Toc241584700"/>
       <w:r>
         <w:t>1. The case: the Equifax breach of 2017</w:t>
       </w:r>
@@ -3539,7 +3539,7 @@
       <w:pPr>
         <w:pStyle w:val="Heading2"/>
       </w:pPr>
-      <w:bookmarkStart w:id="2" w:name="_Toc241498908"/>
+      <w:bookmarkStart w:id="2" w:name="_Toc241584701"/>
       <w:r>
         <w:t>1.1 Who Equifax is</w:t>
       </w:r>
@@ -3559,7 +3559,7 @@
       <w:pPr>
         <w:pStyle w:val="Heading2"/>
       </w:pPr>
-      <w:bookmarkStart w:id="3" w:name="_Toc241498909"/>
+      <w:bookmarkStart w:id="3" w:name="_Toc241584702"/>
       <w:r>
         <w:t>1.2 The flaw: CVE-2017-5638</w:t>
       </w:r>
@@ -3584,7 +3584,7 @@
       <w:pPr>
         <w:pStyle w:val="Heading2"/>
       </w:pPr>
-      <w:bookmarkStart w:id="4" w:name="_Toc241498910"/>
+      <w:bookmarkStart w:id="4" w:name="_Toc241584703"/>
       <w:r>
         <w:t>1.3 How the attack happened</w:t>
       </w:r>
@@ -4373,7 +4373,7 @@
       <w:pPr>
         <w:pStyle w:val="Heading2"/>
       </w:pPr>
-      <w:bookmarkStart w:id="5" w:name="_Toc241498911"/>
+      <w:bookmarkStart w:id="5" w:name="_Toc241584704"/>
       <w:r>
         <w:t>1.4 Why it was not stopped</w:t>
       </w:r>
@@ -4662,7 +4662,7 @@
       <w:pPr>
         <w:pStyle w:val="Heading2"/>
       </w:pPr>
-      <w:bookmarkStart w:id="6" w:name="_Toc241498912"/>
+      <w:bookmarkStart w:id="6" w:name="_Toc241584705"/>
       <w:r>
         <w:t>1.5 What was taken</w:t>
       </w:r>
@@ -5185,7 +5185,7 @@
       <w:pPr>
         <w:pStyle w:val="Heading2"/>
       </w:pPr>
-      <w:bookmarkStart w:id="7" w:name="_Toc241498913"/>
+      <w:bookmarkStart w:id="7" w:name="_Toc241584706"/>
       <w:r>
         <w:t>1.6 What was done afterwards</w:t>
       </w:r>
@@ -5684,7 +5684,7 @@
       <w:pPr>
         <w:pStyle w:val="Heading2"/>
       </w:pPr>
-      <w:bookmarkStart w:id="8" w:name="_Toc241498914"/>
+      <w:bookmarkStart w:id="8" w:name="_Toc241584707"/>
       <w:r>
         <w:t>1.7 What this report asks</w:t>
       </w:r>
@@ -5699,7 +5699,7 @@
       <w:pPr>
         <w:pStyle w:val="Heading1"/>
       </w:pPr>
-      <w:bookmarkStart w:id="9" w:name="_Toc241498915"/>
+      <w:bookmarkStart w:id="9" w:name="_Toc241584708"/>
       <w:r>
         <w:t>2. Methodology: how we demonstrate the examination</w:t>
       </w:r>
@@ -5714,7 +5714,7 @@
       <w:pPr>
         <w:pStyle w:val="Heading2"/>
       </w:pPr>
-      <w:bookmarkStart w:id="10" w:name="_Toc241498916"/>
+      <w:bookmarkStart w:id="10" w:name="_Toc241584709"/>
       <w:r>
         <w:t>2.1 Choosing the tool</w:t>
       </w:r>
@@ -6078,7 +6078,7 @@
       <w:pPr>
         <w:pStyle w:val="Heading2"/>
       </w:pPr>
-      <w:bookmarkStart w:id="11" w:name="_Toc241498917"/>
+      <w:bookmarkStart w:id="11" w:name="_Toc241584710"/>
       <w:r>
         <w:t>2.2 The evidence set</w:t>
       </w:r>
@@ -6464,7 +6464,7 @@
       <w:pPr>
         <w:pStyle w:val="Heading2"/>
       </w:pPr>
-      <w:bookmarkStart w:id="12" w:name="_Toc241498918"/>
+      <w:bookmarkStart w:id="12" w:name="_Toc241584711"/>
       <w:r>
         <w:t>2.3 Safety</w:t>
       </w:r>
@@ -6479,7 +6479,7 @@
       <w:pPr>
         <w:pStyle w:val="Heading2"/>
       </w:pPr>
-      <w:bookmarkStart w:id="13" w:name="_Toc241498919"/>
+      <w:bookmarkStart w:id="13" w:name="_Toc241584712"/>
       <w:r>
         <w:t>2.4 Setup</w:t>
       </w:r>
@@ -6736,7 +6736,7 @@
       <w:pPr>
         <w:pStyle w:val="Heading2"/>
       </w:pPr>
-      <w:bookmarkStart w:id="14" w:name="_Toc241498920"/>
+      <w:bookmarkStart w:id="14" w:name="_Toc241584713"/>
       <w:r>
         <w:t>2.5 The demonstration, step by step</w:t>
       </w:r>
@@ -6744,7 +6744,7 @@
     </w:p>
     <w:p>
       <w:r>
-        <w:t>We demonstrate the examination in two places. This report shows every step, with its command and a screenshot of the output from our run. The video runs under ten minutes, and all three members of the group present parts of it: the case, the examination itself, and the legal analysis.</w:t>
+        <w:t>We demonstrate the examination in two places. This report gives every step with its command and what it produces. The recorded video presentation is the visual record of the run: it lasts under ten minutes, and all three members of the group present parts of it, the case, the examination itself, and the legal analysis.</w:t>
       </w:r>
     </w:p>
     <w:p>
@@ -6780,32 +6780,6 @@
     </w:p>
     <w:p>
       <w:pPr>
-        <w:keepNext/>
-        <w:jc w:val="center"/>
-      </w:pPr>
-      <w:r>
-        <w:rPr>
-          <w:i/>
-          <w:sz w:val="22"/>
-        </w:rPr>
-        <w:t>[ screenshot to be added: 01-summary.png ]</w:t>
-      </w:r>
-    </w:p>
-    <w:p>
-      <w:pPr>
-        <w:spacing w:after="200"/>
-        <w:jc w:val="center"/>
-      </w:pPr>
-      <w:r>
-        <w:rPr>
-          <w:i/>
-          <w:sz w:val="20"/>
-        </w:rPr>
-        <w:t>Figure 1. Summary printed at the end of the examination</w:t>
-      </w:r>
-    </w:p>
-    <w:p>
-      <w:pPr>
         <w:pStyle w:val="Heading3"/>
       </w:pPr>
       <w:r>
@@ -6833,32 +6807,6 @@
     <w:p>
       <w:r>
         <w:t>Before any scan runs, the script records a SHA-256 hash of all 7 evidence files. A hash is a 64-character fingerprint of a file's contents. Change a single byte of the file and the fingerprint comes out completely different.</w:t>
-      </w:r>
-    </w:p>
-    <w:p>
-      <w:pPr>
-        <w:keepNext/>
-        <w:jc w:val="center"/>
-      </w:pPr>
-      <w:r>
-        <w:rPr>
-          <w:i/>
-          <w:sz w:val="22"/>
-        </w:rPr>
-        <w:t>[ screenshot to be added: 02-evidence-hashes.png ]</w:t>
-      </w:r>
-    </w:p>
-    <w:p>
-      <w:pPr>
-        <w:spacing w:after="200"/>
-        <w:jc w:val="center"/>
-      </w:pPr>
-      <w:r>
-        <w:rPr>
-          <w:i/>
-          <w:sz w:val="20"/>
-        </w:rPr>
-        <w:t>Figure 2. SHA-256 hashes of the evidence, recorded before the examination</w:t>
       </w:r>
     </w:p>
     <w:p>
@@ -6894,32 +6842,6 @@
     </w:p>
     <w:p>
       <w:pPr>
-        <w:keepNext/>
-        <w:jc w:val="center"/>
-      </w:pPr>
-      <w:r>
-        <w:rPr>
-          <w:i/>
-          <w:sz w:val="22"/>
-        </w:rPr>
-        <w:t>[ screenshot to be added: 03-integrity-verified.png ]</w:t>
-      </w:r>
-    </w:p>
-    <w:p>
-      <w:pPr>
-        <w:spacing w:after="200"/>
-        <w:jc w:val="center"/>
-      </w:pPr>
-      <w:r>
-        <w:rPr>
-          <w:i/>
-          <w:sz w:val="20"/>
-        </w:rPr>
-        <w:t>Figure 3. Every evidence file still matches the hash recorded before the examination</w:t>
-      </w:r>
-    </w:p>
-    <w:p>
-      <w:pPr>
         <w:pStyle w:val="Heading3"/>
       </w:pPr>
       <w:r>
@@ -6951,32 +6873,6 @@
     </w:p>
     <w:p>
       <w:pPr>
-        <w:keepNext/>
-        <w:jc w:val="center"/>
-      </w:pPr>
-      <w:r>
-        <w:rPr>
-          <w:i/>
-          <w:sz w:val="22"/>
-        </w:rPr>
-        <w:t>[ screenshot to be added: 04-vulnerabilities.png ]</w:t>
-      </w:r>
-    </w:p>
-    <w:p>
-      <w:pPr>
-        <w:spacing w:after="200"/>
-        <w:jc w:val="center"/>
-      </w:pPr>
-      <w:r>
-        <w:rPr>
-          <w:i/>
-          <w:sz w:val="20"/>
-        </w:rPr>
-        <w:t>Figure 4. The 21 vulnerabilities Trivy found in struts2-core 2.5.10, oldest first</w:t>
-      </w:r>
-    </w:p>
-    <w:p>
-      <w:pPr>
         <w:pStyle w:val="Heading3"/>
       </w:pPr>
       <w:r>
@@ -7004,32 +6900,6 @@
     <w:p>
       <w:r>
         <w:t>Given a CVE number, the same script prints Trivy's full record for that one vulnerability: its severity, the CVSS 3.1 score and vector, the installed and fixed versions, the date it was published and the exact file it was found in.</w:t>
-      </w:r>
-    </w:p>
-    <w:p>
-      <w:pPr>
-        <w:keepNext/>
-        <w:jc w:val="center"/>
-      </w:pPr>
-      <w:r>
-        <w:rPr>
-          <w:i/>
-          <w:sz w:val="22"/>
-        </w:rPr>
-        <w:t>[ screenshot to be added: 05-cve-2017-5638.png ]</w:t>
-      </w:r>
-    </w:p>
-    <w:p>
-      <w:pPr>
-        <w:spacing w:after="200"/>
-        <w:jc w:val="center"/>
-      </w:pPr>
-      <w:r>
-        <w:rPr>
-          <w:i/>
-          <w:sz w:val="20"/>
-        </w:rPr>
-        <w:t>Figure 5. Trivy's record for CVE-2017-5638</w:t>
       </w:r>
     </w:p>
     <w:p>
@@ -7079,32 +6949,6 @@
     </w:p>
     <w:p>
       <w:pPr>
-        <w:keepNext/>
-        <w:jc w:val="center"/>
-      </w:pPr>
-      <w:r>
-        <w:rPr>
-          <w:i/>
-          <w:sz w:val="22"/>
-        </w:rPr>
-        <w:t>[ screenshot to be added: 06-jar-metadata.png ]</w:t>
-      </w:r>
-    </w:p>
-    <w:p>
-      <w:pPr>
-        <w:spacing w:after="200"/>
-        <w:jc w:val="center"/>
-      </w:pPr>
-      <w:r>
-        <w:rPr>
-          <w:i/>
-          <w:sz w:val="20"/>
-        </w:rPr>
-        <w:t>Figure 6. Build details stored inside the Struts JAR</w:t>
-      </w:r>
-    </w:p>
-    <w:p>
-      <w:pPr>
         <w:pStyle w:val="Heading3"/>
       </w:pPr>
       <w:r>
@@ -7132,32 +6976,6 @@
     <w:p>
       <w:r>
         <w:t>The pattern keeps two kinds of line from Trivy's secret report: the heading for each file and the severity line of each finding. Every secret appears under the file it was found in.</w:t>
-      </w:r>
-    </w:p>
-    <w:p>
-      <w:pPr>
-        <w:keepNext/>
-        <w:jc w:val="center"/>
-      </w:pPr>
-      <w:r>
-        <w:rPr>
-          <w:i/>
-          <w:sz w:val="22"/>
-        </w:rPr>
-        <w:t>[ screenshot to be added: 07-secrets.png ]</w:t>
-      </w:r>
-    </w:p>
-    <w:p>
-      <w:pPr>
-        <w:spacing w:after="200"/>
-        <w:jc w:val="center"/>
-      </w:pPr>
-      <w:r>
-        <w:rPr>
-          <w:i/>
-          <w:sz w:val="20"/>
-        </w:rPr>
-        <w:t>Figure 7. The 11 secrets Trivy found, grouped by file</w:t>
       </w:r>
     </w:p>
     <w:p>
@@ -7193,32 +7011,6 @@
     </w:p>
     <w:p>
       <w:pPr>
-        <w:keepNext/>
-        <w:jc w:val="center"/>
-      </w:pPr>
-      <w:r>
-        <w:rPr>
-          <w:i/>
-          <w:sz w:val="22"/>
-        </w:rPr>
-        <w:t>[ screenshot to be added: 08-custom-rules.png ]</w:t>
-      </w:r>
-    </w:p>
-    <w:p>
-      <w:pPr>
-        <w:spacing w:after="200"/>
-        <w:jc w:val="center"/>
-      </w:pPr>
-      <w:r>
-        <w:rPr>
-          <w:i/>
-          <w:sz w:val="20"/>
-        </w:rPr>
-        <w:t>Figure 8. The two secret detection rules we wrote for this case</w:t>
-      </w:r>
-    </w:p>
-    <w:p>
-      <w:pPr>
         <w:pStyle w:val="Heading3"/>
       </w:pPr>
       <w:r>
@@ -7246,32 +7038,6 @@
     <w:p>
       <w:r>
         <w:t>Only the failures are printed: the Failures summary line, then one line per failed result, each starting with its check ID.</w:t>
-      </w:r>
-    </w:p>
-    <w:p>
-      <w:pPr>
-        <w:keepNext/>
-        <w:jc w:val="center"/>
-      </w:pPr>
-      <w:r>
-        <w:rPr>
-          <w:i/>
-          <w:sz w:val="22"/>
-        </w:rPr>
-        <w:t>[ screenshot to be added: 09-misconfigurations.png ]</w:t>
-      </w:r>
-    </w:p>
-    <w:p>
-      <w:pPr>
-        <w:spacing w:after="200"/>
-        <w:jc w:val="center"/>
-      </w:pPr>
-      <w:r>
-        <w:rPr>
-          <w:i/>
-          <w:sz w:val="20"/>
-        </w:rPr>
-        <w:t>Figure 9. The 5 failed configuration results for the Dockerfile</w:t>
       </w:r>
     </w:p>
     <w:p>
@@ -7307,32 +7073,6 @@
     </w:p>
     <w:p>
       <w:pPr>
-        <w:keepNext/>
-        <w:jc w:val="center"/>
-      </w:pPr>
-      <w:r>
-        <w:rPr>
-          <w:i/>
-          <w:sz w:val="22"/>
-        </w:rPr>
-        <w:t>[ screenshot to be added: 10-sbom.png ]</w:t>
-      </w:r>
-    </w:p>
-    <w:p>
-      <w:pPr>
-        <w:spacing w:after="200"/>
-        <w:jc w:val="center"/>
-      </w:pPr>
-      <w:r>
-        <w:rPr>
-          <w:i/>
-          <w:sz w:val="20"/>
-        </w:rPr>
-        <w:t>Figure 10. The software bill of materials Trivy produced</w:t>
-      </w:r>
-    </w:p>
-    <w:p>
-      <w:pPr>
         <w:pStyle w:val="Heading3"/>
       </w:pPr>
       <w:r>
@@ -7364,35 +7104,9 @@
     </w:p>
     <w:p>
       <w:pPr>
-        <w:keepNext/>
-        <w:jc w:val="center"/>
-      </w:pPr>
-      <w:r>
-        <w:rPr>
-          <w:i/>
-          <w:sz w:val="22"/>
-        </w:rPr>
-        <w:t>[ screenshot to be added: 11-artefact-hashes.png ]</w:t>
-      </w:r>
-    </w:p>
-    <w:p>
-      <w:pPr>
-        <w:spacing w:after="200"/>
-        <w:jc w:val="center"/>
-      </w:pPr>
-      <w:r>
-        <w:rPr>
-          <w:i/>
-          <w:sz w:val="20"/>
-        </w:rPr>
-        <w:t>Figure 11. SHA-256 hashes of every output file the examination produced</w:t>
-      </w:r>
-    </w:p>
-    <w:p>
-      <w:pPr>
         <w:pStyle w:val="Heading2"/>
       </w:pPr>
-      <w:bookmarkStart w:id="15" w:name="_Toc241498921"/>
+      <w:bookmarkStart w:id="15" w:name="_Toc241584714"/>
       <w:r>
         <w:t>2.6 Evidence log and chain of custody</w:t>
       </w:r>
@@ -7675,7 +7389,7 @@
       <w:pPr>
         <w:pStyle w:val="Heading2"/>
       </w:pPr>
-      <w:bookmarkStart w:id="16" w:name="_Toc241498922"/>
+      <w:bookmarkStart w:id="16" w:name="_Toc241584715"/>
       <w:r>
         <w:t>2.7 What is evidence and what is assumed</w:t>
       </w:r>
@@ -7829,7 +7543,7 @@
               <w:rPr>
                 <w:sz w:val="20"/>
               </w:rPr>
-              <w:t>Evidence: Trivy's scan output (Figure 5)</w:t>
+              <w:t>Evidence: Trivy's scan output (Step 5)</w:t>
             </w:r>
           </w:p>
         </w:tc>
@@ -8048,7 +7762,7 @@
       <w:pPr>
         <w:pStyle w:val="Heading1"/>
       </w:pPr>
-      <w:bookmarkStart w:id="17" w:name="_Toc241498923"/>
+      <w:bookmarkStart w:id="17" w:name="_Toc241584716"/>
       <w:r>
         <w:t>3. Examination findings</w:t>
       </w:r>
@@ -8063,7 +7777,7 @@
       <w:pPr>
         <w:pStyle w:val="Heading2"/>
       </w:pPr>
-      <w:bookmarkStart w:id="18" w:name="_Toc241498924"/>
+      <w:bookmarkStart w:id="18" w:name="_Toc241584717"/>
       <w:r>
         <w:t>Activity 1: evidence identification</w:t>
       </w:r>
@@ -8504,7 +8218,7 @@
               <w:rPr>
                 <w:sz w:val="20"/>
               </w:rPr>
-              <w:t>CycloneDX 1.7 bill of materials listing 1 component, struts2-core 2.5.10 (Figure 10). trivy rootfs identifies compiled JAR files only. The three other libraries in pom.xml have no JAR in the evidence, so they appear only in the second scan (Activity 4)</w:t>
+              <w:t>CycloneDX 1.7 bill of materials listing 1 component, struts2-core 2.5.10 (Step 10). trivy rootfs identifies compiled JAR files only. The three other libraries in pom.xml have no JAR in the evidence, so they appear only in the second scan (Activity 4)</w:t>
             </w:r>
           </w:p>
         </w:tc>
@@ -8563,7 +8277,7 @@
       <w:pPr>
         <w:pStyle w:val="Heading2"/>
       </w:pPr>
-      <w:bookmarkStart w:id="19" w:name="_Toc241498925"/>
+      <w:bookmarkStart w:id="19" w:name="_Toc241584718"/>
       <w:r>
         <w:t>Activity 2: hash verification</w:t>
       </w:r>
@@ -8858,7 +8572,7 @@
         <w:jc w:val="left"/>
       </w:pPr>
       <w:r>
-        <w:t>For all 7 files we recorded SHA-256 hashes before the examination (Figure 2) and hashed them again afterwards (Figure 3). The hashes below are the expected values. The calculated values are in evidence-hashes-after.txt, which is byte for byte identical to the list taken before: both lists hash to e3833f1be425fb980ab7071aaa3ca109ef6c57979e0a70ef7f569b141da2ce26. For every file the calculated hash equals the expected hash, and the result is Match.</w:t>
+        <w:t>For all 7 files we recorded SHA-256 hashes before the examination (Step 2) and hashed them again afterwards (Step 3). The hashes below are the expected values. The calculated values are in evidence-hashes-after.txt, which is byte for byte identical to the list taken before: both lists hash to e3833f1be425fb980ab7071aaa3ca109ef6c57979e0a70ef7f569b141da2ce26. For every file the calculated hash equals the expected hash, and the result is Match.</w:t>
       </w:r>
     </w:p>
     <w:tbl>
@@ -9271,7 +8985,7 @@
       <w:pPr>
         <w:pStyle w:val="Heading2"/>
       </w:pPr>
-      <w:bookmarkStart w:id="20" w:name="_Toc241498926"/>
+      <w:bookmarkStart w:id="20" w:name="_Toc241584719"/>
       <w:r>
         <w:t>Activity 3: creating the case</w:t>
       </w:r>
@@ -9649,7 +9363,7 @@
       <w:pPr>
         <w:pStyle w:val="Heading2"/>
       </w:pPr>
-      <w:bookmarkStart w:id="21" w:name="_Toc241498927"/>
+      <w:bookmarkStart w:id="21" w:name="_Toc241584720"/>
       <w:r>
         <w:t>Activity 4: file system examination</w:t>
       </w:r>
@@ -9662,7 +9376,7 @@
     </w:p>
     <w:p>
       <w:r>
-        <w:t>The trivy rootfs scan found 21 known vulnerabilities in struts2-core 2.5.10: 7 critical, 10 high and 4 medium (Figure 4).</w:t>
+        <w:t>The trivy rootfs scan found 21 known vulnerabilities in struts2-core 2.5.10: 7 critical, 10 high and 4 medium (Step 4).</w:t>
       </w:r>
     </w:p>
     <w:p>
@@ -12369,7 +12083,7 @@
       <w:pPr>
         <w:pStyle w:val="Heading2"/>
       </w:pPr>
-      <w:bookmarkStart w:id="22" w:name="_Toc241498928"/>
+      <w:bookmarkStart w:id="22" w:name="_Toc241584721"/>
       <w:r>
         <w:t>Activity 5: user accounts</w:t>
       </w:r>
@@ -12771,7 +12485,7 @@
     </w:p>
     <w:p>
       <w:r>
-        <w:t>The root account. The application runs as the system administrator, and Trivy flags this as check DS-0002 (Figure 9).</w:t>
+        <w:t>The root account. The application runs as the system administrator, and Trivy flags this as check DS-0002 (Step 9).</w:t>
       </w:r>
     </w:p>
     <w:p>
@@ -12815,7 +12529,7 @@
       <w:pPr>
         <w:pStyle w:val="Heading2"/>
       </w:pPr>
-      <w:bookmarkStart w:id="23" w:name="_Toc241498929"/>
+      <w:bookmarkStart w:id="23" w:name="_Toc241584722"/>
       <w:r>
         <w:t>Activity 6: deleted files</w:t>
       </w:r>
@@ -13137,7 +12851,7 @@
       <w:pPr>
         <w:pStyle w:val="Heading2"/>
       </w:pPr>
-      <w:bookmarkStart w:id="24" w:name="_Toc241498930"/>
+      <w:bookmarkStart w:id="24" w:name="_Toc241584723"/>
       <w:r>
         <w:t>Activity 7: image and metadata examination</w:t>
       </w:r>
@@ -13656,7 +13370,7 @@
     <w:p/>
     <w:p>
       <w:r>
-        <w:t>The build date puts the library 39 days before the flaw was announced on 7 March 2017 (Figure 6). This version was released before the flaw was made public. The fix came out 67 days before the intrusion.</w:t>
+        <w:t>The build date puts the library 39 days before the flaw was announced on 7 March 2017 (Step 6). This version was released before the flaw was made public. The fix came out 67 days before the intrusion.</w:t>
       </w:r>
     </w:p>
     <w:p>
@@ -13711,7 +13425,7 @@
       <w:pPr>
         <w:pStyle w:val="Heading2"/>
       </w:pPr>
-      <w:bookmarkStart w:id="25" w:name="_Toc241498931"/>
+      <w:bookmarkStart w:id="25" w:name="_Toc241584724"/>
       <w:r>
         <w:t>Activity 8: browser activity</w:t>
       </w:r>
@@ -13779,7 +13493,7 @@
       <w:pPr>
         <w:pStyle w:val="Heading2"/>
       </w:pPr>
-      <w:bookmarkStart w:id="26" w:name="_Toc241498932"/>
+      <w:bookmarkStart w:id="26" w:name="_Toc241584725"/>
       <w:r>
         <w:t>Activity 9: keyword search</w:t>
       </w:r>
@@ -14491,7 +14205,7 @@
         <w:keepNext/>
       </w:pPr>
       <w:r>
-        <w:t>A keyword search only matches the words we typed, and an AWS key or a GitHub token contains none of them. To find secrets by their format, we also ran Trivy's secret scanner with two rules of our own (Figures 7 and 8). It found 11 secrets in 4 files, 9 of them critical:</w:t>
+        <w:t>A keyword search only matches the words we typed, and an AWS key or a GitHub token contains none of them. To find secrets by their format, we also ran Trivy's secret scanner with two rules of our own (Steps 7 and 8). It found 11 secrets in 4 files, 9 of them critical:</w:t>
       </w:r>
     </w:p>
     <w:tbl>
@@ -15487,7 +15201,7 @@
       <w:pPr>
         <w:pStyle w:val="Heading2"/>
       </w:pPr>
-      <w:bookmarkStart w:id="27" w:name="_Toc241498933"/>
+      <w:bookmarkStart w:id="27" w:name="_Toc241584726"/>
       <w:r>
         <w:t>Activity 10: file signatures and configuration</w:t>
       </w:r>
@@ -16301,7 +16015,7 @@
         <w:keepNext/>
       </w:pPr>
       <w:r>
-        <w:t>Trivy's configuration scan of the Dockerfile reported 28 tests: 23 passed and 5 failed (Figure 9). The failures come from 4 checks, because DS-0031 failed once for each ENV line that holds a secret:</w:t>
+        <w:t>Trivy's configuration scan of the Dockerfile reported 28 tests: 23 passed and 5 failed (Step 9). The failures come from 4 checks, because DS-0031 failed once for each ENV line that holds a secret:</w:t>
       </w:r>
     </w:p>
     <w:tbl>
@@ -16824,7 +16538,7 @@
       <w:pPr>
         <w:pStyle w:val="Heading2"/>
       </w:pPr>
-      <w:bookmarkStart w:id="28" w:name="_Toc241498934"/>
+      <w:bookmarkStart w:id="28" w:name="_Toc241584727"/>
       <w:r>
         <w:t>Activity 11: timeline</w:t>
       </w:r>
@@ -16974,7 +16688,7 @@
               <w:rPr>
                 <w:sz w:val="20"/>
               </w:rPr>
-              <w:t>Our evidence: pom.properties inside the JAR (Figure 6)</w:t>
+              <w:t>Our evidence: pom.properties inside the JAR (Step 6)</w:t>
             </w:r>
           </w:p>
         </w:tc>
@@ -17214,7 +16928,7 @@
               <w:rPr>
                 <w:sz w:val="20"/>
               </w:rPr>
-              <w:t>Our scan output (Figure 5)</w:t>
+              <w:t>Our scan output (Step 5)</w:t>
             </w:r>
           </w:p>
         </w:tc>
@@ -17571,7 +17285,7 @@
               <w:rPr>
                 <w:sz w:val="20"/>
               </w:rPr>
-              <w:t>Our scan output (Figure 4)</w:t>
+              <w:t>Our scan output (Step 4)</w:t>
             </w:r>
           </w:p>
         </w:tc>
@@ -17588,7 +17302,7 @@
     </w:p>
     <w:p>
       <w:r>
-        <w:t>Event 1, 27 January 2017: struts2-core 2.5.10 is built. Artifact: pom.properties inside lib/struts2-core-2.5.10.jar (our evidence, Figure 6).</w:t>
+        <w:t>Event 1, 27 January 2017: struts2-core 2.5.10 is built. Artifact: pom.properties inside lib/struts2-core-2.5.10.jar (our evidence, Step 6).</w:t>
       </w:r>
     </w:p>
     <w:p>
@@ -17601,7 +17315,7 @@
         <w:jc w:val="left"/>
       </w:pPr>
       <w:r>
-        <w:t>Event 3, 11 March 2017: the CVE record is published in NVD. Artifact: the published date in output/20260928T072443Z/01-rootfs-vulnerabilities.json (our scan output, Figure 5).</w:t>
+        <w:t>Event 3, 11 March 2017: the CVE record is published in NVD. Artifact: the published date in output/20260928T072443Z/01-rootfs-vulnerabilities.json (our scan output, Step 5).</w:t>
       </w:r>
     </w:p>
     <w:p>
@@ -17642,7 +17356,7 @@
       <w:pPr>
         <w:pStyle w:val="Heading2"/>
       </w:pPr>
-      <w:bookmarkStart w:id="29" w:name="_Toc241498935"/>
+      <w:bookmarkStart w:id="29" w:name="_Toc241584728"/>
       <w:r>
         <w:t>Activity 12: correlating the evidence</w:t>
       </w:r>
@@ -17771,7 +17485,7 @@
               <w:rPr>
                 <w:sz w:val="20"/>
               </w:rPr>
-              <w:t>CVE-2017-5638 in struts2-core 2.5.10, CVSS 9.8 (Figure 5)</w:t>
+              <w:t>CVE-2017-5638 in struts2-core 2.5.10, CVSS 9.8 (Step 5)</w:t>
             </w:r>
           </w:p>
         </w:tc>
@@ -17789,7 +17503,7 @@
               <w:rPr>
                 <w:sz w:val="20"/>
               </w:rPr>
-              <w:t>USER root in the Dockerfile (Figure 9)</w:t>
+              <w:t>USER root in the Dockerfile (Step 9)</w:t>
             </w:r>
           </w:p>
         </w:tc>
@@ -17807,7 +17521,7 @@
               <w:rPr>
                 <w:sz w:val="20"/>
               </w:rPr>
-              <w:t>Four plaintext database passwords (Figure 7)</w:t>
+              <w:t>Four plaintext database passwords (Step 7)</w:t>
             </w:r>
           </w:p>
         </w:tc>
@@ -17849,7 +17563,7 @@
               <w:rPr>
                 <w:sz w:val="20"/>
               </w:rPr>
-              <w:t>JAR built 27 January 2017 (Figure 6)</w:t>
+              <w:t>JAR built 27 January 2017 (Step 6)</w:t>
             </w:r>
           </w:p>
         </w:tc>
@@ -18004,7 +17718,7 @@
       <w:pPr>
         <w:pStyle w:val="Heading2"/>
       </w:pPr>
-      <w:bookmarkStart w:id="30" w:name="_Toc241498936"/>
+      <w:bookmarkStart w:id="30" w:name="_Toc241584729"/>
       <w:r>
         <w:t>Activity 13: tagging the evidence</w:t>
       </w:r>
@@ -18824,7 +18538,7 @@
         <w:jc w:val="left"/>
       </w:pPr>
       <w:r>
-        <w:t>These are the SHA-256 hashes of every file the examination exported, taken from output/20260928T072443Z/artefact-hashes.txt (Figure 11). Anyone can check them with sha256sum -c.</w:t>
+        <w:t>These are the SHA-256 hashes of every file the examination exported, taken from output/20260928T072443Z/artefact-hashes.txt (Step 11). Anyone can check them with sha256sum -c.</w:t>
       </w:r>
     </w:p>
     <w:tbl>
@@ -19357,7 +19071,7 @@
       <w:pPr>
         <w:pStyle w:val="Heading1"/>
       </w:pPr>
-      <w:bookmarkStart w:id="31" w:name="_Toc241498937"/>
+      <w:bookmarkStart w:id="31" w:name="_Toc241584730"/>
       <w:r>
         <w:t>4. The same facts under Indian law</w:t>
       </w:r>
@@ -19372,7 +19086,7 @@
       <w:pPr>
         <w:pStyle w:val="Heading2"/>
       </w:pPr>
-      <w:bookmarkStart w:id="32" w:name="_Toc241498938"/>
+      <w:bookmarkStart w:id="32" w:name="_Toc241584731"/>
       <w:r>
         <w:t>4.1 Why Indian law is relevant</w:t>
       </w:r>
@@ -19392,7 +19106,7 @@
       <w:pPr>
         <w:pStyle w:val="Heading2"/>
       </w:pPr>
-      <w:bookmarkStart w:id="33" w:name="_Toc241498939"/>
+      <w:bookmarkStart w:id="33" w:name="_Toc241584732"/>
       <w:r>
         <w:t>4.2 Law in force now</w:t>
       </w:r>
@@ -19910,7 +19624,7 @@
       <w:pPr>
         <w:pStyle w:val="Heading2"/>
       </w:pPr>
-      <w:bookmarkStart w:id="34" w:name="_Toc241498940"/>
+      <w:bookmarkStart w:id="34" w:name="_Toc241584733"/>
       <w:r>
         <w:t>4.3 What changes on 13 May 2027</w:t>
       </w:r>
@@ -20193,7 +19907,7 @@
       <w:pPr>
         <w:pStyle w:val="Heading2"/>
       </w:pPr>
-      <w:bookmarkStart w:id="35" w:name="_Toc241498941"/>
+      <w:bookmarkStart w:id="35" w:name="_Toc241584734"/>
       <w:r>
         <w:t>4.4 Deadlines for reporting and logging</w:t>
       </w:r>
@@ -20403,7 +20117,7 @@
       <w:pPr>
         <w:pStyle w:val="Heading2"/>
       </w:pPr>
-      <w:bookmarkStart w:id="36" w:name="_Toc241498942"/>
+      <w:bookmarkStart w:id="36" w:name="_Toc241584735"/>
       <w:r>
         <w:t>4.5 Using this evidence in an Indian court</w:t>
       </w:r>
@@ -20426,7 +20140,7 @@
       <w:pPr>
         <w:pStyle w:val="Heading1"/>
       </w:pPr>
-      <w:bookmarkStart w:id="37" w:name="_Toc241498943"/>
+      <w:bookmarkStart w:id="37" w:name="_Toc241584736"/>
       <w:r>
         <w:t>5. Final findings and conclusion</w:t>
       </w:r>
@@ -21019,7 +20733,7 @@
       <w:pPr>
         <w:pStyle w:val="Heading1"/>
       </w:pPr>
-      <w:bookmarkStart w:id="38" w:name="_Toc241498944"/>
+      <w:bookmarkStart w:id="38" w:name="_Toc241584737"/>
       <w:r>
         <w:t>6. Limitations</w:t>
       </w:r>
@@ -21064,7 +20778,7 @@
       <w:pPr>
         <w:pStyle w:val="Heading1"/>
       </w:pPr>
-      <w:bookmarkStart w:id="39" w:name="_Toc241498945"/>
+      <w:bookmarkStart w:id="39" w:name="_Toc241584738"/>
       <w:r>
         <w:t>7. Sources</w:t>
       </w:r>
@@ -21418,10 +21132,10 @@
         <w:noProof/>
       </w:rPr>
       <w:drawing>
-        <wp:inline distT="0" distB="0" distL="0" distR="0" wp14:anchorId="4F8DF3AA" wp14:editId="13C99D99">
+        <wp:inline distT="0" distB="0" distL="0" distR="0" wp14:anchorId="0F8827E8" wp14:editId="756F981D">
           <wp:extent cx="5852160" cy="448627"/>
           <wp:effectExtent l="0" t="0" r="0" b="0"/>
-          <wp:docPr id="1499544333" name="Picture 1499544333"/>
+          <wp:docPr id="1040070938" name="Picture 1040070938"/>
           <wp:cNvGraphicFramePr>
             <a:graphicFrameLocks xmlns:a="http://schemas.openxmlformats.org/drawingml/2006/main" noChangeAspect="1"/>
           </wp:cNvGraphicFramePr>
@@ -21504,10 +21218,10 @@
         <w:noProof/>
       </w:rPr>
       <w:drawing>
-        <wp:inline distT="0" distB="0" distL="0" distR="0" wp14:anchorId="38AFAC15" wp14:editId="46696FA1">
+        <wp:inline distT="0" distB="0" distL="0" distR="0" wp14:anchorId="552B9083" wp14:editId="0353D4B9">
           <wp:extent cx="5852160" cy="448627"/>
           <wp:effectExtent l="0" t="0" r="0" b="0"/>
-          <wp:docPr id="121485052" name="Picture 121485052"/>
+          <wp:docPr id="1953358349" name="Picture 1953358349"/>
           <wp:cNvGraphicFramePr>
             <a:graphicFrameLocks xmlns:a="http://schemas.openxmlformats.org/drawingml/2006/main" noChangeAspect="1"/>
           </wp:cNvGraphicFramePr>
@@ -21580,10 +21294,10 @@
         <w:noProof/>
       </w:rPr>
       <w:drawing>
-        <wp:inline distT="0" distB="0" distL="0" distR="0" wp14:anchorId="4CF5739D" wp14:editId="7F613728">
+        <wp:inline distT="0" distB="0" distL="0" distR="0" wp14:anchorId="4592E950" wp14:editId="300D7682">
           <wp:extent cx="2377440" cy="700286"/>
           <wp:effectExtent l="0" t="0" r="0" b="0"/>
-          <wp:docPr id="549376056" name="Picture 549376056"/>
+          <wp:docPr id="734095201" name="Picture 734095201"/>
           <wp:cNvGraphicFramePr>
             <a:graphicFrameLocks xmlns:a="http://schemas.openxmlformats.org/drawingml/2006/main" noChangeAspect="1"/>
           </wp:cNvGraphicFramePr>
@@ -21803,31 +21517,31 @@
       </w:rPr>
     </w:lvl>
   </w:abstractNum>
-  <w:num w:numId="1" w16cid:durableId="1938100533">
+  <w:num w:numId="1" w16cid:durableId="1161888047">
     <w:abstractNumId w:val="8"/>
   </w:num>
-  <w:num w:numId="2" w16cid:durableId="1140266418">
+  <w:num w:numId="2" w16cid:durableId="523132808">
     <w:abstractNumId w:val="6"/>
   </w:num>
-  <w:num w:numId="3" w16cid:durableId="1445273076">
+  <w:num w:numId="3" w16cid:durableId="988555184">
     <w:abstractNumId w:val="5"/>
   </w:num>
-  <w:num w:numId="4" w16cid:durableId="1423915694">
+  <w:num w:numId="4" w16cid:durableId="253710626">
     <w:abstractNumId w:val="4"/>
   </w:num>
-  <w:num w:numId="5" w16cid:durableId="283849810">
+  <w:num w:numId="5" w16cid:durableId="1000892498">
     <w:abstractNumId w:val="7"/>
   </w:num>
-  <w:num w:numId="6" w16cid:durableId="1678192314">
+  <w:num w:numId="6" w16cid:durableId="177886421">
     <w:abstractNumId w:val="3"/>
   </w:num>
-  <w:num w:numId="7" w16cid:durableId="1242253510">
+  <w:num w:numId="7" w16cid:durableId="683554619">
     <w:abstractNumId w:val="2"/>
   </w:num>
-  <w:num w:numId="8" w16cid:durableId="679241424">
+  <w:num w:numId="8" w16cid:durableId="332531292">
     <w:abstractNumId w:val="1"/>
   </w:num>
-  <w:num w:numId="9" w16cid:durableId="599486156">
+  <w:num w:numId="9" w16cid:durableId="1831092512">
     <w:abstractNumId w:val="0"/>
   </w:num>
 </w:numbering>
@@ -33217,7 +32931,7 @@
     <w:autoRedefine/>
     <w:uiPriority w:val="39"/>
     <w:unhideWhenUsed/>
-    <w:rsid w:val="008C48EB"/>
+    <w:rsid w:val="008C28B9"/>
     <w:pPr>
       <w:spacing w:after="100"/>
     </w:pPr>
@@ -33229,7 +32943,7 @@
     <w:autoRedefine/>
     <w:uiPriority w:val="39"/>
     <w:unhideWhenUsed/>
-    <w:rsid w:val="008C48EB"/>
+    <w:rsid w:val="008C28B9"/>
     <w:pPr>
       <w:spacing w:after="100"/>
       <w:ind w:left="240"/>
@@ -33240,7 +32954,7 @@
     <w:basedOn w:val="DefaultParagraphFont"/>
     <w:uiPriority w:val="99"/>
     <w:unhideWhenUsed/>
-    <w:rsid w:val="008C48EB"/>
+    <w:rsid w:val="008C28B9"/>
     <w:rPr>
       <w:color w:val="0000FF" w:themeColor="hyperlink"/>
       <w:u w:val="single"/>

</xml_diff>

<commit_message>
expand the case with a day by day timeline and reword it more plainly
</commit_message>
<xml_diff>
--- a/report/CSFCL-IA2-2026-005-Forensic-Report.docx
+++ b/report/CSFCL-IA2-2026-005-Forensic-Report.docx
@@ -11,7 +11,7 @@
           <w:noProof/>
         </w:rPr>
         <w:drawing>
-          <wp:inline distT="0" distB="0" distL="0" distR="0" wp14:anchorId="7186C1EC" wp14:editId="59CA7B3C">
+          <wp:inline distT="0" distB="0" distL="0" distR="0" wp14:anchorId="43412B97" wp14:editId="3632131A">
             <wp:extent cx="3840480" cy="1131230"/>
             <wp:effectExtent l="0" t="0" r="0" b="0"/>
             <wp:docPr id="1" name="Picture 1"/>
@@ -302,7 +302,7 @@
       <w:r>
         <w:fldChar w:fldCharType="separate"/>
       </w:r>
-      <w:hyperlink w:anchor="_Toc241585070" w:history="1">
+      <w:hyperlink w:anchor="_Toc241586166" w:history="1">
         <w:r>
           <w:rPr>
             <w:rStyle w:val="Hyperlink"/>
@@ -329,7 +329,7 @@
             <w:noProof/>
             <w:webHidden/>
           </w:rPr>
-          <w:instrText xml:space="preserve"> PAGEREF _Toc241585070 \h </w:instrText>
+          <w:instrText xml:space="preserve"> PAGEREF _Toc241586166 \h </w:instrText>
         </w:r>
         <w:r>
           <w:rPr>
@@ -370,7 +370,7 @@
           <w:noProof/>
         </w:rPr>
       </w:pPr>
-      <w:hyperlink w:anchor="_Toc241585071" w:history="1">
+      <w:hyperlink w:anchor="_Toc241586167" w:history="1">
         <w:r>
           <w:rPr>
             <w:rStyle w:val="Hyperlink"/>
@@ -397,7 +397,7 @@
             <w:noProof/>
             <w:webHidden/>
           </w:rPr>
-          <w:instrText xml:space="preserve"> PAGEREF _Toc241585071 \h </w:instrText>
+          <w:instrText xml:space="preserve"> PAGEREF _Toc241586167 \h </w:instrText>
         </w:r>
         <w:r>
           <w:rPr>
@@ -438,13 +438,13 @@
           <w:noProof/>
         </w:rPr>
       </w:pPr>
-      <w:hyperlink w:anchor="_Toc241585072" w:history="1">
+      <w:hyperlink w:anchor="_Toc241586168" w:history="1">
         <w:r>
           <w:rPr>
             <w:rStyle w:val="Hyperlink"/>
             <w:noProof/>
           </w:rPr>
-          <w:t>1.1 What happened</w:t>
+          <w:t>1.1 Who Equifax is</w:t>
         </w:r>
         <w:r>
           <w:rPr>
@@ -465,7 +465,7 @@
             <w:noProof/>
             <w:webHidden/>
           </w:rPr>
-          <w:instrText xml:space="preserve"> PAGEREF _Toc241585072 \h </w:instrText>
+          <w:instrText xml:space="preserve"> PAGEREF _Toc241586168 \h </w:instrText>
         </w:r>
         <w:r>
           <w:rPr>
@@ -506,13 +506,13 @@
           <w:noProof/>
         </w:rPr>
       </w:pPr>
-      <w:hyperlink w:anchor="_Toc241585073" w:history="1">
+      <w:hyperlink w:anchor="_Toc241586169" w:history="1">
         <w:r>
           <w:rPr>
             <w:rStyle w:val="Hyperlink"/>
             <w:noProof/>
           </w:rPr>
-          <w:t>1.2 Why it was not stopped</w:t>
+          <w:t>1.2 How the attack unfolded</w:t>
         </w:r>
         <w:r>
           <w:rPr>
@@ -533,7 +533,7 @@
             <w:noProof/>
             <w:webHidden/>
           </w:rPr>
-          <w:instrText xml:space="preserve"> PAGEREF _Toc241585073 \h </w:instrText>
+          <w:instrText xml:space="preserve"> PAGEREF _Toc241586169 \h </w:instrText>
         </w:r>
         <w:r>
           <w:rPr>
@@ -553,7 +553,7 @@
             <w:noProof/>
             <w:webHidden/>
           </w:rPr>
-          <w:t>5</w:t>
+          <w:t>4</w:t>
         </w:r>
         <w:r>
           <w:rPr>
@@ -574,13 +574,13 @@
           <w:noProof/>
         </w:rPr>
       </w:pPr>
-      <w:hyperlink w:anchor="_Toc241585074" w:history="1">
+      <w:hyperlink w:anchor="_Toc241586170" w:history="1">
         <w:r>
           <w:rPr>
             <w:rStyle w:val="Hyperlink"/>
             <w:noProof/>
           </w:rPr>
-          <w:t>1.3 What was taken</w:t>
+          <w:t>1.3 Why it was not stopped</w:t>
         </w:r>
         <w:r>
           <w:rPr>
@@ -601,7 +601,7 @@
             <w:noProof/>
             <w:webHidden/>
           </w:rPr>
-          <w:instrText xml:space="preserve"> PAGEREF _Toc241585074 \h </w:instrText>
+          <w:instrText xml:space="preserve"> PAGEREF _Toc241586170 \h </w:instrText>
         </w:r>
         <w:r>
           <w:rPr>
@@ -621,7 +621,7 @@
             <w:noProof/>
             <w:webHidden/>
           </w:rPr>
-          <w:t>5</w:t>
+          <w:t>6</w:t>
         </w:r>
         <w:r>
           <w:rPr>
@@ -642,13 +642,13 @@
           <w:noProof/>
         </w:rPr>
       </w:pPr>
-      <w:hyperlink w:anchor="_Toc241585075" w:history="1">
+      <w:hyperlink w:anchor="_Toc241586171" w:history="1">
         <w:r>
           <w:rPr>
             <w:rStyle w:val="Hyperlink"/>
             <w:noProof/>
           </w:rPr>
-          <w:t>1.4 The question this report asks</w:t>
+          <w:t>1.4 What was taken</w:t>
         </w:r>
         <w:r>
           <w:rPr>
@@ -669,7 +669,7 @@
             <w:noProof/>
             <w:webHidden/>
           </w:rPr>
-          <w:instrText xml:space="preserve"> PAGEREF _Toc241585075 \h </w:instrText>
+          <w:instrText xml:space="preserve"> PAGEREF _Toc241586171 \h </w:instrText>
         </w:r>
         <w:r>
           <w:rPr>
@@ -690,6 +690,74 @@
             <w:webHidden/>
           </w:rPr>
           <w:t>6</w:t>
+        </w:r>
+        <w:r>
+          <w:rPr>
+            <w:noProof/>
+            <w:webHidden/>
+          </w:rPr>
+          <w:fldChar w:fldCharType="end"/>
+        </w:r>
+      </w:hyperlink>
+    </w:p>
+    <w:p>
+      <w:pPr>
+        <w:pStyle w:val="TOC2"/>
+        <w:tabs>
+          <w:tab w:val="right" w:leader="dot" w:pos="9019"/>
+        </w:tabs>
+        <w:rPr>
+          <w:noProof/>
+        </w:rPr>
+      </w:pPr>
+      <w:hyperlink w:anchor="_Toc241586172" w:history="1">
+        <w:r>
+          <w:rPr>
+            <w:rStyle w:val="Hyperlink"/>
+            <w:noProof/>
+          </w:rPr>
+          <w:t>1.5 The question this report asks</w:t>
+        </w:r>
+        <w:r>
+          <w:rPr>
+            <w:noProof/>
+            <w:webHidden/>
+          </w:rPr>
+          <w:tab/>
+        </w:r>
+        <w:r>
+          <w:rPr>
+            <w:noProof/>
+            <w:webHidden/>
+          </w:rPr>
+          <w:fldChar w:fldCharType="begin"/>
+        </w:r>
+        <w:r>
+          <w:rPr>
+            <w:noProof/>
+            <w:webHidden/>
+          </w:rPr>
+          <w:instrText xml:space="preserve"> PAGEREF _Toc241586172 \h </w:instrText>
+        </w:r>
+        <w:r>
+          <w:rPr>
+            <w:noProof/>
+            <w:webHidden/>
+          </w:rPr>
+        </w:r>
+        <w:r>
+          <w:rPr>
+            <w:noProof/>
+            <w:webHidden/>
+          </w:rPr>
+          <w:fldChar w:fldCharType="separate"/>
+        </w:r>
+        <w:r>
+          <w:rPr>
+            <w:noProof/>
+            <w:webHidden/>
+          </w:rPr>
+          <w:t>7</w:t>
         </w:r>
         <w:r>
           <w:rPr>
@@ -710,7 +778,7 @@
           <w:noProof/>
         </w:rPr>
       </w:pPr>
-      <w:hyperlink w:anchor="_Toc241585076" w:history="1">
+      <w:hyperlink w:anchor="_Toc241586173" w:history="1">
         <w:r>
           <w:rPr>
             <w:rStyle w:val="Hyperlink"/>
@@ -737,7 +805,7 @@
             <w:noProof/>
             <w:webHidden/>
           </w:rPr>
-          <w:instrText xml:space="preserve"> PAGEREF _Toc241585076 \h </w:instrText>
+          <w:instrText xml:space="preserve"> PAGEREF _Toc241586173 \h </w:instrText>
         </w:r>
         <w:r>
           <w:rPr>
@@ -757,7 +825,7 @@
             <w:noProof/>
             <w:webHidden/>
           </w:rPr>
-          <w:t>6</w:t>
+          <w:t>7</w:t>
         </w:r>
         <w:r>
           <w:rPr>
@@ -778,7 +846,7 @@
           <w:noProof/>
         </w:rPr>
       </w:pPr>
-      <w:hyperlink w:anchor="_Toc241585077" w:history="1">
+      <w:hyperlink w:anchor="_Toc241586174" w:history="1">
         <w:r>
           <w:rPr>
             <w:rStyle w:val="Hyperlink"/>
@@ -805,7 +873,7 @@
             <w:noProof/>
             <w:webHidden/>
           </w:rPr>
-          <w:instrText xml:space="preserve"> PAGEREF _Toc241585077 \h </w:instrText>
+          <w:instrText xml:space="preserve"> PAGEREF _Toc241586174 \h </w:instrText>
         </w:r>
         <w:r>
           <w:rPr>
@@ -825,7 +893,7 @@
             <w:noProof/>
             <w:webHidden/>
           </w:rPr>
-          <w:t>6</w:t>
+          <w:t>7</w:t>
         </w:r>
         <w:r>
           <w:rPr>
@@ -846,7 +914,7 @@
           <w:noProof/>
         </w:rPr>
       </w:pPr>
-      <w:hyperlink w:anchor="_Toc241585078" w:history="1">
+      <w:hyperlink w:anchor="_Toc241586175" w:history="1">
         <w:r>
           <w:rPr>
             <w:rStyle w:val="Hyperlink"/>
@@ -873,7 +941,7 @@
             <w:noProof/>
             <w:webHidden/>
           </w:rPr>
-          <w:instrText xml:space="preserve"> PAGEREF _Toc241585078 \h </w:instrText>
+          <w:instrText xml:space="preserve"> PAGEREF _Toc241586175 \h </w:instrText>
         </w:r>
         <w:r>
           <w:rPr>
@@ -893,7 +961,7 @@
             <w:noProof/>
             <w:webHidden/>
           </w:rPr>
-          <w:t>7</w:t>
+          <w:t>8</w:t>
         </w:r>
         <w:r>
           <w:rPr>
@@ -914,7 +982,7 @@
           <w:noProof/>
         </w:rPr>
       </w:pPr>
-      <w:hyperlink w:anchor="_Toc241585079" w:history="1">
+      <w:hyperlink w:anchor="_Toc241586176" w:history="1">
         <w:r>
           <w:rPr>
             <w:rStyle w:val="Hyperlink"/>
@@ -941,7 +1009,7 @@
             <w:noProof/>
             <w:webHidden/>
           </w:rPr>
-          <w:instrText xml:space="preserve"> PAGEREF _Toc241585079 \h </w:instrText>
+          <w:instrText xml:space="preserve"> PAGEREF _Toc241586176 \h </w:instrText>
         </w:r>
         <w:r>
           <w:rPr>
@@ -961,7 +1029,7 @@
             <w:noProof/>
             <w:webHidden/>
           </w:rPr>
-          <w:t>8</w:t>
+          <w:t>9</w:t>
         </w:r>
         <w:r>
           <w:rPr>
@@ -982,7 +1050,7 @@
           <w:noProof/>
         </w:rPr>
       </w:pPr>
-      <w:hyperlink w:anchor="_Toc241585080" w:history="1">
+      <w:hyperlink w:anchor="_Toc241586177" w:history="1">
         <w:r>
           <w:rPr>
             <w:rStyle w:val="Hyperlink"/>
@@ -1009,7 +1077,7 @@
             <w:noProof/>
             <w:webHidden/>
           </w:rPr>
-          <w:instrText xml:space="preserve"> PAGEREF _Toc241585080 \h </w:instrText>
+          <w:instrText xml:space="preserve"> PAGEREF _Toc241586177 \h </w:instrText>
         </w:r>
         <w:r>
           <w:rPr>
@@ -1029,7 +1097,7 @@
             <w:noProof/>
             <w:webHidden/>
           </w:rPr>
-          <w:t>8</w:t>
+          <w:t>9</w:t>
         </w:r>
         <w:r>
           <w:rPr>
@@ -1050,7 +1118,7 @@
           <w:noProof/>
         </w:rPr>
       </w:pPr>
-      <w:hyperlink w:anchor="_Toc241585081" w:history="1">
+      <w:hyperlink w:anchor="_Toc241586178" w:history="1">
         <w:r>
           <w:rPr>
             <w:rStyle w:val="Hyperlink"/>
@@ -1077,7 +1145,7 @@
             <w:noProof/>
             <w:webHidden/>
           </w:rPr>
-          <w:instrText xml:space="preserve"> PAGEREF _Toc241585081 \h </w:instrText>
+          <w:instrText xml:space="preserve"> PAGEREF _Toc241586178 \h </w:instrText>
         </w:r>
         <w:r>
           <w:rPr>
@@ -1097,7 +1165,7 @@
             <w:noProof/>
             <w:webHidden/>
           </w:rPr>
-          <w:t>8</w:t>
+          <w:t>9</w:t>
         </w:r>
         <w:r>
           <w:rPr>
@@ -1118,7 +1186,7 @@
           <w:noProof/>
         </w:rPr>
       </w:pPr>
-      <w:hyperlink w:anchor="_Toc241585082" w:history="1">
+      <w:hyperlink w:anchor="_Toc241586179" w:history="1">
         <w:r>
           <w:rPr>
             <w:rStyle w:val="Hyperlink"/>
@@ -1145,7 +1213,7 @@
             <w:noProof/>
             <w:webHidden/>
           </w:rPr>
-          <w:instrText xml:space="preserve"> PAGEREF _Toc241585082 \h </w:instrText>
+          <w:instrText xml:space="preserve"> PAGEREF _Toc241586179 \h </w:instrText>
         </w:r>
         <w:r>
           <w:rPr>
@@ -1165,7 +1233,7 @@
             <w:noProof/>
             <w:webHidden/>
           </w:rPr>
-          <w:t>8</w:t>
+          <w:t>9</w:t>
         </w:r>
         <w:r>
           <w:rPr>
@@ -1186,7 +1254,7 @@
           <w:noProof/>
         </w:rPr>
       </w:pPr>
-      <w:hyperlink w:anchor="_Toc241585083" w:history="1">
+      <w:hyperlink w:anchor="_Toc241586180" w:history="1">
         <w:r>
           <w:rPr>
             <w:rStyle w:val="Hyperlink"/>
@@ -1213,7 +1281,7 @@
             <w:noProof/>
             <w:webHidden/>
           </w:rPr>
-          <w:instrText xml:space="preserve"> PAGEREF _Toc241585083 \h </w:instrText>
+          <w:instrText xml:space="preserve"> PAGEREF _Toc241586180 \h </w:instrText>
         </w:r>
         <w:r>
           <w:rPr>
@@ -1233,7 +1301,7 @@
             <w:noProof/>
             <w:webHidden/>
           </w:rPr>
-          <w:t>9</w:t>
+          <w:t>10</w:t>
         </w:r>
         <w:r>
           <w:rPr>
@@ -1254,7 +1322,7 @@
           <w:noProof/>
         </w:rPr>
       </w:pPr>
-      <w:hyperlink w:anchor="_Toc241585084" w:history="1">
+      <w:hyperlink w:anchor="_Toc241586181" w:history="1">
         <w:r>
           <w:rPr>
             <w:rStyle w:val="Hyperlink"/>
@@ -1281,7 +1349,7 @@
             <w:noProof/>
             <w:webHidden/>
           </w:rPr>
-          <w:instrText xml:space="preserve"> PAGEREF _Toc241585084 \h </w:instrText>
+          <w:instrText xml:space="preserve"> PAGEREF _Toc241586181 \h </w:instrText>
         </w:r>
         <w:r>
           <w:rPr>
@@ -1301,7 +1369,7 @@
             <w:noProof/>
             <w:webHidden/>
           </w:rPr>
-          <w:t>9</w:t>
+          <w:t>10</w:t>
         </w:r>
         <w:r>
           <w:rPr>
@@ -1322,7 +1390,7 @@
           <w:noProof/>
         </w:rPr>
       </w:pPr>
-      <w:hyperlink w:anchor="_Toc241585085" w:history="1">
+      <w:hyperlink w:anchor="_Toc241586182" w:history="1">
         <w:r>
           <w:rPr>
             <w:rStyle w:val="Hyperlink"/>
@@ -1349,7 +1417,7 @@
             <w:noProof/>
             <w:webHidden/>
           </w:rPr>
-          <w:instrText xml:space="preserve"> PAGEREF _Toc241585085 \h </w:instrText>
+          <w:instrText xml:space="preserve"> PAGEREF _Toc241586182 \h </w:instrText>
         </w:r>
         <w:r>
           <w:rPr>
@@ -1369,7 +1437,7 @@
             <w:noProof/>
             <w:webHidden/>
           </w:rPr>
-          <w:t>10</w:t>
+          <w:t>11</w:t>
         </w:r>
         <w:r>
           <w:rPr>
@@ -1390,7 +1458,7 @@
           <w:noProof/>
         </w:rPr>
       </w:pPr>
-      <w:hyperlink w:anchor="_Toc241585086" w:history="1">
+      <w:hyperlink w:anchor="_Toc241586183" w:history="1">
         <w:r>
           <w:rPr>
             <w:rStyle w:val="Hyperlink"/>
@@ -1417,7 +1485,7 @@
             <w:noProof/>
             <w:webHidden/>
           </w:rPr>
-          <w:instrText xml:space="preserve"> PAGEREF _Toc241585086 \h </w:instrText>
+          <w:instrText xml:space="preserve"> PAGEREF _Toc241586183 \h </w:instrText>
         </w:r>
         <w:r>
           <w:rPr>
@@ -1437,7 +1505,7 @@
             <w:noProof/>
             <w:webHidden/>
           </w:rPr>
-          <w:t>10</w:t>
+          <w:t>11</w:t>
         </w:r>
         <w:r>
           <w:rPr>
@@ -1458,7 +1526,7 @@
           <w:noProof/>
         </w:rPr>
       </w:pPr>
-      <w:hyperlink w:anchor="_Toc241585087" w:history="1">
+      <w:hyperlink w:anchor="_Toc241586184" w:history="1">
         <w:r>
           <w:rPr>
             <w:rStyle w:val="Hyperlink"/>
@@ -1485,7 +1553,7 @@
             <w:noProof/>
             <w:webHidden/>
           </w:rPr>
-          <w:instrText xml:space="preserve"> PAGEREF _Toc241585087 \h </w:instrText>
+          <w:instrText xml:space="preserve"> PAGEREF _Toc241586184 \h </w:instrText>
         </w:r>
         <w:r>
           <w:rPr>
@@ -1505,7 +1573,7 @@
             <w:noProof/>
             <w:webHidden/>
           </w:rPr>
-          <w:t>11</w:t>
+          <w:t>12</w:t>
         </w:r>
         <w:r>
           <w:rPr>
@@ -1526,7 +1594,7 @@
           <w:noProof/>
         </w:rPr>
       </w:pPr>
-      <w:hyperlink w:anchor="_Toc241585088" w:history="1">
+      <w:hyperlink w:anchor="_Toc241586185" w:history="1">
         <w:r>
           <w:rPr>
             <w:rStyle w:val="Hyperlink"/>
@@ -1553,7 +1621,7 @@
             <w:noProof/>
             <w:webHidden/>
           </w:rPr>
-          <w:instrText xml:space="preserve"> PAGEREF _Toc241585088 \h </w:instrText>
+          <w:instrText xml:space="preserve"> PAGEREF _Toc241586185 \h </w:instrText>
         </w:r>
         <w:r>
           <w:rPr>
@@ -1573,7 +1641,7 @@
             <w:noProof/>
             <w:webHidden/>
           </w:rPr>
-          <w:t>11</w:t>
+          <w:t>12</w:t>
         </w:r>
         <w:r>
           <w:rPr>
@@ -1594,7 +1662,7 @@
           <w:noProof/>
         </w:rPr>
       </w:pPr>
-      <w:hyperlink w:anchor="_Toc241585089" w:history="1">
+      <w:hyperlink w:anchor="_Toc241586186" w:history="1">
         <w:r>
           <w:rPr>
             <w:rStyle w:val="Hyperlink"/>
@@ -1621,7 +1689,7 @@
             <w:noProof/>
             <w:webHidden/>
           </w:rPr>
-          <w:instrText xml:space="preserve"> PAGEREF _Toc241585089 \h </w:instrText>
+          <w:instrText xml:space="preserve"> PAGEREF _Toc241586186 \h </w:instrText>
         </w:r>
         <w:r>
           <w:rPr>
@@ -1641,7 +1709,7 @@
             <w:noProof/>
             <w:webHidden/>
           </w:rPr>
-          <w:t>11</w:t>
+          <w:t>12</w:t>
         </w:r>
         <w:r>
           <w:rPr>
@@ -1662,7 +1730,7 @@
           <w:noProof/>
         </w:rPr>
       </w:pPr>
-      <w:hyperlink w:anchor="_Toc241585090" w:history="1">
+      <w:hyperlink w:anchor="_Toc241586187" w:history="1">
         <w:r>
           <w:rPr>
             <w:rStyle w:val="Hyperlink"/>
@@ -1689,7 +1757,7 @@
             <w:noProof/>
             <w:webHidden/>
           </w:rPr>
-          <w:instrText xml:space="preserve"> PAGEREF _Toc241585090 \h </w:instrText>
+          <w:instrText xml:space="preserve"> PAGEREF _Toc241586187 \h </w:instrText>
         </w:r>
         <w:r>
           <w:rPr>
@@ -1709,7 +1777,7 @@
             <w:noProof/>
             <w:webHidden/>
           </w:rPr>
-          <w:t>11</w:t>
+          <w:t>12</w:t>
         </w:r>
         <w:r>
           <w:rPr>
@@ -1730,7 +1798,7 @@
           <w:noProof/>
         </w:rPr>
       </w:pPr>
-      <w:hyperlink w:anchor="_Toc241585091" w:history="1">
+      <w:hyperlink w:anchor="_Toc241586188" w:history="1">
         <w:r>
           <w:rPr>
             <w:rStyle w:val="Hyperlink"/>
@@ -1757,7 +1825,7 @@
             <w:noProof/>
             <w:webHidden/>
           </w:rPr>
-          <w:instrText xml:space="preserve"> PAGEREF _Toc241585091 \h </w:instrText>
+          <w:instrText xml:space="preserve"> PAGEREF _Toc241586188 \h </w:instrText>
         </w:r>
         <w:r>
           <w:rPr>
@@ -1777,7 +1845,7 @@
             <w:noProof/>
             <w:webHidden/>
           </w:rPr>
-          <w:t>12</w:t>
+          <w:t>13</w:t>
         </w:r>
         <w:r>
           <w:rPr>
@@ -1798,7 +1866,7 @@
           <w:noProof/>
         </w:rPr>
       </w:pPr>
-      <w:hyperlink w:anchor="_Toc241585092" w:history="1">
+      <w:hyperlink w:anchor="_Toc241586189" w:history="1">
         <w:r>
           <w:rPr>
             <w:rStyle w:val="Hyperlink"/>
@@ -1825,7 +1893,7 @@
             <w:noProof/>
             <w:webHidden/>
           </w:rPr>
-          <w:instrText xml:space="preserve"> PAGEREF _Toc241585092 \h </w:instrText>
+          <w:instrText xml:space="preserve"> PAGEREF _Toc241586189 \h </w:instrText>
         </w:r>
         <w:r>
           <w:rPr>
@@ -1845,7 +1913,7 @@
             <w:noProof/>
             <w:webHidden/>
           </w:rPr>
-          <w:t>13</w:t>
+          <w:t>14</w:t>
         </w:r>
         <w:r>
           <w:rPr>
@@ -1866,7 +1934,7 @@
           <w:noProof/>
         </w:rPr>
       </w:pPr>
-      <w:hyperlink w:anchor="_Toc241585093" w:history="1">
+      <w:hyperlink w:anchor="_Toc241586190" w:history="1">
         <w:r>
           <w:rPr>
             <w:rStyle w:val="Hyperlink"/>
@@ -1893,7 +1961,7 @@
             <w:noProof/>
             <w:webHidden/>
           </w:rPr>
-          <w:instrText xml:space="preserve"> PAGEREF _Toc241585093 \h </w:instrText>
+          <w:instrText xml:space="preserve"> PAGEREF _Toc241586190 \h </w:instrText>
         </w:r>
         <w:r>
           <w:rPr>
@@ -1913,7 +1981,7 @@
             <w:noProof/>
             <w:webHidden/>
           </w:rPr>
-          <w:t>13</w:t>
+          <w:t>14</w:t>
         </w:r>
         <w:r>
           <w:rPr>
@@ -1934,7 +2002,7 @@
           <w:noProof/>
         </w:rPr>
       </w:pPr>
-      <w:hyperlink w:anchor="_Toc241585094" w:history="1">
+      <w:hyperlink w:anchor="_Toc241586191" w:history="1">
         <w:r>
           <w:rPr>
             <w:rStyle w:val="Hyperlink"/>
@@ -1961,7 +2029,7 @@
             <w:noProof/>
             <w:webHidden/>
           </w:rPr>
-          <w:instrText xml:space="preserve"> PAGEREF _Toc241585094 \h </w:instrText>
+          <w:instrText xml:space="preserve"> PAGEREF _Toc241586191 \h </w:instrText>
         </w:r>
         <w:r>
           <w:rPr>
@@ -1981,7 +2049,7 @@
             <w:noProof/>
             <w:webHidden/>
           </w:rPr>
-          <w:t>14</w:t>
+          <w:t>15</w:t>
         </w:r>
         <w:r>
           <w:rPr>
@@ -2002,7 +2070,7 @@
           <w:noProof/>
         </w:rPr>
       </w:pPr>
-      <w:hyperlink w:anchor="_Toc241585095" w:history="1">
+      <w:hyperlink w:anchor="_Toc241586192" w:history="1">
         <w:r>
           <w:rPr>
             <w:rStyle w:val="Hyperlink"/>
@@ -2029,7 +2097,7 @@
             <w:noProof/>
             <w:webHidden/>
           </w:rPr>
-          <w:instrText xml:space="preserve"> PAGEREF _Toc241585095 \h </w:instrText>
+          <w:instrText xml:space="preserve"> PAGEREF _Toc241586192 \h </w:instrText>
         </w:r>
         <w:r>
           <w:rPr>
@@ -2049,7 +2117,7 @@
             <w:noProof/>
             <w:webHidden/>
           </w:rPr>
-          <w:t>14</w:t>
+          <w:t>15</w:t>
         </w:r>
         <w:r>
           <w:rPr>
@@ -2070,7 +2138,7 @@
           <w:noProof/>
         </w:rPr>
       </w:pPr>
-      <w:hyperlink w:anchor="_Toc241585096" w:history="1">
+      <w:hyperlink w:anchor="_Toc241586193" w:history="1">
         <w:r>
           <w:rPr>
             <w:rStyle w:val="Hyperlink"/>
@@ -2097,7 +2165,7 @@
             <w:noProof/>
             <w:webHidden/>
           </w:rPr>
-          <w:instrText xml:space="preserve"> PAGEREF _Toc241585096 \h </w:instrText>
+          <w:instrText xml:space="preserve"> PAGEREF _Toc241586193 \h </w:instrText>
         </w:r>
         <w:r>
           <w:rPr>
@@ -2117,7 +2185,7 @@
             <w:noProof/>
             <w:webHidden/>
           </w:rPr>
-          <w:t>14</w:t>
+          <w:t>15</w:t>
         </w:r>
         <w:r>
           <w:rPr>
@@ -2138,7 +2206,7 @@
           <w:noProof/>
         </w:rPr>
       </w:pPr>
-      <w:hyperlink w:anchor="_Toc241585097" w:history="1">
+      <w:hyperlink w:anchor="_Toc241586194" w:history="1">
         <w:r>
           <w:rPr>
             <w:rStyle w:val="Hyperlink"/>
@@ -2165,7 +2233,7 @@
             <w:noProof/>
             <w:webHidden/>
           </w:rPr>
-          <w:instrText xml:space="preserve"> PAGEREF _Toc241585097 \h </w:instrText>
+          <w:instrText xml:space="preserve"> PAGEREF _Toc241586194 \h </w:instrText>
         </w:r>
         <w:r>
           <w:rPr>
@@ -2185,7 +2253,7 @@
             <w:noProof/>
             <w:webHidden/>
           </w:rPr>
-          <w:t>15</w:t>
+          <w:t>16</w:t>
         </w:r>
         <w:r>
           <w:rPr>
@@ -2206,7 +2274,7 @@
           <w:noProof/>
         </w:rPr>
       </w:pPr>
-      <w:hyperlink w:anchor="_Toc241585098" w:history="1">
+      <w:hyperlink w:anchor="_Toc241586195" w:history="1">
         <w:r>
           <w:rPr>
             <w:rStyle w:val="Hyperlink"/>
@@ -2233,7 +2301,7 @@
             <w:noProof/>
             <w:webHidden/>
           </w:rPr>
-          <w:instrText xml:space="preserve"> PAGEREF _Toc241585098 \h </w:instrText>
+          <w:instrText xml:space="preserve"> PAGEREF _Toc241586195 \h </w:instrText>
         </w:r>
         <w:r>
           <w:rPr>
@@ -2253,7 +2321,7 @@
             <w:noProof/>
             <w:webHidden/>
           </w:rPr>
-          <w:t>15</w:t>
+          <w:t>16</w:t>
         </w:r>
         <w:r>
           <w:rPr>
@@ -2274,7 +2342,7 @@
           <w:noProof/>
         </w:rPr>
       </w:pPr>
-      <w:hyperlink w:anchor="_Toc241585099" w:history="1">
+      <w:hyperlink w:anchor="_Toc241586196" w:history="1">
         <w:r>
           <w:rPr>
             <w:rStyle w:val="Hyperlink"/>
@@ -2301,7 +2369,7 @@
             <w:noProof/>
             <w:webHidden/>
           </w:rPr>
-          <w:instrText xml:space="preserve"> PAGEREF _Toc241585099 \h </w:instrText>
+          <w:instrText xml:space="preserve"> PAGEREF _Toc241586196 \h </w:instrText>
         </w:r>
         <w:r>
           <w:rPr>
@@ -2321,7 +2389,7 @@
             <w:noProof/>
             <w:webHidden/>
           </w:rPr>
-          <w:t>15</w:t>
+          <w:t>16</w:t>
         </w:r>
         <w:r>
           <w:rPr>
@@ -2342,7 +2410,7 @@
           <w:noProof/>
         </w:rPr>
       </w:pPr>
-      <w:hyperlink w:anchor="_Toc241585100" w:history="1">
+      <w:hyperlink w:anchor="_Toc241586197" w:history="1">
         <w:r>
           <w:rPr>
             <w:rStyle w:val="Hyperlink"/>
@@ -2369,7 +2437,7 @@
             <w:noProof/>
             <w:webHidden/>
           </w:rPr>
-          <w:instrText xml:space="preserve"> PAGEREF _Toc241585100 \h </w:instrText>
+          <w:instrText xml:space="preserve"> PAGEREF _Toc241586197 \h </w:instrText>
         </w:r>
         <w:r>
           <w:rPr>
@@ -2389,7 +2457,7 @@
             <w:noProof/>
             <w:webHidden/>
           </w:rPr>
-          <w:t>15</w:t>
+          <w:t>16</w:t>
         </w:r>
         <w:r>
           <w:rPr>
@@ -2410,7 +2478,7 @@
           <w:noProof/>
         </w:rPr>
       </w:pPr>
-      <w:hyperlink w:anchor="_Toc241585101" w:history="1">
+      <w:hyperlink w:anchor="_Toc241586198" w:history="1">
         <w:r>
           <w:rPr>
             <w:rStyle w:val="Hyperlink"/>
@@ -2437,7 +2505,7 @@
             <w:noProof/>
             <w:webHidden/>
           </w:rPr>
-          <w:instrText xml:space="preserve"> PAGEREF _Toc241585101 \h </w:instrText>
+          <w:instrText xml:space="preserve"> PAGEREF _Toc241586198 \h </w:instrText>
         </w:r>
         <w:r>
           <w:rPr>
@@ -2457,7 +2525,7 @@
             <w:noProof/>
             <w:webHidden/>
           </w:rPr>
-          <w:t>16</w:t>
+          <w:t>17</w:t>
         </w:r>
         <w:r>
           <w:rPr>
@@ -2478,7 +2546,7 @@
           <w:noProof/>
         </w:rPr>
       </w:pPr>
-      <w:hyperlink w:anchor="_Toc241585102" w:history="1">
+      <w:hyperlink w:anchor="_Toc241586199" w:history="1">
         <w:r>
           <w:rPr>
             <w:rStyle w:val="Hyperlink"/>
@@ -2505,7 +2573,7 @@
             <w:noProof/>
             <w:webHidden/>
           </w:rPr>
-          <w:instrText xml:space="preserve"> PAGEREF _Toc241585102 \h </w:instrText>
+          <w:instrText xml:space="preserve"> PAGEREF _Toc241586199 \h </w:instrText>
         </w:r>
         <w:r>
           <w:rPr>
@@ -2525,7 +2593,7 @@
             <w:noProof/>
             <w:webHidden/>
           </w:rPr>
-          <w:t>16</w:t>
+          <w:t>17</w:t>
         </w:r>
         <w:r>
           <w:rPr>
@@ -2546,7 +2614,7 @@
           <w:noProof/>
         </w:rPr>
       </w:pPr>
-      <w:hyperlink w:anchor="_Toc241585103" w:history="1">
+      <w:hyperlink w:anchor="_Toc241586200" w:history="1">
         <w:r>
           <w:rPr>
             <w:rStyle w:val="Hyperlink"/>
@@ -2573,7 +2641,7 @@
             <w:noProof/>
             <w:webHidden/>
           </w:rPr>
-          <w:instrText xml:space="preserve"> PAGEREF _Toc241585103 \h </w:instrText>
+          <w:instrText xml:space="preserve"> PAGEREF _Toc241586200 \h </w:instrText>
         </w:r>
         <w:r>
           <w:rPr>
@@ -2593,7 +2661,7 @@
             <w:noProof/>
             <w:webHidden/>
           </w:rPr>
-          <w:t>17</w:t>
+          <w:t>18</w:t>
         </w:r>
         <w:r>
           <w:rPr>
@@ -2621,7 +2689,7 @@
       <w:pPr>
         <w:pStyle w:val="Heading1"/>
       </w:pPr>
-      <w:bookmarkStart w:id="0" w:name="_Toc241585070"/>
+      <w:bookmarkStart w:id="0" w:name="_Toc241586166"/>
       <w:r>
         <w:lastRenderedPageBreak/>
         <w:t>Case details</w:t>
@@ -3030,14 +3098,14 @@
     <w:p/>
     <w:p>
       <w:r>
-        <w:t>Section 1 is the case. Section 2 is how we examined a rebuilt copy of the server. Section 3 works through the thirteen activities on the IA2 activity sheet. Section 4 assesses the same facts under Indian law. The final findings, limitations and sources follow. The full demonstration is in the video presentation.</w:t>
+        <w:t>Section 1 tells the case. Section 2 covers how we examined a rebuilt copy of the server. Section 3 works through the thirteen activities on the IA2 activity sheet. Section 4 assesses the same facts under Indian law. The final findings, limitations and sources follow. The full demonstration is in the video presentation.</w:t>
       </w:r>
     </w:p>
     <w:p>
       <w:pPr>
         <w:pStyle w:val="Heading1"/>
       </w:pPr>
-      <w:bookmarkStart w:id="1" w:name="_Toc241585071"/>
+      <w:bookmarkStart w:id="1" w:name="_Toc241586167"/>
       <w:r>
         <w:t>1. The case: the Equifax breach of 2017</w:t>
       </w:r>
@@ -3047,23 +3115,64 @@
       <w:pPr>
         <w:pStyle w:val="Heading2"/>
       </w:pPr>
-      <w:bookmarkStart w:id="2" w:name="_Toc241585072"/>
+      <w:bookmarkStart w:id="2" w:name="_Toc241586168"/>
       <w:r>
-        <w:t>1.1 What happened</w:t>
+        <w:t>1.1 Who Equifax is</w:t>
       </w:r>
       <w:bookmarkEnd w:id="2"/>
     </w:p>
     <w:p>
       <w:r>
-        <w:t>Equifax is one of the three big United States credit bureaus. It holds loan and repayment records, including names, dates of birth, addresses and Social Security numbers, on people who never signed up with it. In 2017 its online dispute portal, ACIS (Automated Consumer Interview System), was built on Apache Struts, a Java web framework.</w:t>
+        <w:t>Equifax is one of the three big credit bureaus in the United States, with Experian and TransUnion. Banks send it records of people's loans and repayments, and it sells credit reports and scores back to lenders who are deciding whether to lend. The people in those records never signed up with Equifax and cannot take themselves out. In the US the records hold Social Security numbers, the number that stands in for a person's whole financial identity, along with names, dates of birth and addresses.</w:t>
+      </w:r>
+    </w:p>
+    <w:p>
+      <w:pPr>
+        <w:pStyle w:val="Heading2"/>
+      </w:pPr>
+      <w:bookmarkStart w:id="3" w:name="_Toc241586169"/>
+      <w:r>
+        <w:t>1.2 How the attack unfolded</w:t>
+      </w:r>
+      <w:bookmarkEnd w:id="3"/>
+    </w:p>
+    <w:p>
+      <w:r>
+        <w:t>The way in was Apache Struts, a free Java framework that companies use to build web applications. Equifax's dispute portal, ACIS (Automated Consumer Interview System), was built on it. ACIS is where people challenged mistakes in their credit files and uploaded documents to back up the challenge.</w:t>
       </w:r>
     </w:p>
     <w:p>
       <w:r>
-        <w:t>On 7 March 2017 the Apache team announced a flaw in Struts, CVE-2017-5638, and released a fix the same day. The flaw was in the Jakarta Multipart parser, which handles file uploads: a malformed Content-Type header was evaluated as an OGNL expression, so an attacker with no account could run commands on the server. It scores 9.8 out of 10 on CVSS, the standard severity scale. Equifax did not patch its dispute portal. Attackers used the flaw on 13 May 2017, 67 days after the fix was public, and were not detec</w:t>
+        <w:t>On 7 March 2017 the Apache team announced a flaw in Struts, CVE-2017-5638, and released a fixed version the same day. The flaw was in the part that handles file uploads. A web request carries a header called Content-Type that says what kind of data is attached. If that header was malformed, Struts tried to run it as a command instead of reading it as text. So anyone on the internet could put a command in that header and the server would run it, with no account and no password. That is remote code execution,</w:t>
       </w:r>
       <w:r>
-        <w:t>ted for 76 days.</w:t>
+        <w:t xml:space="preserve"> the worst kind of flaw, and it scored 9.8 out of 10 on the standard severity scale.</w:t>
+      </w:r>
+    </w:p>
+    <w:p>
+      <w:r>
+        <w:t>The next day, 8 March, the US government's cyber team warned Equifax to patch. On 9 March Equifax sent its own alert to about 430 staff and mailing lists, telling them to patch within 48 hours. The list was out of date, and the people who ran the dispute portal never got it. On 15 March a scan of 958 internet-facing servers was meant to catch anything still unpatched. It missed the portal.</w:t>
+      </w:r>
+    </w:p>
+    <w:p>
+      <w:r>
+        <w:t>The fix was out, the warnings had gone round, and the server stayed vulnerable. On 13 May 2017 attackers used the flaw to get in, 67 days after the fix had been public.</w:t>
+      </w:r>
+    </w:p>
+    <w:p>
+      <w:r>
+        <w:t>Once inside, they set up about 30 web shells, small hidden scripts that kept them in control. On a shared drive they found a configuration file with a database username and password in plain text. The portal needed three databases to do its job, but nothing stopped it reaching further, and those credentials opened 48 more. Over the next weeks the attackers ran about 9,000 database queries. 265 of them returned personal data, which they compressed and carried out in small pieces that looked like ordinary web</w:t>
+      </w:r>
+      <w:r>
+        <w:t xml:space="preserve"> traffic.</w:t>
+      </w:r>
+    </w:p>
+    <w:p>
+      <w:r>
+        <w:t>They went unnoticed for 76 days. The device that was meant to inspect the portal's traffic had a certificate that had expired, so for months it could not read that traffic at all. On 29 July, during routine maintenance, staff renewed the certificate. Inspection came back and the suspicious traffic showed up almost at once. Equifax shut the portal down the next day, 30 July, brought in the security firm Mandiant and told the FBI on 2 August, then announced the breach to the public on 7 September, 40 days aft</w:t>
+      </w:r>
+      <w:r>
+        <w:t>er it was first spotted.</w:t>
       </w:r>
     </w:p>
     <w:tbl>
@@ -3753,11 +3862,11 @@
       <w:pPr>
         <w:pStyle w:val="Heading2"/>
       </w:pPr>
-      <w:bookmarkStart w:id="3" w:name="_Toc241585073"/>
+      <w:bookmarkStart w:id="4" w:name="_Toc241586170"/>
       <w:r>
-        <w:t>1.2 Why it was not stopped</w:t>
+        <w:t>1.3 Why it was not stopped</w:t>
       </w:r>
-      <w:bookmarkEnd w:id="3"/>
+      <w:bookmarkEnd w:id="4"/>
     </w:p>
     <w:p>
       <w:r>
@@ -4042,11 +4151,11 @@
       <w:pPr>
         <w:pStyle w:val="Heading2"/>
       </w:pPr>
-      <w:bookmarkStart w:id="4" w:name="_Toc241585074"/>
+      <w:bookmarkStart w:id="5" w:name="_Toc241586171"/>
       <w:r>
-        <w:t>1.3 What was taken</w:t>
+        <w:t>1.4 What was taken</w:t>
       </w:r>
-      <w:bookmarkEnd w:id="4"/>
+      <w:bookmarkEnd w:id="5"/>
     </w:p>
     <w:p>
       <w:r>
@@ -4060,11 +4169,11 @@
       <w:pPr>
         <w:pStyle w:val="Heading2"/>
       </w:pPr>
-      <w:bookmarkStart w:id="5" w:name="_Toc241585075"/>
+      <w:bookmarkStart w:id="6" w:name="_Toc241586172"/>
       <w:r>
-        <w:t>1.4 The question this report asks</w:t>
+        <w:t>1.5 The question this report asks</w:t>
       </w:r>
-      <w:bookmarkEnd w:id="5"/>
+      <w:bookmarkEnd w:id="6"/>
     </w:p>
     <w:p>
       <w:r>
@@ -4075,25 +4184,25 @@
       <w:pPr>
         <w:pStyle w:val="Heading1"/>
       </w:pPr>
-      <w:bookmarkStart w:id="6" w:name="_Toc241585076"/>
+      <w:bookmarkStart w:id="7" w:name="_Toc241586173"/>
       <w:r>
         <w:t>2. Methodology</w:t>
       </w:r>
-      <w:bookmarkEnd w:id="6"/>
+      <w:bookmarkEnd w:id="7"/>
     </w:p>
     <w:p>
       <w:pPr>
         <w:pStyle w:val="Heading2"/>
       </w:pPr>
-      <w:bookmarkStart w:id="7" w:name="_Toc241585077"/>
+      <w:bookmarkStart w:id="8" w:name="_Toc241586174"/>
       <w:r>
         <w:t>2.1 Tool and evidence</w:t>
       </w:r>
-      <w:bookmarkEnd w:id="7"/>
+      <w:bookmarkEnd w:id="8"/>
     </w:p>
     <w:p>
       <w:r>
-        <w:t>The breach came down to one vulnerable software component that nobody had patched. Trivy is a scanner built for exactly that: it reads a system's files without running them, names each software component and version, and matches them against public vulnerability databases. It also searches files for passwords and keys, checks configuration for unsafe settings, and writes a list of the software present. That lets us rebuild a version of the Equifax server and show each failure from section 1.2 on real softwa</w:t>
+        <w:t>The breach came down to one vulnerable software component that nobody had patched. Trivy is a scanner built for exactly that: it reads a system's files without running them, names each software component and version, and matches them against public vulnerability databases. It also searches files for passwords and keys, checks configuration for unsafe settings, and writes a list of the software present. That lets us rebuild a version of the Equifax server and show each failure from section 1.3 on real softwa</w:t>
       </w:r>
       <w:r>
         <w:t>re, found by a real tool. Trivy is free and scripted, so anyone can repeat the examination and check the results.</w:t>
@@ -4471,11 +4580,11 @@
       <w:pPr>
         <w:pStyle w:val="Heading2"/>
       </w:pPr>
-      <w:bookmarkStart w:id="8" w:name="_Toc241585078"/>
+      <w:bookmarkStart w:id="9" w:name="_Toc241586175"/>
       <w:r>
         <w:t>2.2 The examination</w:t>
       </w:r>
-      <w:bookmarkEnd w:id="8"/>
+      <w:bookmarkEnd w:id="9"/>
     </w:p>
     <w:p>
       <w:r>
@@ -5234,11 +5343,11 @@
       <w:pPr>
         <w:pStyle w:val="Heading2"/>
       </w:pPr>
-      <w:bookmarkStart w:id="9" w:name="_Toc241585079"/>
+      <w:bookmarkStart w:id="10" w:name="_Toc241586176"/>
       <w:r>
         <w:t>2.3 Evidence log and chain of custody</w:t>
       </w:r>
-      <w:bookmarkEnd w:id="9"/>
+      <w:bookmarkEnd w:id="10"/>
     </w:p>
     <w:tbl>
       <w:tblPr>
@@ -5512,11 +5621,11 @@
       <w:pPr>
         <w:pStyle w:val="Heading2"/>
       </w:pPr>
-      <w:bookmarkStart w:id="10" w:name="_Toc241585080"/>
+      <w:bookmarkStart w:id="11" w:name="_Toc241586177"/>
       <w:r>
         <w:t>2.4 Evidence and assumptions</w:t>
       </w:r>
-      <w:bookmarkEnd w:id="10"/>
+      <w:bookmarkEnd w:id="11"/>
     </w:p>
     <w:tbl>
       <w:tblPr>
@@ -5796,21 +5905,21 @@
       <w:pPr>
         <w:pStyle w:val="Heading1"/>
       </w:pPr>
-      <w:bookmarkStart w:id="11" w:name="_Toc241585081"/>
+      <w:bookmarkStart w:id="12" w:name="_Toc241586178"/>
       <w:r>
         <w:t>3. Findings: the thirteen activities</w:t>
       </w:r>
-      <w:bookmarkEnd w:id="11"/>
+      <w:bookmarkEnd w:id="12"/>
     </w:p>
     <w:p>
       <w:pPr>
         <w:pStyle w:val="Heading2"/>
       </w:pPr>
-      <w:bookmarkStart w:id="12" w:name="_Toc241585082"/>
+      <w:bookmarkStart w:id="13" w:name="_Toc241586179"/>
       <w:r>
         <w:t>Activity 1: evidence identification</w:t>
       </w:r>
-      <w:bookmarkEnd w:id="12"/>
+      <w:bookmarkEnd w:id="13"/>
     </w:p>
     <w:p>
       <w:pPr>
@@ -5853,11 +5962,11 @@
       <w:pPr>
         <w:pStyle w:val="Heading2"/>
       </w:pPr>
-      <w:bookmarkStart w:id="13" w:name="_Toc241585083"/>
+      <w:bookmarkStart w:id="14" w:name="_Toc241586180"/>
       <w:r>
         <w:t>Activity 2: hash verification</w:t>
       </w:r>
-      <w:bookmarkEnd w:id="13"/>
+      <w:bookmarkEnd w:id="14"/>
     </w:p>
     <w:p>
       <w:r>
@@ -6495,11 +6604,11 @@
       <w:pPr>
         <w:pStyle w:val="Heading2"/>
       </w:pPr>
-      <w:bookmarkStart w:id="14" w:name="_Toc241585084"/>
+      <w:bookmarkStart w:id="15" w:name="_Toc241586181"/>
       <w:r>
         <w:t>Activity 3: creating the case</w:t>
       </w:r>
-      <w:bookmarkEnd w:id="14"/>
+      <w:bookmarkEnd w:id="15"/>
     </w:p>
     <w:p>
       <w:r>
@@ -6510,11 +6619,11 @@
       <w:pPr>
         <w:pStyle w:val="Heading2"/>
       </w:pPr>
-      <w:bookmarkStart w:id="15" w:name="_Toc241585085"/>
+      <w:bookmarkStart w:id="16" w:name="_Toc241586182"/>
       <w:r>
         <w:t>Activity 4: file system examination</w:t>
       </w:r>
-      <w:bookmarkEnd w:id="15"/>
+      <w:bookmarkEnd w:id="16"/>
     </w:p>
     <w:p>
       <w:r>
@@ -6825,11 +6934,11 @@
       <w:pPr>
         <w:pStyle w:val="Heading2"/>
       </w:pPr>
-      <w:bookmarkStart w:id="16" w:name="_Toc241585086"/>
+      <w:bookmarkStart w:id="17" w:name="_Toc241586183"/>
       <w:r>
         <w:t>Activity 5: user accounts</w:t>
       </w:r>
-      <w:bookmarkEnd w:id="16"/>
+      <w:bookmarkEnd w:id="17"/>
     </w:p>
     <w:tbl>
       <w:tblPr>
@@ -7127,11 +7236,11 @@
       <w:pPr>
         <w:pStyle w:val="Heading2"/>
       </w:pPr>
-      <w:bookmarkStart w:id="17" w:name="_Toc241585087"/>
+      <w:bookmarkStart w:id="18" w:name="_Toc241586184"/>
       <w:r>
         <w:t>Activity 6: deleted files</w:t>
       </w:r>
-      <w:bookmarkEnd w:id="17"/>
+      <w:bookmarkEnd w:id="18"/>
     </w:p>
     <w:p>
       <w:r>
@@ -7351,11 +7460,11 @@
       <w:pPr>
         <w:pStyle w:val="Heading2"/>
       </w:pPr>
-      <w:bookmarkStart w:id="18" w:name="_Toc241585088"/>
+      <w:bookmarkStart w:id="19" w:name="_Toc241586185"/>
       <w:r>
         <w:t>Activity 7: metadata examination</w:t>
       </w:r>
-      <w:bookmarkEnd w:id="18"/>
+      <w:bookmarkEnd w:id="19"/>
     </w:p>
     <w:p>
       <w:r>
@@ -7630,11 +7739,11 @@
       <w:pPr>
         <w:pStyle w:val="Heading2"/>
       </w:pPr>
-      <w:bookmarkStart w:id="19" w:name="_Toc241585089"/>
+      <w:bookmarkStart w:id="20" w:name="_Toc241586186"/>
       <w:r>
         <w:t>Activity 8: browser activity</w:t>
       </w:r>
-      <w:bookmarkEnd w:id="19"/>
+      <w:bookmarkEnd w:id="20"/>
     </w:p>
     <w:p>
       <w:r>
@@ -7672,11 +7781,11 @@
       <w:pPr>
         <w:pStyle w:val="Heading2"/>
       </w:pPr>
-      <w:bookmarkStart w:id="20" w:name="_Toc241585090"/>
+      <w:bookmarkStart w:id="21" w:name="_Toc241586187"/>
       <w:r>
         <w:t>Activity 9: keyword search</w:t>
       </w:r>
-      <w:bookmarkEnd w:id="20"/>
+      <w:bookmarkEnd w:id="21"/>
     </w:p>
     <w:p>
       <w:pPr>
@@ -8664,11 +8773,11 @@
       <w:pPr>
         <w:pStyle w:val="Heading2"/>
       </w:pPr>
-      <w:bookmarkStart w:id="21" w:name="_Toc241585091"/>
+      <w:bookmarkStart w:id="22" w:name="_Toc241586188"/>
       <w:r>
         <w:t>Activity 10: file signatures and configuration</w:t>
       </w:r>
-      <w:bookmarkEnd w:id="21"/>
+      <w:bookmarkEnd w:id="22"/>
     </w:p>
     <w:p>
       <w:r>
@@ -9185,11 +9294,11 @@
       <w:pPr>
         <w:pStyle w:val="Heading2"/>
       </w:pPr>
-      <w:bookmarkStart w:id="22" w:name="_Toc241585092"/>
+      <w:bookmarkStart w:id="23" w:name="_Toc241586189"/>
       <w:r>
         <w:t>Activity 11: timeline</w:t>
       </w:r>
-      <w:bookmarkEnd w:id="22"/>
+      <w:bookmarkEnd w:id="23"/>
     </w:p>
     <w:p>
       <w:r>
@@ -9209,11 +9318,11 @@
       <w:pPr>
         <w:pStyle w:val="Heading2"/>
       </w:pPr>
-      <w:bookmarkStart w:id="23" w:name="_Toc241585093"/>
+      <w:bookmarkStart w:id="24" w:name="_Toc241586190"/>
       <w:r>
         <w:t>Activity 12: correlating the evidence</w:t>
       </w:r>
-      <w:bookmarkEnd w:id="23"/>
+      <w:bookmarkEnd w:id="24"/>
     </w:p>
     <w:tbl>
       <w:tblPr>
@@ -9410,11 +9519,11 @@
       <w:pPr>
         <w:pStyle w:val="Heading2"/>
       </w:pPr>
-      <w:bookmarkStart w:id="24" w:name="_Toc241585094"/>
+      <w:bookmarkStart w:id="25" w:name="_Toc241586191"/>
       <w:r>
         <w:t>Activity 13: evidence tagging and exported hashes</w:t>
       </w:r>
-      <w:bookmarkEnd w:id="24"/>
+      <w:bookmarkEnd w:id="25"/>
     </w:p>
     <w:tbl>
       <w:tblPr>
@@ -10602,11 +10711,11 @@
       <w:pPr>
         <w:pStyle w:val="Heading1"/>
       </w:pPr>
-      <w:bookmarkStart w:id="25" w:name="_Toc241585095"/>
+      <w:bookmarkStart w:id="26" w:name="_Toc241586192"/>
       <w:r>
         <w:t>4. The same facts under Indian law</w:t>
       </w:r>
-      <w:bookmarkEnd w:id="25"/>
+      <w:bookmarkEnd w:id="26"/>
     </w:p>
     <w:p>
       <w:r>
@@ -10617,11 +10726,11 @@
       <w:pPr>
         <w:pStyle w:val="Heading2"/>
       </w:pPr>
-      <w:bookmarkStart w:id="26" w:name="_Toc241585096"/>
+      <w:bookmarkStart w:id="27" w:name="_Toc241586193"/>
       <w:r>
         <w:t>4.1 Why Indian law applies</w:t>
       </w:r>
-      <w:bookmarkEnd w:id="26"/>
+      <w:bookmarkEnd w:id="27"/>
     </w:p>
     <w:p>
       <w:r>
@@ -10632,11 +10741,11 @@
       <w:pPr>
         <w:pStyle w:val="Heading2"/>
       </w:pPr>
-      <w:bookmarkStart w:id="27" w:name="_Toc241585097"/>
+      <w:bookmarkStart w:id="28" w:name="_Toc241586194"/>
       <w:r>
         <w:t>4.2 Law in force now</w:t>
       </w:r>
-      <w:bookmarkEnd w:id="27"/>
+      <w:bookmarkEnd w:id="28"/>
     </w:p>
     <w:tbl>
       <w:tblPr>
@@ -10921,11 +11030,11 @@
       <w:pPr>
         <w:pStyle w:val="Heading2"/>
       </w:pPr>
-      <w:bookmarkStart w:id="28" w:name="_Toc241585098"/>
+      <w:bookmarkStart w:id="29" w:name="_Toc241586195"/>
       <w:r>
         <w:t>4.3 From 13 May 2027: the DPDP Act</w:t>
       </w:r>
-      <w:bookmarkEnd w:id="28"/>
+      <w:bookmarkEnd w:id="29"/>
     </w:p>
     <w:p>
       <w:r>
@@ -11144,11 +11253,11 @@
       <w:pPr>
         <w:pStyle w:val="Heading2"/>
       </w:pPr>
-      <w:bookmarkStart w:id="29" w:name="_Toc241585099"/>
+      <w:bookmarkStart w:id="30" w:name="_Toc241586196"/>
       <w:r>
         <w:t>4.4 Reporting and logging deadlines</w:t>
       </w:r>
-      <w:bookmarkEnd w:id="29"/>
+      <w:bookmarkEnd w:id="30"/>
     </w:p>
     <w:tbl>
       <w:tblPr>
@@ -11344,11 +11453,11 @@
       <w:pPr>
         <w:pStyle w:val="Heading2"/>
       </w:pPr>
-      <w:bookmarkStart w:id="30" w:name="_Toc241585100"/>
+      <w:bookmarkStart w:id="31" w:name="_Toc241586197"/>
       <w:r>
         <w:t>4.5 Using this evidence in an Indian court</w:t>
       </w:r>
-      <w:bookmarkEnd w:id="30"/>
+      <w:bookmarkEnd w:id="31"/>
     </w:p>
     <w:p>
       <w:r>
@@ -11359,11 +11468,11 @@
       <w:pPr>
         <w:pStyle w:val="Heading1"/>
       </w:pPr>
-      <w:bookmarkStart w:id="31" w:name="_Toc241585101"/>
+      <w:bookmarkStart w:id="32" w:name="_Toc241586198"/>
       <w:r>
         <w:t>5. Final findings and conclusion</w:t>
       </w:r>
-      <w:bookmarkEnd w:id="31"/>
+      <w:bookmarkEnd w:id="32"/>
     </w:p>
     <w:tbl>
       <w:tblPr>
@@ -11903,11 +12012,11 @@
       <w:pPr>
         <w:pStyle w:val="Heading1"/>
       </w:pPr>
-      <w:bookmarkStart w:id="32" w:name="_Toc241585102"/>
+      <w:bookmarkStart w:id="33" w:name="_Toc241586199"/>
       <w:r>
         <w:t>6. Limitations</w:t>
       </w:r>
-      <w:bookmarkEnd w:id="32"/>
+      <w:bookmarkEnd w:id="33"/>
     </w:p>
     <w:p>
       <w:r>
@@ -11921,11 +12030,11 @@
       <w:pPr>
         <w:pStyle w:val="Heading1"/>
       </w:pPr>
-      <w:bookmarkStart w:id="33" w:name="_Toc241585103"/>
+      <w:bookmarkStart w:id="34" w:name="_Toc241586200"/>
       <w:r>
         <w:t>7. Sources</w:t>
       </w:r>
-      <w:bookmarkEnd w:id="33"/>
+      <w:bookmarkEnd w:id="34"/>
     </w:p>
     <w:p>
       <w:pPr>
@@ -12052,10 +12161,10 @@
         <w:noProof/>
       </w:rPr>
       <w:drawing>
-        <wp:inline distT="0" distB="0" distL="0" distR="0" wp14:anchorId="355DEECA" wp14:editId="6F9E80B0">
+        <wp:inline distT="0" distB="0" distL="0" distR="0" wp14:anchorId="27D25D29" wp14:editId="4C4CC38A">
           <wp:extent cx="5852160" cy="448627"/>
           <wp:effectExtent l="0" t="0" r="0" b="0"/>
-          <wp:docPr id="1837609844" name="Picture 1837609844"/>
+          <wp:docPr id="1661248780" name="Picture 1661248780"/>
           <wp:cNvGraphicFramePr>
             <a:graphicFrameLocks xmlns:a="http://schemas.openxmlformats.org/drawingml/2006/main" noChangeAspect="1"/>
           </wp:cNvGraphicFramePr>
@@ -12138,10 +12247,10 @@
         <w:noProof/>
       </w:rPr>
       <w:drawing>
-        <wp:inline distT="0" distB="0" distL="0" distR="0" wp14:anchorId="2EBBE0D1" wp14:editId="78AC7595">
+        <wp:inline distT="0" distB="0" distL="0" distR="0" wp14:anchorId="37F65036" wp14:editId="7F70019A">
           <wp:extent cx="5852160" cy="448627"/>
           <wp:effectExtent l="0" t="0" r="0" b="0"/>
-          <wp:docPr id="798369318" name="Picture 798369318"/>
+          <wp:docPr id="1963645204" name="Picture 1963645204"/>
           <wp:cNvGraphicFramePr>
             <a:graphicFrameLocks xmlns:a="http://schemas.openxmlformats.org/drawingml/2006/main" noChangeAspect="1"/>
           </wp:cNvGraphicFramePr>
@@ -12214,10 +12323,10 @@
         <w:noProof/>
       </w:rPr>
       <w:drawing>
-        <wp:inline distT="0" distB="0" distL="0" distR="0" wp14:anchorId="4FB03DA4" wp14:editId="37398988">
+        <wp:inline distT="0" distB="0" distL="0" distR="0" wp14:anchorId="11E4733B" wp14:editId="042558F5">
           <wp:extent cx="2377440" cy="700286"/>
           <wp:effectExtent l="0" t="0" r="0" b="0"/>
-          <wp:docPr id="477045740" name="Picture 477045740"/>
+          <wp:docPr id="1593882555" name="Picture 1593882555"/>
           <wp:cNvGraphicFramePr>
             <a:graphicFrameLocks xmlns:a="http://schemas.openxmlformats.org/drawingml/2006/main" noChangeAspect="1"/>
           </wp:cNvGraphicFramePr>
@@ -12437,31 +12546,31 @@
       </w:rPr>
     </w:lvl>
   </w:abstractNum>
-  <w:num w:numId="1" w16cid:durableId="101608895">
+  <w:num w:numId="1" w16cid:durableId="1733846149">
     <w:abstractNumId w:val="8"/>
   </w:num>
-  <w:num w:numId="2" w16cid:durableId="442922697">
+  <w:num w:numId="2" w16cid:durableId="1866477752">
     <w:abstractNumId w:val="6"/>
   </w:num>
-  <w:num w:numId="3" w16cid:durableId="1879782391">
+  <w:num w:numId="3" w16cid:durableId="1945383277">
     <w:abstractNumId w:val="5"/>
   </w:num>
-  <w:num w:numId="4" w16cid:durableId="1253778411">
+  <w:num w:numId="4" w16cid:durableId="1380320683">
     <w:abstractNumId w:val="4"/>
   </w:num>
-  <w:num w:numId="5" w16cid:durableId="962611714">
+  <w:num w:numId="5" w16cid:durableId="1018191138">
     <w:abstractNumId w:val="7"/>
   </w:num>
-  <w:num w:numId="6" w16cid:durableId="301546653">
+  <w:num w:numId="6" w16cid:durableId="1053433331">
     <w:abstractNumId w:val="3"/>
   </w:num>
-  <w:num w:numId="7" w16cid:durableId="610282851">
+  <w:num w:numId="7" w16cid:durableId="1178617621">
     <w:abstractNumId w:val="2"/>
   </w:num>
-  <w:num w:numId="8" w16cid:durableId="222760220">
+  <w:num w:numId="8" w16cid:durableId="2005930857">
     <w:abstractNumId w:val="1"/>
   </w:num>
-  <w:num w:numId="9" w16cid:durableId="461464670">
+  <w:num w:numId="9" w16cid:durableId="718743945">
     <w:abstractNumId w:val="0"/>
   </w:num>
 </w:numbering>
@@ -23851,7 +23960,7 @@
     <w:autoRedefine/>
     <w:uiPriority w:val="39"/>
     <w:unhideWhenUsed/>
-    <w:rsid w:val="00C71CE8"/>
+    <w:rsid w:val="00324F96"/>
     <w:pPr>
       <w:spacing w:after="100"/>
     </w:pPr>
@@ -23863,7 +23972,7 @@
     <w:autoRedefine/>
     <w:uiPriority w:val="39"/>
     <w:unhideWhenUsed/>
-    <w:rsid w:val="00C71CE8"/>
+    <w:rsid w:val="00324F96"/>
     <w:pPr>
       <w:spacing w:after="100"/>
       <w:ind w:left="240"/>
@@ -23874,7 +23983,7 @@
     <w:basedOn w:val="DefaultParagraphFont"/>
     <w:uiPriority w:val="99"/>
     <w:unhideWhenUsed/>
-    <w:rsid w:val="00C71CE8"/>
+    <w:rsid w:val="00324F96"/>
     <w:rPr>
       <w:color w:val="0000FF" w:themeColor="hyperlink"/>
       <w:u w:val="single"/>

</xml_diff>

<commit_message>
add terminal screenshots and apply the review corrections
</commit_message>
<xml_diff>
--- a/report/CSFCL-IA2-2026-005-Forensic-Report.docx
+++ b/report/CSFCL-IA2-2026-005-Forensic-Report.docx
@@ -11,7 +11,7 @@
           <w:noProof/>
         </w:rPr>
         <w:drawing>
-          <wp:inline distT="0" distB="0" distL="0" distR="0" wp14:anchorId="43412B97" wp14:editId="3632131A">
+          <wp:inline distT="0" distB="0" distL="0" distR="0" wp14:anchorId="779D88D3" wp14:editId="7197014F">
             <wp:extent cx="3840480" cy="1131230"/>
             <wp:effectExtent l="0" t="0" r="0" b="0"/>
             <wp:docPr id="1" name="Picture 1"/>
@@ -302,7 +302,7 @@
       <w:r>
         <w:fldChar w:fldCharType="separate"/>
       </w:r>
-      <w:hyperlink w:anchor="_Toc241586166" w:history="1">
+      <w:hyperlink w:anchor="_Toc241587852" w:history="1">
         <w:r>
           <w:rPr>
             <w:rStyle w:val="Hyperlink"/>
@@ -329,7 +329,7 @@
             <w:noProof/>
             <w:webHidden/>
           </w:rPr>
-          <w:instrText xml:space="preserve"> PAGEREF _Toc241586166 \h </w:instrText>
+          <w:instrText xml:space="preserve"> PAGEREF _Toc241587852 \h </w:instrText>
         </w:r>
         <w:r>
           <w:rPr>
@@ -370,7 +370,7 @@
           <w:noProof/>
         </w:rPr>
       </w:pPr>
-      <w:hyperlink w:anchor="_Toc241586167" w:history="1">
+      <w:hyperlink w:anchor="_Toc241587853" w:history="1">
         <w:r>
           <w:rPr>
             <w:rStyle w:val="Hyperlink"/>
@@ -397,7 +397,7 @@
             <w:noProof/>
             <w:webHidden/>
           </w:rPr>
-          <w:instrText xml:space="preserve"> PAGEREF _Toc241586167 \h </w:instrText>
+          <w:instrText xml:space="preserve"> PAGEREF _Toc241587853 \h </w:instrText>
         </w:r>
         <w:r>
           <w:rPr>
@@ -438,7 +438,7 @@
           <w:noProof/>
         </w:rPr>
       </w:pPr>
-      <w:hyperlink w:anchor="_Toc241586168" w:history="1">
+      <w:hyperlink w:anchor="_Toc241587854" w:history="1">
         <w:r>
           <w:rPr>
             <w:rStyle w:val="Hyperlink"/>
@@ -465,7 +465,7 @@
             <w:noProof/>
             <w:webHidden/>
           </w:rPr>
-          <w:instrText xml:space="preserve"> PAGEREF _Toc241586168 \h </w:instrText>
+          <w:instrText xml:space="preserve"> PAGEREF _Toc241587854 \h </w:instrText>
         </w:r>
         <w:r>
           <w:rPr>
@@ -506,7 +506,7 @@
           <w:noProof/>
         </w:rPr>
       </w:pPr>
-      <w:hyperlink w:anchor="_Toc241586169" w:history="1">
+      <w:hyperlink w:anchor="_Toc241587855" w:history="1">
         <w:r>
           <w:rPr>
             <w:rStyle w:val="Hyperlink"/>
@@ -533,7 +533,7 @@
             <w:noProof/>
             <w:webHidden/>
           </w:rPr>
-          <w:instrText xml:space="preserve"> PAGEREF _Toc241586169 \h </w:instrText>
+          <w:instrText xml:space="preserve"> PAGEREF _Toc241587855 \h </w:instrText>
         </w:r>
         <w:r>
           <w:rPr>
@@ -574,7 +574,7 @@
           <w:noProof/>
         </w:rPr>
       </w:pPr>
-      <w:hyperlink w:anchor="_Toc241586170" w:history="1">
+      <w:hyperlink w:anchor="_Toc241587856" w:history="1">
         <w:r>
           <w:rPr>
             <w:rStyle w:val="Hyperlink"/>
@@ -601,7 +601,7 @@
             <w:noProof/>
             <w:webHidden/>
           </w:rPr>
-          <w:instrText xml:space="preserve"> PAGEREF _Toc241586170 \h </w:instrText>
+          <w:instrText xml:space="preserve"> PAGEREF _Toc241587856 \h </w:instrText>
         </w:r>
         <w:r>
           <w:rPr>
@@ -642,7 +642,7 @@
           <w:noProof/>
         </w:rPr>
       </w:pPr>
-      <w:hyperlink w:anchor="_Toc241586171" w:history="1">
+      <w:hyperlink w:anchor="_Toc241587857" w:history="1">
         <w:r>
           <w:rPr>
             <w:rStyle w:val="Hyperlink"/>
@@ -669,7 +669,7 @@
             <w:noProof/>
             <w:webHidden/>
           </w:rPr>
-          <w:instrText xml:space="preserve"> PAGEREF _Toc241586171 \h </w:instrText>
+          <w:instrText xml:space="preserve"> PAGEREF _Toc241587857 \h </w:instrText>
         </w:r>
         <w:r>
           <w:rPr>
@@ -710,7 +710,7 @@
           <w:noProof/>
         </w:rPr>
       </w:pPr>
-      <w:hyperlink w:anchor="_Toc241586172" w:history="1">
+      <w:hyperlink w:anchor="_Toc241587858" w:history="1">
         <w:r>
           <w:rPr>
             <w:rStyle w:val="Hyperlink"/>
@@ -737,7 +737,7 @@
             <w:noProof/>
             <w:webHidden/>
           </w:rPr>
-          <w:instrText xml:space="preserve"> PAGEREF _Toc241586172 \h </w:instrText>
+          <w:instrText xml:space="preserve"> PAGEREF _Toc241587858 \h </w:instrText>
         </w:r>
         <w:r>
           <w:rPr>
@@ -778,7 +778,7 @@
           <w:noProof/>
         </w:rPr>
       </w:pPr>
-      <w:hyperlink w:anchor="_Toc241586173" w:history="1">
+      <w:hyperlink w:anchor="_Toc241587859" w:history="1">
         <w:r>
           <w:rPr>
             <w:rStyle w:val="Hyperlink"/>
@@ -805,7 +805,7 @@
             <w:noProof/>
             <w:webHidden/>
           </w:rPr>
-          <w:instrText xml:space="preserve"> PAGEREF _Toc241586173 \h </w:instrText>
+          <w:instrText xml:space="preserve"> PAGEREF _Toc241587859 \h </w:instrText>
         </w:r>
         <w:r>
           <w:rPr>
@@ -846,7 +846,7 @@
           <w:noProof/>
         </w:rPr>
       </w:pPr>
-      <w:hyperlink w:anchor="_Toc241586174" w:history="1">
+      <w:hyperlink w:anchor="_Toc241587860" w:history="1">
         <w:r>
           <w:rPr>
             <w:rStyle w:val="Hyperlink"/>
@@ -873,7 +873,7 @@
             <w:noProof/>
             <w:webHidden/>
           </w:rPr>
-          <w:instrText xml:space="preserve"> PAGEREF _Toc241586174 \h </w:instrText>
+          <w:instrText xml:space="preserve"> PAGEREF _Toc241587860 \h </w:instrText>
         </w:r>
         <w:r>
           <w:rPr>
@@ -914,7 +914,7 @@
           <w:noProof/>
         </w:rPr>
       </w:pPr>
-      <w:hyperlink w:anchor="_Toc241586175" w:history="1">
+      <w:hyperlink w:anchor="_Toc241587861" w:history="1">
         <w:r>
           <w:rPr>
             <w:rStyle w:val="Hyperlink"/>
@@ -941,7 +941,7 @@
             <w:noProof/>
             <w:webHidden/>
           </w:rPr>
-          <w:instrText xml:space="preserve"> PAGEREF _Toc241586175 \h </w:instrText>
+          <w:instrText xml:space="preserve"> PAGEREF _Toc241587861 \h </w:instrText>
         </w:r>
         <w:r>
           <w:rPr>
@@ -982,7 +982,7 @@
           <w:noProof/>
         </w:rPr>
       </w:pPr>
-      <w:hyperlink w:anchor="_Toc241586176" w:history="1">
+      <w:hyperlink w:anchor="_Toc241587862" w:history="1">
         <w:r>
           <w:rPr>
             <w:rStyle w:val="Hyperlink"/>
@@ -1009,7 +1009,7 @@
             <w:noProof/>
             <w:webHidden/>
           </w:rPr>
-          <w:instrText xml:space="preserve"> PAGEREF _Toc241586176 \h </w:instrText>
+          <w:instrText xml:space="preserve"> PAGEREF _Toc241587862 \h </w:instrText>
         </w:r>
         <w:r>
           <w:rPr>
@@ -1050,7 +1050,7 @@
           <w:noProof/>
         </w:rPr>
       </w:pPr>
-      <w:hyperlink w:anchor="_Toc241586177" w:history="1">
+      <w:hyperlink w:anchor="_Toc241587863" w:history="1">
         <w:r>
           <w:rPr>
             <w:rStyle w:val="Hyperlink"/>
@@ -1077,7 +1077,7 @@
             <w:noProof/>
             <w:webHidden/>
           </w:rPr>
-          <w:instrText xml:space="preserve"> PAGEREF _Toc241586177 \h </w:instrText>
+          <w:instrText xml:space="preserve"> PAGEREF _Toc241587863 \h </w:instrText>
         </w:r>
         <w:r>
           <w:rPr>
@@ -1097,7 +1097,7 @@
             <w:noProof/>
             <w:webHidden/>
           </w:rPr>
-          <w:t>9</w:t>
+          <w:t>10</w:t>
         </w:r>
         <w:r>
           <w:rPr>
@@ -1118,7 +1118,7 @@
           <w:noProof/>
         </w:rPr>
       </w:pPr>
-      <w:hyperlink w:anchor="_Toc241586178" w:history="1">
+      <w:hyperlink w:anchor="_Toc241587864" w:history="1">
         <w:r>
           <w:rPr>
             <w:rStyle w:val="Hyperlink"/>
@@ -1145,7 +1145,7 @@
             <w:noProof/>
             <w:webHidden/>
           </w:rPr>
-          <w:instrText xml:space="preserve"> PAGEREF _Toc241586178 \h </w:instrText>
+          <w:instrText xml:space="preserve"> PAGEREF _Toc241587864 \h </w:instrText>
         </w:r>
         <w:r>
           <w:rPr>
@@ -1165,7 +1165,7 @@
             <w:noProof/>
             <w:webHidden/>
           </w:rPr>
-          <w:t>9</w:t>
+          <w:t>10</w:t>
         </w:r>
         <w:r>
           <w:rPr>
@@ -1186,7 +1186,7 @@
           <w:noProof/>
         </w:rPr>
       </w:pPr>
-      <w:hyperlink w:anchor="_Toc241586179" w:history="1">
+      <w:hyperlink w:anchor="_Toc241587865" w:history="1">
         <w:r>
           <w:rPr>
             <w:rStyle w:val="Hyperlink"/>
@@ -1213,7 +1213,7 @@
             <w:noProof/>
             <w:webHidden/>
           </w:rPr>
-          <w:instrText xml:space="preserve"> PAGEREF _Toc241586179 \h </w:instrText>
+          <w:instrText xml:space="preserve"> PAGEREF _Toc241587865 \h </w:instrText>
         </w:r>
         <w:r>
           <w:rPr>
@@ -1233,7 +1233,7 @@
             <w:noProof/>
             <w:webHidden/>
           </w:rPr>
-          <w:t>9</w:t>
+          <w:t>10</w:t>
         </w:r>
         <w:r>
           <w:rPr>
@@ -1254,7 +1254,7 @@
           <w:noProof/>
         </w:rPr>
       </w:pPr>
-      <w:hyperlink w:anchor="_Toc241586180" w:history="1">
+      <w:hyperlink w:anchor="_Toc241587866" w:history="1">
         <w:r>
           <w:rPr>
             <w:rStyle w:val="Hyperlink"/>
@@ -1281,7 +1281,7 @@
             <w:noProof/>
             <w:webHidden/>
           </w:rPr>
-          <w:instrText xml:space="preserve"> PAGEREF _Toc241586180 \h </w:instrText>
+          <w:instrText xml:space="preserve"> PAGEREF _Toc241587866 \h </w:instrText>
         </w:r>
         <w:r>
           <w:rPr>
@@ -1301,7 +1301,7 @@
             <w:noProof/>
             <w:webHidden/>
           </w:rPr>
-          <w:t>10</w:t>
+          <w:t>11</w:t>
         </w:r>
         <w:r>
           <w:rPr>
@@ -1322,7 +1322,7 @@
           <w:noProof/>
         </w:rPr>
       </w:pPr>
-      <w:hyperlink w:anchor="_Toc241586181" w:history="1">
+      <w:hyperlink w:anchor="_Toc241587867" w:history="1">
         <w:r>
           <w:rPr>
             <w:rStyle w:val="Hyperlink"/>
@@ -1349,7 +1349,7 @@
             <w:noProof/>
             <w:webHidden/>
           </w:rPr>
-          <w:instrText xml:space="preserve"> PAGEREF _Toc241586181 \h </w:instrText>
+          <w:instrText xml:space="preserve"> PAGEREF _Toc241587867 \h </w:instrText>
         </w:r>
         <w:r>
           <w:rPr>
@@ -1369,7 +1369,7 @@
             <w:noProof/>
             <w:webHidden/>
           </w:rPr>
-          <w:t>10</w:t>
+          <w:t>12</w:t>
         </w:r>
         <w:r>
           <w:rPr>
@@ -1390,7 +1390,7 @@
           <w:noProof/>
         </w:rPr>
       </w:pPr>
-      <w:hyperlink w:anchor="_Toc241586182" w:history="1">
+      <w:hyperlink w:anchor="_Toc241587868" w:history="1">
         <w:r>
           <w:rPr>
             <w:rStyle w:val="Hyperlink"/>
@@ -1417,7 +1417,7 @@
             <w:noProof/>
             <w:webHidden/>
           </w:rPr>
-          <w:instrText xml:space="preserve"> PAGEREF _Toc241586182 \h </w:instrText>
+          <w:instrText xml:space="preserve"> PAGEREF _Toc241587868 \h </w:instrText>
         </w:r>
         <w:r>
           <w:rPr>
@@ -1437,7 +1437,7 @@
             <w:noProof/>
             <w:webHidden/>
           </w:rPr>
-          <w:t>11</w:t>
+          <w:t>13</w:t>
         </w:r>
         <w:r>
           <w:rPr>
@@ -1458,7 +1458,7 @@
           <w:noProof/>
         </w:rPr>
       </w:pPr>
-      <w:hyperlink w:anchor="_Toc241586183" w:history="1">
+      <w:hyperlink w:anchor="_Toc241587869" w:history="1">
         <w:r>
           <w:rPr>
             <w:rStyle w:val="Hyperlink"/>
@@ -1485,7 +1485,7 @@
             <w:noProof/>
             <w:webHidden/>
           </w:rPr>
-          <w:instrText xml:space="preserve"> PAGEREF _Toc241586183 \h </w:instrText>
+          <w:instrText xml:space="preserve"> PAGEREF _Toc241587869 \h </w:instrText>
         </w:r>
         <w:r>
           <w:rPr>
@@ -1505,7 +1505,7 @@
             <w:noProof/>
             <w:webHidden/>
           </w:rPr>
-          <w:t>11</w:t>
+          <w:t>15</w:t>
         </w:r>
         <w:r>
           <w:rPr>
@@ -1526,7 +1526,7 @@
           <w:noProof/>
         </w:rPr>
       </w:pPr>
-      <w:hyperlink w:anchor="_Toc241586184" w:history="1">
+      <w:hyperlink w:anchor="_Toc241587870" w:history="1">
         <w:r>
           <w:rPr>
             <w:rStyle w:val="Hyperlink"/>
@@ -1553,7 +1553,7 @@
             <w:noProof/>
             <w:webHidden/>
           </w:rPr>
-          <w:instrText xml:space="preserve"> PAGEREF _Toc241586184 \h </w:instrText>
+          <w:instrText xml:space="preserve"> PAGEREF _Toc241587870 \h </w:instrText>
         </w:r>
         <w:r>
           <w:rPr>
@@ -1573,7 +1573,7 @@
             <w:noProof/>
             <w:webHidden/>
           </w:rPr>
-          <w:t>12</w:t>
+          <w:t>15</w:t>
         </w:r>
         <w:r>
           <w:rPr>
@@ -1594,7 +1594,7 @@
           <w:noProof/>
         </w:rPr>
       </w:pPr>
-      <w:hyperlink w:anchor="_Toc241586185" w:history="1">
+      <w:hyperlink w:anchor="_Toc241587871" w:history="1">
         <w:r>
           <w:rPr>
             <w:rStyle w:val="Hyperlink"/>
@@ -1621,7 +1621,7 @@
             <w:noProof/>
             <w:webHidden/>
           </w:rPr>
-          <w:instrText xml:space="preserve"> PAGEREF _Toc241586185 \h </w:instrText>
+          <w:instrText xml:space="preserve"> PAGEREF _Toc241587871 \h </w:instrText>
         </w:r>
         <w:r>
           <w:rPr>
@@ -1641,7 +1641,7 @@
             <w:noProof/>
             <w:webHidden/>
           </w:rPr>
-          <w:t>12</w:t>
+          <w:t>16</w:t>
         </w:r>
         <w:r>
           <w:rPr>
@@ -1662,7 +1662,7 @@
           <w:noProof/>
         </w:rPr>
       </w:pPr>
-      <w:hyperlink w:anchor="_Toc241586186" w:history="1">
+      <w:hyperlink w:anchor="_Toc241587872" w:history="1">
         <w:r>
           <w:rPr>
             <w:rStyle w:val="Hyperlink"/>
@@ -1689,7 +1689,7 @@
             <w:noProof/>
             <w:webHidden/>
           </w:rPr>
-          <w:instrText xml:space="preserve"> PAGEREF _Toc241586186 \h </w:instrText>
+          <w:instrText xml:space="preserve"> PAGEREF _Toc241587872 \h </w:instrText>
         </w:r>
         <w:r>
           <w:rPr>
@@ -1709,7 +1709,7 @@
             <w:noProof/>
             <w:webHidden/>
           </w:rPr>
-          <w:t>12</w:t>
+          <w:t>16</w:t>
         </w:r>
         <w:r>
           <w:rPr>
@@ -1730,7 +1730,7 @@
           <w:noProof/>
         </w:rPr>
       </w:pPr>
-      <w:hyperlink w:anchor="_Toc241586187" w:history="1">
+      <w:hyperlink w:anchor="_Toc241587873" w:history="1">
         <w:r>
           <w:rPr>
             <w:rStyle w:val="Hyperlink"/>
@@ -1757,7 +1757,7 @@
             <w:noProof/>
             <w:webHidden/>
           </w:rPr>
-          <w:instrText xml:space="preserve"> PAGEREF _Toc241586187 \h </w:instrText>
+          <w:instrText xml:space="preserve"> PAGEREF _Toc241587873 \h </w:instrText>
         </w:r>
         <w:r>
           <w:rPr>
@@ -1777,7 +1777,7 @@
             <w:noProof/>
             <w:webHidden/>
           </w:rPr>
-          <w:t>12</w:t>
+          <w:t>16</w:t>
         </w:r>
         <w:r>
           <w:rPr>
@@ -1798,7 +1798,7 @@
           <w:noProof/>
         </w:rPr>
       </w:pPr>
-      <w:hyperlink w:anchor="_Toc241586188" w:history="1">
+      <w:hyperlink w:anchor="_Toc241587874" w:history="1">
         <w:r>
           <w:rPr>
             <w:rStyle w:val="Hyperlink"/>
@@ -1825,7 +1825,7 @@
             <w:noProof/>
             <w:webHidden/>
           </w:rPr>
-          <w:instrText xml:space="preserve"> PAGEREF _Toc241586188 \h </w:instrText>
+          <w:instrText xml:space="preserve"> PAGEREF _Toc241587874 \h </w:instrText>
         </w:r>
         <w:r>
           <w:rPr>
@@ -1845,7 +1845,7 @@
             <w:noProof/>
             <w:webHidden/>
           </w:rPr>
-          <w:t>13</w:t>
+          <w:t>19</w:t>
         </w:r>
         <w:r>
           <w:rPr>
@@ -1866,7 +1866,7 @@
           <w:noProof/>
         </w:rPr>
       </w:pPr>
-      <w:hyperlink w:anchor="_Toc241586189" w:history="1">
+      <w:hyperlink w:anchor="_Toc241587875" w:history="1">
         <w:r>
           <w:rPr>
             <w:rStyle w:val="Hyperlink"/>
@@ -1893,7 +1893,7 @@
             <w:noProof/>
             <w:webHidden/>
           </w:rPr>
-          <w:instrText xml:space="preserve"> PAGEREF _Toc241586189 \h </w:instrText>
+          <w:instrText xml:space="preserve"> PAGEREF _Toc241587875 \h </w:instrText>
         </w:r>
         <w:r>
           <w:rPr>
@@ -1913,7 +1913,7 @@
             <w:noProof/>
             <w:webHidden/>
           </w:rPr>
-          <w:t>14</w:t>
+          <w:t>20</w:t>
         </w:r>
         <w:r>
           <w:rPr>
@@ -1934,7 +1934,7 @@
           <w:noProof/>
         </w:rPr>
       </w:pPr>
-      <w:hyperlink w:anchor="_Toc241586190" w:history="1">
+      <w:hyperlink w:anchor="_Toc241587876" w:history="1">
         <w:r>
           <w:rPr>
             <w:rStyle w:val="Hyperlink"/>
@@ -1961,7 +1961,7 @@
             <w:noProof/>
             <w:webHidden/>
           </w:rPr>
-          <w:instrText xml:space="preserve"> PAGEREF _Toc241586190 \h </w:instrText>
+          <w:instrText xml:space="preserve"> PAGEREF _Toc241587876 \h </w:instrText>
         </w:r>
         <w:r>
           <w:rPr>
@@ -1981,7 +1981,7 @@
             <w:noProof/>
             <w:webHidden/>
           </w:rPr>
-          <w:t>14</w:t>
+          <w:t>20</w:t>
         </w:r>
         <w:r>
           <w:rPr>
@@ -2002,7 +2002,7 @@
           <w:noProof/>
         </w:rPr>
       </w:pPr>
-      <w:hyperlink w:anchor="_Toc241586191" w:history="1">
+      <w:hyperlink w:anchor="_Toc241587877" w:history="1">
         <w:r>
           <w:rPr>
             <w:rStyle w:val="Hyperlink"/>
@@ -2029,7 +2029,7 @@
             <w:noProof/>
             <w:webHidden/>
           </w:rPr>
-          <w:instrText xml:space="preserve"> PAGEREF _Toc241586191 \h </w:instrText>
+          <w:instrText xml:space="preserve"> PAGEREF _Toc241587877 \h </w:instrText>
         </w:r>
         <w:r>
           <w:rPr>
@@ -2049,7 +2049,7 @@
             <w:noProof/>
             <w:webHidden/>
           </w:rPr>
-          <w:t>15</w:t>
+          <w:t>21</w:t>
         </w:r>
         <w:r>
           <w:rPr>
@@ -2070,7 +2070,7 @@
           <w:noProof/>
         </w:rPr>
       </w:pPr>
-      <w:hyperlink w:anchor="_Toc241586192" w:history="1">
+      <w:hyperlink w:anchor="_Toc241587878" w:history="1">
         <w:r>
           <w:rPr>
             <w:rStyle w:val="Hyperlink"/>
@@ -2097,7 +2097,7 @@
             <w:noProof/>
             <w:webHidden/>
           </w:rPr>
-          <w:instrText xml:space="preserve"> PAGEREF _Toc241586192 \h </w:instrText>
+          <w:instrText xml:space="preserve"> PAGEREF _Toc241587878 \h </w:instrText>
         </w:r>
         <w:r>
           <w:rPr>
@@ -2117,7 +2117,7 @@
             <w:noProof/>
             <w:webHidden/>
           </w:rPr>
-          <w:t>15</w:t>
+          <w:t>22</w:t>
         </w:r>
         <w:r>
           <w:rPr>
@@ -2138,7 +2138,7 @@
           <w:noProof/>
         </w:rPr>
       </w:pPr>
-      <w:hyperlink w:anchor="_Toc241586193" w:history="1">
+      <w:hyperlink w:anchor="_Toc241587879" w:history="1">
         <w:r>
           <w:rPr>
             <w:rStyle w:val="Hyperlink"/>
@@ -2165,7 +2165,7 @@
             <w:noProof/>
             <w:webHidden/>
           </w:rPr>
-          <w:instrText xml:space="preserve"> PAGEREF _Toc241586193 \h </w:instrText>
+          <w:instrText xml:space="preserve"> PAGEREF _Toc241587879 \h </w:instrText>
         </w:r>
         <w:r>
           <w:rPr>
@@ -2185,7 +2185,7 @@
             <w:noProof/>
             <w:webHidden/>
           </w:rPr>
-          <w:t>15</w:t>
+          <w:t>22</w:t>
         </w:r>
         <w:r>
           <w:rPr>
@@ -2206,7 +2206,7 @@
           <w:noProof/>
         </w:rPr>
       </w:pPr>
-      <w:hyperlink w:anchor="_Toc241586194" w:history="1">
+      <w:hyperlink w:anchor="_Toc241587880" w:history="1">
         <w:r>
           <w:rPr>
             <w:rStyle w:val="Hyperlink"/>
@@ -2233,7 +2233,7 @@
             <w:noProof/>
             <w:webHidden/>
           </w:rPr>
-          <w:instrText xml:space="preserve"> PAGEREF _Toc241586194 \h </w:instrText>
+          <w:instrText xml:space="preserve"> PAGEREF _Toc241587880 \h </w:instrText>
         </w:r>
         <w:r>
           <w:rPr>
@@ -2253,7 +2253,7 @@
             <w:noProof/>
             <w:webHidden/>
           </w:rPr>
-          <w:t>16</w:t>
+          <w:t>22</w:t>
         </w:r>
         <w:r>
           <w:rPr>
@@ -2274,7 +2274,7 @@
           <w:noProof/>
         </w:rPr>
       </w:pPr>
-      <w:hyperlink w:anchor="_Toc241586195" w:history="1">
+      <w:hyperlink w:anchor="_Toc241587881" w:history="1">
         <w:r>
           <w:rPr>
             <w:rStyle w:val="Hyperlink"/>
@@ -2301,7 +2301,7 @@
             <w:noProof/>
             <w:webHidden/>
           </w:rPr>
-          <w:instrText xml:space="preserve"> PAGEREF _Toc241586195 \h </w:instrText>
+          <w:instrText xml:space="preserve"> PAGEREF _Toc241587881 \h </w:instrText>
         </w:r>
         <w:r>
           <w:rPr>
@@ -2321,7 +2321,7 @@
             <w:noProof/>
             <w:webHidden/>
           </w:rPr>
-          <w:t>16</w:t>
+          <w:t>23</w:t>
         </w:r>
         <w:r>
           <w:rPr>
@@ -2342,7 +2342,7 @@
           <w:noProof/>
         </w:rPr>
       </w:pPr>
-      <w:hyperlink w:anchor="_Toc241586196" w:history="1">
+      <w:hyperlink w:anchor="_Toc241587882" w:history="1">
         <w:r>
           <w:rPr>
             <w:rStyle w:val="Hyperlink"/>
@@ -2369,7 +2369,7 @@
             <w:noProof/>
             <w:webHidden/>
           </w:rPr>
-          <w:instrText xml:space="preserve"> PAGEREF _Toc241586196 \h </w:instrText>
+          <w:instrText xml:space="preserve"> PAGEREF _Toc241587882 \h </w:instrText>
         </w:r>
         <w:r>
           <w:rPr>
@@ -2389,7 +2389,7 @@
             <w:noProof/>
             <w:webHidden/>
           </w:rPr>
-          <w:t>16</w:t>
+          <w:t>23</w:t>
         </w:r>
         <w:r>
           <w:rPr>
@@ -2410,7 +2410,7 @@
           <w:noProof/>
         </w:rPr>
       </w:pPr>
-      <w:hyperlink w:anchor="_Toc241586197" w:history="1">
+      <w:hyperlink w:anchor="_Toc241587883" w:history="1">
         <w:r>
           <w:rPr>
             <w:rStyle w:val="Hyperlink"/>
@@ -2437,7 +2437,7 @@
             <w:noProof/>
             <w:webHidden/>
           </w:rPr>
-          <w:instrText xml:space="preserve"> PAGEREF _Toc241586197 \h </w:instrText>
+          <w:instrText xml:space="preserve"> PAGEREF _Toc241587883 \h </w:instrText>
         </w:r>
         <w:r>
           <w:rPr>
@@ -2457,7 +2457,7 @@
             <w:noProof/>
             <w:webHidden/>
           </w:rPr>
-          <w:t>16</w:t>
+          <w:t>23</w:t>
         </w:r>
         <w:r>
           <w:rPr>
@@ -2478,7 +2478,7 @@
           <w:noProof/>
         </w:rPr>
       </w:pPr>
-      <w:hyperlink w:anchor="_Toc241586198" w:history="1">
+      <w:hyperlink w:anchor="_Toc241587884" w:history="1">
         <w:r>
           <w:rPr>
             <w:rStyle w:val="Hyperlink"/>
@@ -2505,7 +2505,7 @@
             <w:noProof/>
             <w:webHidden/>
           </w:rPr>
-          <w:instrText xml:space="preserve"> PAGEREF _Toc241586198 \h </w:instrText>
+          <w:instrText xml:space="preserve"> PAGEREF _Toc241587884 \h </w:instrText>
         </w:r>
         <w:r>
           <w:rPr>
@@ -2525,7 +2525,7 @@
             <w:noProof/>
             <w:webHidden/>
           </w:rPr>
-          <w:t>17</w:t>
+          <w:t>24</w:t>
         </w:r>
         <w:r>
           <w:rPr>
@@ -2546,7 +2546,7 @@
           <w:noProof/>
         </w:rPr>
       </w:pPr>
-      <w:hyperlink w:anchor="_Toc241586199" w:history="1">
+      <w:hyperlink w:anchor="_Toc241587885" w:history="1">
         <w:r>
           <w:rPr>
             <w:rStyle w:val="Hyperlink"/>
@@ -2573,7 +2573,7 @@
             <w:noProof/>
             <w:webHidden/>
           </w:rPr>
-          <w:instrText xml:space="preserve"> PAGEREF _Toc241586199 \h </w:instrText>
+          <w:instrText xml:space="preserve"> PAGEREF _Toc241587885 \h </w:instrText>
         </w:r>
         <w:r>
           <w:rPr>
@@ -2593,7 +2593,7 @@
             <w:noProof/>
             <w:webHidden/>
           </w:rPr>
-          <w:t>17</w:t>
+          <w:t>24</w:t>
         </w:r>
         <w:r>
           <w:rPr>
@@ -2614,7 +2614,7 @@
           <w:noProof/>
         </w:rPr>
       </w:pPr>
-      <w:hyperlink w:anchor="_Toc241586200" w:history="1">
+      <w:hyperlink w:anchor="_Toc241587886" w:history="1">
         <w:r>
           <w:rPr>
             <w:rStyle w:val="Hyperlink"/>
@@ -2641,7 +2641,7 @@
             <w:noProof/>
             <w:webHidden/>
           </w:rPr>
-          <w:instrText xml:space="preserve"> PAGEREF _Toc241586200 \h </w:instrText>
+          <w:instrText xml:space="preserve"> PAGEREF _Toc241587886 \h </w:instrText>
         </w:r>
         <w:r>
           <w:rPr>
@@ -2661,7 +2661,7 @@
             <w:noProof/>
             <w:webHidden/>
           </w:rPr>
-          <w:t>18</w:t>
+          <w:t>25</w:t>
         </w:r>
         <w:r>
           <w:rPr>
@@ -2689,7 +2689,7 @@
       <w:pPr>
         <w:pStyle w:val="Heading1"/>
       </w:pPr>
-      <w:bookmarkStart w:id="0" w:name="_Toc241586166"/>
+      <w:bookmarkStart w:id="0" w:name="_Toc241587852"/>
       <w:r>
         <w:lastRenderedPageBreak/>
         <w:t>Case details</w:t>
@@ -3105,7 +3105,7 @@
       <w:pPr>
         <w:pStyle w:val="Heading1"/>
       </w:pPr>
-      <w:bookmarkStart w:id="1" w:name="_Toc241586167"/>
+      <w:bookmarkStart w:id="1" w:name="_Toc241587853"/>
       <w:r>
         <w:t>1. The case: the Equifax breach of 2017</w:t>
       </w:r>
@@ -3115,7 +3115,7 @@
       <w:pPr>
         <w:pStyle w:val="Heading2"/>
       </w:pPr>
-      <w:bookmarkStart w:id="2" w:name="_Toc241586168"/>
+      <w:bookmarkStart w:id="2" w:name="_Toc241587854"/>
       <w:r>
         <w:t>1.1 Who Equifax is</w:t>
       </w:r>
@@ -3130,7 +3130,7 @@
       <w:pPr>
         <w:pStyle w:val="Heading2"/>
       </w:pPr>
-      <w:bookmarkStart w:id="3" w:name="_Toc241586169"/>
+      <w:bookmarkStart w:id="3" w:name="_Toc241587855"/>
       <w:r>
         <w:t>1.2 How the attack unfolded</w:t>
       </w:r>
@@ -3834,7 +3834,7 @@
               <w:rPr>
                 <w:sz w:val="20"/>
               </w:rPr>
-              <w:t>The breach is announced; about 147 million people affected</w:t>
+              <w:t>The breach is announced, initially about 143 million US consumers, later revised to about 147 million</w:t>
             </w:r>
           </w:p>
         </w:tc>
@@ -3862,7 +3862,7 @@
       <w:pPr>
         <w:pStyle w:val="Heading2"/>
       </w:pPr>
-      <w:bookmarkStart w:id="4" w:name="_Toc241586170"/>
+      <w:bookmarkStart w:id="4" w:name="_Toc241587856"/>
       <w:r>
         <w:t>1.3 Why it was not stopped</w:t>
       </w:r>
@@ -4151,7 +4151,7 @@
       <w:pPr>
         <w:pStyle w:val="Heading2"/>
       </w:pPr>
-      <w:bookmarkStart w:id="5" w:name="_Toc241586171"/>
+      <w:bookmarkStart w:id="5" w:name="_Toc241587857"/>
       <w:r>
         <w:t>1.4 What was taken</w:t>
       </w:r>
@@ -4159,17 +4159,17 @@
     </w:p>
     <w:p>
       <w:r>
-        <w:t>Equifax's May 2018 statement gives approximate US figures: names and dates of birth 146.6 million each, Social Security numbers 145.5 million, addresses 99 million, driver's licence numbers 17.6 million, payment card numbers 209,000. The same person appears in several categories, so the figures are not added. Dispute documents for about 182,000 consumers were also taken. Outside the US, GAO counted nearly one million people in 2018; the UK regulator later found up to 13.8 million UK records accessed, and ab</w:t>
+        <w:t>Equifax first announced about 143 million affected US consumers on 7 September 2017 and later revised the total to about 147 million. Equifax's May 2018 statement gives approximate US figures: names and dates of birth 146.6 million each, Social Security numbers 145.5 million, addresses 99 million, driver's licence numbers 17.6 million, payment card numbers 209,000. The same person appears in several categories, so the figures are not added. Dispute documents for about 182,000 consumers were also taken. Outs</w:t>
       </w:r>
       <w:r>
-        <w:t>out 19,000 Canadians were affected. The company later paid a US settlement of 575 to 700 million dollars, was fined by UK regulators, and spent about 1.5 billion dollars on security. The chief information officer, chief security officer and chief executive all left within weeks.</w:t>
+        <w:t>ide the US, GAO counted nearly one million people in 2018; the UK regulator later found up to 13.8 million UK records accessed, and about 19,000 Canadians were affected. The company later paid a US settlement of 575 to 700 million dollars, was fined by UK regulators, and spent about 1.5 billion dollars on security. The chief information officer, chief security officer and chief executive all left within weeks.</w:t>
       </w:r>
     </w:p>
     <w:p>
       <w:pPr>
         <w:pStyle w:val="Heading2"/>
       </w:pPr>
-      <w:bookmarkStart w:id="6" w:name="_Toc241586172"/>
+      <w:bookmarkStart w:id="6" w:name="_Toc241587858"/>
       <w:r>
         <w:t>1.5 The question this report asks</w:t>
       </w:r>
@@ -4184,7 +4184,7 @@
       <w:pPr>
         <w:pStyle w:val="Heading1"/>
       </w:pPr>
-      <w:bookmarkStart w:id="7" w:name="_Toc241586173"/>
+      <w:bookmarkStart w:id="7" w:name="_Toc241587859"/>
       <w:r>
         <w:t>2. Methodology</w:t>
       </w:r>
@@ -4194,7 +4194,7 @@
       <w:pPr>
         <w:pStyle w:val="Heading2"/>
       </w:pPr>
-      <w:bookmarkStart w:id="8" w:name="_Toc241586174"/>
+      <w:bookmarkStart w:id="8" w:name="_Toc241587860"/>
       <w:r>
         <w:t>2.1 Tool and evidence</w:t>
       </w:r>
@@ -4202,10 +4202,10 @@
     </w:p>
     <w:p>
       <w:r>
-        <w:t>The breach came down to one vulnerable software component that nobody had patched. Trivy is a scanner built for exactly that: it reads a system's files without running them, names each software component and version, and matches them against public vulnerability databases. It also searches files for passwords and keys, checks configuration for unsafe settings, and writes a list of the software present. That lets us rebuild a version of the Equifax server and show each failure from section 1.3 on real softwa</w:t>
+        <w:t>The breach came down to one vulnerable software component that nobody had patched. Trivy is a scanner built for exactly that: it reads a system's files without running them, names each software component and version, and matches them against public vulnerability databases. It also searches files for passwords and keys, checks configuration for unsafe settings, and writes a list of the software present. That lets us rebuild a version of the Equifax server and show three of the failures from section 1.3 on re</w:t>
       </w:r>
       <w:r>
-        <w:t>re, found by a real tool. Trivy is free and scripted, so anyone can repeat the examination and check the results.</w:t>
+        <w:t>al software: the unpatched vulnerable component, the exposed credentials and the unsafe configuration. Trivy reads files, so it does not show the monitoring failure, the missing segmentation or the missing query limits; those come from the case record. Trivy is free and scripted, so anyone can repeat the examination and check the results.</w:t>
       </w:r>
     </w:p>
     <w:p>
@@ -4580,7 +4580,7 @@
       <w:pPr>
         <w:pStyle w:val="Heading2"/>
       </w:pPr>
-      <w:bookmarkStart w:id="9" w:name="_Toc241586175"/>
+      <w:bookmarkStart w:id="9" w:name="_Toc241587861"/>
       <w:r>
         <w:t>2.2 The examination</w:t>
       </w:r>
@@ -4591,749 +4591,169 @@
         <w:t>One script, run-investigation.sh, does the whole job: it hashes every evidence file, runs five scans, hashes the evidence again, checks nothing changed, and hashes every file it produced. Each step below is one command, and the video shows them running.</w:t>
       </w:r>
     </w:p>
-    <w:tbl>
-      <w:tblPr>
-        <w:tblStyle w:val="TableGrid"/>
-        <w:tblW w:w="0" w:type="auto"/>
-        <w:jc w:val="center"/>
-        <w:tblBorders>
-          <w:top w:val="single" w:sz="6" w:space="0" w:color="000000"/>
-          <w:left w:val="single" w:sz="6" w:space="0" w:color="000000"/>
-          <w:bottom w:val="single" w:sz="6" w:space="0" w:color="000000"/>
-          <w:right w:val="single" w:sz="6" w:space="0" w:color="000000"/>
-          <w:insideH w:val="single" w:sz="6" w:space="0" w:color="000000"/>
-          <w:insideV w:val="single" w:sz="6" w:space="0" w:color="000000"/>
-        </w:tblBorders>
-        <w:tblLook w:val="04A0" w:firstRow="1" w:lastRow="0" w:firstColumn="1" w:lastColumn="0" w:noHBand="0" w:noVBand="1"/>
-      </w:tblPr>
-      <w:tblGrid>
-        <w:gridCol w:w="3010"/>
-        <w:gridCol w:w="3010"/>
-        <w:gridCol w:w="3010"/>
-      </w:tblGrid>
-      <w:tr>
-        <w:trPr>
-          <w:cantSplit/>
-          <w:tblHeader/>
-          <w:jc w:val="center"/>
-        </w:trPr>
-        <w:tc>
-          <w:tcPr>
-            <w:tcW w:w="3010" w:type="dxa"/>
-          </w:tcPr>
-          <w:p>
-            <w:pPr>
-              <w:keepNext/>
-              <w:spacing w:after="40"/>
-              <w:jc w:val="left"/>
-            </w:pPr>
-            <w:r>
-              <w:rPr>
-                <w:b/>
-                <w:sz w:val="20"/>
-              </w:rPr>
-              <w:t>Step</w:t>
-            </w:r>
-          </w:p>
-        </w:tc>
-        <w:tc>
-          <w:tcPr>
-            <w:tcW w:w="3010" w:type="dxa"/>
-          </w:tcPr>
-          <w:p>
-            <w:pPr>
-              <w:keepNext/>
-              <w:spacing w:after="40"/>
-              <w:jc w:val="left"/>
-            </w:pPr>
-            <w:r>
-              <w:rPr>
-                <w:b/>
-                <w:sz w:val="20"/>
-              </w:rPr>
-              <w:t>Command</w:t>
-            </w:r>
-          </w:p>
-        </w:tc>
-        <w:tc>
-          <w:tcPr>
-            <w:tcW w:w="3010" w:type="dxa"/>
-          </w:tcPr>
-          <w:p>
-            <w:pPr>
-              <w:keepNext/>
-              <w:spacing w:after="40"/>
-              <w:jc w:val="left"/>
-            </w:pPr>
-            <w:r>
-              <w:rPr>
-                <w:b/>
-                <w:sz w:val="20"/>
-              </w:rPr>
-              <w:t>What it shows</w:t>
-            </w:r>
-          </w:p>
-        </w:tc>
-      </w:tr>
-      <w:tr>
-        <w:trPr>
-          <w:cantSplit/>
-          <w:jc w:val="center"/>
-        </w:trPr>
-        <w:tc>
-          <w:tcPr>
-            <w:tcW w:w="3010" w:type="dxa"/>
-          </w:tcPr>
-          <w:p>
-            <w:pPr>
-              <w:keepNext/>
-              <w:spacing w:after="40"/>
-              <w:jc w:val="left"/>
-            </w:pPr>
-            <w:r>
-              <w:rPr>
-                <w:sz w:val="20"/>
-              </w:rPr>
-              <w:t>1</w:t>
-            </w:r>
-          </w:p>
-        </w:tc>
-        <w:tc>
-          <w:tcPr>
-            <w:tcW w:w="3010" w:type="dxa"/>
-          </w:tcPr>
-          <w:p>
-            <w:pPr>
-              <w:keepNext/>
-              <w:spacing w:after="40"/>
-              <w:jc w:val="left"/>
-            </w:pPr>
-            <w:r>
-              <w:rPr>
-                <w:sz w:val="20"/>
-              </w:rPr>
-              <w:t>bash scripts/run-investigation.sh</w:t>
-            </w:r>
-          </w:p>
-        </w:tc>
-        <w:tc>
-          <w:tcPr>
-            <w:tcW w:w="3010" w:type="dxa"/>
-          </w:tcPr>
-          <w:p>
-            <w:pPr>
-              <w:keepNext/>
-              <w:spacing w:after="40"/>
-              <w:jc w:val="left"/>
-            </w:pPr>
-            <w:r>
-              <w:rPr>
-                <w:sz w:val="20"/>
-              </w:rPr>
-              <w:t>The whole examination and its summary</w:t>
-            </w:r>
-          </w:p>
-        </w:tc>
-      </w:tr>
-      <w:tr>
-        <w:trPr>
-          <w:cantSplit/>
-          <w:jc w:val="center"/>
-        </w:trPr>
-        <w:tc>
-          <w:tcPr>
-            <w:tcW w:w="3010" w:type="dxa"/>
-          </w:tcPr>
-          <w:p>
-            <w:pPr>
-              <w:keepNext/>
-              <w:spacing w:after="40"/>
-              <w:jc w:val="left"/>
-            </w:pPr>
-            <w:r>
-              <w:rPr>
-                <w:sz w:val="20"/>
-              </w:rPr>
-              <w:t>2</w:t>
-            </w:r>
-          </w:p>
-        </w:tc>
-        <w:tc>
-          <w:tcPr>
-            <w:tcW w:w="3010" w:type="dxa"/>
-          </w:tcPr>
-          <w:p>
-            <w:pPr>
-              <w:keepNext/>
-              <w:spacing w:after="40"/>
-              <w:jc w:val="left"/>
-            </w:pPr>
-            <w:r>
-              <w:rPr>
-                <w:sz w:val="20"/>
-              </w:rPr>
-              <w:t>cat output/latest/evidence-hashes-before.txt</w:t>
-            </w:r>
-          </w:p>
-        </w:tc>
-        <w:tc>
-          <w:tcPr>
-            <w:tcW w:w="3010" w:type="dxa"/>
-          </w:tcPr>
-          <w:p>
-            <w:pPr>
-              <w:keepNext/>
-              <w:spacing w:after="40"/>
-              <w:jc w:val="left"/>
-            </w:pPr>
-            <w:r>
-              <w:rPr>
-                <w:sz w:val="20"/>
-              </w:rPr>
-              <w:t>The SHA-256 fingerprints taken before the scan</w:t>
-            </w:r>
-          </w:p>
-        </w:tc>
-      </w:tr>
-      <w:tr>
-        <w:trPr>
-          <w:cantSplit/>
-          <w:jc w:val="center"/>
-        </w:trPr>
-        <w:tc>
-          <w:tcPr>
-            <w:tcW w:w="3010" w:type="dxa"/>
-          </w:tcPr>
-          <w:p>
-            <w:pPr>
-              <w:keepNext/>
-              <w:spacing w:after="40"/>
-              <w:jc w:val="left"/>
-            </w:pPr>
-            <w:r>
-              <w:rPr>
-                <w:sz w:val="20"/>
-              </w:rPr>
-              <w:t>3</w:t>
-            </w:r>
-          </w:p>
-        </w:tc>
-        <w:tc>
-          <w:tcPr>
-            <w:tcW w:w="3010" w:type="dxa"/>
-          </w:tcPr>
-          <w:p>
-            <w:pPr>
-              <w:keepNext/>
-              <w:spacing w:after="40"/>
-              <w:jc w:val="left"/>
-            </w:pPr>
-            <w:r>
-              <w:rPr>
-                <w:sz w:val="20"/>
-              </w:rPr>
-              <w:t>sha256sum -c output/latest/evidence-hashes-before.txt</w:t>
-            </w:r>
-          </w:p>
-        </w:tc>
-        <w:tc>
-          <w:tcPr>
-            <w:tcW w:w="3010" w:type="dxa"/>
-          </w:tcPr>
-          <w:p>
-            <w:pPr>
-              <w:keepNext/>
-              <w:spacing w:after="40"/>
-              <w:jc w:val="left"/>
-            </w:pPr>
-            <w:r>
-              <w:rPr>
-                <w:sz w:val="20"/>
-              </w:rPr>
-              <w:t>Every file still matches its fingerprint</w:t>
-            </w:r>
-          </w:p>
-        </w:tc>
-      </w:tr>
-      <w:tr>
-        <w:trPr>
-          <w:cantSplit/>
-          <w:jc w:val="center"/>
-        </w:trPr>
-        <w:tc>
-          <w:tcPr>
-            <w:tcW w:w="3010" w:type="dxa"/>
-          </w:tcPr>
-          <w:p>
-            <w:pPr>
-              <w:keepNext/>
-              <w:spacing w:after="40"/>
-              <w:jc w:val="left"/>
-            </w:pPr>
-            <w:r>
-              <w:rPr>
-                <w:sz w:val="20"/>
-              </w:rPr>
-              <w:t>4</w:t>
-            </w:r>
-          </w:p>
-        </w:tc>
-        <w:tc>
-          <w:tcPr>
-            <w:tcW w:w="3010" w:type="dxa"/>
-          </w:tcPr>
-          <w:p>
-            <w:pPr>
-              <w:keepNext/>
-              <w:spacing w:after="40"/>
-              <w:jc w:val="left"/>
-            </w:pPr>
-            <w:r>
-              <w:rPr>
-                <w:sz w:val="20"/>
-              </w:rPr>
-              <w:t>python scripts/show-cve.py</w:t>
-            </w:r>
-          </w:p>
-        </w:tc>
-        <w:tc>
-          <w:tcPr>
-            <w:tcW w:w="3010" w:type="dxa"/>
-          </w:tcPr>
-          <w:p>
-            <w:pPr>
-              <w:keepNext/>
-              <w:spacing w:after="40"/>
-              <w:jc w:val="left"/>
-            </w:pPr>
-            <w:r>
-              <w:rPr>
-                <w:sz w:val="20"/>
-              </w:rPr>
-              <w:t>Every known flaw in the Struts library, oldest first</w:t>
-            </w:r>
-          </w:p>
-        </w:tc>
-      </w:tr>
-      <w:tr>
-        <w:trPr>
-          <w:cantSplit/>
-          <w:jc w:val="center"/>
-        </w:trPr>
-        <w:tc>
-          <w:tcPr>
-            <w:tcW w:w="3010" w:type="dxa"/>
-          </w:tcPr>
-          <w:p>
-            <w:pPr>
-              <w:keepNext/>
-              <w:spacing w:after="40"/>
-              <w:jc w:val="left"/>
-            </w:pPr>
-            <w:r>
-              <w:rPr>
-                <w:sz w:val="20"/>
-              </w:rPr>
-              <w:t>5</w:t>
-            </w:r>
-          </w:p>
-        </w:tc>
-        <w:tc>
-          <w:tcPr>
-            <w:tcW w:w="3010" w:type="dxa"/>
-          </w:tcPr>
-          <w:p>
-            <w:pPr>
-              <w:keepNext/>
-              <w:spacing w:after="40"/>
-              <w:jc w:val="left"/>
-            </w:pPr>
-            <w:r>
-              <w:rPr>
-                <w:sz w:val="20"/>
-              </w:rPr>
-              <w:t>python scripts/show-cve.py CVE-2017-5638</w:t>
-            </w:r>
-          </w:p>
-        </w:tc>
-        <w:tc>
-          <w:tcPr>
-            <w:tcW w:w="3010" w:type="dxa"/>
-          </w:tcPr>
-          <w:p>
-            <w:pPr>
-              <w:keepNext/>
-              <w:spacing w:after="40"/>
-              <w:jc w:val="left"/>
-            </w:pPr>
-            <w:r>
-              <w:rPr>
-                <w:sz w:val="20"/>
-              </w:rPr>
-              <w:t>The Equifax flaw in detail</w:t>
-            </w:r>
-          </w:p>
-        </w:tc>
-      </w:tr>
-      <w:tr>
-        <w:trPr>
-          <w:cantSplit/>
-          <w:jc w:val="center"/>
-        </w:trPr>
-        <w:tc>
-          <w:tcPr>
-            <w:tcW w:w="3010" w:type="dxa"/>
-          </w:tcPr>
-          <w:p>
-            <w:pPr>
-              <w:keepNext/>
-              <w:spacing w:after="40"/>
-              <w:jc w:val="left"/>
-            </w:pPr>
-            <w:r>
-              <w:rPr>
-                <w:sz w:val="20"/>
-              </w:rPr>
-              <w:t>6</w:t>
-            </w:r>
-          </w:p>
-        </w:tc>
-        <w:tc>
-          <w:tcPr>
-            <w:tcW w:w="3010" w:type="dxa"/>
-          </w:tcPr>
-          <w:p>
-            <w:pPr>
-              <w:keepNext/>
-              <w:spacing w:after="40"/>
-              <w:jc w:val="left"/>
-            </w:pPr>
-            <w:r>
-              <w:rPr>
-                <w:sz w:val="20"/>
-              </w:rPr>
-              <w:t>unzip -p .../struts2-core-2.5.10.jar .../pom.properties</w:t>
-            </w:r>
-          </w:p>
-        </w:tc>
-        <w:tc>
-          <w:tcPr>
-            <w:tcW w:w="3010" w:type="dxa"/>
-          </w:tcPr>
-          <w:p>
-            <w:pPr>
-              <w:keepNext/>
-              <w:spacing w:after="40"/>
-              <w:jc w:val="left"/>
-            </w:pPr>
-            <w:r>
-              <w:rPr>
-                <w:sz w:val="20"/>
-              </w:rPr>
-              <w:t>The build details inside the library</w:t>
-            </w:r>
-          </w:p>
-        </w:tc>
-      </w:tr>
-      <w:tr>
-        <w:trPr>
-          <w:cantSplit/>
-          <w:jc w:val="center"/>
-        </w:trPr>
-        <w:tc>
-          <w:tcPr>
-            <w:tcW w:w="3010" w:type="dxa"/>
-          </w:tcPr>
-          <w:p>
-            <w:pPr>
-              <w:keepNext/>
-              <w:spacing w:after="40"/>
-              <w:jc w:val="left"/>
-            </w:pPr>
-            <w:r>
-              <w:rPr>
-                <w:sz w:val="20"/>
-              </w:rPr>
-              <w:t>7</w:t>
-            </w:r>
-          </w:p>
-        </w:tc>
-        <w:tc>
-          <w:tcPr>
-            <w:tcW w:w="3010" w:type="dxa"/>
-          </w:tcPr>
-          <w:p>
-            <w:pPr>
-              <w:keepNext/>
-              <w:spacing w:after="40"/>
-              <w:jc w:val="left"/>
-            </w:pPr>
-            <w:r>
-              <w:rPr>
-                <w:sz w:val="20"/>
-              </w:rPr>
-              <w:t>grep on output/latest/03-secrets.txt</w:t>
-            </w:r>
-          </w:p>
-        </w:tc>
-        <w:tc>
-          <w:tcPr>
-            <w:tcW w:w="3010" w:type="dxa"/>
-          </w:tcPr>
-          <w:p>
-            <w:pPr>
-              <w:keepNext/>
-              <w:spacing w:after="40"/>
-              <w:jc w:val="left"/>
-            </w:pPr>
-            <w:r>
-              <w:rPr>
-                <w:sz w:val="20"/>
-              </w:rPr>
-              <w:t>The passwords and keys found</w:t>
-            </w:r>
-          </w:p>
-        </w:tc>
-      </w:tr>
-      <w:tr>
-        <w:trPr>
-          <w:cantSplit/>
-          <w:jc w:val="center"/>
-        </w:trPr>
-        <w:tc>
-          <w:tcPr>
-            <w:tcW w:w="3010" w:type="dxa"/>
-          </w:tcPr>
-          <w:p>
-            <w:pPr>
-              <w:keepNext/>
-              <w:spacing w:after="40"/>
-              <w:jc w:val="left"/>
-            </w:pPr>
-            <w:r>
-              <w:rPr>
-                <w:sz w:val="20"/>
-              </w:rPr>
-              <w:t>8</w:t>
-            </w:r>
-          </w:p>
-        </w:tc>
-        <w:tc>
-          <w:tcPr>
-            <w:tcW w:w="3010" w:type="dxa"/>
-          </w:tcPr>
-          <w:p>
-            <w:pPr>
-              <w:keepNext/>
-              <w:spacing w:after="40"/>
-              <w:jc w:val="left"/>
-            </w:pPr>
-            <w:r>
-              <w:rPr>
-                <w:sz w:val="20"/>
-              </w:rPr>
-              <w:t>cat scripts/trivy-secret-rules.yaml</w:t>
-            </w:r>
-          </w:p>
-        </w:tc>
-        <w:tc>
-          <w:tcPr>
-            <w:tcW w:w="3010" w:type="dxa"/>
-          </w:tcPr>
-          <w:p>
-            <w:pPr>
-              <w:keepNext/>
-              <w:spacing w:after="40"/>
-              <w:jc w:val="left"/>
-            </w:pPr>
-            <w:r>
-              <w:rPr>
-                <w:sz w:val="20"/>
-              </w:rPr>
-              <w:t>The two custom rules we wrote</w:t>
-            </w:r>
-          </w:p>
-        </w:tc>
-      </w:tr>
-      <w:tr>
-        <w:trPr>
-          <w:cantSplit/>
-          <w:jc w:val="center"/>
-        </w:trPr>
-        <w:tc>
-          <w:tcPr>
-            <w:tcW w:w="3010" w:type="dxa"/>
-          </w:tcPr>
-          <w:p>
-            <w:pPr>
-              <w:keepNext/>
-              <w:spacing w:after="40"/>
-              <w:jc w:val="left"/>
-            </w:pPr>
-            <w:r>
-              <w:rPr>
-                <w:sz w:val="20"/>
-              </w:rPr>
-              <w:t>9</w:t>
-            </w:r>
-          </w:p>
-        </w:tc>
-        <w:tc>
-          <w:tcPr>
-            <w:tcW w:w="3010" w:type="dxa"/>
-          </w:tcPr>
-          <w:p>
-            <w:pPr>
-              <w:keepNext/>
-              <w:spacing w:after="40"/>
-              <w:jc w:val="left"/>
-            </w:pPr>
-            <w:r>
-              <w:rPr>
-                <w:sz w:val="20"/>
-              </w:rPr>
-              <w:t>grep on output/latest/04-misconfigurations.txt</w:t>
-            </w:r>
-          </w:p>
-        </w:tc>
-        <w:tc>
-          <w:tcPr>
-            <w:tcW w:w="3010" w:type="dxa"/>
-          </w:tcPr>
-          <w:p>
-            <w:pPr>
-              <w:keepNext/>
-              <w:spacing w:after="40"/>
-              <w:jc w:val="left"/>
-            </w:pPr>
-            <w:r>
-              <w:rPr>
-                <w:sz w:val="20"/>
-              </w:rPr>
-              <w:t>The unsafe server settings</w:t>
-            </w:r>
-          </w:p>
-        </w:tc>
-      </w:tr>
-      <w:tr>
-        <w:trPr>
-          <w:cantSplit/>
-          <w:jc w:val="center"/>
-        </w:trPr>
-        <w:tc>
-          <w:tcPr>
-            <w:tcW w:w="3010" w:type="dxa"/>
-          </w:tcPr>
-          <w:p>
-            <w:pPr>
-              <w:keepNext/>
-              <w:spacing w:after="40"/>
-              <w:jc w:val="left"/>
-            </w:pPr>
-            <w:r>
-              <w:rPr>
-                <w:sz w:val="20"/>
-              </w:rPr>
-              <w:t>10</w:t>
-            </w:r>
-          </w:p>
-        </w:tc>
-        <w:tc>
-          <w:tcPr>
-            <w:tcW w:w="3010" w:type="dxa"/>
-          </w:tcPr>
-          <w:p>
-            <w:pPr>
-              <w:keepNext/>
-              <w:spacing w:after="40"/>
-              <w:jc w:val="left"/>
-            </w:pPr>
-            <w:r>
-              <w:rPr>
-                <w:sz w:val="20"/>
-              </w:rPr>
-              <w:t>grep on output/latest/05-sbom-cyclonedx.json</w:t>
-            </w:r>
-          </w:p>
-        </w:tc>
-        <w:tc>
-          <w:tcPr>
-            <w:tcW w:w="3010" w:type="dxa"/>
-          </w:tcPr>
-          <w:p>
-            <w:pPr>
-              <w:keepNext/>
-              <w:spacing w:after="40"/>
-              <w:jc w:val="left"/>
-            </w:pPr>
-            <w:r>
-              <w:rPr>
-                <w:sz w:val="20"/>
-              </w:rPr>
-              <w:t>The software list</w:t>
-            </w:r>
-          </w:p>
-        </w:tc>
-      </w:tr>
-      <w:tr>
-        <w:trPr>
-          <w:cantSplit/>
-          <w:jc w:val="center"/>
-        </w:trPr>
-        <w:tc>
-          <w:tcPr>
-            <w:tcW w:w="3010" w:type="dxa"/>
-          </w:tcPr>
-          <w:p>
-            <w:pPr>
-              <w:spacing w:after="40"/>
-              <w:jc w:val="left"/>
-            </w:pPr>
-            <w:r>
-              <w:rPr>
-                <w:sz w:val="20"/>
-              </w:rPr>
-              <w:t>11</w:t>
-            </w:r>
-          </w:p>
-        </w:tc>
-        <w:tc>
-          <w:tcPr>
-            <w:tcW w:w="3010" w:type="dxa"/>
-          </w:tcPr>
-          <w:p>
-            <w:pPr>
-              <w:spacing w:after="40"/>
-              <w:jc w:val="left"/>
-            </w:pPr>
-            <w:r>
-              <w:rPr>
-                <w:sz w:val="20"/>
-              </w:rPr>
-              <w:t>cat output/latest/artefact-hashes.txt</w:t>
-            </w:r>
-          </w:p>
-        </w:tc>
-        <w:tc>
-          <w:tcPr>
-            <w:tcW w:w="3010" w:type="dxa"/>
-          </w:tcPr>
-          <w:p>
-            <w:pPr>
-              <w:spacing w:after="40"/>
-              <w:jc w:val="left"/>
-            </w:pPr>
-            <w:r>
-              <w:rPr>
-                <w:sz w:val="20"/>
-              </w:rPr>
-              <w:t>Fingerprints of everything the examination produced</w:t>
-            </w:r>
-          </w:p>
-        </w:tc>
-      </w:tr>
-    </w:tbl>
-    <w:p/>
+    <w:p>
+      <w:r>
+        <w:t>The eleven commands, in order. Each one produces a figure in section 3.</w:t>
+      </w:r>
+    </w:p>
+    <w:p>
+      <w:pPr>
+        <w:keepNext/>
+        <w:spacing w:after="0"/>
+        <w:ind w:left="576"/>
+        <w:jc w:val="left"/>
+      </w:pPr>
+      <w:r>
+        <w:rPr>
+          <w:sz w:val="22"/>
+        </w:rPr>
+        <w:t>bash scripts/run-investigation.sh</w:t>
+      </w:r>
+    </w:p>
+    <w:p>
+      <w:pPr>
+        <w:keepNext/>
+        <w:spacing w:after="0"/>
+        <w:ind w:left="576"/>
+        <w:jc w:val="left"/>
+      </w:pPr>
+      <w:r>
+        <w:rPr>
+          <w:sz w:val="22"/>
+        </w:rPr>
+        <w:t>cat output/latest/evidence-hashes-before.txt</w:t>
+      </w:r>
+    </w:p>
+    <w:p>
+      <w:pPr>
+        <w:keepNext/>
+        <w:spacing w:after="0"/>
+        <w:ind w:left="576"/>
+        <w:jc w:val="left"/>
+      </w:pPr>
+      <w:r>
+        <w:rPr>
+          <w:sz w:val="22"/>
+        </w:rPr>
+        <w:t>sha256sum -c output/latest/evidence-hashes-before.txt</w:t>
+      </w:r>
+    </w:p>
+    <w:p>
+      <w:pPr>
+        <w:keepNext/>
+        <w:spacing w:after="0"/>
+        <w:ind w:left="576"/>
+        <w:jc w:val="left"/>
+      </w:pPr>
+      <w:r>
+        <w:rPr>
+          <w:sz w:val="22"/>
+        </w:rPr>
+        <w:t>python3 scripts/show-cve.py</w:t>
+      </w:r>
+    </w:p>
+    <w:p>
+      <w:pPr>
+        <w:keepNext/>
+        <w:spacing w:after="0"/>
+        <w:ind w:left="576"/>
+        <w:jc w:val="left"/>
+      </w:pPr>
+      <w:r>
+        <w:rPr>
+          <w:sz w:val="22"/>
+        </w:rPr>
+        <w:t>python3 scripts/show-cve.py CVE-2017-5638</w:t>
+      </w:r>
+    </w:p>
+    <w:p>
+      <w:pPr>
+        <w:keepNext/>
+        <w:spacing w:after="0"/>
+        <w:ind w:left="576"/>
+        <w:jc w:val="left"/>
+      </w:pPr>
+      <w:r>
+        <w:rPr>
+          <w:sz w:val="22"/>
+        </w:rPr>
+        <w:t>unzip -p evidence/acis-portal/lib/struts2-core-2.5.10.jar META-INF/maven/org.apache.struts/struts2-core/pom.properties</w:t>
+      </w:r>
+    </w:p>
+    <w:p>
+      <w:pPr>
+        <w:keepNext/>
+        <w:spacing w:after="0"/>
+        <w:ind w:left="576"/>
+        <w:jc w:val="left"/>
+      </w:pPr>
+      <w:r>
+        <w:rPr>
+          <w:sz w:val="22"/>
+        </w:rPr>
+        <w:t>grep -E "\(secrets\)$|^(CRITICAL|HIGH|MEDIUM|LOW): " output/latest/03-secrets.txt</w:t>
+      </w:r>
+    </w:p>
+    <w:p>
+      <w:pPr>
+        <w:keepNext/>
+        <w:spacing w:after="0"/>
+        <w:ind w:left="576"/>
+        <w:jc w:val="left"/>
+      </w:pPr>
+      <w:r>
+        <w:rPr>
+          <w:sz w:val="22"/>
+        </w:rPr>
+        <w:t>cat scripts/trivy-secret-rules.yaml</w:t>
+      </w:r>
+    </w:p>
+    <w:p>
+      <w:pPr>
+        <w:keepNext/>
+        <w:spacing w:after="0"/>
+        <w:ind w:left="576"/>
+        <w:jc w:val="left"/>
+      </w:pPr>
+      <w:r>
+        <w:rPr>
+          <w:sz w:val="22"/>
+        </w:rPr>
+        <w:t>grep -E "^(Failures|DS-)" output/latest/04-misconfigurations.txt</w:t>
+      </w:r>
+    </w:p>
+    <w:p>
+      <w:pPr>
+        <w:keepNext/>
+        <w:spacing w:after="0"/>
+        <w:ind w:left="576"/>
+        <w:jc w:val="left"/>
+      </w:pPr>
+      <w:r>
+        <w:rPr>
+          <w:sz w:val="22"/>
+        </w:rPr>
+        <w:t>grep -E '"(bomFormat|specVersion|purl)"' output/latest/05-sbom-cyclonedx.json</w:t>
+      </w:r>
+    </w:p>
+    <w:p>
+      <w:pPr>
+        <w:spacing w:after="0"/>
+        <w:ind w:left="576"/>
+        <w:jc w:val="left"/>
+      </w:pPr>
+      <w:r>
+        <w:rPr>
+          <w:sz w:val="22"/>
+        </w:rPr>
+        <w:t>cat output/latest/artefact-hashes.txt</w:t>
+      </w:r>
+    </w:p>
+    <w:p>
+      <w:pPr>
+        <w:spacing w:after="0"/>
+      </w:pPr>
+    </w:p>
     <w:p>
       <w:r>
         <w:t>Two scans need --offline-scan because Trivy otherwise contacts Maven Central, which rate-limits and can stop the scan. The JAR is read with trivy rootfs, because trivy fs only reads dependency lists such as pom.xml and returns nothing for a compiled .jar.</w:t>
@@ -5341,9 +4761,68 @@
     </w:p>
     <w:p>
       <w:pPr>
+        <w:keepNext/>
+        <w:jc w:val="center"/>
+      </w:pPr>
+      <w:r>
+        <w:rPr>
+          <w:noProof/>
+        </w:rPr>
+        <w:drawing>
+          <wp:inline distT="0" distB="0" distL="0" distR="0" wp14:anchorId="491A1AE0" wp14:editId="0985E1DD">
+            <wp:extent cx="5486400" cy="4205104"/>
+            <wp:effectExtent l="0" t="0" r="0" b="0"/>
+            <wp:docPr id="2" name="Picture 2"/>
+            <wp:cNvGraphicFramePr>
+              <a:graphicFrameLocks xmlns:a="http://schemas.openxmlformats.org/drawingml/2006/main" noChangeAspect="1"/>
+            </wp:cNvGraphicFramePr>
+            <a:graphic xmlns:a="http://schemas.openxmlformats.org/drawingml/2006/main">
+              <a:graphicData uri="http://schemas.openxmlformats.org/drawingml/2006/picture">
+                <pic:pic xmlns:pic="http://schemas.openxmlformats.org/drawingml/2006/picture">
+                  <pic:nvPicPr>
+                    <pic:cNvPr id="0" name="fig-01.png"/>
+                    <pic:cNvPicPr/>
+                  </pic:nvPicPr>
+                  <pic:blipFill>
+                    <a:blip r:embed="rId9"/>
+                    <a:stretch>
+                      <a:fillRect/>
+                    </a:stretch>
+                  </pic:blipFill>
+                  <pic:spPr>
+                    <a:xfrm>
+                      <a:off x="0" y="0"/>
+                      <a:ext cx="5486400" cy="4205104"/>
+                    </a:xfrm>
+                    <a:prstGeom prst="rect">
+                      <a:avLst/>
+                    </a:prstGeom>
+                  </pic:spPr>
+                </pic:pic>
+              </a:graphicData>
+            </a:graphic>
+          </wp:inline>
+        </w:drawing>
+      </w:r>
+    </w:p>
+    <w:p>
+      <w:pPr>
+        <w:spacing w:after="200"/>
+        <w:jc w:val="center"/>
+      </w:pPr>
+      <w:r>
+        <w:rPr>
+          <w:i/>
+          <w:sz w:val="20"/>
+        </w:rPr>
+        <w:t>Figure 1. The examination script and its summary: 21 filesystem findings, 88 in the manifest, 11 secrets, 5 misconfigurations, and evidence integrity PASS.</w:t>
+      </w:r>
+    </w:p>
+    <w:p>
+      <w:pPr>
         <w:pStyle w:val="Heading2"/>
       </w:pPr>
-      <w:bookmarkStart w:id="10" w:name="_Toc241586176"/>
+      <w:bookmarkStart w:id="10" w:name="_Toc241587862"/>
       <w:r>
         <w:t>2.3 Evidence log and chain of custody</w:t>
       </w:r>
@@ -5614,14 +5093,14 @@
     <w:p/>
     <w:p>
       <w:r>
-        <w:t>Git records every change to the evidence, and .gitattributes stops Git rewriting line endings, which would otherwise change the hashes across machines. No evidence file was ever opened for writing.</w:t>
+        <w:t>Git records every change to the evidence, and .gitattributes stops Git rewriting line endings, which would otherwise change the hashes across machines. After the final evidence baseline was established, no evidence file was modified during the examination.</w:t>
       </w:r>
     </w:p>
     <w:p>
       <w:pPr>
         <w:pStyle w:val="Heading2"/>
       </w:pPr>
-      <w:bookmarkStart w:id="11" w:name="_Toc241586177"/>
+      <w:bookmarkStart w:id="11" w:name="_Toc241587863"/>
       <w:r>
         <w:t>2.4 Evidence and assumptions</w:t>
       </w:r>
@@ -5905,7 +5384,7 @@
       <w:pPr>
         <w:pStyle w:val="Heading1"/>
       </w:pPr>
-      <w:bookmarkStart w:id="12" w:name="_Toc241586178"/>
+      <w:bookmarkStart w:id="12" w:name="_Toc241587864"/>
       <w:r>
         <w:t>3. Findings: the thirteen activities</w:t>
       </w:r>
@@ -5915,7 +5394,7 @@
       <w:pPr>
         <w:pStyle w:val="Heading2"/>
       </w:pPr>
-      <w:bookmarkStart w:id="13" w:name="_Toc241586179"/>
+      <w:bookmarkStart w:id="13" w:name="_Toc241587865"/>
       <w:r>
         <w:t>Activity 1: evidence identification</w:t>
       </w:r>
@@ -5927,6 +5406,65 @@
       </w:pPr>
       <w:r>
         <w:t>A logical image (a copy of files and folders, not a whole disk) of 7 files at evidence/acis-portal/, about 1.6 MB, most of it the 1,594,816-byte Struts library. There is no container file such as E01 or raw dd. The SHA-256 of the evidence hash list is e3833f1be425fb980ab7071aaa3ca109ef6c57979e0a70ef7f569b141da2ce26.</w:t>
+      </w:r>
+    </w:p>
+    <w:p>
+      <w:pPr>
+        <w:keepNext/>
+        <w:jc w:val="center"/>
+      </w:pPr>
+      <w:r>
+        <w:rPr>
+          <w:noProof/>
+        </w:rPr>
+        <w:drawing>
+          <wp:inline distT="0" distB="0" distL="0" distR="0" wp14:anchorId="703690A2" wp14:editId="78577D47">
+            <wp:extent cx="5486400" cy="3265869"/>
+            <wp:effectExtent l="0" t="0" r="0" b="0"/>
+            <wp:docPr id="3" name="Picture 3"/>
+            <wp:cNvGraphicFramePr>
+              <a:graphicFrameLocks xmlns:a="http://schemas.openxmlformats.org/drawingml/2006/main" noChangeAspect="1"/>
+            </wp:cNvGraphicFramePr>
+            <a:graphic xmlns:a="http://schemas.openxmlformats.org/drawingml/2006/main">
+              <a:graphicData uri="http://schemas.openxmlformats.org/drawingml/2006/picture">
+                <pic:pic xmlns:pic="http://schemas.openxmlformats.org/drawingml/2006/picture">
+                  <pic:nvPicPr>
+                    <pic:cNvPr id="0" name="fig-02.png"/>
+                    <pic:cNvPicPr/>
+                  </pic:nvPicPr>
+                  <pic:blipFill>
+                    <a:blip r:embed="rId10"/>
+                    <a:stretch>
+                      <a:fillRect/>
+                    </a:stretch>
+                  </pic:blipFill>
+                  <pic:spPr>
+                    <a:xfrm>
+                      <a:off x="0" y="0"/>
+                      <a:ext cx="5486400" cy="3265869"/>
+                    </a:xfrm>
+                    <a:prstGeom prst="rect">
+                      <a:avLst/>
+                    </a:prstGeom>
+                  </pic:spPr>
+                </pic:pic>
+              </a:graphicData>
+            </a:graphic>
+          </wp:inline>
+        </w:drawing>
+      </w:r>
+    </w:p>
+    <w:p>
+      <w:pPr>
+        <w:spacing w:after="200"/>
+        <w:jc w:val="center"/>
+      </w:pPr>
+      <w:r>
+        <w:rPr>
+          <w:i/>
+          <w:sz w:val="20"/>
+        </w:rPr>
+        <w:t>Figure 2. The seven evidence files, including the hidden .env file.</w:t>
       </w:r>
     </w:p>
     <w:p>
@@ -5962,7 +5500,7 @@
       <w:pPr>
         <w:pStyle w:val="Heading2"/>
       </w:pPr>
-      <w:bookmarkStart w:id="14" w:name="_Toc241586180"/>
+      <w:bookmarkStart w:id="14" w:name="_Toc241587866"/>
       <w:r>
         <w:t>Activity 2: hash verification</w:t>
       </w:r>
@@ -6572,6 +6110,124 @@
     </w:tbl>
     <w:p/>
     <w:p>
+      <w:pPr>
+        <w:keepNext/>
+        <w:jc w:val="center"/>
+      </w:pPr>
+      <w:r>
+        <w:rPr>
+          <w:noProof/>
+        </w:rPr>
+        <w:drawing>
+          <wp:inline distT="0" distB="0" distL="0" distR="0" wp14:anchorId="4F6DF252" wp14:editId="47F6126C">
+            <wp:extent cx="5486400" cy="1250616"/>
+            <wp:effectExtent l="0" t="0" r="0" b="0"/>
+            <wp:docPr id="4" name="Picture 4"/>
+            <wp:cNvGraphicFramePr>
+              <a:graphicFrameLocks xmlns:a="http://schemas.openxmlformats.org/drawingml/2006/main" noChangeAspect="1"/>
+            </wp:cNvGraphicFramePr>
+            <a:graphic xmlns:a="http://schemas.openxmlformats.org/drawingml/2006/main">
+              <a:graphicData uri="http://schemas.openxmlformats.org/drawingml/2006/picture">
+                <pic:pic xmlns:pic="http://schemas.openxmlformats.org/drawingml/2006/picture">
+                  <pic:nvPicPr>
+                    <pic:cNvPr id="0" name="fig-03.png"/>
+                    <pic:cNvPicPr/>
+                  </pic:nvPicPr>
+                  <pic:blipFill>
+                    <a:blip r:embed="rId11"/>
+                    <a:stretch>
+                      <a:fillRect/>
+                    </a:stretch>
+                  </pic:blipFill>
+                  <pic:spPr>
+                    <a:xfrm>
+                      <a:off x="0" y="0"/>
+                      <a:ext cx="5486400" cy="1250616"/>
+                    </a:xfrm>
+                    <a:prstGeom prst="rect">
+                      <a:avLst/>
+                    </a:prstGeom>
+                  </pic:spPr>
+                </pic:pic>
+              </a:graphicData>
+            </a:graphic>
+          </wp:inline>
+        </w:drawing>
+      </w:r>
+    </w:p>
+    <w:p>
+      <w:pPr>
+        <w:spacing w:after="200"/>
+        <w:jc w:val="center"/>
+      </w:pPr>
+      <w:r>
+        <w:rPr>
+          <w:i/>
+          <w:sz w:val="20"/>
+        </w:rPr>
+        <w:t>Figure 3. Baseline SHA-256 hashes of the seven evidence files, recorded before the examination.</w:t>
+      </w:r>
+    </w:p>
+    <w:p>
+      <w:pPr>
+        <w:keepNext/>
+        <w:jc w:val="center"/>
+      </w:pPr>
+      <w:r>
+        <w:rPr>
+          <w:noProof/>
+        </w:rPr>
+        <w:drawing>
+          <wp:inline distT="0" distB="0" distL="0" distR="0" wp14:anchorId="462DA2E2" wp14:editId="5FCE9649">
+            <wp:extent cx="5486400" cy="2572624"/>
+            <wp:effectExtent l="0" t="0" r="0" b="0"/>
+            <wp:docPr id="5" name="Picture 5"/>
+            <wp:cNvGraphicFramePr>
+              <a:graphicFrameLocks xmlns:a="http://schemas.openxmlformats.org/drawingml/2006/main" noChangeAspect="1"/>
+            </wp:cNvGraphicFramePr>
+            <a:graphic xmlns:a="http://schemas.openxmlformats.org/drawingml/2006/main">
+              <a:graphicData uri="http://schemas.openxmlformats.org/drawingml/2006/picture">
+                <pic:pic xmlns:pic="http://schemas.openxmlformats.org/drawingml/2006/picture">
+                  <pic:nvPicPr>
+                    <pic:cNvPr id="0" name="fig-04.png"/>
+                    <pic:cNvPicPr/>
+                  </pic:nvPicPr>
+                  <pic:blipFill>
+                    <a:blip r:embed="rId12"/>
+                    <a:stretch>
+                      <a:fillRect/>
+                    </a:stretch>
+                  </pic:blipFill>
+                  <pic:spPr>
+                    <a:xfrm>
+                      <a:off x="0" y="0"/>
+                      <a:ext cx="5486400" cy="2572624"/>
+                    </a:xfrm>
+                    <a:prstGeom prst="rect">
+                      <a:avLst/>
+                    </a:prstGeom>
+                  </pic:spPr>
+                </pic:pic>
+              </a:graphicData>
+            </a:graphic>
+          </wp:inline>
+        </w:drawing>
+      </w:r>
+    </w:p>
+    <w:p>
+      <w:pPr>
+        <w:spacing w:after="200"/>
+        <w:jc w:val="center"/>
+      </w:pPr>
+      <w:r>
+        <w:rPr>
+          <w:i/>
+          <w:sz w:val="20"/>
+        </w:rPr>
+        <w:t>Figure 4. Integrity check after the examination: all seven files return OK.</w:t>
+      </w:r>
+    </w:p>
+    <w:p>
       <w:r>
         <w:rPr>
           <w:i/>
@@ -6604,7 +6260,7 @@
       <w:pPr>
         <w:pStyle w:val="Heading2"/>
       </w:pPr>
-      <w:bookmarkStart w:id="15" w:name="_Toc241586181"/>
+      <w:bookmarkStart w:id="15" w:name="_Toc241587867"/>
       <w:r>
         <w:t>Activity 3: creating the case</w:t>
       </w:r>
@@ -6619,7 +6275,7 @@
       <w:pPr>
         <w:pStyle w:val="Heading2"/>
       </w:pPr>
-      <w:bookmarkStart w:id="16" w:name="_Toc241586182"/>
+      <w:bookmarkStart w:id="16" w:name="_Toc241587868"/>
       <w:r>
         <w:t>Activity 4: file system examination</w:t>
       </w:r>
@@ -6898,7 +6554,184 @@
     <w:p/>
     <w:p>
       <w:r>
-        <w:t>A scan of the JAR in spring 2017 would have shown 1 critical finding, CVE-2017-5638, the flaw the attackers used. The other 6 critical findings were published from September 2017 onward. The trivy fs scan of pom.xml found 88 flaws in the four declared libraries (34 critical); 4 were public before the intrusion, 3 of them critical.</w:t>
+        <w:t>Filtering our recorded findings by publication date leaves 1 critical Struts finding known before the intrusion, CVE-2017-5638, the flaw the attackers used; the other 6 critical findings were published from September 2017 onward. We did not reproduce a 2017 scanner or its database; this is our 2026 scan filtered by date. The trivy fs scan of pom.xml found 88 flaws in the four declared libraries (34 critical); 4 were public before the intrusion, 3 of them critical.</w:t>
+      </w:r>
+    </w:p>
+    <w:p>
+      <w:pPr>
+        <w:keepNext/>
+        <w:jc w:val="center"/>
+      </w:pPr>
+      <w:r>
+        <w:rPr>
+          <w:noProof/>
+        </w:rPr>
+        <w:drawing>
+          <wp:inline distT="0" distB="0" distL="0" distR="0" wp14:anchorId="136854BA" wp14:editId="24870DC2">
+            <wp:extent cx="5486400" cy="4342667"/>
+            <wp:effectExtent l="0" t="0" r="0" b="0"/>
+            <wp:docPr id="6" name="Picture 6"/>
+            <wp:cNvGraphicFramePr>
+              <a:graphicFrameLocks xmlns:a="http://schemas.openxmlformats.org/drawingml/2006/main" noChangeAspect="1"/>
+            </wp:cNvGraphicFramePr>
+            <a:graphic xmlns:a="http://schemas.openxmlformats.org/drawingml/2006/main">
+              <a:graphicData uri="http://schemas.openxmlformats.org/drawingml/2006/picture">
+                <pic:pic xmlns:pic="http://schemas.openxmlformats.org/drawingml/2006/picture">
+                  <pic:nvPicPr>
+                    <pic:cNvPr id="0" name="fig-05.png"/>
+                    <pic:cNvPicPr/>
+                  </pic:nvPicPr>
+                  <pic:blipFill>
+                    <a:blip r:embed="rId13"/>
+                    <a:stretch>
+                      <a:fillRect/>
+                    </a:stretch>
+                  </pic:blipFill>
+                  <pic:spPr>
+                    <a:xfrm>
+                      <a:off x="0" y="0"/>
+                      <a:ext cx="5486400" cy="4342667"/>
+                    </a:xfrm>
+                    <a:prstGeom prst="rect">
+                      <a:avLst/>
+                    </a:prstGeom>
+                  </pic:spPr>
+                </pic:pic>
+              </a:graphicData>
+            </a:graphic>
+          </wp:inline>
+        </w:drawing>
+      </w:r>
+    </w:p>
+    <w:p>
+      <w:pPr>
+        <w:spacing w:after="200"/>
+        <w:jc w:val="center"/>
+      </w:pPr>
+      <w:r>
+        <w:rPr>
+          <w:i/>
+          <w:sz w:val="20"/>
+        </w:rPr>
+        <w:t>Figure 5. The 21 known Struts flaws, sorted by publication date; two predate the intrusion.</w:t>
+      </w:r>
+    </w:p>
+    <w:p>
+      <w:pPr>
+        <w:keepNext/>
+        <w:jc w:val="center"/>
+      </w:pPr>
+      <w:r>
+        <w:rPr>
+          <w:noProof/>
+        </w:rPr>
+        <w:drawing>
+          <wp:inline distT="0" distB="0" distL="0" distR="0" wp14:anchorId="6C278911" wp14:editId="43C236DB">
+            <wp:extent cx="5486400" cy="1965626"/>
+            <wp:effectExtent l="0" t="0" r="0" b="0"/>
+            <wp:docPr id="7" name="Picture 7"/>
+            <wp:cNvGraphicFramePr>
+              <a:graphicFrameLocks xmlns:a="http://schemas.openxmlformats.org/drawingml/2006/main" noChangeAspect="1"/>
+            </wp:cNvGraphicFramePr>
+            <a:graphic xmlns:a="http://schemas.openxmlformats.org/drawingml/2006/main">
+              <a:graphicData uri="http://schemas.openxmlformats.org/drawingml/2006/picture">
+                <pic:pic xmlns:pic="http://schemas.openxmlformats.org/drawingml/2006/picture">
+                  <pic:nvPicPr>
+                    <pic:cNvPr id="0" name="fig-06.png"/>
+                    <pic:cNvPicPr/>
+                  </pic:nvPicPr>
+                  <pic:blipFill>
+                    <a:blip r:embed="rId14"/>
+                    <a:stretch>
+                      <a:fillRect/>
+                    </a:stretch>
+                  </pic:blipFill>
+                  <pic:spPr>
+                    <a:xfrm>
+                      <a:off x="0" y="0"/>
+                      <a:ext cx="5486400" cy="1965626"/>
+                    </a:xfrm>
+                    <a:prstGeom prst="rect">
+                      <a:avLst/>
+                    </a:prstGeom>
+                  </pic:spPr>
+                </pic:pic>
+              </a:graphicData>
+            </a:graphic>
+          </wp:inline>
+        </w:drawing>
+      </w:r>
+    </w:p>
+    <w:p>
+      <w:pPr>
+        <w:spacing w:after="200"/>
+        <w:jc w:val="center"/>
+      </w:pPr>
+      <w:r>
+        <w:rPr>
+          <w:i/>
+          <w:sz w:val="20"/>
+        </w:rPr>
+        <w:t>Figure 6. CVE-2017-5638 in detail: critical, CVSS 9.8, installed 2.5.10, fixed in 2.3.32 and 2.5.10.1.</w:t>
+      </w:r>
+    </w:p>
+    <w:p>
+      <w:pPr>
+        <w:keepNext/>
+        <w:jc w:val="center"/>
+      </w:pPr>
+      <w:r>
+        <w:rPr>
+          <w:noProof/>
+        </w:rPr>
+        <w:drawing>
+          <wp:inline distT="0" distB="0" distL="0" distR="0" wp14:anchorId="0CBF35C5" wp14:editId="1E7E819D">
+            <wp:extent cx="5486400" cy="1732366"/>
+            <wp:effectExtent l="0" t="0" r="0" b="0"/>
+            <wp:docPr id="8" name="Picture 8"/>
+            <wp:cNvGraphicFramePr>
+              <a:graphicFrameLocks xmlns:a="http://schemas.openxmlformats.org/drawingml/2006/main" noChangeAspect="1"/>
+            </wp:cNvGraphicFramePr>
+            <a:graphic xmlns:a="http://schemas.openxmlformats.org/drawingml/2006/main">
+              <a:graphicData uri="http://schemas.openxmlformats.org/drawingml/2006/picture">
+                <pic:pic xmlns:pic="http://schemas.openxmlformats.org/drawingml/2006/picture">
+                  <pic:nvPicPr>
+                    <pic:cNvPr id="0" name="fig-07.png"/>
+                    <pic:cNvPicPr/>
+                  </pic:nvPicPr>
+                  <pic:blipFill>
+                    <a:blip r:embed="rId15"/>
+                    <a:stretch>
+                      <a:fillRect/>
+                    </a:stretch>
+                  </pic:blipFill>
+                  <pic:spPr>
+                    <a:xfrm>
+                      <a:off x="0" y="0"/>
+                      <a:ext cx="5486400" cy="1732366"/>
+                    </a:xfrm>
+                    <a:prstGeom prst="rect">
+                      <a:avLst/>
+                    </a:prstGeom>
+                  </pic:spPr>
+                </pic:pic>
+              </a:graphicData>
+            </a:graphic>
+          </wp:inline>
+        </w:drawing>
+      </w:r>
+    </w:p>
+    <w:p>
+      <w:pPr>
+        <w:spacing w:after="200"/>
+        <w:jc w:val="center"/>
+      </w:pPr>
+      <w:r>
+        <w:rPr>
+          <w:i/>
+          <w:sz w:val="20"/>
+        </w:rPr>
+        <w:t>Figure 7. The four declared libraries in pom.xml and their share of the 88 manifest findings.</w:t>
       </w:r>
     </w:p>
     <w:p>
@@ -6934,7 +6767,7 @@
       <w:pPr>
         <w:pStyle w:val="Heading2"/>
       </w:pPr>
-      <w:bookmarkStart w:id="17" w:name="_Toc241586183"/>
+      <w:bookmarkStart w:id="17" w:name="_Toc241587869"/>
       <w:r>
         <w:t>Activity 5: user accounts</w:t>
       </w:r>
@@ -7211,7 +7044,7 @@
         <w:t>Primary user?</w:t>
       </w:r>
       <w:r>
-        <w:t xml:space="preserve"> root; Trivy flags this as check DS-0002. </w:t>
+        <w:t xml:space="preserve"> The Dockerfile sets root as the container's execution account (USER root, line 6), which Trivy flags as check DS-0002. This is a configured service account, not a human user, and no human user can be identified from this evidence. </w:t>
       </w:r>
       <w:r>
         <w:rPr>
@@ -7236,7 +7069,7 @@
       <w:pPr>
         <w:pStyle w:val="Heading2"/>
       </w:pPr>
-      <w:bookmarkStart w:id="18" w:name="_Toc241586184"/>
+      <w:bookmarkStart w:id="18" w:name="_Toc241587870"/>
       <w:r>
         <w:t>Activity 6: deleted files</w:t>
       </w:r>
@@ -7244,7 +7077,7 @@
     </w:p>
     <w:p>
       <w:r>
-        <w:t>None. A logical image holds only current files, so there is no unallocated space to recover from, and Trivy does not carve files. Recovery would need a physical disk image and a tool such as PhotoRec.</w:t>
+        <w:t>The supplied dataset contains seven selected application files and no unallocated-space image or deleted-file artifacts, so deleted-file recovery was not performed. It would need a physical disk image and a carving tool such as PhotoRec; Trivy does not carve files.</w:t>
       </w:r>
     </w:p>
     <w:tbl>
@@ -7386,7 +7219,7 @@
               <w:rPr>
                 <w:sz w:val="20"/>
               </w:rPr>
-              <w:t>None found</w:t>
+              <w:t>None in this dataset</w:t>
             </w:r>
           </w:p>
         </w:tc>
@@ -7403,7 +7236,7 @@
               <w:rPr>
                 <w:sz w:val="20"/>
               </w:rPr>
-              <w:t>No deleted entries exist in a logical copy</w:t>
+              <w:t>No unallocated-space image was supplied</w:t>
             </w:r>
           </w:p>
         </w:tc>
@@ -7420,7 +7253,7 @@
               <w:rPr>
                 <w:sz w:val="20"/>
               </w:rPr>
-              <w:t>No; there is no unallocated space</w:t>
+              <w:t>Not performed; recovery needs a physical image</w:t>
             </w:r>
           </w:p>
         </w:tc>
@@ -7460,7 +7293,7 @@
       <w:pPr>
         <w:pStyle w:val="Heading2"/>
       </w:pPr>
-      <w:bookmarkStart w:id="19" w:name="_Toc241586185"/>
+      <w:bookmarkStart w:id="19" w:name="_Toc241587871"/>
       <w:r>
         <w:t>Activity 7: metadata examination</w:t>
       </w:r>
@@ -7703,6 +7536,65 @@
       </w:tr>
     </w:tbl>
     <w:p/>
+    <w:p>
+      <w:pPr>
+        <w:keepNext/>
+        <w:jc w:val="center"/>
+      </w:pPr>
+      <w:r>
+        <w:rPr>
+          <w:noProof/>
+        </w:rPr>
+        <w:drawing>
+          <wp:inline distT="0" distB="0" distL="0" distR="0" wp14:anchorId="763F1C9A" wp14:editId="6E394577">
+            <wp:extent cx="5486400" cy="952606"/>
+            <wp:effectExtent l="0" t="0" r="0" b="0"/>
+            <wp:docPr id="9" name="Picture 9"/>
+            <wp:cNvGraphicFramePr>
+              <a:graphicFrameLocks xmlns:a="http://schemas.openxmlformats.org/drawingml/2006/main" noChangeAspect="1"/>
+            </wp:cNvGraphicFramePr>
+            <a:graphic xmlns:a="http://schemas.openxmlformats.org/drawingml/2006/main">
+              <a:graphicData uri="http://schemas.openxmlformats.org/drawingml/2006/picture">
+                <pic:pic xmlns:pic="http://schemas.openxmlformats.org/drawingml/2006/picture">
+                  <pic:nvPicPr>
+                    <pic:cNvPr id="0" name="fig-08.png"/>
+                    <pic:cNvPicPr/>
+                  </pic:nvPicPr>
+                  <pic:blipFill>
+                    <a:blip r:embed="rId16"/>
+                    <a:stretch>
+                      <a:fillRect/>
+                    </a:stretch>
+                  </pic:blipFill>
+                  <pic:spPr>
+                    <a:xfrm>
+                      <a:off x="0" y="0"/>
+                      <a:ext cx="5486400" cy="952606"/>
+                    </a:xfrm>
+                    <a:prstGeom prst="rect">
+                      <a:avLst/>
+                    </a:prstGeom>
+                  </pic:spPr>
+                </pic:pic>
+              </a:graphicData>
+            </a:graphic>
+          </wp:inline>
+        </w:drawing>
+      </w:r>
+    </w:p>
+    <w:p>
+      <w:pPr>
+        <w:spacing w:after="200"/>
+        <w:jc w:val="center"/>
+      </w:pPr>
+      <w:r>
+        <w:rPr>
+          <w:i/>
+          <w:sz w:val="20"/>
+        </w:rPr>
+        <w:t>Figure 8. Metadata inside the JAR: struts2-core 2.5.10, built 27 January 2017.</w:t>
+      </w:r>
+    </w:p>
     <w:p>
       <w:r>
         <w:t xml:space="preserve">The build date is 39 days before the flaw was announced, so this version existed before the flaw was public. </w:t>
@@ -7739,7 +7631,7 @@
       <w:pPr>
         <w:pStyle w:val="Heading2"/>
       </w:pPr>
-      <w:bookmarkStart w:id="20" w:name="_Toc241586186"/>
+      <w:bookmarkStart w:id="20" w:name="_Toc241587872"/>
       <w:r>
         <w:t>Activity 8: browser activity</w:t>
       </w:r>
@@ -7747,7 +7639,7 @@
     </w:p>
     <w:p>
       <w:r>
-        <w:t xml:space="preserve">Not applicable. Browser history, cookies and downloads are made by a person browsing on a workstation; a web server answers requests and never browses, so none exist here. The server-side equivalent is the access log, which this evidence set does not include. </w:t>
+        <w:t xml:space="preserve">No browser-history databases, cookies, download records or server access logs were included in the reconstructed dataset. Browser activity therefore could not be assessed. </w:t>
       </w:r>
       <w:r>
         <w:rPr>
@@ -7756,7 +7648,7 @@
         <w:t>Which sites were visited?</w:t>
       </w:r>
       <w:r>
-        <w:t xml:space="preserve"> None can be identified. </w:t>
+        <w:t xml:space="preserve"> None can be identified from this dataset. </w:t>
       </w:r>
       <w:r>
         <w:rPr>
@@ -7765,7 +7657,7 @@
         <w:t>Suspicious downloads?</w:t>
       </w:r>
       <w:r>
-        <w:t xml:space="preserve"> No download records exist. </w:t>
+        <w:t xml:space="preserve"> No download records are present. </w:t>
       </w:r>
       <w:r>
         <w:rPr>
@@ -7774,14 +7666,14 @@
         <w:t>Can browser history establish user activity?</w:t>
       </w:r>
       <w:r>
-        <w:t xml:space="preserve"> Yes on a workstation, since its entries carry times; but it records the browser, not who typed, and needs support from other records.</w:t>
+        <w:t xml:space="preserve"> On a workstation, yes: its entries carry times, though they record the browser, not who typed, and need support from other records.</w:t>
       </w:r>
     </w:p>
     <w:p>
       <w:pPr>
         <w:pStyle w:val="Heading2"/>
       </w:pPr>
-      <w:bookmarkStart w:id="21" w:name="_Toc241586187"/>
+      <w:bookmarkStart w:id="21" w:name="_Toc241587873"/>
       <w:r>
         <w:t>Activity 9: keyword search</w:t>
       </w:r>
@@ -8756,6 +8648,65 @@
     </w:tbl>
     <w:p/>
     <w:p>
+      <w:pPr>
+        <w:keepNext/>
+        <w:jc w:val="center"/>
+      </w:pPr>
+      <w:r>
+        <w:rPr>
+          <w:noProof/>
+        </w:rPr>
+        <w:drawing>
+          <wp:inline distT="0" distB="0" distL="0" distR="0" wp14:anchorId="262ADA72" wp14:editId="550B16C3">
+            <wp:extent cx="5486400" cy="3027499"/>
+            <wp:effectExtent l="0" t="0" r="0" b="0"/>
+            <wp:docPr id="10" name="Picture 10"/>
+            <wp:cNvGraphicFramePr>
+              <a:graphicFrameLocks xmlns:a="http://schemas.openxmlformats.org/drawingml/2006/main" noChangeAspect="1"/>
+            </wp:cNvGraphicFramePr>
+            <a:graphic xmlns:a="http://schemas.openxmlformats.org/drawingml/2006/main">
+              <a:graphicData uri="http://schemas.openxmlformats.org/drawingml/2006/picture">
+                <pic:pic xmlns:pic="http://schemas.openxmlformats.org/drawingml/2006/picture">
+                  <pic:nvPicPr>
+                    <pic:cNvPr id="0" name="fig-09.png"/>
+                    <pic:cNvPicPr/>
+                  </pic:nvPicPr>
+                  <pic:blipFill>
+                    <a:blip r:embed="rId17"/>
+                    <a:stretch>
+                      <a:fillRect/>
+                    </a:stretch>
+                  </pic:blipFill>
+                  <pic:spPr>
+                    <a:xfrm>
+                      <a:off x="0" y="0"/>
+                      <a:ext cx="5486400" cy="3027499"/>
+                    </a:xfrm>
+                    <a:prstGeom prst="rect">
+                      <a:avLst/>
+                    </a:prstGeom>
+                  </pic:spPr>
+                </pic:pic>
+              </a:graphicData>
+            </a:graphic>
+          </wp:inline>
+        </w:drawing>
+      </w:r>
+    </w:p>
+    <w:p>
+      <w:pPr>
+        <w:spacing w:after="200"/>
+        <w:jc w:val="center"/>
+      </w:pPr>
+      <w:r>
+        <w:rPr>
+          <w:i/>
+          <w:sz w:val="20"/>
+        </w:rPr>
+        <w:t>Figure 9. The secret scan: eleven findings across four files. Reconstructed evidence, synthetic credentials.</w:t>
+      </w:r>
+    </w:p>
+    <w:p>
       <w:r>
         <w:t xml:space="preserve">Our first rule missed the read-only password on line 11; we found that by hand and widened the pattern. The scanner also missed the two secrets in the Dockerfile, which the keyword and configuration checks caught. </w:t>
       </w:r>
@@ -8771,9 +8722,68 @@
     </w:p>
     <w:p>
       <w:pPr>
+        <w:keepNext/>
+        <w:jc w:val="center"/>
+      </w:pPr>
+      <w:r>
+        <w:rPr>
+          <w:noProof/>
+        </w:rPr>
+        <w:drawing>
+          <wp:inline distT="0" distB="0" distL="0" distR="0" wp14:anchorId="25751E65" wp14:editId="191BBD38">
+            <wp:extent cx="5486400" cy="3888693"/>
+            <wp:effectExtent l="0" t="0" r="0" b="0"/>
+            <wp:docPr id="11" name="Picture 11"/>
+            <wp:cNvGraphicFramePr>
+              <a:graphicFrameLocks xmlns:a="http://schemas.openxmlformats.org/drawingml/2006/main" noChangeAspect="1"/>
+            </wp:cNvGraphicFramePr>
+            <a:graphic xmlns:a="http://schemas.openxmlformats.org/drawingml/2006/main">
+              <a:graphicData uri="http://schemas.openxmlformats.org/drawingml/2006/picture">
+                <pic:pic xmlns:pic="http://schemas.openxmlformats.org/drawingml/2006/picture">
+                  <pic:nvPicPr>
+                    <pic:cNvPr id="0" name="fig-10.png"/>
+                    <pic:cNvPicPr/>
+                  </pic:nvPicPr>
+                  <pic:blipFill>
+                    <a:blip r:embed="rId18"/>
+                    <a:stretch>
+                      <a:fillRect/>
+                    </a:stretch>
+                  </pic:blipFill>
+                  <pic:spPr>
+                    <a:xfrm>
+                      <a:off x="0" y="0"/>
+                      <a:ext cx="5486400" cy="3888693"/>
+                    </a:xfrm>
+                    <a:prstGeom prst="rect">
+                      <a:avLst/>
+                    </a:prstGeom>
+                  </pic:spPr>
+                </pic:pic>
+              </a:graphicData>
+            </a:graphic>
+          </wp:inline>
+        </w:drawing>
+      </w:r>
+    </w:p>
+    <w:p>
+      <w:pPr>
+        <w:spacing w:after="200"/>
+        <w:jc w:val="center"/>
+      </w:pPr>
+      <w:r>
+        <w:rPr>
+          <w:i/>
+          <w:sz w:val="20"/>
+        </w:rPr>
+        <w:t>Figure 10. The two custom secret rules we added for the ACIS credentials.</w:t>
+      </w:r>
+    </w:p>
+    <w:p>
+      <w:pPr>
         <w:pStyle w:val="Heading2"/>
       </w:pPr>
-      <w:bookmarkStart w:id="22" w:name="_Toc241586188"/>
+      <w:bookmarkStart w:id="22" w:name="_Toc241587874"/>
       <w:r>
         <w:t>Activity 10: file signatures and configuration</w:t>
       </w:r>
@@ -8795,7 +8805,7 @@
     </w:p>
     <w:p>
       <w:r>
-        <w:t>Trivy's configuration scan of the Dockerfile ran 28 tests: 23 passed, 5 failed, from 4 checks (DS-0031 failed once per secret in an ENV line).</w:t>
+        <w:t>Trivy's configuration scan of the Dockerfile ran 28 tests: 23 passed and 5 failed results across 4 checks, 2 of the results critical (DS-0031 failed once for each secret in an ENV line).</w:t>
       </w:r>
     </w:p>
     <w:tbl>
@@ -9292,9 +9302,68 @@
     <w:p/>
     <w:p>
       <w:pPr>
+        <w:keepNext/>
+        <w:jc w:val="center"/>
+      </w:pPr>
+      <w:r>
+        <w:rPr>
+          <w:noProof/>
+        </w:rPr>
+        <w:drawing>
+          <wp:inline distT="0" distB="0" distL="0" distR="0" wp14:anchorId="5836CD7B" wp14:editId="4975D41B">
+            <wp:extent cx="5486400" cy="1627190"/>
+            <wp:effectExtent l="0" t="0" r="0" b="0"/>
+            <wp:docPr id="12" name="Picture 12"/>
+            <wp:cNvGraphicFramePr>
+              <a:graphicFrameLocks xmlns:a="http://schemas.openxmlformats.org/drawingml/2006/main" noChangeAspect="1"/>
+            </wp:cNvGraphicFramePr>
+            <a:graphic xmlns:a="http://schemas.openxmlformats.org/drawingml/2006/main">
+              <a:graphicData uri="http://schemas.openxmlformats.org/drawingml/2006/picture">
+                <pic:pic xmlns:pic="http://schemas.openxmlformats.org/drawingml/2006/picture">
+                  <pic:nvPicPr>
+                    <pic:cNvPr id="0" name="fig-11.png"/>
+                    <pic:cNvPicPr/>
+                  </pic:nvPicPr>
+                  <pic:blipFill>
+                    <a:blip r:embed="rId19"/>
+                    <a:stretch>
+                      <a:fillRect/>
+                    </a:stretch>
+                  </pic:blipFill>
+                  <pic:spPr>
+                    <a:xfrm>
+                      <a:off x="0" y="0"/>
+                      <a:ext cx="5486400" cy="1627190"/>
+                    </a:xfrm>
+                    <a:prstGeom prst="rect">
+                      <a:avLst/>
+                    </a:prstGeom>
+                  </pic:spPr>
+                </pic:pic>
+              </a:graphicData>
+            </a:graphic>
+          </wp:inline>
+        </w:drawing>
+      </w:r>
+    </w:p>
+    <w:p>
+      <w:pPr>
+        <w:spacing w:after="200"/>
+        <w:jc w:val="center"/>
+      </w:pPr>
+      <w:r>
+        <w:rPr>
+          <w:i/>
+          <w:sz w:val="20"/>
+        </w:rPr>
+        <w:t>Figure 11. The Dockerfile configuration scan: five failed results across four checks.</w:t>
+      </w:r>
+    </w:p>
+    <w:p>
+      <w:pPr>
         <w:pStyle w:val="Heading2"/>
       </w:pPr>
-      <w:bookmarkStart w:id="23" w:name="_Toc241586189"/>
+      <w:bookmarkStart w:id="23" w:name="_Toc241587875"/>
       <w:r>
         <w:t>Activity 11: timeline</w:t>
       </w:r>
@@ -9318,7 +9387,7 @@
       <w:pPr>
         <w:pStyle w:val="Heading2"/>
       </w:pPr>
-      <w:bookmarkStart w:id="24" w:name="_Toc241586190"/>
+      <w:bookmarkStart w:id="24" w:name="_Toc241587876"/>
       <w:r>
         <w:t>Activity 12: correlating the evidence</w:t>
       </w:r>
@@ -9519,7 +9588,7 @@
       <w:pPr>
         <w:pStyle w:val="Heading2"/>
       </w:pPr>
-      <w:bookmarkStart w:id="25" w:name="_Toc241586191"/>
+      <w:bookmarkStart w:id="25" w:name="_Toc241587877"/>
       <w:r>
         <w:t>Activity 13: evidence tagging and exported hashes</w:t>
       </w:r>
@@ -10709,9 +10778,68 @@
     <w:p/>
     <w:p>
       <w:pPr>
+        <w:keepNext/>
+        <w:jc w:val="center"/>
+      </w:pPr>
+      <w:r>
+        <w:rPr>
+          <w:noProof/>
+        </w:rPr>
+        <w:drawing>
+          <wp:inline distT="0" distB="0" distL="0" distR="0" wp14:anchorId="4856E347" wp14:editId="485A01F8">
+            <wp:extent cx="5486400" cy="2526384"/>
+            <wp:effectExtent l="0" t="0" r="0" b="0"/>
+            <wp:docPr id="13" name="Picture 13"/>
+            <wp:cNvGraphicFramePr>
+              <a:graphicFrameLocks xmlns:a="http://schemas.openxmlformats.org/drawingml/2006/main" noChangeAspect="1"/>
+            </wp:cNvGraphicFramePr>
+            <a:graphic xmlns:a="http://schemas.openxmlformats.org/drawingml/2006/main">
+              <a:graphicData uri="http://schemas.openxmlformats.org/drawingml/2006/picture">
+                <pic:pic xmlns:pic="http://schemas.openxmlformats.org/drawingml/2006/picture">
+                  <pic:nvPicPr>
+                    <pic:cNvPr id="0" name="fig-12.png"/>
+                    <pic:cNvPicPr/>
+                  </pic:nvPicPr>
+                  <pic:blipFill>
+                    <a:blip r:embed="rId20"/>
+                    <a:stretch>
+                      <a:fillRect/>
+                    </a:stretch>
+                  </pic:blipFill>
+                  <pic:spPr>
+                    <a:xfrm>
+                      <a:off x="0" y="0"/>
+                      <a:ext cx="5486400" cy="2526384"/>
+                    </a:xfrm>
+                    <a:prstGeom prst="rect">
+                      <a:avLst/>
+                    </a:prstGeom>
+                  </pic:spPr>
+                </pic:pic>
+              </a:graphicData>
+            </a:graphic>
+          </wp:inline>
+        </w:drawing>
+      </w:r>
+    </w:p>
+    <w:p>
+      <w:pPr>
+        <w:spacing w:after="200"/>
+        <w:jc w:val="center"/>
+      </w:pPr>
+      <w:r>
+        <w:rPr>
+          <w:i/>
+          <w:sz w:val="20"/>
+        </w:rPr>
+        <w:t>Figure 12. SHA-256 hashes of every file the examination exported.</w:t>
+      </w:r>
+    </w:p>
+    <w:p>
+      <w:pPr>
         <w:pStyle w:val="Heading1"/>
       </w:pPr>
-      <w:bookmarkStart w:id="26" w:name="_Toc241586192"/>
+      <w:bookmarkStart w:id="26" w:name="_Toc241587878"/>
       <w:r>
         <w:t>4. The same facts under Indian law</w:t>
       </w:r>
@@ -10726,7 +10854,7 @@
       <w:pPr>
         <w:pStyle w:val="Heading2"/>
       </w:pPr>
-      <w:bookmarkStart w:id="27" w:name="_Toc241586193"/>
+      <w:bookmarkStart w:id="27" w:name="_Toc241587879"/>
       <w:r>
         <w:t>4.1 Why Indian law applies</w:t>
       </w:r>
@@ -10741,7 +10869,7 @@
       <w:pPr>
         <w:pStyle w:val="Heading2"/>
       </w:pPr>
-      <w:bookmarkStart w:id="28" w:name="_Toc241586194"/>
+      <w:bookmarkStart w:id="28" w:name="_Toc241587880"/>
       <w:r>
         <w:t>4.2 Law in force now</w:t>
       </w:r>
@@ -11030,7 +11158,7 @@
       <w:pPr>
         <w:pStyle w:val="Heading2"/>
       </w:pPr>
-      <w:bookmarkStart w:id="29" w:name="_Toc241586195"/>
+      <w:bookmarkStart w:id="29" w:name="_Toc241587881"/>
       <w:r>
         <w:t>4.3 From 13 May 2027: the DPDP Act</w:t>
       </w:r>
@@ -11220,7 +11348,7 @@
               <w:rPr>
                 <w:sz w:val="20"/>
               </w:rPr>
-              <w:t>Tell the Board and every affected person, full report in 72 hours</w:t>
+              <w:t>Tell each affected person and the Board without delay, then a detailed report to the Board within 72 hours (an extension may be allowed)</w:t>
             </w:r>
           </w:p>
         </w:tc>
@@ -11253,7 +11381,7 @@
       <w:pPr>
         <w:pStyle w:val="Heading2"/>
       </w:pPr>
-      <w:bookmarkStart w:id="30" w:name="_Toc241586196"/>
+      <w:bookmarkStart w:id="30" w:name="_Toc241587882"/>
       <w:r>
         <w:t>4.4 Reporting and logging deadlines</w:t>
       </w:r>
@@ -11425,7 +11553,7 @@
               <w:rPr>
                 <w:sz w:val="20"/>
               </w:rPr>
-              <w:t>From 2027: report to the Board in 72 hours</w:t>
+              <w:t>From 2027: tell affected people and the Board without delay, detailed report to the Board within 72 hours</w:t>
             </w:r>
           </w:p>
         </w:tc>
@@ -11453,7 +11581,7 @@
       <w:pPr>
         <w:pStyle w:val="Heading2"/>
       </w:pPr>
-      <w:bookmarkStart w:id="31" w:name="_Toc241586197"/>
+      <w:bookmarkStart w:id="31" w:name="_Toc241587883"/>
       <w:r>
         <w:t>4.5 Using this evidence in an Indian court</w:t>
       </w:r>
@@ -11468,7 +11596,7 @@
       <w:pPr>
         <w:pStyle w:val="Heading1"/>
       </w:pPr>
-      <w:bookmarkStart w:id="32" w:name="_Toc241586198"/>
+      <w:bookmarkStart w:id="32" w:name="_Toc241587884"/>
       <w:r>
         <w:t>5. Final findings and conclusion</w:t>
       </w:r>
@@ -11953,7 +12081,7 @@
               <w:rPr>
                 <w:sz w:val="20"/>
               </w:rPr>
-              <w:t>5 failed checks, 2 critical</w:t>
+              <w:t>5 failed results across 4 checks, 2 critical</w:t>
             </w:r>
           </w:p>
         </w:tc>
@@ -12002,17 +12130,17 @@
     <w:p/>
     <w:p>
       <w:r>
-        <w:t>Based on the examination of the forensic image, the evidence indicates that the rebuilt dispute portal contains struts2-core 2.5.10, a genuine Apache release built on 27 January 2017, carrying CVE-2017-5638 at CVSS 9.8. The server runs as root and keeps four database passwords, two cloud key pairs, a private key and a token in plain text. None of the 7 files changed during the examination. Counting only flaws public on 13 May 2017, the library has 2, and 1 of them is critical: CVE-2017-5638, the flaw the at</w:t>
+        <w:t>Based on the examination of the forensic image, the evidence indicates that the rebuilt dispute portal contains struts2-core 2.5.10, a genuine Apache release built on 27 January 2017, carrying CVE-2017-5638 at CVSS 9.8. The Dockerfile specifies root as the execution user, and the config files store four database passwords, two cloud key pairs, a private key and a token in plain text. None of the 7 files changed during the examination. Counting only flaws public on 13 May 2017, the library has 2, and 1 of th</w:t>
       </w:r>
       <w:r>
-        <w:t>tackers used. The attack could have been seen coming; whether anyone would have acted on the warning, the evidence cannot say.</w:t>
+        <w:t>em is critical: CVE-2017-5638, the flaw the attackers used. This shows the flaw was public and identifiable before the intrusion. The evidence does not show whether Equifax scanned for it or would have acted on the result.</w:t>
       </w:r>
     </w:p>
     <w:p>
       <w:pPr>
         <w:pStyle w:val="Heading1"/>
       </w:pPr>
-      <w:bookmarkStart w:id="33" w:name="_Toc241586199"/>
+      <w:bookmarkStart w:id="33" w:name="_Toc241587885"/>
       <w:r>
         <w:t>6. Limitations</w:t>
       </w:r>
@@ -12020,17 +12148,17 @@
     </w:p>
     <w:p>
       <w:r>
-        <w:t>The evidence is a reconstruction built from published reports, not Equifax's own disk. A logical image supports no deleted-file recovery, and a web server has no browser artifacts, so Activities 6 and 8 are recorded as not applicable. Trivy reports only published vulnerabilities, so a clean scan is not proof of safety, and our secret rules find only what their patterns describe. Vulnerability counts change as new flaws are published; the figures here come from the scan on 28 September 2026. The Indian law a</w:t>
+        <w:t xml:space="preserve">The evidence is a reconstruction built from published reports, not Equifax's own disk. This dataset has no unallocated space and no browser or access-log artifacts, so Activities 6 and 8 could not be performed on it. Trivy reports only published vulnerabilities, so a clean scan is not proof of safety, and our secret rules find only what their patterns describe. Vulnerability counts change as new flaws are published; the figures here come from the scan on 28 September 2026. The Indian law analysis describes </w:t>
       </w:r>
       <w:r>
-        <w:t>nalysis describes the position in September 2026.</w:t>
+        <w:t>the position in September 2026.</w:t>
       </w:r>
     </w:p>
     <w:p>
       <w:pPr>
         <w:pStyle w:val="Heading1"/>
       </w:pPr>
-      <w:bookmarkStart w:id="34" w:name="_Toc241586200"/>
+      <w:bookmarkStart w:id="34" w:name="_Toc241587886"/>
       <w:r>
         <w:t>7. Sources</w:t>
       </w:r>
@@ -12091,7 +12219,7 @@
         <w:pStyle w:val="ListBullet"/>
       </w:pPr>
       <w:r>
-        <w:t>The Digital Personal Data Protection Act, 2023, and Rules, 2025. https://www.meity.gov.in/static/uploads/2024/06/2bf1f0e9f04e6fb4f8fef35e82c42aa5.pdf</w:t>
+        <w:t>The Digital Personal Data Protection Act, 2023; the DPDP Rules, 2025 (G.S.R. 846(E)); and the commencement notification (G.S.R. 843(E), 13 November 2025, which sets a phased commencement including an eighteen-month phase). https://www.meity.gov.in/static/uploads/2024/06/2bf1f0e9f04e6fb4f8fef35e82c42aa5.pdf</w:t>
       </w:r>
     </w:p>
     <w:p>
@@ -12111,9 +12239,9 @@
       </w:r>
     </w:p>
     <w:sectPr>
-      <w:headerReference w:type="default" r:id="rId9"/>
-      <w:footerReference w:type="default" r:id="rId10"/>
-      <w:footerReference w:type="first" r:id="rId11"/>
+      <w:headerReference w:type="default" r:id="rId21"/>
+      <w:footerReference w:type="default" r:id="rId22"/>
+      <w:footerReference w:type="first" r:id="rId23"/>
       <w:pgSz w:w="11909" w:h="16834"/>
       <w:pgMar w:top="1440" w:right="1440" w:bottom="1440" w:left="1440" w:header="720" w:footer="720" w:gutter="0"/>
       <w:cols w:space="720"/>
@@ -12161,10 +12289,10 @@
         <w:noProof/>
       </w:rPr>
       <w:drawing>
-        <wp:inline distT="0" distB="0" distL="0" distR="0" wp14:anchorId="27D25D29" wp14:editId="4C4CC38A">
+        <wp:inline distT="0" distB="0" distL="0" distR="0" wp14:anchorId="60C07225" wp14:editId="51E7F1E6">
           <wp:extent cx="5852160" cy="448627"/>
           <wp:effectExtent l="0" t="0" r="0" b="0"/>
-          <wp:docPr id="1661248780" name="Picture 1661248780"/>
+          <wp:docPr id="447317979" name="Picture 447317979"/>
           <wp:cNvGraphicFramePr>
             <a:graphicFrameLocks xmlns:a="http://schemas.openxmlformats.org/drawingml/2006/main" noChangeAspect="1"/>
           </wp:cNvGraphicFramePr>
@@ -12247,10 +12375,10 @@
         <w:noProof/>
       </w:rPr>
       <w:drawing>
-        <wp:inline distT="0" distB="0" distL="0" distR="0" wp14:anchorId="37F65036" wp14:editId="7F70019A">
+        <wp:inline distT="0" distB="0" distL="0" distR="0" wp14:anchorId="4A37D314" wp14:editId="5AA98DE4">
           <wp:extent cx="5852160" cy="448627"/>
           <wp:effectExtent l="0" t="0" r="0" b="0"/>
-          <wp:docPr id="1963645204" name="Picture 1963645204"/>
+          <wp:docPr id="1838522327" name="Picture 1838522327"/>
           <wp:cNvGraphicFramePr>
             <a:graphicFrameLocks xmlns:a="http://schemas.openxmlformats.org/drawingml/2006/main" noChangeAspect="1"/>
           </wp:cNvGraphicFramePr>
@@ -12323,10 +12451,10 @@
         <w:noProof/>
       </w:rPr>
       <w:drawing>
-        <wp:inline distT="0" distB="0" distL="0" distR="0" wp14:anchorId="11E4733B" wp14:editId="042558F5">
+        <wp:inline distT="0" distB="0" distL="0" distR="0" wp14:anchorId="54CCEB94" wp14:editId="54767DAE">
           <wp:extent cx="2377440" cy="700286"/>
           <wp:effectExtent l="0" t="0" r="0" b="0"/>
-          <wp:docPr id="1593882555" name="Picture 1593882555"/>
+          <wp:docPr id="2050422307" name="Picture 2050422307"/>
           <wp:cNvGraphicFramePr>
             <a:graphicFrameLocks xmlns:a="http://schemas.openxmlformats.org/drawingml/2006/main" noChangeAspect="1"/>
           </wp:cNvGraphicFramePr>
@@ -12546,31 +12674,31 @@
       </w:rPr>
     </w:lvl>
   </w:abstractNum>
-  <w:num w:numId="1" w16cid:durableId="1733846149">
+  <w:num w:numId="1" w16cid:durableId="875389910">
     <w:abstractNumId w:val="8"/>
   </w:num>
-  <w:num w:numId="2" w16cid:durableId="1866477752">
+  <w:num w:numId="2" w16cid:durableId="1919553352">
     <w:abstractNumId w:val="6"/>
   </w:num>
-  <w:num w:numId="3" w16cid:durableId="1945383277">
+  <w:num w:numId="3" w16cid:durableId="1636643729">
     <w:abstractNumId w:val="5"/>
   </w:num>
-  <w:num w:numId="4" w16cid:durableId="1380320683">
+  <w:num w:numId="4" w16cid:durableId="362172609">
     <w:abstractNumId w:val="4"/>
   </w:num>
-  <w:num w:numId="5" w16cid:durableId="1018191138">
+  <w:num w:numId="5" w16cid:durableId="988023530">
     <w:abstractNumId w:val="7"/>
   </w:num>
-  <w:num w:numId="6" w16cid:durableId="1053433331">
+  <w:num w:numId="6" w16cid:durableId="1800952342">
     <w:abstractNumId w:val="3"/>
   </w:num>
-  <w:num w:numId="7" w16cid:durableId="1178617621">
+  <w:num w:numId="7" w16cid:durableId="565381293">
     <w:abstractNumId w:val="2"/>
   </w:num>
-  <w:num w:numId="8" w16cid:durableId="2005930857">
+  <w:num w:numId="8" w16cid:durableId="223374440">
     <w:abstractNumId w:val="1"/>
   </w:num>
-  <w:num w:numId="9" w16cid:durableId="718743945">
+  <w:num w:numId="9" w16cid:durableId="267852193">
     <w:abstractNumId w:val="0"/>
   </w:num>
 </w:numbering>
@@ -23960,7 +24088,7 @@
     <w:autoRedefine/>
     <w:uiPriority w:val="39"/>
     <w:unhideWhenUsed/>
-    <w:rsid w:val="00324F96"/>
+    <w:rsid w:val="008D24E9"/>
     <w:pPr>
       <w:spacing w:after="100"/>
     </w:pPr>
@@ -23972,7 +24100,7 @@
     <w:autoRedefine/>
     <w:uiPriority w:val="39"/>
     <w:unhideWhenUsed/>
-    <w:rsid w:val="00324F96"/>
+    <w:rsid w:val="008D24E9"/>
     <w:pPr>
       <w:spacing w:after="100"/>
       <w:ind w:left="240"/>
@@ -23983,7 +24111,7 @@
     <w:basedOn w:val="DefaultParagraphFont"/>
     <w:uiPriority w:val="99"/>
     <w:unhideWhenUsed/>
-    <w:rsid w:val="00324F96"/>
+    <w:rsid w:val="008D24E9"/>
     <w:rPr>
       <w:color w:val="0000FF" w:themeColor="hyperlink"/>
       <w:u w:val="single"/>

</xml_diff>

<commit_message>
swap in the real terminal screenshots for figures 3 to 11
</commit_message>
<xml_diff>
--- a/report/CSFCL-IA2-2026-005-Forensic-Report.docx
+++ b/report/CSFCL-IA2-2026-005-Forensic-Report.docx
@@ -11,9 +11,9 @@
           <w:noProof/>
         </w:rPr>
         <w:drawing>
-          <wp:inline distT="0" distB="0" distL="0" distR="0" wp14:anchorId="779D88D3" wp14:editId="7197014F">
-            <wp:extent cx="3840480" cy="1131230"/>
-            <wp:effectExtent l="0" t="0" r="0" b="0"/>
+          <wp:inline distT="0" distB="0" distL="0" distR="0" wp14:anchorId="779D88D3" wp14:editId="1B8C40EE">
+            <wp:extent cx="1781230" cy="524669"/>
+            <wp:effectExtent l="0" t="0" r="0" b="8890"/>
             <wp:docPr id="1" name="Picture 1"/>
             <wp:cNvGraphicFramePr>
               <a:graphicFrameLocks xmlns:a="http://schemas.openxmlformats.org/drawingml/2006/main" noChangeAspect="1"/>
@@ -34,7 +34,7 @@
                   <pic:spPr>
                     <a:xfrm>
                       <a:off x="0" y="0"/>
-                      <a:ext cx="3840480" cy="1131230"/>
+                      <a:ext cx="1802489" cy="530931"/>
                     </a:xfrm>
                     <a:prstGeom prst="rect">
                       <a:avLst/>
@@ -46,6 +46,11 @@
           </wp:inline>
         </w:drawing>
       </w:r>
+    </w:p>
+    <w:p>
+      <w:pPr>
+        <w:jc w:val="center"/>
+      </w:pPr>
     </w:p>
     <w:p>
       <w:pPr>
@@ -116,8 +121,8 @@
         <w:tblLook w:val="04A0" w:firstRow="1" w:lastRow="0" w:firstColumn="1" w:lastColumn="0" w:noHBand="0" w:noVBand="1"/>
       </w:tblPr>
       <w:tblGrid>
-        <w:gridCol w:w="4514"/>
-        <w:gridCol w:w="4514"/>
+        <w:gridCol w:w="2430"/>
+        <w:gridCol w:w="3960"/>
       </w:tblGrid>
       <w:tr>
         <w:trPr>
@@ -125,7 +130,7 @@
         </w:trPr>
         <w:tc>
           <w:tcPr>
-            <w:tcW w:w="4514" w:type="dxa"/>
+            <w:tcW w:w="2430" w:type="dxa"/>
           </w:tcPr>
           <w:p>
             <w:pPr>
@@ -141,7 +146,7 @@
         </w:tc>
         <w:tc>
           <w:tcPr>
-            <w:tcW w:w="4514" w:type="dxa"/>
+            <w:tcW w:w="3960" w:type="dxa"/>
           </w:tcPr>
           <w:p>
             <w:pPr>
@@ -159,7 +164,7 @@
         </w:trPr>
         <w:tc>
           <w:tcPr>
-            <w:tcW w:w="4514" w:type="dxa"/>
+            <w:tcW w:w="2430" w:type="dxa"/>
           </w:tcPr>
           <w:p>
             <w:pPr>
@@ -175,7 +180,7 @@
         </w:tc>
         <w:tc>
           <w:tcPr>
-            <w:tcW w:w="4514" w:type="dxa"/>
+            <w:tcW w:w="3960" w:type="dxa"/>
           </w:tcPr>
           <w:p>
             <w:pPr>
@@ -193,7 +198,7 @@
         </w:trPr>
         <w:tc>
           <w:tcPr>
-            <w:tcW w:w="4514" w:type="dxa"/>
+            <w:tcW w:w="2430" w:type="dxa"/>
           </w:tcPr>
           <w:p>
             <w:pPr>
@@ -209,7 +214,7 @@
         </w:tc>
         <w:tc>
           <w:tcPr>
-            <w:tcW w:w="4514" w:type="dxa"/>
+            <w:tcW w:w="3960" w:type="dxa"/>
           </w:tcPr>
           <w:p>
             <w:pPr>
@@ -227,7 +232,7 @@
         </w:trPr>
         <w:tc>
           <w:tcPr>
-            <w:tcW w:w="4514" w:type="dxa"/>
+            <w:tcW w:w="2430" w:type="dxa"/>
           </w:tcPr>
           <w:p>
             <w:pPr>
@@ -243,7 +248,7 @@
         </w:tc>
         <w:tc>
           <w:tcPr>
-            <w:tcW w:w="4514" w:type="dxa"/>
+            <w:tcW w:w="3960" w:type="dxa"/>
           </w:tcPr>
           <w:p>
             <w:pPr>
@@ -2712,8 +2717,8 @@
         <w:tblLook w:val="04A0" w:firstRow="1" w:lastRow="0" w:firstColumn="1" w:lastColumn="0" w:noHBand="0" w:noVBand="1"/>
       </w:tblPr>
       <w:tblGrid>
-        <w:gridCol w:w="4514"/>
-        <w:gridCol w:w="4514"/>
+        <w:gridCol w:w="1800"/>
+        <w:gridCol w:w="7228"/>
       </w:tblGrid>
       <w:tr>
         <w:trPr>
@@ -2723,7 +2728,7 @@
         </w:trPr>
         <w:tc>
           <w:tcPr>
-            <w:tcW w:w="4514" w:type="dxa"/>
+            <w:tcW w:w="1800" w:type="dxa"/>
           </w:tcPr>
           <w:p>
             <w:pPr>
@@ -2742,7 +2747,7 @@
         </w:tc>
         <w:tc>
           <w:tcPr>
-            <w:tcW w:w="4514" w:type="dxa"/>
+            <w:tcW w:w="7228" w:type="dxa"/>
           </w:tcPr>
           <w:p>
             <w:pPr>
@@ -2767,7 +2772,7 @@
         </w:trPr>
         <w:tc>
           <w:tcPr>
-            <w:tcW w:w="4514" w:type="dxa"/>
+            <w:tcW w:w="1800" w:type="dxa"/>
           </w:tcPr>
           <w:p>
             <w:pPr>
@@ -2785,7 +2790,7 @@
         </w:tc>
         <w:tc>
           <w:tcPr>
-            <w:tcW w:w="4514" w:type="dxa"/>
+            <w:tcW w:w="7228" w:type="dxa"/>
           </w:tcPr>
           <w:p>
             <w:pPr>
@@ -2809,7 +2814,7 @@
         </w:trPr>
         <w:tc>
           <w:tcPr>
-            <w:tcW w:w="4514" w:type="dxa"/>
+            <w:tcW w:w="1800" w:type="dxa"/>
           </w:tcPr>
           <w:p>
             <w:pPr>
@@ -2827,7 +2832,7 @@
         </w:tc>
         <w:tc>
           <w:tcPr>
-            <w:tcW w:w="4514" w:type="dxa"/>
+            <w:tcW w:w="7228" w:type="dxa"/>
           </w:tcPr>
           <w:p>
             <w:pPr>
@@ -2851,7 +2856,7 @@
         </w:trPr>
         <w:tc>
           <w:tcPr>
-            <w:tcW w:w="4514" w:type="dxa"/>
+            <w:tcW w:w="1800" w:type="dxa"/>
           </w:tcPr>
           <w:p>
             <w:pPr>
@@ -2869,7 +2874,7 @@
         </w:tc>
         <w:tc>
           <w:tcPr>
-            <w:tcW w:w="4514" w:type="dxa"/>
+            <w:tcW w:w="7228" w:type="dxa"/>
           </w:tcPr>
           <w:p>
             <w:pPr>
@@ -2893,7 +2898,7 @@
         </w:trPr>
         <w:tc>
           <w:tcPr>
-            <w:tcW w:w="4514" w:type="dxa"/>
+            <w:tcW w:w="1800" w:type="dxa"/>
           </w:tcPr>
           <w:p>
             <w:pPr>
@@ -2911,7 +2916,7 @@
         </w:tc>
         <w:tc>
           <w:tcPr>
-            <w:tcW w:w="4514" w:type="dxa"/>
+            <w:tcW w:w="7228" w:type="dxa"/>
           </w:tcPr>
           <w:p>
             <w:pPr>
@@ -2935,7 +2940,7 @@
         </w:trPr>
         <w:tc>
           <w:tcPr>
-            <w:tcW w:w="4514" w:type="dxa"/>
+            <w:tcW w:w="1800" w:type="dxa"/>
           </w:tcPr>
           <w:p>
             <w:pPr>
@@ -2953,7 +2958,7 @@
         </w:tc>
         <w:tc>
           <w:tcPr>
-            <w:tcW w:w="4514" w:type="dxa"/>
+            <w:tcW w:w="7228" w:type="dxa"/>
           </w:tcPr>
           <w:p>
             <w:pPr>
@@ -2977,7 +2982,7 @@
         </w:trPr>
         <w:tc>
           <w:tcPr>
-            <w:tcW w:w="4514" w:type="dxa"/>
+            <w:tcW w:w="1800" w:type="dxa"/>
           </w:tcPr>
           <w:p>
             <w:pPr>
@@ -2995,7 +3000,7 @@
         </w:tc>
         <w:tc>
           <w:tcPr>
-            <w:tcW w:w="4514" w:type="dxa"/>
+            <w:tcW w:w="7228" w:type="dxa"/>
           </w:tcPr>
           <w:p>
             <w:pPr>
@@ -3019,7 +3024,7 @@
         </w:trPr>
         <w:tc>
           <w:tcPr>
-            <w:tcW w:w="4514" w:type="dxa"/>
+            <w:tcW w:w="1800" w:type="dxa"/>
           </w:tcPr>
           <w:p>
             <w:pPr>
@@ -3037,7 +3042,7 @@
         </w:tc>
         <w:tc>
           <w:tcPr>
-            <w:tcW w:w="4514" w:type="dxa"/>
+            <w:tcW w:w="7228" w:type="dxa"/>
           </w:tcPr>
           <w:p>
             <w:pPr>
@@ -3061,7 +3066,7 @@
         </w:trPr>
         <w:tc>
           <w:tcPr>
-            <w:tcW w:w="4514" w:type="dxa"/>
+            <w:tcW w:w="1800" w:type="dxa"/>
           </w:tcPr>
           <w:p>
             <w:pPr>
@@ -3078,7 +3083,7 @@
         </w:tc>
         <w:tc>
           <w:tcPr>
-            <w:tcW w:w="4514" w:type="dxa"/>
+            <w:tcW w:w="7228" w:type="dxa"/>
           </w:tcPr>
           <w:p>
             <w:pPr>
@@ -3143,14 +3148,20 @@
     </w:p>
     <w:p>
       <w:r>
-        <w:t>On 7 March 2017 the Apache team announced a flaw in Struts, CVE-2017-5638, and released a fixed version the same day. The flaw was in the part that handles file uploads. A web request carries a header called Content-Type that says what kind of data is attached. If that header was malformed, Struts tried to run it as a command instead of reading it as text. So anyone on the internet could put a command in that header and the server would run it, with no account and no password. That is remote code execution,</w:t>
+        <w:t xml:space="preserve">On 7 March 2017 the Apache team announced a flaw in Struts, CVE-2017-5638, and released a fixed version the same day. The flaw was in the part that handles file uploads. A web request carries a header called Content-Type that says what kind of data is attached. If that header was malformed, Struts tried to run it as a command instead of reading it as text. </w:t>
       </w:r>
+      <w:proofErr w:type="gramStart"/>
       <w:r>
-        <w:t xml:space="preserve"> the worst kind of flaw, and it scored 9.8 out of 10 on the standard severity scale.</w:t>
+        <w:t>So</w:t>
+      </w:r>
+      <w:proofErr w:type="gramEnd"/>
+      <w:r>
+        <w:t xml:space="preserve"> anyone on the internet could put a command in that header and the server would run it, with no account and no password. That is remote code execution, the worst kind of flaw, and it scored 9.8 out of 10 on the standard severity scale.</w:t>
       </w:r>
     </w:p>
     <w:p>
       <w:r>
+        <w:lastRenderedPageBreak/>
         <w:t>The next day, 8 March, the US government's cyber team warned Equifax to patch. On 9 March Equifax sent its own alert to about 430 staff and mailing lists, telling them to patch within 48 hours. The list was out of date, and the people who ran the dispute portal never got it. On 15 March a scan of 958 internet-facing servers was meant to catch anything still unpatched. It missed the portal.</w:t>
       </w:r>
     </w:p>
@@ -3161,18 +3172,12 @@
     </w:p>
     <w:p>
       <w:r>
-        <w:t>Once inside, they set up about 30 web shells, small hidden scripts that kept them in control. On a shared drive they found a configuration file with a database username and password in plain text. The portal needed three databases to do its job, but nothing stopped it reaching further, and those credentials opened 48 more. Over the next weeks the attackers ran about 9,000 database queries. 265 of them returned personal data, which they compressed and carried out in small pieces that looked like ordinary web</w:t>
-      </w:r>
-      <w:r>
-        <w:t xml:space="preserve"> traffic.</w:t>
+        <w:t>Once inside, they set up about 30 web shells, small hidden scripts that kept them in control. On a shared drive they found a configuration file with a database username and password in plain text. The portal needed three databases to do its job, but nothing stopped it reaching further, and those credentials opened 48 more. Over the next weeks the attackers ran about 9,000 database queries. 265 of them returned personal data, which they compressed and carried out in small pieces that looked like ordinary web traffic.</w:t>
       </w:r>
     </w:p>
     <w:p>
       <w:r>
-        <w:t>They went unnoticed for 76 days. The device that was meant to inspect the portal's traffic had a certificate that had expired, so for months it could not read that traffic at all. On 29 July, during routine maintenance, staff renewed the certificate. Inspection came back and the suspicious traffic showed up almost at once. Equifax shut the portal down the next day, 30 July, brought in the security firm Mandiant and told the FBI on 2 August, then announced the breach to the public on 7 September, 40 days aft</w:t>
-      </w:r>
-      <w:r>
-        <w:t>er it was first spotted.</w:t>
+        <w:t>They went unnoticed for 76 days. The device that was meant to inspect the portal's traffic had a certificate that had expired, so for months it could not read that traffic at all. On 29 July, during routine maintenance, staff renewed the certificate. Inspection came back and the suspicious traffic showed up almost at once. Equifax shut the portal down the next day, 30 July, brought in the security firm Mandiant and told the FBI on 2 August, then announced the breach to the public on 7 September, 40 days after it was first spotted.</w:t>
       </w:r>
     </w:p>
     <w:tbl>
@@ -3191,8 +3196,8 @@
         <w:tblLook w:val="04A0" w:firstRow="1" w:lastRow="0" w:firstColumn="1" w:lastColumn="0" w:noHBand="0" w:noVBand="1"/>
       </w:tblPr>
       <w:tblGrid>
-        <w:gridCol w:w="3010"/>
-        <w:gridCol w:w="3010"/>
+        <w:gridCol w:w="1351"/>
+        <w:gridCol w:w="4669"/>
         <w:gridCol w:w="3010"/>
       </w:tblGrid>
       <w:tr>
@@ -3203,7 +3208,7 @@
         </w:trPr>
         <w:tc>
           <w:tcPr>
-            <w:tcW w:w="3010" w:type="dxa"/>
+            <w:tcW w:w="1351" w:type="dxa"/>
           </w:tcPr>
           <w:p>
             <w:pPr>
@@ -3222,7 +3227,7 @@
         </w:tc>
         <w:tc>
           <w:tcPr>
-            <w:tcW w:w="3010" w:type="dxa"/>
+            <w:tcW w:w="4669" w:type="dxa"/>
           </w:tcPr>
           <w:p>
             <w:pPr>
@@ -3266,7 +3271,7 @@
         </w:trPr>
         <w:tc>
           <w:tcPr>
-            <w:tcW w:w="3010" w:type="dxa"/>
+            <w:tcW w:w="1351" w:type="dxa"/>
           </w:tcPr>
           <w:p>
             <w:pPr>
@@ -3284,7 +3289,7 @@
         </w:tc>
         <w:tc>
           <w:tcPr>
-            <w:tcW w:w="3010" w:type="dxa"/>
+            <w:tcW w:w="4669" w:type="dxa"/>
           </w:tcPr>
           <w:p>
             <w:pPr>
@@ -3326,7 +3331,7 @@
         </w:trPr>
         <w:tc>
           <w:tcPr>
-            <w:tcW w:w="3010" w:type="dxa"/>
+            <w:tcW w:w="1351" w:type="dxa"/>
           </w:tcPr>
           <w:p>
             <w:pPr>
@@ -3344,7 +3349,7 @@
         </w:tc>
         <w:tc>
           <w:tcPr>
-            <w:tcW w:w="3010" w:type="dxa"/>
+            <w:tcW w:w="4669" w:type="dxa"/>
           </w:tcPr>
           <w:p>
             <w:pPr>
@@ -3386,7 +3391,7 @@
         </w:trPr>
         <w:tc>
           <w:tcPr>
-            <w:tcW w:w="3010" w:type="dxa"/>
+            <w:tcW w:w="1351" w:type="dxa"/>
           </w:tcPr>
           <w:p>
             <w:pPr>
@@ -3404,7 +3409,7 @@
         </w:tc>
         <w:tc>
           <w:tcPr>
-            <w:tcW w:w="3010" w:type="dxa"/>
+            <w:tcW w:w="4669" w:type="dxa"/>
           </w:tcPr>
           <w:p>
             <w:pPr>
@@ -3446,7 +3451,7 @@
         </w:trPr>
         <w:tc>
           <w:tcPr>
-            <w:tcW w:w="3010" w:type="dxa"/>
+            <w:tcW w:w="1351" w:type="dxa"/>
           </w:tcPr>
           <w:p>
             <w:pPr>
@@ -3464,7 +3469,7 @@
         </w:tc>
         <w:tc>
           <w:tcPr>
-            <w:tcW w:w="3010" w:type="dxa"/>
+            <w:tcW w:w="4669" w:type="dxa"/>
           </w:tcPr>
           <w:p>
             <w:pPr>
@@ -3506,7 +3511,7 @@
         </w:trPr>
         <w:tc>
           <w:tcPr>
-            <w:tcW w:w="3010" w:type="dxa"/>
+            <w:tcW w:w="1351" w:type="dxa"/>
           </w:tcPr>
           <w:p>
             <w:pPr>
@@ -3524,7 +3529,7 @@
         </w:tc>
         <w:tc>
           <w:tcPr>
-            <w:tcW w:w="3010" w:type="dxa"/>
+            <w:tcW w:w="4669" w:type="dxa"/>
           </w:tcPr>
           <w:p>
             <w:pPr>
@@ -3566,7 +3571,7 @@
         </w:trPr>
         <w:tc>
           <w:tcPr>
-            <w:tcW w:w="3010" w:type="dxa"/>
+            <w:tcW w:w="1351" w:type="dxa"/>
           </w:tcPr>
           <w:p>
             <w:pPr>
@@ -3584,7 +3589,7 @@
         </w:tc>
         <w:tc>
           <w:tcPr>
-            <w:tcW w:w="3010" w:type="dxa"/>
+            <w:tcW w:w="4669" w:type="dxa"/>
           </w:tcPr>
           <w:p>
             <w:pPr>
@@ -3626,7 +3631,7 @@
         </w:trPr>
         <w:tc>
           <w:tcPr>
-            <w:tcW w:w="3010" w:type="dxa"/>
+            <w:tcW w:w="1351" w:type="dxa"/>
           </w:tcPr>
           <w:p>
             <w:pPr>
@@ -3644,7 +3649,7 @@
         </w:tc>
         <w:tc>
           <w:tcPr>
-            <w:tcW w:w="3010" w:type="dxa"/>
+            <w:tcW w:w="4669" w:type="dxa"/>
           </w:tcPr>
           <w:p>
             <w:pPr>
@@ -3686,7 +3691,7 @@
         </w:trPr>
         <w:tc>
           <w:tcPr>
-            <w:tcW w:w="3010" w:type="dxa"/>
+            <w:tcW w:w="1351" w:type="dxa"/>
           </w:tcPr>
           <w:p>
             <w:pPr>
@@ -3704,7 +3709,7 @@
         </w:tc>
         <w:tc>
           <w:tcPr>
-            <w:tcW w:w="3010" w:type="dxa"/>
+            <w:tcW w:w="4669" w:type="dxa"/>
           </w:tcPr>
           <w:p>
             <w:pPr>
@@ -3746,7 +3751,7 @@
         </w:trPr>
         <w:tc>
           <w:tcPr>
-            <w:tcW w:w="3010" w:type="dxa"/>
+            <w:tcW w:w="1351" w:type="dxa"/>
           </w:tcPr>
           <w:p>
             <w:pPr>
@@ -3764,7 +3769,7 @@
         </w:tc>
         <w:tc>
           <w:tcPr>
-            <w:tcW w:w="3010" w:type="dxa"/>
+            <w:tcW w:w="4669" w:type="dxa"/>
           </w:tcPr>
           <w:p>
             <w:pPr>
@@ -3806,7 +3811,7 @@
         </w:trPr>
         <w:tc>
           <w:tcPr>
-            <w:tcW w:w="3010" w:type="dxa"/>
+            <w:tcW w:w="1351" w:type="dxa"/>
           </w:tcPr>
           <w:p>
             <w:pPr>
@@ -3823,7 +3828,7 @@
         </w:tc>
         <w:tc>
           <w:tcPr>
-            <w:tcW w:w="3010" w:type="dxa"/>
+            <w:tcW w:w="4669" w:type="dxa"/>
           </w:tcPr>
           <w:p>
             <w:pPr>
@@ -3889,8 +3894,8 @@
         <w:tblLook w:val="04A0" w:firstRow="1" w:lastRow="0" w:firstColumn="1" w:lastColumn="0" w:noHBand="0" w:noVBand="1"/>
       </w:tblPr>
       <w:tblGrid>
-        <w:gridCol w:w="4514"/>
-        <w:gridCol w:w="4514"/>
+        <w:gridCol w:w="1800"/>
+        <w:gridCol w:w="7228"/>
       </w:tblGrid>
       <w:tr>
         <w:trPr>
@@ -3900,7 +3905,7 @@
         </w:trPr>
         <w:tc>
           <w:tcPr>
-            <w:tcW w:w="4514" w:type="dxa"/>
+            <w:tcW w:w="1800" w:type="dxa"/>
           </w:tcPr>
           <w:p>
             <w:pPr>
@@ -3913,13 +3918,14 @@
                 <w:b/>
                 <w:sz w:val="20"/>
               </w:rPr>
+              <w:lastRenderedPageBreak/>
               <w:t>Factor</w:t>
             </w:r>
           </w:p>
         </w:tc>
         <w:tc>
           <w:tcPr>
-            <w:tcW w:w="4514" w:type="dxa"/>
+            <w:tcW w:w="7228" w:type="dxa"/>
           </w:tcPr>
           <w:p>
             <w:pPr>
@@ -3944,7 +3950,7 @@
         </w:trPr>
         <w:tc>
           <w:tcPr>
-            <w:tcW w:w="4514" w:type="dxa"/>
+            <w:tcW w:w="1800" w:type="dxa"/>
           </w:tcPr>
           <w:p>
             <w:pPr>
@@ -3962,7 +3968,7 @@
         </w:tc>
         <w:tc>
           <w:tcPr>
-            <w:tcW w:w="4514" w:type="dxa"/>
+            <w:tcW w:w="7228" w:type="dxa"/>
           </w:tcPr>
           <w:p>
             <w:pPr>
@@ -3986,7 +3992,7 @@
         </w:trPr>
         <w:tc>
           <w:tcPr>
-            <w:tcW w:w="4514" w:type="dxa"/>
+            <w:tcW w:w="1800" w:type="dxa"/>
           </w:tcPr>
           <w:p>
             <w:pPr>
@@ -4004,7 +4010,7 @@
         </w:tc>
         <w:tc>
           <w:tcPr>
-            <w:tcW w:w="4514" w:type="dxa"/>
+            <w:tcW w:w="7228" w:type="dxa"/>
           </w:tcPr>
           <w:p>
             <w:pPr>
@@ -4028,7 +4034,7 @@
         </w:trPr>
         <w:tc>
           <w:tcPr>
-            <w:tcW w:w="4514" w:type="dxa"/>
+            <w:tcW w:w="1800" w:type="dxa"/>
           </w:tcPr>
           <w:p>
             <w:pPr>
@@ -4046,7 +4052,7 @@
         </w:tc>
         <w:tc>
           <w:tcPr>
-            <w:tcW w:w="4514" w:type="dxa"/>
+            <w:tcW w:w="7228" w:type="dxa"/>
           </w:tcPr>
           <w:p>
             <w:pPr>
@@ -4070,7 +4076,7 @@
         </w:trPr>
         <w:tc>
           <w:tcPr>
-            <w:tcW w:w="4514" w:type="dxa"/>
+            <w:tcW w:w="1800" w:type="dxa"/>
           </w:tcPr>
           <w:p>
             <w:pPr>
@@ -4088,7 +4094,7 @@
         </w:tc>
         <w:tc>
           <w:tcPr>
-            <w:tcW w:w="4514" w:type="dxa"/>
+            <w:tcW w:w="7228" w:type="dxa"/>
           </w:tcPr>
           <w:p>
             <w:pPr>
@@ -4112,7 +4118,7 @@
         </w:trPr>
         <w:tc>
           <w:tcPr>
-            <w:tcW w:w="4514" w:type="dxa"/>
+            <w:tcW w:w="1800" w:type="dxa"/>
           </w:tcPr>
           <w:p>
             <w:pPr>
@@ -4129,7 +4135,7 @@
         </w:tc>
         <w:tc>
           <w:tcPr>
-            <w:tcW w:w="4514" w:type="dxa"/>
+            <w:tcW w:w="7228" w:type="dxa"/>
           </w:tcPr>
           <w:p>
             <w:pPr>
@@ -4159,10 +4165,7 @@
     </w:p>
     <w:p>
       <w:r>
-        <w:t>Equifax first announced about 143 million affected US consumers on 7 September 2017 and later revised the total to about 147 million. Equifax's May 2018 statement gives approximate US figures: names and dates of birth 146.6 million each, Social Security numbers 145.5 million, addresses 99 million, driver's licence numbers 17.6 million, payment card numbers 209,000. The same person appears in several categories, so the figures are not added. Dispute documents for about 182,000 consumers were also taken. Outs</w:t>
-      </w:r>
-      <w:r>
-        <w:t>ide the US, GAO counted nearly one million people in 2018; the UK regulator later found up to 13.8 million UK records accessed, and about 19,000 Canadians were affected. The company later paid a US settlement of 575 to 700 million dollars, was fined by UK regulators, and spent about 1.5 billion dollars on security. The chief information officer, chief security officer and chief executive all left within weeks.</w:t>
+        <w:t>Equifax first announced about 143 million affected US consumers on 7 September 2017 and later revised the total to about 147 million. Equifax's May 2018 statement gives approximate US figures: names and dates of birth 146.6 million each, Social Security numbers 145.5 million, addresses 99 million, driver's licence numbers 17.6 million, payment card numbers 209,000. The same person appears in several categories, so the figures are not added. Dispute documents for about 182,000 consumers were also taken. Outside the US, GAO counted nearly one million people in 2018; the UK regulator later found up to 13.8 million UK records accessed, and about 19,000 Canadians were affected. The company later paid a US settlement of 575 to 700 million dollars, was fined by UK regulators, and spent about 1.5 billion dollars on security. The chief information officer, chief security officer and chief executive all left within weeks.</w:t>
       </w:r>
     </w:p>
     <w:p>
@@ -4202,10 +4205,7 @@
     </w:p>
     <w:p>
       <w:r>
-        <w:t>The breach came down to one vulnerable software component that nobody had patched. Trivy is a scanner built for exactly that: it reads a system's files without running them, names each software component and version, and matches them against public vulnerability databases. It also searches files for passwords and keys, checks configuration for unsafe settings, and writes a list of the software present. That lets us rebuild a version of the Equifax server and show three of the failures from section 1.3 on re</w:t>
-      </w:r>
-      <w:r>
-        <w:t>al software: the unpatched vulnerable component, the exposed credentials and the unsafe configuration. Trivy reads files, so it does not show the monitoring failure, the missing segmentation or the missing query limits; those come from the case record. Trivy is free and scripted, so anyone can repeat the examination and check the results.</w:t>
+        <w:t>The breach came down to one vulnerable software component that nobody had patched. Trivy is a scanner built for exactly that: it reads a system's files without running them, names each software component and version, and matches them against public vulnerability databases. It also searches files for passwords and keys, checks configuration for unsafe settings, and writes a list of the software present. That lets us rebuild a version of the Equifax server and show three of the failures from section 1.3 on real software: the unpatched vulnerable component, the exposed credentials and the unsafe configuration. Trivy reads files, so it does not show the monitoring failure, the missing segmentation or the missing query limits; those come from the case record. Trivy is free and scripted, so anyone can repeat the examination and check the results.</w:t>
       </w:r>
     </w:p>
     <w:p>
@@ -4229,8 +4229,8 @@
         <w:tblLook w:val="04A0" w:firstRow="1" w:lastRow="0" w:firstColumn="1" w:lastColumn="0" w:noHBand="0" w:noVBand="1"/>
       </w:tblPr>
       <w:tblGrid>
-        <w:gridCol w:w="4514"/>
-        <w:gridCol w:w="4514"/>
+        <w:gridCol w:w="2520"/>
+        <w:gridCol w:w="6508"/>
       </w:tblGrid>
       <w:tr>
         <w:trPr>
@@ -4240,7 +4240,7 @@
         </w:trPr>
         <w:tc>
           <w:tcPr>
-            <w:tcW w:w="4514" w:type="dxa"/>
+            <w:tcW w:w="2520" w:type="dxa"/>
           </w:tcPr>
           <w:p>
             <w:pPr>
@@ -4253,13 +4253,14 @@
                 <w:b/>
                 <w:sz w:val="20"/>
               </w:rPr>
+              <w:lastRenderedPageBreak/>
               <w:t>File</w:t>
             </w:r>
           </w:p>
         </w:tc>
         <w:tc>
           <w:tcPr>
-            <w:tcW w:w="4514" w:type="dxa"/>
+            <w:tcW w:w="6508" w:type="dxa"/>
           </w:tcPr>
           <w:p>
             <w:pPr>
@@ -4284,7 +4285,7 @@
         </w:trPr>
         <w:tc>
           <w:tcPr>
-            <w:tcW w:w="4514" w:type="dxa"/>
+            <w:tcW w:w="2520" w:type="dxa"/>
           </w:tcPr>
           <w:p>
             <w:pPr>
@@ -4302,7 +4303,7 @@
         </w:tc>
         <w:tc>
           <w:tcPr>
-            <w:tcW w:w="4514" w:type="dxa"/>
+            <w:tcW w:w="6508" w:type="dxa"/>
           </w:tcPr>
           <w:p>
             <w:pPr>
@@ -4326,7 +4327,7 @@
         </w:trPr>
         <w:tc>
           <w:tcPr>
-            <w:tcW w:w="4514" w:type="dxa"/>
+            <w:tcW w:w="2520" w:type="dxa"/>
           </w:tcPr>
           <w:p>
             <w:pPr>
@@ -4344,7 +4345,7 @@
         </w:tc>
         <w:tc>
           <w:tcPr>
-            <w:tcW w:w="4514" w:type="dxa"/>
+            <w:tcW w:w="6508" w:type="dxa"/>
           </w:tcPr>
           <w:p>
             <w:pPr>
@@ -4368,7 +4369,7 @@
         </w:trPr>
         <w:tc>
           <w:tcPr>
-            <w:tcW w:w="4514" w:type="dxa"/>
+            <w:tcW w:w="2520" w:type="dxa"/>
           </w:tcPr>
           <w:p>
             <w:pPr>
@@ -4386,7 +4387,7 @@
         </w:tc>
         <w:tc>
           <w:tcPr>
-            <w:tcW w:w="4514" w:type="dxa"/>
+            <w:tcW w:w="6508" w:type="dxa"/>
           </w:tcPr>
           <w:p>
             <w:pPr>
@@ -4410,7 +4411,7 @@
         </w:trPr>
         <w:tc>
           <w:tcPr>
-            <w:tcW w:w="4514" w:type="dxa"/>
+            <w:tcW w:w="2520" w:type="dxa"/>
           </w:tcPr>
           <w:p>
             <w:pPr>
@@ -4428,7 +4429,7 @@
         </w:tc>
         <w:tc>
           <w:tcPr>
-            <w:tcW w:w="4514" w:type="dxa"/>
+            <w:tcW w:w="6508" w:type="dxa"/>
           </w:tcPr>
           <w:p>
             <w:pPr>
@@ -4452,7 +4453,7 @@
         </w:trPr>
         <w:tc>
           <w:tcPr>
-            <w:tcW w:w="4514" w:type="dxa"/>
+            <w:tcW w:w="2520" w:type="dxa"/>
           </w:tcPr>
           <w:p>
             <w:pPr>
@@ -4470,7 +4471,7 @@
         </w:tc>
         <w:tc>
           <w:tcPr>
-            <w:tcW w:w="4514" w:type="dxa"/>
+            <w:tcW w:w="6508" w:type="dxa"/>
           </w:tcPr>
           <w:p>
             <w:pPr>
@@ -4494,25 +4495,33 @@
         </w:trPr>
         <w:tc>
           <w:tcPr>
-            <w:tcW w:w="4514" w:type="dxa"/>
-          </w:tcPr>
-          <w:p>
-            <w:pPr>
-              <w:keepNext/>
-              <w:spacing w:after="40"/>
-              <w:jc w:val="left"/>
-            </w:pPr>
-            <w:r>
-              <w:rPr>
-                <w:sz w:val="20"/>
-              </w:rPr>
-              <w:t>config/.env</w:t>
-            </w:r>
-          </w:p>
-        </w:tc>
-        <w:tc>
-          <w:tcPr>
-            <w:tcW w:w="4514" w:type="dxa"/>
+            <w:tcW w:w="2520" w:type="dxa"/>
+          </w:tcPr>
+          <w:p>
+            <w:pPr>
+              <w:keepNext/>
+              <w:spacing w:after="40"/>
+              <w:jc w:val="left"/>
+            </w:pPr>
+            <w:r>
+              <w:rPr>
+                <w:sz w:val="20"/>
+              </w:rPr>
+              <w:t>config</w:t>
+            </w:r>
+            <w:proofErr w:type="gramStart"/>
+            <w:r>
+              <w:rPr>
+                <w:sz w:val="20"/>
+              </w:rPr>
+              <w:t>/.env</w:t>
+            </w:r>
+            <w:proofErr w:type="gramEnd"/>
+          </w:p>
+        </w:tc>
+        <w:tc>
+          <w:tcPr>
+            <w:tcW w:w="6508" w:type="dxa"/>
           </w:tcPr>
           <w:p>
             <w:pPr>
@@ -4536,7 +4545,7 @@
         </w:trPr>
         <w:tc>
           <w:tcPr>
-            <w:tcW w:w="4514" w:type="dxa"/>
+            <w:tcW w:w="2520" w:type="dxa"/>
           </w:tcPr>
           <w:p>
             <w:pPr>
@@ -4553,7 +4562,7 @@
         </w:tc>
         <w:tc>
           <w:tcPr>
-            <w:tcW w:w="4514" w:type="dxa"/>
+            <w:tcW w:w="6508" w:type="dxa"/>
           </w:tcPr>
           <w:p>
             <w:pPr>
@@ -4691,7 +4700,21 @@
         <w:rPr>
           <w:sz w:val="22"/>
         </w:rPr>
-        <w:t>grep -E "\(secrets\)$|^(CRITICAL|HIGH|MEDIUM|LOW): " output/latest/03-secrets.txt</w:t>
+        <w:t>grep -E "\(secrets</w:t>
+      </w:r>
+      <w:proofErr w:type="gramStart"/>
+      <w:r>
+        <w:rPr>
+          <w:sz w:val="22"/>
+        </w:rPr>
+        <w:t>\)$</w:t>
+      </w:r>
+      <w:proofErr w:type="gramEnd"/>
+      <w:r>
+        <w:rPr>
+          <w:sz w:val="22"/>
+        </w:rPr>
+        <w:t>|^(CRITICAL|HIGH|MEDIUM|LOW): " output/latest/03-secrets.txt</w:t>
       </w:r>
     </w:p>
     <w:p>
@@ -4768,6 +4791,7 @@
         <w:rPr>
           <w:noProof/>
         </w:rPr>
+        <w:lastRenderedPageBreak/>
         <w:drawing>
           <wp:inline distT="0" distB="0" distL="0" distR="0" wp14:anchorId="491A1AE0" wp14:editId="0985E1DD">
             <wp:extent cx="5486400" cy="4205104"/>
@@ -4844,9 +4868,9 @@
         <w:tblLook w:val="04A0" w:firstRow="1" w:lastRow="0" w:firstColumn="1" w:lastColumn="0" w:noHBand="0" w:noVBand="1"/>
       </w:tblPr>
       <w:tblGrid>
-        <w:gridCol w:w="3010"/>
-        <w:gridCol w:w="3010"/>
-        <w:gridCol w:w="3010"/>
+        <w:gridCol w:w="2791"/>
+        <w:gridCol w:w="1890"/>
+        <w:gridCol w:w="4349"/>
       </w:tblGrid>
       <w:tr>
         <w:trPr>
@@ -4856,7 +4880,7 @@
         </w:trPr>
         <w:tc>
           <w:tcPr>
-            <w:tcW w:w="3010" w:type="dxa"/>
+            <w:tcW w:w="2791" w:type="dxa"/>
           </w:tcPr>
           <w:p>
             <w:pPr>
@@ -4875,7 +4899,7 @@
         </w:tc>
         <w:tc>
           <w:tcPr>
-            <w:tcW w:w="3010" w:type="dxa"/>
+            <w:tcW w:w="1890" w:type="dxa"/>
           </w:tcPr>
           <w:p>
             <w:pPr>
@@ -4894,7 +4918,7 @@
         </w:tc>
         <w:tc>
           <w:tcPr>
-            <w:tcW w:w="3010" w:type="dxa"/>
+            <w:tcW w:w="4349" w:type="dxa"/>
           </w:tcPr>
           <w:p>
             <w:pPr>
@@ -4919,7 +4943,7 @@
         </w:trPr>
         <w:tc>
           <w:tcPr>
-            <w:tcW w:w="3010" w:type="dxa"/>
+            <w:tcW w:w="2791" w:type="dxa"/>
           </w:tcPr>
           <w:p>
             <w:pPr>
@@ -4937,7 +4961,7 @@
         </w:tc>
         <w:tc>
           <w:tcPr>
-            <w:tcW w:w="3010" w:type="dxa"/>
+            <w:tcW w:w="1890" w:type="dxa"/>
           </w:tcPr>
           <w:p>
             <w:pPr>
@@ -4955,7 +4979,7 @@
         </w:tc>
         <w:tc>
           <w:tcPr>
-            <w:tcW w:w="3010" w:type="dxa"/>
+            <w:tcW w:w="4349" w:type="dxa"/>
           </w:tcPr>
           <w:p>
             <w:pPr>
@@ -4979,7 +5003,7 @@
         </w:trPr>
         <w:tc>
           <w:tcPr>
-            <w:tcW w:w="3010" w:type="dxa"/>
+            <w:tcW w:w="2791" w:type="dxa"/>
           </w:tcPr>
           <w:p>
             <w:pPr>
@@ -4997,7 +5021,7 @@
         </w:tc>
         <w:tc>
           <w:tcPr>
-            <w:tcW w:w="3010" w:type="dxa"/>
+            <w:tcW w:w="1890" w:type="dxa"/>
           </w:tcPr>
           <w:p>
             <w:pPr>
@@ -5015,7 +5039,7 @@
         </w:tc>
         <w:tc>
           <w:tcPr>
-            <w:tcW w:w="3010" w:type="dxa"/>
+            <w:tcW w:w="4349" w:type="dxa"/>
           </w:tcPr>
           <w:p>
             <w:pPr>
@@ -5039,7 +5063,7 @@
         </w:trPr>
         <w:tc>
           <w:tcPr>
-            <w:tcW w:w="3010" w:type="dxa"/>
+            <w:tcW w:w="2791" w:type="dxa"/>
           </w:tcPr>
           <w:p>
             <w:pPr>
@@ -5056,7 +5080,7 @@
         </w:tc>
         <w:tc>
           <w:tcPr>
-            <w:tcW w:w="3010" w:type="dxa"/>
+            <w:tcW w:w="1890" w:type="dxa"/>
           </w:tcPr>
           <w:p>
             <w:pPr>
@@ -5073,7 +5097,7 @@
         </w:tc>
         <w:tc>
           <w:tcPr>
-            <w:tcW w:w="3010" w:type="dxa"/>
+            <w:tcW w:w="4349" w:type="dxa"/>
           </w:tcPr>
           <w:p>
             <w:pPr>
@@ -5102,6 +5126,7 @@
       </w:pPr>
       <w:bookmarkStart w:id="11" w:name="_Toc241587863"/>
       <w:r>
+        <w:lastRenderedPageBreak/>
         <w:t>2.4 Evidence and assumptions</w:t>
       </w:r>
       <w:bookmarkEnd w:id="11"/>
@@ -5207,7 +5232,21 @@
               <w:rPr>
                 <w:sz w:val="20"/>
               </w:rPr>
-              <w:t>Evidence: pom.properties inside the JAR, and the SHA-1 match with Maven Central</w:t>
+              <w:t xml:space="preserve">Evidence: </w:t>
+            </w:r>
+            <w:proofErr w:type="gramStart"/>
+            <w:r>
+              <w:rPr>
+                <w:sz w:val="20"/>
+              </w:rPr>
+              <w:t>pom.properties</w:t>
+            </w:r>
+            <w:proofErr w:type="gramEnd"/>
+            <w:r>
+              <w:rPr>
+                <w:sz w:val="20"/>
+              </w:rPr>
+              <w:t xml:space="preserve"> inside the JAR, and the SHA-1 match with Maven Central</w:t>
             </w:r>
           </w:p>
         </w:tc>
@@ -5418,9 +5457,9 @@
           <w:noProof/>
         </w:rPr>
         <w:drawing>
-          <wp:inline distT="0" distB="0" distL="0" distR="0" wp14:anchorId="703690A2" wp14:editId="78577D47">
-            <wp:extent cx="5486400" cy="3265869"/>
-            <wp:effectExtent l="0" t="0" r="0" b="0"/>
+          <wp:inline distT="0" distB="0" distL="0" distR="0" wp14:anchorId="703690A2" wp14:editId="15AE87B8">
+            <wp:extent cx="4439754" cy="2642836"/>
+            <wp:effectExtent l="0" t="0" r="0" b="5715"/>
             <wp:docPr id="3" name="Picture 3"/>
             <wp:cNvGraphicFramePr>
               <a:graphicFrameLocks xmlns:a="http://schemas.openxmlformats.org/drawingml/2006/main" noChangeAspect="1"/>
@@ -5441,7 +5480,7 @@
                   <pic:spPr>
                     <a:xfrm>
                       <a:off x="0" y="0"/>
-                      <a:ext cx="5486400" cy="3265869"/>
+                      <a:ext cx="4447850" cy="2647655"/>
                     </a:xfrm>
                     <a:prstGeom prst="rect">
                       <a:avLst/>
@@ -5502,6 +5541,7 @@
       </w:pPr>
       <w:bookmarkStart w:id="14" w:name="_Toc241587866"/>
       <w:r>
+        <w:lastRenderedPageBreak/>
         <w:t>Activity 2: hash verification</w:t>
       </w:r>
       <w:bookmarkEnd w:id="14"/>
@@ -5527,8 +5567,8 @@
         <w:tblLook w:val="04A0" w:firstRow="1" w:lastRow="0" w:firstColumn="1" w:lastColumn="0" w:noHBand="0" w:noVBand="1"/>
       </w:tblPr>
       <w:tblGrid>
-        <w:gridCol w:w="4514"/>
-        <w:gridCol w:w="4514"/>
+        <w:gridCol w:w="2520"/>
+        <w:gridCol w:w="4140"/>
       </w:tblGrid>
       <w:tr>
         <w:trPr>
@@ -5538,7 +5578,7 @@
         </w:trPr>
         <w:tc>
           <w:tcPr>
-            <w:tcW w:w="4514" w:type="dxa"/>
+            <w:tcW w:w="2520" w:type="dxa"/>
           </w:tcPr>
           <w:p>
             <w:pPr>
@@ -5557,7 +5597,7 @@
         </w:tc>
         <w:tc>
           <w:tcPr>
-            <w:tcW w:w="4514" w:type="dxa"/>
+            <w:tcW w:w="4140" w:type="dxa"/>
           </w:tcPr>
           <w:p>
             <w:pPr>
@@ -5582,7 +5622,7 @@
         </w:trPr>
         <w:tc>
           <w:tcPr>
-            <w:tcW w:w="4514" w:type="dxa"/>
+            <w:tcW w:w="2520" w:type="dxa"/>
           </w:tcPr>
           <w:p>
             <w:pPr>
@@ -5600,7 +5640,7 @@
         </w:tc>
         <w:tc>
           <w:tcPr>
-            <w:tcW w:w="4514" w:type="dxa"/>
+            <w:tcW w:w="4140" w:type="dxa"/>
           </w:tcPr>
           <w:p>
             <w:pPr>
@@ -5624,7 +5664,7 @@
         </w:trPr>
         <w:tc>
           <w:tcPr>
-            <w:tcW w:w="4514" w:type="dxa"/>
+            <w:tcW w:w="2520" w:type="dxa"/>
           </w:tcPr>
           <w:p>
             <w:pPr>
@@ -5642,7 +5682,7 @@
         </w:tc>
         <w:tc>
           <w:tcPr>
-            <w:tcW w:w="4514" w:type="dxa"/>
+            <w:tcW w:w="4140" w:type="dxa"/>
           </w:tcPr>
           <w:p>
             <w:pPr>
@@ -5666,7 +5706,7 @@
         </w:trPr>
         <w:tc>
           <w:tcPr>
-            <w:tcW w:w="4514" w:type="dxa"/>
+            <w:tcW w:w="2520" w:type="dxa"/>
           </w:tcPr>
           <w:p>
             <w:pPr>
@@ -5684,7 +5724,7 @@
         </w:tc>
         <w:tc>
           <w:tcPr>
-            <w:tcW w:w="4514" w:type="dxa"/>
+            <w:tcW w:w="4140" w:type="dxa"/>
           </w:tcPr>
           <w:p>
             <w:pPr>
@@ -5708,7 +5748,7 @@
         </w:trPr>
         <w:tc>
           <w:tcPr>
-            <w:tcW w:w="4514" w:type="dxa"/>
+            <w:tcW w:w="2520" w:type="dxa"/>
           </w:tcPr>
           <w:p>
             <w:pPr>
@@ -5725,7 +5765,7 @@
         </w:tc>
         <w:tc>
           <w:tcPr>
-            <w:tcW w:w="4514" w:type="dxa"/>
+            <w:tcW w:w="4140" w:type="dxa"/>
           </w:tcPr>
           <w:p>
             <w:pPr>
@@ -5876,8 +5916,16 @@
               <w:rPr>
                 <w:sz w:val="20"/>
               </w:rPr>
-              <w:t>config/.env</w:t>
-            </w:r>
+              <w:t>config</w:t>
+            </w:r>
+            <w:proofErr w:type="gramStart"/>
+            <w:r>
+              <w:rPr>
+                <w:sz w:val="20"/>
+              </w:rPr>
+              <w:t>/.env</w:t>
+            </w:r>
+            <w:proofErr w:type="gramEnd"/>
           </w:p>
         </w:tc>
         <w:tc>
@@ -6120,7 +6168,7 @@
         </w:rPr>
         <w:drawing>
           <wp:inline distT="0" distB="0" distL="0" distR="0" wp14:anchorId="4F6DF252" wp14:editId="47F6126C">
-            <wp:extent cx="5486400" cy="1250616"/>
+            <wp:extent cx="5486400" cy="749908"/>
             <wp:effectExtent l="0" t="0" r="0" b="0"/>
             <wp:docPr id="4" name="Picture 4"/>
             <wp:cNvGraphicFramePr>
@@ -6142,7 +6190,7 @@
                   <pic:spPr>
                     <a:xfrm>
                       <a:off x="0" y="0"/>
-                      <a:ext cx="5486400" cy="1250616"/>
+                      <a:ext cx="5486400" cy="749908"/>
                     </a:xfrm>
                     <a:prstGeom prst="rect">
                       <a:avLst/>
@@ -6178,9 +6226,9 @@
           <w:noProof/>
         </w:rPr>
         <w:drawing>
-          <wp:inline distT="0" distB="0" distL="0" distR="0" wp14:anchorId="462DA2E2" wp14:editId="5FCE9649">
-            <wp:extent cx="5486400" cy="2572624"/>
-            <wp:effectExtent l="0" t="0" r="0" b="0"/>
+          <wp:inline distT="0" distB="0" distL="0" distR="0" wp14:anchorId="462DA2E2" wp14:editId="42BFDF3E">
+            <wp:extent cx="5486400" cy="665844"/>
+            <wp:effectExtent l="0" t="0" r="9525" b="0"/>
             <wp:docPr id="5" name="Picture 5"/>
             <wp:cNvGraphicFramePr>
               <a:graphicFrameLocks xmlns:a="http://schemas.openxmlformats.org/drawingml/2006/main" noChangeAspect="1"/>
@@ -6201,7 +6249,7 @@
                   <pic:spPr>
                     <a:xfrm>
                       <a:off x="0" y="0"/>
-                      <a:ext cx="5486400" cy="2572624"/>
+                      <a:ext cx="5486400" cy="665844"/>
                     </a:xfrm>
                     <a:prstGeom prst="rect">
                       <a:avLst/>
@@ -6232,6 +6280,7 @@
         <w:rPr>
           <w:i/>
         </w:rPr>
+        <w:lastRenderedPageBreak/>
         <w:t>What is a hash?</w:t>
       </w:r>
       <w:r>
@@ -6244,7 +6293,15 @@
         <w:t>Why does it matter?</w:t>
       </w:r>
       <w:r>
-        <w:t xml:space="preserve"> Changing one bit changes about half the hash, so tampering shows. </w:t>
+        <w:t xml:space="preserve"> Changing </w:t>
+      </w:r>
+      <w:proofErr w:type="gramStart"/>
+      <w:r>
+        <w:t>one bit</w:t>
+      </w:r>
+      <w:proofErr w:type="gramEnd"/>
+      <w:r>
+        <w:t xml:space="preserve"> changes about half the hash, so tampering shows. </w:t>
       </w:r>
       <w:r>
         <w:rPr>
@@ -6310,10 +6367,10 @@
         <w:tblLook w:val="04A0" w:firstRow="1" w:lastRow="0" w:firstColumn="1" w:lastColumn="0" w:noHBand="0" w:noVBand="1"/>
       </w:tblPr>
       <w:tblGrid>
-        <w:gridCol w:w="2257"/>
-        <w:gridCol w:w="2257"/>
-        <w:gridCol w:w="2257"/>
-        <w:gridCol w:w="2257"/>
+        <w:gridCol w:w="1530"/>
+        <w:gridCol w:w="1800"/>
+        <w:gridCol w:w="1350"/>
+        <w:gridCol w:w="4348"/>
       </w:tblGrid>
       <w:tr>
         <w:trPr>
@@ -6323,7 +6380,7 @@
         </w:trPr>
         <w:tc>
           <w:tcPr>
-            <w:tcW w:w="2257" w:type="dxa"/>
+            <w:tcW w:w="1530" w:type="dxa"/>
           </w:tcPr>
           <w:p>
             <w:pPr>
@@ -6342,7 +6399,7 @@
         </w:tc>
         <w:tc>
           <w:tcPr>
-            <w:tcW w:w="2257" w:type="dxa"/>
+            <w:tcW w:w="1800" w:type="dxa"/>
           </w:tcPr>
           <w:p>
             <w:pPr>
@@ -6361,7 +6418,7 @@
         </w:tc>
         <w:tc>
           <w:tcPr>
-            <w:tcW w:w="2257" w:type="dxa"/>
+            <w:tcW w:w="1350" w:type="dxa"/>
           </w:tcPr>
           <w:p>
             <w:pPr>
@@ -6380,7 +6437,7 @@
         </w:tc>
         <w:tc>
           <w:tcPr>
-            <w:tcW w:w="2257" w:type="dxa"/>
+            <w:tcW w:w="4348" w:type="dxa"/>
           </w:tcPr>
           <w:p>
             <w:pPr>
@@ -6405,7 +6462,7 @@
         </w:trPr>
         <w:tc>
           <w:tcPr>
-            <w:tcW w:w="2257" w:type="dxa"/>
+            <w:tcW w:w="1530" w:type="dxa"/>
           </w:tcPr>
           <w:p>
             <w:pPr>
@@ -6423,7 +6480,7 @@
         </w:tc>
         <w:tc>
           <w:tcPr>
-            <w:tcW w:w="2257" w:type="dxa"/>
+            <w:tcW w:w="1800" w:type="dxa"/>
           </w:tcPr>
           <w:p>
             <w:pPr>
@@ -6441,7 +6498,7 @@
         </w:tc>
         <w:tc>
           <w:tcPr>
-            <w:tcW w:w="2257" w:type="dxa"/>
+            <w:tcW w:w="1350" w:type="dxa"/>
           </w:tcPr>
           <w:p>
             <w:pPr>
@@ -6459,7 +6516,7 @@
         </w:tc>
         <w:tc>
           <w:tcPr>
-            <w:tcW w:w="2257" w:type="dxa"/>
+            <w:tcW w:w="4348" w:type="dxa"/>
           </w:tcPr>
           <w:p>
             <w:pPr>
@@ -6483,7 +6540,7 @@
         </w:trPr>
         <w:tc>
           <w:tcPr>
-            <w:tcW w:w="2257" w:type="dxa"/>
+            <w:tcW w:w="1530" w:type="dxa"/>
           </w:tcPr>
           <w:p>
             <w:pPr>
@@ -6500,7 +6557,7 @@
         </w:tc>
         <w:tc>
           <w:tcPr>
-            <w:tcW w:w="2257" w:type="dxa"/>
+            <w:tcW w:w="1800" w:type="dxa"/>
           </w:tcPr>
           <w:p>
             <w:pPr>
@@ -6517,7 +6574,7 @@
         </w:tc>
         <w:tc>
           <w:tcPr>
-            <w:tcW w:w="2257" w:type="dxa"/>
+            <w:tcW w:w="1350" w:type="dxa"/>
           </w:tcPr>
           <w:p>
             <w:pPr>
@@ -6534,7 +6591,7 @@
         </w:tc>
         <w:tc>
           <w:tcPr>
-            <w:tcW w:w="2257" w:type="dxa"/>
+            <w:tcW w:w="4348" w:type="dxa"/>
           </w:tcPr>
           <w:p>
             <w:pPr>
@@ -6566,9 +6623,10 @@
         <w:rPr>
           <w:noProof/>
         </w:rPr>
+        <w:lastRenderedPageBreak/>
         <w:drawing>
           <wp:inline distT="0" distB="0" distL="0" distR="0" wp14:anchorId="136854BA" wp14:editId="24870DC2">
-            <wp:extent cx="5486400" cy="4342667"/>
+            <wp:extent cx="5486400" cy="2721684"/>
             <wp:effectExtent l="0" t="0" r="0" b="0"/>
             <wp:docPr id="6" name="Picture 6"/>
             <wp:cNvGraphicFramePr>
@@ -6590,7 +6648,7 @@
                   <pic:spPr>
                     <a:xfrm>
                       <a:off x="0" y="0"/>
-                      <a:ext cx="5486400" cy="4342667"/>
+                      <a:ext cx="5486400" cy="2721684"/>
                     </a:xfrm>
                     <a:prstGeom prst="rect">
                       <a:avLst/>
@@ -6627,7 +6685,7 @@
         </w:rPr>
         <w:drawing>
           <wp:inline distT="0" distB="0" distL="0" distR="0" wp14:anchorId="6C278911" wp14:editId="43C236DB">
-            <wp:extent cx="5486400" cy="1965626"/>
+            <wp:extent cx="5486400" cy="1016527"/>
             <wp:effectExtent l="0" t="0" r="0" b="0"/>
             <wp:docPr id="7" name="Picture 7"/>
             <wp:cNvGraphicFramePr>
@@ -6649,7 +6707,7 @@
                   <pic:spPr>
                     <a:xfrm>
                       <a:off x="0" y="0"/>
-                      <a:ext cx="5486400" cy="1965626"/>
+                      <a:ext cx="5486400" cy="1016527"/>
                     </a:xfrm>
                     <a:prstGeom prst="rect">
                       <a:avLst/>
@@ -6684,6 +6742,7 @@
         <w:rPr>
           <w:noProof/>
         </w:rPr>
+        <w:lastRenderedPageBreak/>
         <w:drawing>
           <wp:inline distT="0" distB="0" distL="0" distR="0" wp14:anchorId="0CBF35C5" wp14:editId="1E7E819D">
             <wp:extent cx="5486400" cy="1732366"/>
@@ -6751,7 +6810,15 @@
         <w:t>Which OS?</w:t>
       </w:r>
       <w:r>
-        <w:t xml:space="preserve"> The Dockerfile builds on tomcat:latest, a Linux image. </w:t>
+        <w:t xml:space="preserve"> The Dockerfile builds on </w:t>
+      </w:r>
+      <w:proofErr w:type="gramStart"/>
+      <w:r>
+        <w:t>tomcat:latest</w:t>
+      </w:r>
+      <w:proofErr w:type="gramEnd"/>
+      <w:r>
+        <w:t xml:space="preserve">, a Linux image. </w:t>
       </w:r>
       <w:r>
         <w:rPr>
@@ -6789,9 +6856,9 @@
         <w:tblLook w:val="04A0" w:firstRow="1" w:lastRow="0" w:firstColumn="1" w:lastColumn="0" w:noHBand="0" w:noVBand="1"/>
       </w:tblPr>
       <w:tblGrid>
-        <w:gridCol w:w="3010"/>
-        <w:gridCol w:w="3010"/>
-        <w:gridCol w:w="3010"/>
+        <w:gridCol w:w="2341"/>
+        <w:gridCol w:w="2880"/>
+        <w:gridCol w:w="3809"/>
       </w:tblGrid>
       <w:tr>
         <w:trPr>
@@ -6801,7 +6868,7 @@
         </w:trPr>
         <w:tc>
           <w:tcPr>
-            <w:tcW w:w="3010" w:type="dxa"/>
+            <w:tcW w:w="2341" w:type="dxa"/>
           </w:tcPr>
           <w:p>
             <w:pPr>
@@ -6820,7 +6887,7 @@
         </w:tc>
         <w:tc>
           <w:tcPr>
-            <w:tcW w:w="3010" w:type="dxa"/>
+            <w:tcW w:w="2880" w:type="dxa"/>
           </w:tcPr>
           <w:p>
             <w:pPr>
@@ -6839,7 +6906,7 @@
         </w:tc>
         <w:tc>
           <w:tcPr>
-            <w:tcW w:w="3010" w:type="dxa"/>
+            <w:tcW w:w="3809" w:type="dxa"/>
           </w:tcPr>
           <w:p>
             <w:pPr>
@@ -6864,7 +6931,7 @@
         </w:trPr>
         <w:tc>
           <w:tcPr>
-            <w:tcW w:w="3010" w:type="dxa"/>
+            <w:tcW w:w="2341" w:type="dxa"/>
           </w:tcPr>
           <w:p>
             <w:pPr>
@@ -6882,7 +6949,7 @@
         </w:tc>
         <w:tc>
           <w:tcPr>
-            <w:tcW w:w="3010" w:type="dxa"/>
+            <w:tcW w:w="2880" w:type="dxa"/>
           </w:tcPr>
           <w:p>
             <w:pPr>
@@ -6900,7 +6967,7 @@
         </w:tc>
         <w:tc>
           <w:tcPr>
-            <w:tcW w:w="3010" w:type="dxa"/>
+            <w:tcW w:w="3809" w:type="dxa"/>
           </w:tcPr>
           <w:p>
             <w:pPr>
@@ -6924,7 +6991,7 @@
         </w:trPr>
         <w:tc>
           <w:tcPr>
-            <w:tcW w:w="3010" w:type="dxa"/>
+            <w:tcW w:w="2341" w:type="dxa"/>
           </w:tcPr>
           <w:p>
             <w:pPr>
@@ -6942,25 +7009,33 @@
         </w:tc>
         <w:tc>
           <w:tcPr>
-            <w:tcW w:w="3010" w:type="dxa"/>
-          </w:tcPr>
-          <w:p>
-            <w:pPr>
-              <w:keepNext/>
-              <w:spacing w:after="40"/>
-              <w:jc w:val="left"/>
-            </w:pPr>
-            <w:r>
-              <w:rPr>
-                <w:sz w:val="20"/>
-              </w:rPr>
-              <w:t>database.properties lines 8, 10</w:t>
-            </w:r>
-          </w:p>
-        </w:tc>
-        <w:tc>
-          <w:tcPr>
-            <w:tcW w:w="3010" w:type="dxa"/>
+            <w:tcW w:w="2880" w:type="dxa"/>
+          </w:tcPr>
+          <w:p>
+            <w:pPr>
+              <w:keepNext/>
+              <w:spacing w:after="40"/>
+              <w:jc w:val="left"/>
+            </w:pPr>
+            <w:proofErr w:type="gramStart"/>
+            <w:r>
+              <w:rPr>
+                <w:sz w:val="20"/>
+              </w:rPr>
+              <w:t>database.properties</w:t>
+            </w:r>
+            <w:proofErr w:type="gramEnd"/>
+            <w:r>
+              <w:rPr>
+                <w:sz w:val="20"/>
+              </w:rPr>
+              <w:t xml:space="preserve"> lines 8, 10</w:t>
+            </w:r>
+          </w:p>
+        </w:tc>
+        <w:tc>
+          <w:tcPr>
+            <w:tcW w:w="3809" w:type="dxa"/>
           </w:tcPr>
           <w:p>
             <w:pPr>
@@ -6984,7 +7059,7 @@
         </w:trPr>
         <w:tc>
           <w:tcPr>
-            <w:tcW w:w="3010" w:type="dxa"/>
+            <w:tcW w:w="2341" w:type="dxa"/>
           </w:tcPr>
           <w:p>
             <w:pPr>
@@ -7001,24 +7076,32 @@
         </w:tc>
         <w:tc>
           <w:tcPr>
-            <w:tcW w:w="3010" w:type="dxa"/>
-          </w:tcPr>
-          <w:p>
-            <w:pPr>
-              <w:spacing w:after="40"/>
-              <w:jc w:val="left"/>
-            </w:pPr>
-            <w:r>
-              <w:rPr>
-                <w:sz w:val="20"/>
-              </w:rPr>
-              <w:t>database.properties lines 14, 16</w:t>
-            </w:r>
-          </w:p>
-        </w:tc>
-        <w:tc>
-          <w:tcPr>
-            <w:tcW w:w="3010" w:type="dxa"/>
+            <w:tcW w:w="2880" w:type="dxa"/>
+          </w:tcPr>
+          <w:p>
+            <w:pPr>
+              <w:spacing w:after="40"/>
+              <w:jc w:val="left"/>
+            </w:pPr>
+            <w:proofErr w:type="gramStart"/>
+            <w:r>
+              <w:rPr>
+                <w:sz w:val="20"/>
+              </w:rPr>
+              <w:t>database.properties</w:t>
+            </w:r>
+            <w:proofErr w:type="gramEnd"/>
+            <w:r>
+              <w:rPr>
+                <w:sz w:val="20"/>
+              </w:rPr>
+              <w:t xml:space="preserve"> lines 14, 16</w:t>
+            </w:r>
+          </w:p>
+        </w:tc>
+        <w:tc>
+          <w:tcPr>
+            <w:tcW w:w="3809" w:type="dxa"/>
           </w:tcPr>
           <w:p>
             <w:pPr>
@@ -7096,10 +7179,10 @@
         <w:tblLook w:val="04A0" w:firstRow="1" w:lastRow="0" w:firstColumn="1" w:lastColumn="0" w:noHBand="0" w:noVBand="1"/>
       </w:tblPr>
       <w:tblGrid>
-        <w:gridCol w:w="2257"/>
-        <w:gridCol w:w="2257"/>
-        <w:gridCol w:w="2257"/>
-        <w:gridCol w:w="2257"/>
+        <w:gridCol w:w="720"/>
+        <w:gridCol w:w="1800"/>
+        <w:gridCol w:w="3510"/>
+        <w:gridCol w:w="2998"/>
       </w:tblGrid>
       <w:tr>
         <w:trPr>
@@ -7109,14 +7192,15 @@
         </w:trPr>
         <w:tc>
           <w:tcPr>
-            <w:tcW w:w="2257" w:type="dxa"/>
-          </w:tcPr>
-          <w:p>
-            <w:pPr>
-              <w:keepNext/>
-              <w:spacing w:after="40"/>
-              <w:jc w:val="left"/>
-            </w:pPr>
+            <w:tcW w:w="720" w:type="dxa"/>
+          </w:tcPr>
+          <w:p>
+            <w:pPr>
+              <w:keepNext/>
+              <w:spacing w:after="40"/>
+              <w:jc w:val="left"/>
+            </w:pPr>
+            <w:proofErr w:type="gramStart"/>
             <w:r>
               <w:rPr>
                 <w:b/>
@@ -7124,11 +7208,12 @@
               </w:rPr>
               <w:t>S.No</w:t>
             </w:r>
-          </w:p>
-        </w:tc>
-        <w:tc>
-          <w:tcPr>
-            <w:tcW w:w="2257" w:type="dxa"/>
+            <w:proofErr w:type="gramEnd"/>
+          </w:p>
+        </w:tc>
+        <w:tc>
+          <w:tcPr>
+            <w:tcW w:w="1800" w:type="dxa"/>
           </w:tcPr>
           <w:p>
             <w:pPr>
@@ -7147,7 +7232,7 @@
         </w:tc>
         <w:tc>
           <w:tcPr>
-            <w:tcW w:w="2257" w:type="dxa"/>
+            <w:tcW w:w="3510" w:type="dxa"/>
           </w:tcPr>
           <w:p>
             <w:pPr>
@@ -7166,7 +7251,7 @@
         </w:tc>
         <w:tc>
           <w:tcPr>
-            <w:tcW w:w="2257" w:type="dxa"/>
+            <w:tcW w:w="2998" w:type="dxa"/>
           </w:tcPr>
           <w:p>
             <w:pPr>
@@ -7191,7 +7276,7 @@
         </w:trPr>
         <w:tc>
           <w:tcPr>
-            <w:tcW w:w="2257" w:type="dxa"/>
+            <w:tcW w:w="720" w:type="dxa"/>
           </w:tcPr>
           <w:p>
             <w:pPr>
@@ -7208,7 +7293,7 @@
         </w:tc>
         <w:tc>
           <w:tcPr>
-            <w:tcW w:w="2257" w:type="dxa"/>
+            <w:tcW w:w="1800" w:type="dxa"/>
           </w:tcPr>
           <w:p>
             <w:pPr>
@@ -7225,7 +7310,7 @@
         </w:tc>
         <w:tc>
           <w:tcPr>
-            <w:tcW w:w="2257" w:type="dxa"/>
+            <w:tcW w:w="3510" w:type="dxa"/>
           </w:tcPr>
           <w:p>
             <w:pPr>
@@ -7242,7 +7327,7 @@
         </w:tc>
         <w:tc>
           <w:tcPr>
-            <w:tcW w:w="2257" w:type="dxa"/>
+            <w:tcW w:w="2998" w:type="dxa"/>
           </w:tcPr>
           <w:p>
             <w:pPr>
@@ -7295,6 +7380,7 @@
       </w:pPr>
       <w:bookmarkStart w:id="19" w:name="_Toc241587871"/>
       <w:r>
+        <w:lastRenderedPageBreak/>
         <w:t>Activity 7: metadata examination</w:t>
       </w:r>
       <w:bookmarkEnd w:id="19"/>
@@ -7320,8 +7406,8 @@
         <w:tblLook w:val="04A0" w:firstRow="1" w:lastRow="0" w:firstColumn="1" w:lastColumn="0" w:noHBand="0" w:noVBand="1"/>
       </w:tblPr>
       <w:tblGrid>
-        <w:gridCol w:w="2997"/>
-        <w:gridCol w:w="6248"/>
+        <w:gridCol w:w="1008"/>
+        <w:gridCol w:w="6300"/>
       </w:tblGrid>
       <w:tr>
         <w:trPr>
@@ -7331,7 +7417,7 @@
         </w:trPr>
         <w:tc>
           <w:tcPr>
-            <w:tcW w:w="4514" w:type="dxa"/>
+            <w:tcW w:w="1008" w:type="dxa"/>
           </w:tcPr>
           <w:p>
             <w:pPr>
@@ -7350,7 +7436,7 @@
         </w:tc>
         <w:tc>
           <w:tcPr>
-            <w:tcW w:w="4514" w:type="dxa"/>
+            <w:tcW w:w="6300" w:type="dxa"/>
           </w:tcPr>
           <w:p>
             <w:pPr>
@@ -7375,7 +7461,7 @@
         </w:trPr>
         <w:tc>
           <w:tcPr>
-            <w:tcW w:w="4514" w:type="dxa"/>
+            <w:tcW w:w="1008" w:type="dxa"/>
           </w:tcPr>
           <w:p>
             <w:pPr>
@@ -7393,7 +7479,7 @@
         </w:tc>
         <w:tc>
           <w:tcPr>
-            <w:tcW w:w="4514" w:type="dxa"/>
+            <w:tcW w:w="6300" w:type="dxa"/>
           </w:tcPr>
           <w:p>
             <w:pPr>
@@ -7417,7 +7503,7 @@
         </w:trPr>
         <w:tc>
           <w:tcPr>
-            <w:tcW w:w="4514" w:type="dxa"/>
+            <w:tcW w:w="1008" w:type="dxa"/>
           </w:tcPr>
           <w:p>
             <w:pPr>
@@ -7435,7 +7521,7 @@
         </w:tc>
         <w:tc>
           <w:tcPr>
-            <w:tcW w:w="4514" w:type="dxa"/>
+            <w:tcW w:w="6300" w:type="dxa"/>
           </w:tcPr>
           <w:p>
             <w:pPr>
@@ -7459,7 +7545,7 @@
         </w:trPr>
         <w:tc>
           <w:tcPr>
-            <w:tcW w:w="4514" w:type="dxa"/>
+            <w:tcW w:w="1008" w:type="dxa"/>
           </w:tcPr>
           <w:p>
             <w:pPr>
@@ -7477,19 +7563,27 @@
         </w:tc>
         <w:tc>
           <w:tcPr>
-            <w:tcW w:w="4514" w:type="dxa"/>
-          </w:tcPr>
-          <w:p>
-            <w:pPr>
-              <w:keepNext/>
-              <w:spacing w:after="40"/>
-              <w:jc w:val="left"/>
-            </w:pPr>
-            <w:r>
-              <w:rPr>
-                <w:sz w:val="20"/>
-              </w:rPr>
-              <w:t>org.apache.struts, struts2-core, version 2.5.10</w:t>
+            <w:tcW w:w="6300" w:type="dxa"/>
+          </w:tcPr>
+          <w:p>
+            <w:pPr>
+              <w:keepNext/>
+              <w:spacing w:after="40"/>
+              <w:jc w:val="left"/>
+            </w:pPr>
+            <w:proofErr w:type="gramStart"/>
+            <w:r>
+              <w:rPr>
+                <w:sz w:val="20"/>
+              </w:rPr>
+              <w:t>org.apache</w:t>
+            </w:r>
+            <w:proofErr w:type="gramEnd"/>
+            <w:r>
+              <w:rPr>
+                <w:sz w:val="20"/>
+              </w:rPr>
+              <w:t>.struts, struts2-core, version 2.5.10</w:t>
             </w:r>
           </w:p>
         </w:tc>
@@ -7501,7 +7595,7 @@
         </w:trPr>
         <w:tc>
           <w:tcPr>
-            <w:tcW w:w="4514" w:type="dxa"/>
+            <w:tcW w:w="1008" w:type="dxa"/>
           </w:tcPr>
           <w:p>
             <w:pPr>
@@ -7518,7 +7612,7 @@
         </w:tc>
         <w:tc>
           <w:tcPr>
-            <w:tcW w:w="4514" w:type="dxa"/>
+            <w:tcW w:w="6300" w:type="dxa"/>
           </w:tcPr>
           <w:p>
             <w:pPr>
@@ -7547,7 +7641,7 @@
         </w:rPr>
         <w:drawing>
           <wp:inline distT="0" distB="0" distL="0" distR="0" wp14:anchorId="763F1C9A" wp14:editId="6E394577">
-            <wp:extent cx="5486400" cy="952606"/>
+            <wp:extent cx="5486400" cy="462915"/>
             <wp:effectExtent l="0" t="0" r="0" b="0"/>
             <wp:docPr id="9" name="Picture 9"/>
             <wp:cNvGraphicFramePr>
@@ -7569,7 +7663,7 @@
                   <pic:spPr>
                     <a:xfrm>
                       <a:off x="0" y="0"/>
-                      <a:ext cx="5486400" cy="952606"/>
+                      <a:ext cx="5486400" cy="462915"/>
                     </a:xfrm>
                     <a:prstGeom prst="rect">
                       <a:avLst/>
@@ -7675,6 +7769,7 @@
       </w:pPr>
       <w:bookmarkStart w:id="21" w:name="_Toc241587873"/>
       <w:r>
+        <w:lastRenderedPageBreak/>
         <w:t>Activity 9: keyword search</w:t>
       </w:r>
       <w:bookmarkEnd w:id="21"/>
@@ -7684,7 +7779,15 @@
         <w:keepNext/>
       </w:pPr>
       <w:r>
-        <w:t>Searching the evidence for the sheet's eight keywords, password gave the most: four database passwords in database.properties (lines 9, 11, 15, 17), plus the same password in the Dockerfile. secret and backup matched the session secret, AWS keys and the private key; confidential, customer and salary matched nothing. A keyword only finds words, so we also ran Trivy's secret scanner with two custom rules, which found 11 secrets in 4 files, 9 critical:</w:t>
+        <w:t xml:space="preserve">Searching the evidence for the sheet's eight keywords, password gave the most: four database passwords in </w:t>
+      </w:r>
+      <w:proofErr w:type="gramStart"/>
+      <w:r>
+        <w:t>database.properties</w:t>
+      </w:r>
+      <w:proofErr w:type="gramEnd"/>
+      <w:r>
+        <w:t xml:space="preserve"> (lines 9, 11, 15, 17), plus the same password in the Dockerfile. secret and backup matched the session secret, AWS keys and the private key; confidential, customer and salary matched nothing. A keyword only finds words, so we also ran Trivy's secret scanner with two custom rules, which found 11 secrets in 4 files, 9 critical:</w:t>
       </w:r>
     </w:p>
     <w:tbl>
@@ -7703,10 +7806,10 @@
         <w:tblLook w:val="04A0" w:firstRow="1" w:lastRow="0" w:firstColumn="1" w:lastColumn="0" w:noHBand="0" w:noVBand="1"/>
       </w:tblPr>
       <w:tblGrid>
-        <w:gridCol w:w="2219"/>
-        <w:gridCol w:w="2577"/>
-        <w:gridCol w:w="2220"/>
-        <w:gridCol w:w="2229"/>
+        <w:gridCol w:w="1008"/>
+        <w:gridCol w:w="2790"/>
+        <w:gridCol w:w="2160"/>
+        <w:gridCol w:w="3287"/>
       </w:tblGrid>
       <w:tr>
         <w:trPr>
@@ -7716,7 +7819,7 @@
         </w:trPr>
         <w:tc>
           <w:tcPr>
-            <w:tcW w:w="2257" w:type="dxa"/>
+            <w:tcW w:w="1008" w:type="dxa"/>
           </w:tcPr>
           <w:p>
             <w:pPr>
@@ -7735,7 +7838,7 @@
         </w:tc>
         <w:tc>
           <w:tcPr>
-            <w:tcW w:w="2257" w:type="dxa"/>
+            <w:tcW w:w="2790" w:type="dxa"/>
           </w:tcPr>
           <w:p>
             <w:pPr>
@@ -7754,7 +7857,7 @@
         </w:tc>
         <w:tc>
           <w:tcPr>
-            <w:tcW w:w="2257" w:type="dxa"/>
+            <w:tcW w:w="2160" w:type="dxa"/>
           </w:tcPr>
           <w:p>
             <w:pPr>
@@ -7773,7 +7876,7 @@
         </w:tc>
         <w:tc>
           <w:tcPr>
-            <w:tcW w:w="2257" w:type="dxa"/>
+            <w:tcW w:w="3287" w:type="dxa"/>
           </w:tcPr>
           <w:p>
             <w:pPr>
@@ -7798,7 +7901,7 @@
         </w:trPr>
         <w:tc>
           <w:tcPr>
-            <w:tcW w:w="2257" w:type="dxa"/>
+            <w:tcW w:w="1008" w:type="dxa"/>
           </w:tcPr>
           <w:p>
             <w:pPr>
@@ -7816,25 +7919,39 @@
         </w:tc>
         <w:tc>
           <w:tcPr>
-            <w:tcW w:w="2257" w:type="dxa"/>
-          </w:tcPr>
-          <w:p>
-            <w:pPr>
-              <w:keepNext/>
-              <w:spacing w:after="40"/>
-              <w:jc w:val="left"/>
-            </w:pPr>
-            <w:r>
-              <w:rPr>
-                <w:sz w:val="20"/>
-              </w:rPr>
-              <w:t>config/.env:4</w:t>
-            </w:r>
-          </w:p>
-        </w:tc>
-        <w:tc>
-          <w:tcPr>
-            <w:tcW w:w="2257" w:type="dxa"/>
+            <w:tcW w:w="2790" w:type="dxa"/>
+          </w:tcPr>
+          <w:p>
+            <w:pPr>
+              <w:keepNext/>
+              <w:spacing w:after="40"/>
+              <w:jc w:val="left"/>
+            </w:pPr>
+            <w:r>
+              <w:rPr>
+                <w:sz w:val="20"/>
+              </w:rPr>
+              <w:t>config</w:t>
+            </w:r>
+            <w:proofErr w:type="gramStart"/>
+            <w:r>
+              <w:rPr>
+                <w:sz w:val="20"/>
+              </w:rPr>
+              <w:t>/.env</w:t>
+            </w:r>
+            <w:proofErr w:type="gramEnd"/>
+            <w:r>
+              <w:rPr>
+                <w:sz w:val="20"/>
+              </w:rPr>
+              <w:t>:4</w:t>
+            </w:r>
+          </w:p>
+        </w:tc>
+        <w:tc>
+          <w:tcPr>
+            <w:tcW w:w="2160" w:type="dxa"/>
           </w:tcPr>
           <w:p>
             <w:pPr>
@@ -7852,7 +7969,7 @@
         </w:tc>
         <w:tc>
           <w:tcPr>
-            <w:tcW w:w="2257" w:type="dxa"/>
+            <w:tcW w:w="3287" w:type="dxa"/>
           </w:tcPr>
           <w:p>
             <w:pPr>
@@ -7876,7 +7993,7 @@
         </w:trPr>
         <w:tc>
           <w:tcPr>
-            <w:tcW w:w="2257" w:type="dxa"/>
+            <w:tcW w:w="1008" w:type="dxa"/>
           </w:tcPr>
           <w:p>
             <w:pPr>
@@ -7894,25 +8011,39 @@
         </w:tc>
         <w:tc>
           <w:tcPr>
-            <w:tcW w:w="2257" w:type="dxa"/>
-          </w:tcPr>
-          <w:p>
-            <w:pPr>
-              <w:keepNext/>
-              <w:spacing w:after="40"/>
-              <w:jc w:val="left"/>
-            </w:pPr>
-            <w:r>
-              <w:rPr>
-                <w:sz w:val="20"/>
-              </w:rPr>
-              <w:t>config/.env:3</w:t>
-            </w:r>
-          </w:p>
-        </w:tc>
-        <w:tc>
-          <w:tcPr>
-            <w:tcW w:w="2257" w:type="dxa"/>
+            <w:tcW w:w="2790" w:type="dxa"/>
+          </w:tcPr>
+          <w:p>
+            <w:pPr>
+              <w:keepNext/>
+              <w:spacing w:after="40"/>
+              <w:jc w:val="left"/>
+            </w:pPr>
+            <w:r>
+              <w:rPr>
+                <w:sz w:val="20"/>
+              </w:rPr>
+              <w:t>config</w:t>
+            </w:r>
+            <w:proofErr w:type="gramStart"/>
+            <w:r>
+              <w:rPr>
+                <w:sz w:val="20"/>
+              </w:rPr>
+              <w:t>/.env</w:t>
+            </w:r>
+            <w:proofErr w:type="gramEnd"/>
+            <w:r>
+              <w:rPr>
+                <w:sz w:val="20"/>
+              </w:rPr>
+              <w:t>:3</w:t>
+            </w:r>
+          </w:p>
+        </w:tc>
+        <w:tc>
+          <w:tcPr>
+            <w:tcW w:w="2160" w:type="dxa"/>
           </w:tcPr>
           <w:p>
             <w:pPr>
@@ -7930,7 +8061,7 @@
         </w:tc>
         <w:tc>
           <w:tcPr>
-            <w:tcW w:w="2257" w:type="dxa"/>
+            <w:tcW w:w="3287" w:type="dxa"/>
           </w:tcPr>
           <w:p>
             <w:pPr>
@@ -7954,7 +8085,7 @@
         </w:trPr>
         <w:tc>
           <w:tcPr>
-            <w:tcW w:w="2257" w:type="dxa"/>
+            <w:tcW w:w="1008" w:type="dxa"/>
           </w:tcPr>
           <w:p>
             <w:pPr>
@@ -7972,7 +8103,7 @@
         </w:tc>
         <w:tc>
           <w:tcPr>
-            <w:tcW w:w="2257" w:type="dxa"/>
+            <w:tcW w:w="2790" w:type="dxa"/>
           </w:tcPr>
           <w:p>
             <w:pPr>
@@ -7990,7 +8121,7 @@
         </w:tc>
         <w:tc>
           <w:tcPr>
-            <w:tcW w:w="2257" w:type="dxa"/>
+            <w:tcW w:w="2160" w:type="dxa"/>
           </w:tcPr>
           <w:p>
             <w:pPr>
@@ -8008,7 +8139,7 @@
         </w:tc>
         <w:tc>
           <w:tcPr>
-            <w:tcW w:w="2257" w:type="dxa"/>
+            <w:tcW w:w="3287" w:type="dxa"/>
           </w:tcPr>
           <w:p>
             <w:pPr>
@@ -8032,7 +8163,7 @@
         </w:trPr>
         <w:tc>
           <w:tcPr>
-            <w:tcW w:w="2257" w:type="dxa"/>
+            <w:tcW w:w="1008" w:type="dxa"/>
           </w:tcPr>
           <w:p>
             <w:pPr>
@@ -8050,7 +8181,7 @@
         </w:tc>
         <w:tc>
           <w:tcPr>
-            <w:tcW w:w="2257" w:type="dxa"/>
+            <w:tcW w:w="2790" w:type="dxa"/>
           </w:tcPr>
           <w:p>
             <w:pPr>
@@ -8068,7 +8199,7 @@
         </w:tc>
         <w:tc>
           <w:tcPr>
-            <w:tcW w:w="2257" w:type="dxa"/>
+            <w:tcW w:w="2160" w:type="dxa"/>
           </w:tcPr>
           <w:p>
             <w:pPr>
@@ -8086,7 +8217,7 @@
         </w:tc>
         <w:tc>
           <w:tcPr>
-            <w:tcW w:w="2257" w:type="dxa"/>
+            <w:tcW w:w="3287" w:type="dxa"/>
           </w:tcPr>
           <w:p>
             <w:pPr>
@@ -8110,7 +8241,7 @@
         </w:trPr>
         <w:tc>
           <w:tcPr>
-            <w:tcW w:w="2257" w:type="dxa"/>
+            <w:tcW w:w="1008" w:type="dxa"/>
           </w:tcPr>
           <w:p>
             <w:pPr>
@@ -8128,7 +8259,7 @@
         </w:tc>
         <w:tc>
           <w:tcPr>
-            <w:tcW w:w="2257" w:type="dxa"/>
+            <w:tcW w:w="2790" w:type="dxa"/>
           </w:tcPr>
           <w:p>
             <w:pPr>
@@ -8146,7 +8277,7 @@
         </w:tc>
         <w:tc>
           <w:tcPr>
-            <w:tcW w:w="2257" w:type="dxa"/>
+            <w:tcW w:w="2160" w:type="dxa"/>
           </w:tcPr>
           <w:p>
             <w:pPr>
@@ -8164,7 +8295,7 @@
         </w:tc>
         <w:tc>
           <w:tcPr>
-            <w:tcW w:w="2257" w:type="dxa"/>
+            <w:tcW w:w="3287" w:type="dxa"/>
           </w:tcPr>
           <w:p>
             <w:pPr>
@@ -8188,7 +8319,7 @@
         </w:trPr>
         <w:tc>
           <w:tcPr>
-            <w:tcW w:w="2257" w:type="dxa"/>
+            <w:tcW w:w="1008" w:type="dxa"/>
           </w:tcPr>
           <w:p>
             <w:pPr>
@@ -8206,7 +8337,7 @@
         </w:tc>
         <w:tc>
           <w:tcPr>
-            <w:tcW w:w="2257" w:type="dxa"/>
+            <w:tcW w:w="2790" w:type="dxa"/>
           </w:tcPr>
           <w:p>
             <w:pPr>
@@ -8224,7 +8355,7 @@
         </w:tc>
         <w:tc>
           <w:tcPr>
-            <w:tcW w:w="2257" w:type="dxa"/>
+            <w:tcW w:w="2160" w:type="dxa"/>
           </w:tcPr>
           <w:p>
             <w:pPr>
@@ -8242,7 +8373,7 @@
         </w:tc>
         <w:tc>
           <w:tcPr>
-            <w:tcW w:w="2257" w:type="dxa"/>
+            <w:tcW w:w="3287" w:type="dxa"/>
           </w:tcPr>
           <w:p>
             <w:pPr>
@@ -8266,7 +8397,7 @@
         </w:trPr>
         <w:tc>
           <w:tcPr>
-            <w:tcW w:w="2257" w:type="dxa"/>
+            <w:tcW w:w="1008" w:type="dxa"/>
           </w:tcPr>
           <w:p>
             <w:pPr>
@@ -8284,7 +8415,7 @@
         </w:tc>
         <w:tc>
           <w:tcPr>
-            <w:tcW w:w="2257" w:type="dxa"/>
+            <w:tcW w:w="2790" w:type="dxa"/>
           </w:tcPr>
           <w:p>
             <w:pPr>
@@ -8302,7 +8433,7 @@
         </w:tc>
         <w:tc>
           <w:tcPr>
-            <w:tcW w:w="2257" w:type="dxa"/>
+            <w:tcW w:w="2160" w:type="dxa"/>
           </w:tcPr>
           <w:p>
             <w:pPr>
@@ -8320,7 +8451,7 @@
         </w:tc>
         <w:tc>
           <w:tcPr>
-            <w:tcW w:w="2257" w:type="dxa"/>
+            <w:tcW w:w="3287" w:type="dxa"/>
           </w:tcPr>
           <w:p>
             <w:pPr>
@@ -8344,7 +8475,7 @@
         </w:trPr>
         <w:tc>
           <w:tcPr>
-            <w:tcW w:w="2257" w:type="dxa"/>
+            <w:tcW w:w="1008" w:type="dxa"/>
           </w:tcPr>
           <w:p>
             <w:pPr>
@@ -8362,7 +8493,7 @@
         </w:tc>
         <w:tc>
           <w:tcPr>
-            <w:tcW w:w="2257" w:type="dxa"/>
+            <w:tcW w:w="2790" w:type="dxa"/>
           </w:tcPr>
           <w:p>
             <w:pPr>
@@ -8380,7 +8511,7 @@
         </w:tc>
         <w:tc>
           <w:tcPr>
-            <w:tcW w:w="2257" w:type="dxa"/>
+            <w:tcW w:w="2160" w:type="dxa"/>
           </w:tcPr>
           <w:p>
             <w:pPr>
@@ -8398,7 +8529,7 @@
         </w:tc>
         <w:tc>
           <w:tcPr>
-            <w:tcW w:w="2257" w:type="dxa"/>
+            <w:tcW w:w="3287" w:type="dxa"/>
           </w:tcPr>
           <w:p>
             <w:pPr>
@@ -8422,7 +8553,7 @@
         </w:trPr>
         <w:tc>
           <w:tcPr>
-            <w:tcW w:w="2257" w:type="dxa"/>
+            <w:tcW w:w="1008" w:type="dxa"/>
           </w:tcPr>
           <w:p>
             <w:pPr>
@@ -8440,7 +8571,7 @@
         </w:tc>
         <w:tc>
           <w:tcPr>
-            <w:tcW w:w="2257" w:type="dxa"/>
+            <w:tcW w:w="2790" w:type="dxa"/>
           </w:tcPr>
           <w:p>
             <w:pPr>
@@ -8458,7 +8589,7 @@
         </w:tc>
         <w:tc>
           <w:tcPr>
-            <w:tcW w:w="2257" w:type="dxa"/>
+            <w:tcW w:w="2160" w:type="dxa"/>
           </w:tcPr>
           <w:p>
             <w:pPr>
@@ -8476,7 +8607,7 @@
         </w:tc>
         <w:tc>
           <w:tcPr>
-            <w:tcW w:w="2257" w:type="dxa"/>
+            <w:tcW w:w="3287" w:type="dxa"/>
           </w:tcPr>
           <w:p>
             <w:pPr>
@@ -8500,7 +8631,7 @@
         </w:trPr>
         <w:tc>
           <w:tcPr>
-            <w:tcW w:w="2257" w:type="dxa"/>
+            <w:tcW w:w="1008" w:type="dxa"/>
           </w:tcPr>
           <w:p>
             <w:pPr>
@@ -8518,7 +8649,7 @@
         </w:tc>
         <w:tc>
           <w:tcPr>
-            <w:tcW w:w="2257" w:type="dxa"/>
+            <w:tcW w:w="2790" w:type="dxa"/>
           </w:tcPr>
           <w:p>
             <w:pPr>
@@ -8536,7 +8667,7 @@
         </w:tc>
         <w:tc>
           <w:tcPr>
-            <w:tcW w:w="2257" w:type="dxa"/>
+            <w:tcW w:w="2160" w:type="dxa"/>
           </w:tcPr>
           <w:p>
             <w:pPr>
@@ -8554,7 +8685,7 @@
         </w:tc>
         <w:tc>
           <w:tcPr>
-            <w:tcW w:w="2257" w:type="dxa"/>
+            <w:tcW w:w="3287" w:type="dxa"/>
           </w:tcPr>
           <w:p>
             <w:pPr>
@@ -8578,7 +8709,7 @@
         </w:trPr>
         <w:tc>
           <w:tcPr>
-            <w:tcW w:w="2257" w:type="dxa"/>
+            <w:tcW w:w="1008" w:type="dxa"/>
           </w:tcPr>
           <w:p>
             <w:pPr>
@@ -8595,7 +8726,7 @@
         </w:tc>
         <w:tc>
           <w:tcPr>
-            <w:tcW w:w="2257" w:type="dxa"/>
+            <w:tcW w:w="2790" w:type="dxa"/>
           </w:tcPr>
           <w:p>
             <w:pPr>
@@ -8612,7 +8743,7 @@
         </w:tc>
         <w:tc>
           <w:tcPr>
-            <w:tcW w:w="2257" w:type="dxa"/>
+            <w:tcW w:w="2160" w:type="dxa"/>
           </w:tcPr>
           <w:p>
             <w:pPr>
@@ -8629,7 +8760,7 @@
         </w:tc>
         <w:tc>
           <w:tcPr>
-            <w:tcW w:w="2257" w:type="dxa"/>
+            <w:tcW w:w="3287" w:type="dxa"/>
           </w:tcPr>
           <w:p>
             <w:pPr>
@@ -8658,7 +8789,7 @@
         </w:rPr>
         <w:drawing>
           <wp:inline distT="0" distB="0" distL="0" distR="0" wp14:anchorId="262ADA72" wp14:editId="550B16C3">
-            <wp:extent cx="5486400" cy="3027499"/>
+            <wp:extent cx="5486400" cy="1076706"/>
             <wp:effectExtent l="0" t="0" r="0" b="0"/>
             <wp:docPr id="10" name="Picture 10"/>
             <wp:cNvGraphicFramePr>
@@ -8680,7 +8811,7 @@
                   <pic:spPr>
                     <a:xfrm>
                       <a:off x="0" y="0"/>
-                      <a:ext cx="5486400" cy="3027499"/>
+                      <a:ext cx="5486400" cy="1076706"/>
                     </a:xfrm>
                     <a:prstGeom prst="rect">
                       <a:avLst/>
@@ -8708,7 +8839,11 @@
     </w:p>
     <w:p>
       <w:r>
-        <w:t xml:space="preserve">Our first rule missed the read-only password on line 11; we found that by hand and widened the pattern. The scanner also missed the two secrets in the Dockerfile, which the keyword and configuration checks caught. </w:t>
+        <w:t xml:space="preserve">Our first rule missed the read-only password on line 11; we found that by hand and widened the pattern. The scanner also missed the two secrets in the Dockerfile, which the keyword and </w:t>
+      </w:r>
+      <w:r>
+        <w:lastRenderedPageBreak/>
+        <w:t xml:space="preserve">configuration checks caught. </w:t>
       </w:r>
       <w:r>
         <w:rPr>
@@ -8731,7 +8866,7 @@
         </w:rPr>
         <w:drawing>
           <wp:inline distT="0" distB="0" distL="0" distR="0" wp14:anchorId="25751E65" wp14:editId="191BBD38">
-            <wp:extent cx="5486400" cy="3888693"/>
+            <wp:extent cx="5486400" cy="1522476"/>
             <wp:effectExtent l="0" t="0" r="0" b="0"/>
             <wp:docPr id="11" name="Picture 11"/>
             <wp:cNvGraphicFramePr>
@@ -8753,7 +8888,7 @@
                   <pic:spPr>
                     <a:xfrm>
                       <a:off x="0" y="0"/>
-                      <a:ext cx="5486400" cy="3888693"/>
+                      <a:ext cx="5486400" cy="1522476"/>
                     </a:xfrm>
                     <a:prstGeom prst="rect">
                       <a:avLst/>
@@ -8791,7 +8926,15 @@
     </w:p>
     <w:p>
       <w:r>
-        <w:t xml:space="preserve">Every file's first bytes matched its extension: the JAR is a ZIP (50 4B 03 04), the .pem an RSA key, pom.xml is XML, the rest text. No file was disguised. aws-credentials and Dockerfile have no extension, yet hold sensitive data; Trivy scans by content, so it read them anyway. </w:t>
+        <w:t xml:space="preserve">Every file's first bytes matched its extension: the JAR is a ZIP (50 4B 03 04), </w:t>
+      </w:r>
+      <w:proofErr w:type="gramStart"/>
+      <w:r>
+        <w:t>the .pem</w:t>
+      </w:r>
+      <w:proofErr w:type="gramEnd"/>
+      <w:r>
+        <w:t xml:space="preserve"> an RSA key, pom.xml is XML, the rest text. No file was disguised. aws-credentials and Dockerfile have no extension, yet hold sensitive data; Trivy scans by content, so it read them anyway. </w:t>
       </w:r>
       <w:r>
         <w:rPr>
@@ -8850,6 +8993,7 @@
                 <w:b/>
                 <w:sz w:val="20"/>
               </w:rPr>
+              <w:lastRenderedPageBreak/>
               <w:t>Severity</w:t>
             </w:r>
           </w:p>
@@ -9215,11 +9359,19 @@
               <w:spacing w:after="40"/>
               <w:jc w:val="left"/>
             </w:pPr>
-            <w:r>
-              <w:rPr>
-                <w:sz w:val="20"/>
-              </w:rPr>
-              <w:t>':latest' tag used</w:t>
+            <w:proofErr w:type="gramStart"/>
+            <w:r>
+              <w:rPr>
+                <w:sz w:val="20"/>
+              </w:rPr>
+              <w:t>':latest</w:t>
+            </w:r>
+            <w:proofErr w:type="gramEnd"/>
+            <w:r>
+              <w:rPr>
+                <w:sz w:val="20"/>
+              </w:rPr>
+              <w:t>' tag used</w:t>
             </w:r>
           </w:p>
         </w:tc>
@@ -9311,7 +9463,7 @@
         </w:rPr>
         <w:drawing>
           <wp:inline distT="0" distB="0" distL="0" distR="0" wp14:anchorId="5836CD7B" wp14:editId="4975D41B">
-            <wp:extent cx="5486400" cy="1627190"/>
+            <wp:extent cx="5486400" cy="473202"/>
             <wp:effectExtent l="0" t="0" r="0" b="0"/>
             <wp:docPr id="12" name="Picture 12"/>
             <wp:cNvGraphicFramePr>
@@ -9333,7 +9485,7 @@
                   <pic:spPr>
                     <a:xfrm>
                       <a:off x="0" y="0"/>
-                      <a:ext cx="5486400" cy="1627190"/>
+                      <a:ext cx="5486400" cy="473202"/>
                     </a:xfrm>
                     <a:prstGeom prst="rect">
                       <a:avLst/>
@@ -9371,7 +9523,15 @@
     </w:p>
     <w:p>
       <w:r>
-        <w:t xml:space="preserve">Two dates come from our evidence: the JAR was built 27 January 2017 (pom.properties), and the CVE record is dated 11 March 2017 (scan output). The rest come from the case record: flaw announced and fixed 7 March, intrusion 13 May, attack spotted 29 July, portal down 30 July, breach announced 7 September. In order: library built, flaw announced and fixed, intrusion 67 days later, 76 days undetected, certificate renewed, attack spotted, portal down, breach disclosed. </w:t>
+        <w:t>Two dates come from our evidence: the JAR was built 27 January 2017 (</w:t>
+      </w:r>
+      <w:proofErr w:type="gramStart"/>
+      <w:r>
+        <w:t>pom.properties</w:t>
+      </w:r>
+      <w:proofErr w:type="gramEnd"/>
+      <w:r>
+        <w:t xml:space="preserve">), and the CVE record is dated 11 March 2017 (scan output). The rest come from the case record: flaw announced and fixed 7 March, intrusion 13 May, attack spotted 29 July, portal down 30 July, breach announced 7 September. In order: library built, flaw announced and fixed, intrusion 67 days later, 76 days undetected, certificate renewed, attack spotted, portal down, breach disclosed. </w:t>
       </w:r>
       <w:r>
         <w:rPr>
@@ -9581,7 +9741,11 @@
         <w:t>What follows when several independent artifacts agree?</w:t>
       </w:r>
       <w:r>
-        <w:t xml:space="preserve"> Confidence rises. One finding could be a misconfiguration or a tool error; a vulnerability record, a configuration file and a credentials file all pointing the same way, with consistent dates, would all have to be wrong at once.</w:t>
+        <w:t xml:space="preserve"> Confidence rises. One finding could be a misconfiguration or a tool error; a vulnerability record, a configuration file and a </w:t>
+      </w:r>
+      <w:r>
+        <w:lastRenderedPageBreak/>
+        <w:t>credentials file all pointing the same way, with consistent dates, would all have to be wrong at once.</w:t>
       </w:r>
     </w:p>
     <w:p>
@@ -10125,8 +10289,16 @@
               <w:rPr>
                 <w:sz w:val="20"/>
               </w:rPr>
-              <w:t>config/.env</w:t>
-            </w:r>
+              <w:t>config</w:t>
+            </w:r>
+            <w:proofErr w:type="gramStart"/>
+            <w:r>
+              <w:rPr>
+                <w:sz w:val="20"/>
+              </w:rPr>
+              <w:t>/.env</w:t>
+            </w:r>
+            <w:proofErr w:type="gramEnd"/>
           </w:p>
         </w:tc>
         <w:tc>
@@ -10333,8 +10505,16 @@
               <w:rPr>
                 <w:sz w:val="20"/>
               </w:rPr>
-              <w:t>01-rootfs-vulnerabilities.json</w:t>
-            </w:r>
+              <w:t>01-rootfs-</w:t>
+            </w:r>
+            <w:proofErr w:type="gramStart"/>
+            <w:r>
+              <w:rPr>
+                <w:sz w:val="20"/>
+              </w:rPr>
+              <w:t>vulnerabilities.json</w:t>
+            </w:r>
+            <w:proofErr w:type="gramEnd"/>
           </w:p>
         </w:tc>
         <w:tc>
@@ -10417,8 +10597,16 @@
               <w:rPr>
                 <w:sz w:val="20"/>
               </w:rPr>
-              <w:t>02-manifest-vulnerabilities.json</w:t>
-            </w:r>
+              <w:t>02-manifest-</w:t>
+            </w:r>
+            <w:proofErr w:type="gramStart"/>
+            <w:r>
+              <w:rPr>
+                <w:sz w:val="20"/>
+              </w:rPr>
+              <w:t>vulnerabilities.json</w:t>
+            </w:r>
+            <w:proofErr w:type="gramEnd"/>
           </w:p>
         </w:tc>
         <w:tc>
@@ -10501,8 +10689,16 @@
               <w:rPr>
                 <w:sz w:val="20"/>
               </w:rPr>
-              <w:t>03-secrets.json</w:t>
-            </w:r>
+              <w:t>03-</w:t>
+            </w:r>
+            <w:proofErr w:type="gramStart"/>
+            <w:r>
+              <w:rPr>
+                <w:sz w:val="20"/>
+              </w:rPr>
+              <w:t>secrets.json</w:t>
+            </w:r>
+            <w:proofErr w:type="gramEnd"/>
           </w:p>
         </w:tc>
         <w:tc>
@@ -10585,8 +10781,16 @@
               <w:rPr>
                 <w:sz w:val="20"/>
               </w:rPr>
-              <w:t>04-misconfigurations.json</w:t>
-            </w:r>
+              <w:t>04-</w:t>
+            </w:r>
+            <w:proofErr w:type="gramStart"/>
+            <w:r>
+              <w:rPr>
+                <w:sz w:val="20"/>
+              </w:rPr>
+              <w:t>misconfigurations.json</w:t>
+            </w:r>
+            <w:proofErr w:type="gramEnd"/>
           </w:p>
         </w:tc>
         <w:tc>
@@ -10669,8 +10873,16 @@
               <w:rPr>
                 <w:sz w:val="20"/>
               </w:rPr>
-              <w:t>05-sbom-cyclonedx.json</w:t>
-            </w:r>
+              <w:t>05-sbom-</w:t>
+            </w:r>
+            <w:proofErr w:type="gramStart"/>
+            <w:r>
+              <w:rPr>
+                <w:sz w:val="20"/>
+              </w:rPr>
+              <w:t>cyclonedx.json</w:t>
+            </w:r>
+            <w:proofErr w:type="gramEnd"/>
           </w:p>
         </w:tc>
         <w:tc>
@@ -10785,6 +10997,7 @@
         <w:rPr>
           <w:noProof/>
         </w:rPr>
+        <w:lastRenderedPageBreak/>
         <w:drawing>
           <wp:inline distT="0" distB="0" distL="0" distR="0" wp14:anchorId="4856E347" wp14:editId="485A01F8">
             <wp:extent cx="5486400" cy="2526384"/>
@@ -10891,8 +11104,8 @@
         <w:tblLook w:val="04A0" w:firstRow="1" w:lastRow="0" w:firstColumn="1" w:lastColumn="0" w:noHBand="0" w:noVBand="1"/>
       </w:tblPr>
       <w:tblGrid>
-        <w:gridCol w:w="4514"/>
-        <w:gridCol w:w="4514"/>
+        <w:gridCol w:w="3600"/>
+        <w:gridCol w:w="5428"/>
       </w:tblGrid>
       <w:tr>
         <w:trPr>
@@ -10902,7 +11115,7 @@
         </w:trPr>
         <w:tc>
           <w:tcPr>
-            <w:tcW w:w="4514" w:type="dxa"/>
+            <w:tcW w:w="3600" w:type="dxa"/>
           </w:tcPr>
           <w:p>
             <w:pPr>
@@ -10921,7 +11134,7 @@
         </w:tc>
         <w:tc>
           <w:tcPr>
-            <w:tcW w:w="4514" w:type="dxa"/>
+            <w:tcW w:w="5428" w:type="dxa"/>
           </w:tcPr>
           <w:p>
             <w:pPr>
@@ -10946,7 +11159,7 @@
         </w:trPr>
         <w:tc>
           <w:tcPr>
-            <w:tcW w:w="4514" w:type="dxa"/>
+            <w:tcW w:w="3600" w:type="dxa"/>
           </w:tcPr>
           <w:p>
             <w:pPr>
@@ -10964,7 +11177,7 @@
         </w:tc>
         <w:tc>
           <w:tcPr>
-            <w:tcW w:w="4514" w:type="dxa"/>
+            <w:tcW w:w="5428" w:type="dxa"/>
           </w:tcPr>
           <w:p>
             <w:pPr>
@@ -10988,7 +11201,7 @@
         </w:trPr>
         <w:tc>
           <w:tcPr>
-            <w:tcW w:w="4514" w:type="dxa"/>
+            <w:tcW w:w="3600" w:type="dxa"/>
           </w:tcPr>
           <w:p>
             <w:pPr>
@@ -11006,7 +11219,7 @@
         </w:tc>
         <w:tc>
           <w:tcPr>
-            <w:tcW w:w="4514" w:type="dxa"/>
+            <w:tcW w:w="5428" w:type="dxa"/>
           </w:tcPr>
           <w:p>
             <w:pPr>
@@ -11030,7 +11243,7 @@
         </w:trPr>
         <w:tc>
           <w:tcPr>
-            <w:tcW w:w="4514" w:type="dxa"/>
+            <w:tcW w:w="3600" w:type="dxa"/>
           </w:tcPr>
           <w:p>
             <w:pPr>
@@ -11048,7 +11261,7 @@
         </w:tc>
         <w:tc>
           <w:tcPr>
-            <w:tcW w:w="4514" w:type="dxa"/>
+            <w:tcW w:w="5428" w:type="dxa"/>
           </w:tcPr>
           <w:p>
             <w:pPr>
@@ -11072,7 +11285,7 @@
         </w:trPr>
         <w:tc>
           <w:tcPr>
-            <w:tcW w:w="4514" w:type="dxa"/>
+            <w:tcW w:w="3600" w:type="dxa"/>
           </w:tcPr>
           <w:p>
             <w:pPr>
@@ -11090,7 +11303,7 @@
         </w:tc>
         <w:tc>
           <w:tcPr>
-            <w:tcW w:w="4514" w:type="dxa"/>
+            <w:tcW w:w="5428" w:type="dxa"/>
           </w:tcPr>
           <w:p>
             <w:pPr>
@@ -11114,7 +11327,7 @@
         </w:trPr>
         <w:tc>
           <w:tcPr>
-            <w:tcW w:w="4514" w:type="dxa"/>
+            <w:tcW w:w="3600" w:type="dxa"/>
           </w:tcPr>
           <w:p>
             <w:pPr>
@@ -11131,7 +11344,7 @@
         </w:tc>
         <w:tc>
           <w:tcPr>
-            <w:tcW w:w="4514" w:type="dxa"/>
+            <w:tcW w:w="5428" w:type="dxa"/>
           </w:tcPr>
           <w:p>
             <w:pPr>
@@ -11160,6 +11373,7 @@
       </w:pPr>
       <w:bookmarkStart w:id="29" w:name="_Toc241587881"/>
       <w:r>
+        <w:lastRenderedPageBreak/>
         <w:t>4.3 From 13 May 2027: the DPDP Act</w:t>
       </w:r>
       <w:bookmarkEnd w:id="29"/>
@@ -11185,8 +11399,8 @@
         <w:tblLook w:val="04A0" w:firstRow="1" w:lastRow="0" w:firstColumn="1" w:lastColumn="0" w:noHBand="0" w:noVBand="1"/>
       </w:tblPr>
       <w:tblGrid>
-        <w:gridCol w:w="3010"/>
-        <w:gridCol w:w="3010"/>
+        <w:gridCol w:w="1621"/>
+        <w:gridCol w:w="4399"/>
         <w:gridCol w:w="3010"/>
       </w:tblGrid>
       <w:tr>
@@ -11197,7 +11411,7 @@
         </w:trPr>
         <w:tc>
           <w:tcPr>
-            <w:tcW w:w="3010" w:type="dxa"/>
+            <w:tcW w:w="1621" w:type="dxa"/>
           </w:tcPr>
           <w:p>
             <w:pPr>
@@ -11216,7 +11430,7 @@
         </w:tc>
         <w:tc>
           <w:tcPr>
-            <w:tcW w:w="3010" w:type="dxa"/>
+            <w:tcW w:w="4399" w:type="dxa"/>
           </w:tcPr>
           <w:p>
             <w:pPr>
@@ -11260,7 +11474,7 @@
         </w:trPr>
         <w:tc>
           <w:tcPr>
-            <w:tcW w:w="3010" w:type="dxa"/>
+            <w:tcW w:w="1621" w:type="dxa"/>
           </w:tcPr>
           <w:p>
             <w:pPr>
@@ -11278,7 +11492,7 @@
         </w:tc>
         <w:tc>
           <w:tcPr>
-            <w:tcW w:w="3010" w:type="dxa"/>
+            <w:tcW w:w="4399" w:type="dxa"/>
           </w:tcPr>
           <w:p>
             <w:pPr>
@@ -11320,7 +11534,7 @@
         </w:trPr>
         <w:tc>
           <w:tcPr>
-            <w:tcW w:w="3010" w:type="dxa"/>
+            <w:tcW w:w="1621" w:type="dxa"/>
           </w:tcPr>
           <w:p>
             <w:pPr>
@@ -11337,7 +11551,7 @@
         </w:tc>
         <w:tc>
           <w:tcPr>
-            <w:tcW w:w="3010" w:type="dxa"/>
+            <w:tcW w:w="4399" w:type="dxa"/>
           </w:tcPr>
           <w:p>
             <w:pPr>
@@ -11618,8 +11832,8 @@
         <w:tblLook w:val="04A0" w:firstRow="1" w:lastRow="0" w:firstColumn="1" w:lastColumn="0" w:noHBand="0" w:noVBand="1"/>
       </w:tblPr>
       <w:tblGrid>
-        <w:gridCol w:w="4514"/>
-        <w:gridCol w:w="4514"/>
+        <w:gridCol w:w="1800"/>
+        <w:gridCol w:w="6570"/>
       </w:tblGrid>
       <w:tr>
         <w:trPr>
@@ -11629,7 +11843,7 @@
         </w:trPr>
         <w:tc>
           <w:tcPr>
-            <w:tcW w:w="4514" w:type="dxa"/>
+            <w:tcW w:w="1800" w:type="dxa"/>
           </w:tcPr>
           <w:p>
             <w:pPr>
@@ -11648,7 +11862,7 @@
         </w:tc>
         <w:tc>
           <w:tcPr>
-            <w:tcW w:w="4514" w:type="dxa"/>
+            <w:tcW w:w="6570" w:type="dxa"/>
           </w:tcPr>
           <w:p>
             <w:pPr>
@@ -11673,7 +11887,7 @@
         </w:trPr>
         <w:tc>
           <w:tcPr>
-            <w:tcW w:w="4514" w:type="dxa"/>
+            <w:tcW w:w="1800" w:type="dxa"/>
           </w:tcPr>
           <w:p>
             <w:pPr>
@@ -11691,19 +11905,33 @@
         </w:tc>
         <w:tc>
           <w:tcPr>
-            <w:tcW w:w="4514" w:type="dxa"/>
-          </w:tcPr>
-          <w:p>
-            <w:pPr>
-              <w:keepNext/>
-              <w:spacing w:after="40"/>
-              <w:jc w:val="left"/>
-            </w:pPr>
-            <w:r>
-              <w:rPr>
-                <w:sz w:val="20"/>
-              </w:rPr>
-              <w:t>Linux (tomcat:latest); the real ACIS ran on Solaris</w:t>
+            <w:tcW w:w="6570" w:type="dxa"/>
+          </w:tcPr>
+          <w:p>
+            <w:pPr>
+              <w:keepNext/>
+              <w:spacing w:after="40"/>
+              <w:jc w:val="left"/>
+            </w:pPr>
+            <w:r>
+              <w:rPr>
+                <w:sz w:val="20"/>
+              </w:rPr>
+              <w:t>Linux (</w:t>
+            </w:r>
+            <w:proofErr w:type="gramStart"/>
+            <w:r>
+              <w:rPr>
+                <w:sz w:val="20"/>
+              </w:rPr>
+              <w:t>tomcat:latest</w:t>
+            </w:r>
+            <w:proofErr w:type="gramEnd"/>
+            <w:r>
+              <w:rPr>
+                <w:sz w:val="20"/>
+              </w:rPr>
+              <w:t>); the real ACIS ran on Solaris</w:t>
             </w:r>
           </w:p>
         </w:tc>
@@ -11715,7 +11943,7 @@
         </w:trPr>
         <w:tc>
           <w:tcPr>
-            <w:tcW w:w="4514" w:type="dxa"/>
+            <w:tcW w:w="1800" w:type="dxa"/>
           </w:tcPr>
           <w:p>
             <w:pPr>
@@ -11733,7 +11961,7 @@
         </w:tc>
         <w:tc>
           <w:tcPr>
-            <w:tcW w:w="4514" w:type="dxa"/>
+            <w:tcW w:w="6570" w:type="dxa"/>
           </w:tcPr>
           <w:p>
             <w:pPr>
@@ -11757,7 +11985,7 @@
         </w:trPr>
         <w:tc>
           <w:tcPr>
-            <w:tcW w:w="4514" w:type="dxa"/>
+            <w:tcW w:w="1800" w:type="dxa"/>
           </w:tcPr>
           <w:p>
             <w:pPr>
@@ -11775,7 +12003,7 @@
         </w:tc>
         <w:tc>
           <w:tcPr>
-            <w:tcW w:w="4514" w:type="dxa"/>
+            <w:tcW w:w="6570" w:type="dxa"/>
           </w:tcPr>
           <w:p>
             <w:pPr>
@@ -11799,7 +12027,7 @@
         </w:trPr>
         <w:tc>
           <w:tcPr>
-            <w:tcW w:w="4514" w:type="dxa"/>
+            <w:tcW w:w="1800" w:type="dxa"/>
           </w:tcPr>
           <w:p>
             <w:pPr>
@@ -11817,7 +12045,7 @@
         </w:tc>
         <w:tc>
           <w:tcPr>
-            <w:tcW w:w="4514" w:type="dxa"/>
+            <w:tcW w:w="6570" w:type="dxa"/>
           </w:tcPr>
           <w:p>
             <w:pPr>
@@ -11841,7 +12069,7 @@
         </w:trPr>
         <w:tc>
           <w:tcPr>
-            <w:tcW w:w="4514" w:type="dxa"/>
+            <w:tcW w:w="1800" w:type="dxa"/>
           </w:tcPr>
           <w:p>
             <w:pPr>
@@ -11859,7 +12087,7 @@
         </w:tc>
         <w:tc>
           <w:tcPr>
-            <w:tcW w:w="4514" w:type="dxa"/>
+            <w:tcW w:w="6570" w:type="dxa"/>
           </w:tcPr>
           <w:p>
             <w:pPr>
@@ -11883,7 +12111,7 @@
         </w:trPr>
         <w:tc>
           <w:tcPr>
-            <w:tcW w:w="4514" w:type="dxa"/>
+            <w:tcW w:w="1800" w:type="dxa"/>
           </w:tcPr>
           <w:p>
             <w:pPr>
@@ -11901,7 +12129,7 @@
         </w:tc>
         <w:tc>
           <w:tcPr>
-            <w:tcW w:w="4514" w:type="dxa"/>
+            <w:tcW w:w="6570" w:type="dxa"/>
           </w:tcPr>
           <w:p>
             <w:pPr>
@@ -11925,7 +12153,7 @@
         </w:trPr>
         <w:tc>
           <w:tcPr>
-            <w:tcW w:w="4514" w:type="dxa"/>
+            <w:tcW w:w="1800" w:type="dxa"/>
           </w:tcPr>
           <w:p>
             <w:pPr>
@@ -11943,7 +12171,7 @@
         </w:tc>
         <w:tc>
           <w:tcPr>
-            <w:tcW w:w="4514" w:type="dxa"/>
+            <w:tcW w:w="6570" w:type="dxa"/>
           </w:tcPr>
           <w:p>
             <w:pPr>
@@ -11967,7 +12195,7 @@
         </w:trPr>
         <w:tc>
           <w:tcPr>
-            <w:tcW w:w="4514" w:type="dxa"/>
+            <w:tcW w:w="1800" w:type="dxa"/>
           </w:tcPr>
           <w:p>
             <w:pPr>
@@ -11985,7 +12213,7 @@
         </w:tc>
         <w:tc>
           <w:tcPr>
-            <w:tcW w:w="4514" w:type="dxa"/>
+            <w:tcW w:w="6570" w:type="dxa"/>
           </w:tcPr>
           <w:p>
             <w:pPr>
@@ -12009,7 +12237,7 @@
         </w:trPr>
         <w:tc>
           <w:tcPr>
-            <w:tcW w:w="4514" w:type="dxa"/>
+            <w:tcW w:w="1800" w:type="dxa"/>
           </w:tcPr>
           <w:p>
             <w:pPr>
@@ -12027,7 +12255,7 @@
         </w:tc>
         <w:tc>
           <w:tcPr>
-            <w:tcW w:w="4514" w:type="dxa"/>
+            <w:tcW w:w="6570" w:type="dxa"/>
           </w:tcPr>
           <w:p>
             <w:pPr>
@@ -12051,7 +12279,7 @@
         </w:trPr>
         <w:tc>
           <w:tcPr>
-            <w:tcW w:w="4514" w:type="dxa"/>
+            <w:tcW w:w="1800" w:type="dxa"/>
           </w:tcPr>
           <w:p>
             <w:pPr>
@@ -12069,7 +12297,7 @@
         </w:tc>
         <w:tc>
           <w:tcPr>
-            <w:tcW w:w="4514" w:type="dxa"/>
+            <w:tcW w:w="6570" w:type="dxa"/>
           </w:tcPr>
           <w:p>
             <w:pPr>
@@ -12093,7 +12321,7 @@
         </w:trPr>
         <w:tc>
           <w:tcPr>
-            <w:tcW w:w="4514" w:type="dxa"/>
+            <w:tcW w:w="1800" w:type="dxa"/>
           </w:tcPr>
           <w:p>
             <w:pPr>
@@ -12110,7 +12338,7 @@
         </w:tc>
         <w:tc>
           <w:tcPr>
-            <w:tcW w:w="4514" w:type="dxa"/>
+            <w:tcW w:w="6570" w:type="dxa"/>
           </w:tcPr>
           <w:p>
             <w:pPr>
@@ -12130,10 +12358,8 @@
     <w:p/>
     <w:p>
       <w:r>
-        <w:t>Based on the examination of the forensic image, the evidence indicates that the rebuilt dispute portal contains struts2-core 2.5.10, a genuine Apache release built on 27 January 2017, carrying CVE-2017-5638 at CVSS 9.8. The Dockerfile specifies root as the execution user, and the config files store four database passwords, two cloud key pairs, a private key and a token in plain text. None of the 7 files changed during the examination. Counting only flaws public on 13 May 2017, the library has 2, and 1 of th</w:t>
-      </w:r>
-      <w:r>
-        <w:t>em is critical: CVE-2017-5638, the flaw the attackers used. This shows the flaw was public and identifiable before the intrusion. The evidence does not show whether Equifax scanned for it or would have acted on the result.</w:t>
+        <w:lastRenderedPageBreak/>
+        <w:t>Based on the examination of the forensic image, the evidence indicates that the rebuilt dispute portal contains struts2-core 2.5.10, a genuine Apache release built on 27 January 2017, carrying CVE-2017-5638 at CVSS 9.8. The Dockerfile specifies root as the execution user, and the config files store four database passwords, two cloud key pairs, a private key and a token in plain text. None of the 7 files changed during the examination. Counting only flaws public on 13 May 2017, the library has 2, and 1 of them is critical: CVE-2017-5638, the flaw the attackers used. This shows the flaw was public and identifiable before the intrusion. The evidence does not show whether Equifax scanned for it or would have acted on the result.</w:t>
       </w:r>
     </w:p>
     <w:p>
@@ -12148,10 +12374,7 @@
     </w:p>
     <w:p>
       <w:r>
-        <w:t xml:space="preserve">The evidence is a reconstruction built from published reports, not Equifax's own disk. This dataset has no unallocated space and no browser or access-log artifacts, so Activities 6 and 8 could not be performed on it. Trivy reports only published vulnerabilities, so a clean scan is not proof of safety, and our secret rules find only what their patterns describe. Vulnerability counts change as new flaws are published; the figures here come from the scan on 28 September 2026. The Indian law analysis describes </w:t>
-      </w:r>
-      <w:r>
-        <w:t>the position in September 2026.</w:t>
+        <w:t>The evidence is a reconstruction built from published reports, not Equifax's own disk. This dataset has no unallocated space and no browser or access-log artifacts, so Activities 6 and 8 could not be performed on it. Trivy reports only published vulnerabilities, so a clean scan is not proof of safety, and our secret rules find only what their patterns describe. Vulnerability counts change as new flaws are published; the figures here come from the scan on 28 September 2026. The Indian law analysis describes the position in September 2026.</w:t>
       </w:r>
     </w:p>
     <w:p>
@@ -12178,7 +12401,18 @@
         <w:t>Actions Taken by Equifax and Federal Agencies in Response to the 2017 Breach</w:t>
       </w:r>
       <w:r>
-        <w:t xml:space="preserve"> (2018). https://www.gao.gov/assets/gao-18-559.pdf</w:t>
+        <w:t xml:space="preserve"> (2018). </w:t>
+      </w:r>
+      <w:hyperlink r:id="rId21" w:history="1">
+        <w:r>
+          <w:rPr>
+            <w:rStyle w:val="Hyperlink"/>
+          </w:rPr>
+          <w:t>https://www.gao.gov/assets/gao-18-559.pdf</w:t>
+        </w:r>
+      </w:hyperlink>
+      <w:r>
+        <w:t xml:space="preserve"> </w:t>
       </w:r>
     </w:p>
     <w:p>
@@ -12195,7 +12429,18 @@
         <w:t>The Equifax Data Breach</w:t>
       </w:r>
       <w:r>
-        <w:t xml:space="preserve"> (December 2018). https://oversight.house.gov/wp-content/uploads/2018/12/Equifax-Report.pdf</w:t>
+        <w:t xml:space="preserve"> (December 2018). </w:t>
+      </w:r>
+      <w:hyperlink r:id="rId22" w:history="1">
+        <w:r>
+          <w:rPr>
+            <w:rStyle w:val="Hyperlink"/>
+          </w:rPr>
+          <w:t>https://oversight.house.gov/wp-content/uploads/2018/12/Equifax-Report.pdf</w:t>
+        </w:r>
+      </w:hyperlink>
+      <w:r>
+        <w:t xml:space="preserve"> </w:t>
       </w:r>
     </w:p>
     <w:p>
@@ -12203,7 +12448,18 @@
         <w:pStyle w:val="ListBullet"/>
       </w:pPr>
       <w:r>
-        <w:t>NVD, CVE-2017-5638; Apache Struts bulletin S2-045. https://nvd.nist.gov/vuln/detail/CVE-2017-5638</w:t>
+        <w:t xml:space="preserve">NVD, CVE-2017-5638; Apache Struts bulletin S2-045. </w:t>
+      </w:r>
+      <w:hyperlink r:id="rId23" w:history="1">
+        <w:r>
+          <w:rPr>
+            <w:rStyle w:val="Hyperlink"/>
+          </w:rPr>
+          <w:t>https://nvd.nist.gov/vuln/detail/CVE-2017-5638</w:t>
+        </w:r>
+      </w:hyperlink>
+      <w:r>
+        <w:t xml:space="preserve"> </w:t>
       </w:r>
     </w:p>
     <w:p>
@@ -12211,7 +12467,18 @@
         <w:pStyle w:val="ListBullet"/>
       </w:pPr>
       <w:r>
-        <w:t>The Information Technology Act, 2000; SPDI Rules, 2011; CERT-In Directions, 28 April 2022. https://www.indiacode.nic.in/bitstream/123456789/13116/1/it_act_2000_updated.pdf</w:t>
+        <w:t xml:space="preserve">The Information Technology Act, 2000; SPDI Rules, 2011; CERT-In Directions, 28 April 2022. </w:t>
+      </w:r>
+      <w:hyperlink r:id="rId24" w:history="1">
+        <w:r>
+          <w:rPr>
+            <w:rStyle w:val="Hyperlink"/>
+          </w:rPr>
+          <w:t>https://www.indiacode.nic.in/bitstream/123456789/13116/1/it_act_2000_updated.pdf</w:t>
+        </w:r>
+      </w:hyperlink>
+      <w:r>
+        <w:t xml:space="preserve"> </w:t>
       </w:r>
     </w:p>
     <w:p>
@@ -12219,7 +12486,18 @@
         <w:pStyle w:val="ListBullet"/>
       </w:pPr>
       <w:r>
-        <w:t>The Digital Personal Data Protection Act, 2023; the DPDP Rules, 2025 (G.S.R. 846(E)); and the commencement notification (G.S.R. 843(E), 13 November 2025, which sets a phased commencement including an eighteen-month phase). https://www.meity.gov.in/static/uploads/2024/06/2bf1f0e9f04e6fb4f8fef35e82c42aa5.pdf</w:t>
+        <w:t xml:space="preserve">The Digital Personal Data Protection Act, 2023; the DPDP Rules, 2025 (G.S.R. 846(E)); and the commencement notification (G.S.R. 843(E), 13 November 2025, which sets a phased commencement including an eighteen-month phase). </w:t>
+      </w:r>
+      <w:hyperlink r:id="rId25" w:history="1">
+        <w:r>
+          <w:rPr>
+            <w:rStyle w:val="Hyperlink"/>
+          </w:rPr>
+          <w:t>https://www.meity.gov.in/static/uploads/2024/06/2bf1f0e9f04e6fb4f8fef35e82c42aa5.pdf</w:t>
+        </w:r>
+      </w:hyperlink>
+      <w:r>
+        <w:t xml:space="preserve"> </w:t>
       </w:r>
     </w:p>
     <w:p>
@@ -12235,13 +12513,24 @@
         <w:pStyle w:val="ListBullet"/>
       </w:pPr>
       <w:r>
-        <w:t>Trivy documentation. https://trivy.dev/docs/</w:t>
+        <w:t xml:space="preserve">Trivy documentation. </w:t>
+      </w:r>
+      <w:hyperlink r:id="rId26" w:history="1">
+        <w:r>
+          <w:rPr>
+            <w:rStyle w:val="Hyperlink"/>
+          </w:rPr>
+          <w:t>https://trivy.dev/docs/</w:t>
+        </w:r>
+      </w:hyperlink>
+      <w:r>
+        <w:t xml:space="preserve"> </w:t>
       </w:r>
     </w:p>
     <w:sectPr>
-      <w:headerReference w:type="default" r:id="rId21"/>
-      <w:footerReference w:type="default" r:id="rId22"/>
-      <w:footerReference w:type="first" r:id="rId23"/>
+      <w:headerReference w:type="default" r:id="rId27"/>
+      <w:footerReference w:type="default" r:id="rId28"/>
+      <w:footerReference w:type="first" r:id="rId29"/>
       <w:pgSz w:w="11909" w:h="16834"/>
       <w:pgMar w:top="1440" w:right="1440" w:bottom="1440" w:left="1440" w:header="720" w:footer="720" w:gutter="0"/>
       <w:cols w:space="720"/>
@@ -12329,6 +12618,15 @@
     <w:pPr>
       <w:jc w:val="center"/>
     </w:pPr>
+    <w:r>
+      <w:rPr>
+        <w:sz w:val="16"/>
+      </w:rPr>
+      <w:t xml:space="preserve">Cyber Security Forensics and Compliance Laws | IA2 </w:t>
+    </w:r>
+    <w:r>
+      <w:t xml:space="preserve">                                                                                     </w:t>
+    </w:r>
     <w:r>
       <w:rPr>
         <w:sz w:val="18"/>
@@ -12451,8 +12749,8 @@
         <w:noProof/>
       </w:rPr>
       <w:drawing>
-        <wp:inline distT="0" distB="0" distL="0" distR="0" wp14:anchorId="54CCEB94" wp14:editId="54767DAE">
-          <wp:extent cx="2377440" cy="700286"/>
+        <wp:inline distT="0" distB="0" distL="0" distR="0" wp14:anchorId="54CCEB94" wp14:editId="3FD8B570">
+          <wp:extent cx="1643806" cy="484191"/>
           <wp:effectExtent l="0" t="0" r="0" b="0"/>
           <wp:docPr id="2050422307" name="Picture 2050422307"/>
           <wp:cNvGraphicFramePr>
@@ -12474,7 +12772,7 @@
                 <pic:spPr>
                   <a:xfrm>
                     <a:off x="0" y="0"/>
-                    <a:ext cx="2377440" cy="700286"/>
+                    <a:ext cx="1667264" cy="491101"/>
                   </a:xfrm>
                   <a:prstGeom prst="rect">
                     <a:avLst/>
@@ -12489,14 +12787,9 @@
   </w:p>
   <w:p>
     <w:pPr>
+      <w:pStyle w:val="Header"/>
       <w:jc w:val="center"/>
     </w:pPr>
-    <w:r>
-      <w:rPr>
-        <w:sz w:val="16"/>
-      </w:rPr>
-      <w:t>Cyber Security Forensics and Compliance Laws | IA2 | Case CSFCL-IA2-2026-005</w:t>
-    </w:r>
   </w:p>
 </w:hdr>
 </file>
@@ -24117,6 +24410,18 @@
       <w:u w:val="single"/>
     </w:rPr>
   </w:style>
+  <w:style w:type="character" w:styleId="UnresolvedMention">
+    <w:name w:val="Unresolved Mention"/>
+    <w:basedOn w:val="DefaultParagraphFont"/>
+    <w:uiPriority w:val="99"/>
+    <w:semiHidden/>
+    <w:unhideWhenUsed/>
+    <w:rsid w:val="0038745E"/>
+    <w:rPr>
+      <w:color w:val="605E5C"/>
+      <w:shd w:val="clear" w:color="auto" w:fill="E1DFDD"/>
+    </w:rPr>
+  </w:style>
 </w:styles>
 </file>
 

</xml_diff>

<commit_message>
make figures 1 2 7 12 match the mac terminal screenshots
</commit_message>
<xml_diff>
--- a/report/CSFCL-IA2-2026-005-Forensic-Report.docx
+++ b/report/CSFCL-IA2-2026-005-Forensic-Report.docx
@@ -4794,7 +4794,7 @@
         <w:lastRenderedPageBreak/>
         <w:drawing>
           <wp:inline distT="0" distB="0" distL="0" distR="0" wp14:anchorId="491A1AE0" wp14:editId="0985E1DD">
-            <wp:extent cx="5486400" cy="4205104"/>
+            <wp:extent cx="5486400" cy="2916194"/>
             <wp:effectExtent l="0" t="0" r="0" b="0"/>
             <wp:docPr id="2" name="Picture 2"/>
             <wp:cNvGraphicFramePr>
@@ -4816,7 +4816,7 @@
                   <pic:spPr>
                     <a:xfrm>
                       <a:off x="0" y="0"/>
-                      <a:ext cx="5486400" cy="4205104"/>
+                      <a:ext cx="5486400" cy="2916194"/>
                     </a:xfrm>
                     <a:prstGeom prst="rect">
                       <a:avLst/>
@@ -5458,7 +5458,7 @@
         </w:rPr>
         <w:drawing>
           <wp:inline distT="0" distB="0" distL="0" distR="0" wp14:anchorId="703690A2" wp14:editId="15AE87B8">
-            <wp:extent cx="4439754" cy="2642836"/>
+            <wp:extent cx="4439754" cy="647603"/>
             <wp:effectExtent l="0" t="0" r="0" b="5715"/>
             <wp:docPr id="3" name="Picture 3"/>
             <wp:cNvGraphicFramePr>
@@ -5480,7 +5480,7 @@
                   <pic:spPr>
                     <a:xfrm>
                       <a:off x="0" y="0"/>
-                      <a:ext cx="4447850" cy="2647655"/>
+                      <a:ext cx="4447850" cy="647603"/>
                     </a:xfrm>
                     <a:prstGeom prst="rect">
                       <a:avLst/>
@@ -6745,7 +6745,7 @@
         <w:lastRenderedPageBreak/>
         <w:drawing>
           <wp:inline distT="0" distB="0" distL="0" distR="0" wp14:anchorId="0CBF35C5" wp14:editId="1E7E819D">
-            <wp:extent cx="5486400" cy="1732366"/>
+            <wp:extent cx="5486400" cy="1629294"/>
             <wp:effectExtent l="0" t="0" r="0" b="0"/>
             <wp:docPr id="8" name="Picture 8"/>
             <wp:cNvGraphicFramePr>
@@ -6767,7 +6767,7 @@
                   <pic:spPr>
                     <a:xfrm>
                       <a:off x="0" y="0"/>
-                      <a:ext cx="5486400" cy="1732366"/>
+                      <a:ext cx="5486400" cy="1629294"/>
                     </a:xfrm>
                     <a:prstGeom prst="rect">
                       <a:avLst/>
@@ -6790,7 +6790,7 @@
           <w:i/>
           <w:sz w:val="20"/>
         </w:rPr>
-        <w:t>Figure 7. The four declared libraries in pom.xml and their share of the 88 manifest findings.</w:t>
+        <w:t>Figure 7. The dependency scan of pom.xml: 88 findings, 34 critical, across the declared libraries.</w:t>
       </w:r>
     </w:p>
     <w:p>
@@ -11000,7 +11000,7 @@
         <w:lastRenderedPageBreak/>
         <w:drawing>
           <wp:inline distT="0" distB="0" distL="0" distR="0" wp14:anchorId="4856E347" wp14:editId="485A01F8">
-            <wp:extent cx="5486400" cy="2526384"/>
+            <wp:extent cx="5486400" cy="1765189"/>
             <wp:effectExtent l="0" t="0" r="0" b="0"/>
             <wp:docPr id="13" name="Picture 13"/>
             <wp:cNvGraphicFramePr>
@@ -11022,7 +11022,7 @@
                   <pic:spPr>
                     <a:xfrm>
                       <a:off x="0" y="0"/>
-                      <a:ext cx="5486400" cy="2526384"/>
+                      <a:ext cx="5486400" cy="1765189"/>
                     </a:xfrm>
                     <a:prstGeom prst="rect">
                       <a:avLst/>

</xml_diff>

<commit_message>
push the latest report, add the pdf, drop the slides from the repo
</commit_message>
<xml_diff>
--- a/report/CSFCL-IA2-2026-005-Forensic-Report.docx
+++ b/report/CSFCL-IA2-2026-005-Forensic-Report.docx
@@ -4785,6 +4785,7 @@
     <w:p>
       <w:pPr>
         <w:keepNext/>
+        <w:spacing w:after="0"/>
         <w:jc w:val="center"/>
       </w:pPr>
       <w:r>
@@ -5126,7 +5127,6 @@
       </w:pPr>
       <w:bookmarkStart w:id="11" w:name="_Toc241587863"/>
       <w:r>
-        <w:lastRenderedPageBreak/>
         <w:t>2.4 Evidence and assumptions</w:t>
       </w:r>
       <w:bookmarkEnd w:id="11"/>
@@ -5425,6 +5425,7 @@
       </w:pPr>
       <w:bookmarkStart w:id="12" w:name="_Toc241587864"/>
       <w:r>
+        <w:lastRenderedPageBreak/>
         <w:t>3. Findings: the thirteen activities</w:t>
       </w:r>
       <w:bookmarkEnd w:id="12"/>
@@ -5450,6 +5451,7 @@
     <w:p>
       <w:pPr>
         <w:keepNext/>
+        <w:spacing w:after="0"/>
         <w:jc w:val="center"/>
       </w:pPr>
       <w:r>
@@ -5541,7 +5543,6 @@
       </w:pPr>
       <w:bookmarkStart w:id="14" w:name="_Toc241587866"/>
       <w:r>
-        <w:lastRenderedPageBreak/>
         <w:t>Activity 2: hash verification</w:t>
       </w:r>
       <w:bookmarkEnd w:id="14"/>
@@ -6160,12 +6161,14 @@
     <w:p>
       <w:pPr>
         <w:keepNext/>
+        <w:spacing w:after="0"/>
         <w:jc w:val="center"/>
       </w:pPr>
       <w:r>
         <w:rPr>
           <w:noProof/>
         </w:rPr>
+        <w:lastRenderedPageBreak/>
         <w:drawing>
           <wp:inline distT="0" distB="0" distL="0" distR="0" wp14:anchorId="4F6DF252" wp14:editId="47F6126C">
             <wp:extent cx="5486400" cy="749908"/>
@@ -6219,6 +6222,7 @@
     <w:p>
       <w:pPr>
         <w:keepNext/>
+        <w:spacing w:after="0"/>
         <w:jc w:val="center"/>
       </w:pPr>
       <w:r>
@@ -6280,7 +6284,6 @@
         <w:rPr>
           <w:i/>
         </w:rPr>
-        <w:lastRenderedPageBreak/>
         <w:t>What is a hash?</w:t>
       </w:r>
       <w:r>
@@ -6617,6 +6620,7 @@
     <w:p>
       <w:pPr>
         <w:keepNext/>
+        <w:spacing w:after="0"/>
         <w:jc w:val="center"/>
       </w:pPr>
       <w:r>
@@ -6677,6 +6681,7 @@
     <w:p>
       <w:pPr>
         <w:keepNext/>
+        <w:spacing w:after="0"/>
         <w:jc w:val="center"/>
       </w:pPr>
       <w:r>
@@ -6736,13 +6741,13 @@
     <w:p>
       <w:pPr>
         <w:keepNext/>
+        <w:spacing w:after="0"/>
         <w:jc w:val="center"/>
       </w:pPr>
       <w:r>
         <w:rPr>
           <w:noProof/>
         </w:rPr>
-        <w:lastRenderedPageBreak/>
         <w:drawing>
           <wp:inline distT="0" distB="0" distL="0" distR="0" wp14:anchorId="0CBF35C5" wp14:editId="1E7E819D">
             <wp:extent cx="5486400" cy="1629294"/>
@@ -7124,6 +7129,7 @@
         <w:rPr>
           <w:i/>
         </w:rPr>
+        <w:lastRenderedPageBreak/>
         <w:t>Primary user?</w:t>
       </w:r>
       <w:r>
@@ -7380,7 +7386,6 @@
       </w:pPr>
       <w:bookmarkStart w:id="19" w:name="_Toc241587871"/>
       <w:r>
-        <w:lastRenderedPageBreak/>
         <w:t>Activity 7: metadata examination</w:t>
       </w:r>
       <w:bookmarkEnd w:id="19"/>
@@ -7633,6 +7638,7 @@
     <w:p>
       <w:pPr>
         <w:keepNext/>
+        <w:spacing w:after="0"/>
         <w:jc w:val="center"/>
       </w:pPr>
       <w:r>
@@ -7739,7 +7745,14 @@
         <w:rPr>
           <w:i/>
         </w:rPr>
-        <w:t>Which sites were visited?</w:t>
+        <w:t xml:space="preserve">Which sites </w:t>
+      </w:r>
+      <w:r>
+        <w:rPr>
+          <w:i/>
+        </w:rPr>
+        <w:lastRenderedPageBreak/>
+        <w:t>were visited?</w:t>
       </w:r>
       <w:r>
         <w:t xml:space="preserve"> None can be identified from this dataset. </w:t>
@@ -7769,7 +7782,6 @@
       </w:pPr>
       <w:bookmarkStart w:id="21" w:name="_Toc241587873"/>
       <w:r>
-        <w:lastRenderedPageBreak/>
         <w:t>Activity 9: keyword search</w:t>
       </w:r>
       <w:bookmarkEnd w:id="21"/>
@@ -8781,6 +8793,7 @@
     <w:p>
       <w:pPr>
         <w:keepNext/>
+        <w:spacing w:after="0"/>
         <w:jc w:val="center"/>
       </w:pPr>
       <w:r>
@@ -8839,11 +8852,7 @@
     </w:p>
     <w:p>
       <w:r>
-        <w:t xml:space="preserve">Our first rule missed the read-only password on line 11; we found that by hand and widened the pattern. The scanner also missed the two secrets in the Dockerfile, which the keyword and </w:t>
-      </w:r>
-      <w:r>
-        <w:lastRenderedPageBreak/>
-        <w:t xml:space="preserve">configuration checks caught. </w:t>
+        <w:t xml:space="preserve">Our first rule missed the read-only password on line 11; we found that by hand and widened the pattern. The scanner also missed the two secrets in the Dockerfile, which the keyword and configuration checks caught. </w:t>
       </w:r>
       <w:r>
         <w:rPr>
@@ -8858,12 +8867,14 @@
     <w:p>
       <w:pPr>
         <w:keepNext/>
+        <w:spacing w:after="0"/>
         <w:jc w:val="center"/>
       </w:pPr>
       <w:r>
         <w:rPr>
           <w:noProof/>
         </w:rPr>
+        <w:lastRenderedPageBreak/>
         <w:drawing>
           <wp:inline distT="0" distB="0" distL="0" distR="0" wp14:anchorId="25751E65" wp14:editId="191BBD38">
             <wp:extent cx="5486400" cy="1522476"/>
@@ -8993,7 +9004,6 @@
                 <w:b/>
                 <w:sz w:val="20"/>
               </w:rPr>
-              <w:lastRenderedPageBreak/>
               <w:t>Severity</w:t>
             </w:r>
           </w:p>
@@ -9455,6 +9465,7 @@
     <w:p>
       <w:pPr>
         <w:keepNext/>
+        <w:spacing w:after="0"/>
         <w:jc w:val="center"/>
       </w:pPr>
       <w:r>
@@ -9540,7 +9551,11 @@
         <w:t>What sequence can be rebuilt?</w:t>
       </w:r>
       <w:r>
-        <w:t xml:space="preserve"> The library existed before its flaw was public; the fix was available for 67 days before the intrusion; the attack was found only when a certificate was renewed during maintenance.</w:t>
+        <w:t xml:space="preserve"> The library existed before its flaw was </w:t>
+      </w:r>
+      <w:r>
+        <w:lastRenderedPageBreak/>
+        <w:t>public; the fix was available for 67 days before the intrusion; the attack was found only when a certificate was renewed during maintenance.</w:t>
       </w:r>
     </w:p>
     <w:p>
@@ -9741,11 +9756,7 @@
         <w:t>What follows when several independent artifacts agree?</w:t>
       </w:r>
       <w:r>
-        <w:t xml:space="preserve"> Confidence rises. One finding could be a misconfiguration or a tool error; a vulnerability record, a configuration file and a </w:t>
-      </w:r>
-      <w:r>
-        <w:lastRenderedPageBreak/>
-        <w:t>credentials file all pointing the same way, with consistent dates, would all have to be wrong at once.</w:t>
+        <w:t xml:space="preserve"> Confidence rises. One finding could be a misconfiguration or a tool error; a vulnerability record, a configuration file and a credentials file all pointing the same way, with consistent dates, would all have to be wrong at once.</w:t>
       </w:r>
     </w:p>
     <w:p>
@@ -10991,6 +11002,7 @@
     <w:p>
       <w:pPr>
         <w:keepNext/>
+        <w:spacing w:after="0"/>
         <w:jc w:val="center"/>
       </w:pPr>
       <w:r>
@@ -11373,7 +11385,6 @@
       </w:pPr>
       <w:bookmarkStart w:id="29" w:name="_Toc241587881"/>
       <w:r>
-        <w:lastRenderedPageBreak/>
         <w:t>4.3 From 13 May 2027: the DPDP Act</w:t>
       </w:r>
       <w:bookmarkEnd w:id="29"/>
@@ -11424,6 +11435,7 @@
                 <w:b/>
                 <w:sz w:val="20"/>
               </w:rPr>
+              <w:lastRenderedPageBreak/>
               <w:t>Provision</w:t>
             </w:r>
           </w:p>
@@ -12358,8 +12370,11 @@
     <w:p/>
     <w:p>
       <w:r>
+        <w:t xml:space="preserve">Based on the examination of the forensic image, the evidence indicates that the rebuilt dispute portal contains struts2-core 2.5.10, a genuine Apache release built on 27 January 2017, carrying CVE-2017-5638 at CVSS 9.8. The Dockerfile specifies root as the execution user, and the config files store four database passwords, two cloud key pairs, a private key </w:t>
+      </w:r>
+      <w:r>
         <w:lastRenderedPageBreak/>
-        <w:t>Based on the examination of the forensic image, the evidence indicates that the rebuilt dispute portal contains struts2-core 2.5.10, a genuine Apache release built on 27 January 2017, carrying CVE-2017-5638 at CVSS 9.8. The Dockerfile specifies root as the execution user, and the config files store four database passwords, two cloud key pairs, a private key and a token in plain text. None of the 7 files changed during the examination. Counting only flaws public on 13 May 2017, the library has 2, and 1 of them is critical: CVE-2017-5638, the flaw the attackers used. This shows the flaw was public and identifiable before the intrusion. The evidence does not show whether Equifax scanned for it or would have acted on the result.</w:t>
+        <w:t>and a token in plain text. None of the 7 files changed during the examination. Counting only flaws public on 13 May 2017, the library has 2, and 1 of them is critical: CVE-2017-5638, the flaw the attackers used. This shows the flaw was public and identifiable before the intrusion. The evidence does not show whether Equifax scanned for it or would have acted on the result.</w:t>
       </w:r>
     </w:p>
     <w:p>

</xml_diff>

<commit_message>
apply the review fixes to the report, add the ppt pdf
</commit_message>
<xml_diff>
--- a/report/CSFCL-IA2-2026-005-Forensic-Report.docx
+++ b/report/CSFCL-IA2-2026-005-Forensic-Report.docx
@@ -295,7 +295,13 @@
           <w:tab w:val="right" w:leader="dot" w:pos="9019"/>
         </w:tabs>
         <w:rPr>
+          <w:rFonts w:asciiTheme="minorHAnsi" w:eastAsiaTheme="minorEastAsia" w:hAnsiTheme="minorHAnsi" w:cstheme="minorBidi"/>
           <w:noProof/>
+          <w:color w:val="auto"/>
+          <w:kern w:val="2"/>
+          <w:szCs w:val="24"/>
+          <w:lang w:val="en-IN" w:eastAsia="en-IN"/>
+          <w14:ligatures w14:val="standardContextual"/>
         </w:rPr>
       </w:pPr>
       <w:r>
@@ -307,7 +313,7 @@
       <w:r>
         <w:fldChar w:fldCharType="separate"/>
       </w:r>
-      <w:hyperlink w:anchor="_Toc241587852" w:history="1">
+      <w:hyperlink w:anchor="_Toc241614222" w:history="1">
         <w:r>
           <w:rPr>
             <w:rStyle w:val="Hyperlink"/>
@@ -334,7 +340,7 @@
             <w:noProof/>
             <w:webHidden/>
           </w:rPr>
-          <w:instrText xml:space="preserve"> PAGEREF _Toc241587852 \h </w:instrText>
+          <w:instrText xml:space="preserve"> PAGEREF _Toc241614222 \h </w:instrText>
         </w:r>
         <w:r>
           <w:rPr>
@@ -372,10 +378,16 @@
           <w:tab w:val="right" w:leader="dot" w:pos="9019"/>
         </w:tabs>
         <w:rPr>
+          <w:rFonts w:asciiTheme="minorHAnsi" w:eastAsiaTheme="minorEastAsia" w:hAnsiTheme="minorHAnsi" w:cstheme="minorBidi"/>
           <w:noProof/>
+          <w:color w:val="auto"/>
+          <w:kern w:val="2"/>
+          <w:szCs w:val="24"/>
+          <w:lang w:val="en-IN" w:eastAsia="en-IN"/>
+          <w14:ligatures w14:val="standardContextual"/>
         </w:rPr>
       </w:pPr>
-      <w:hyperlink w:anchor="_Toc241587853" w:history="1">
+      <w:hyperlink w:anchor="_Toc241614223" w:history="1">
         <w:r>
           <w:rPr>
             <w:rStyle w:val="Hyperlink"/>
@@ -402,7 +414,7 @@
             <w:noProof/>
             <w:webHidden/>
           </w:rPr>
-          <w:instrText xml:space="preserve"> PAGEREF _Toc241587853 \h </w:instrText>
+          <w:instrText xml:space="preserve"> PAGEREF _Toc241614223 \h </w:instrText>
         </w:r>
         <w:r>
           <w:rPr>
@@ -440,10 +452,16 @@
           <w:tab w:val="right" w:leader="dot" w:pos="9019"/>
         </w:tabs>
         <w:rPr>
+          <w:rFonts w:asciiTheme="minorHAnsi" w:eastAsiaTheme="minorEastAsia" w:hAnsiTheme="minorHAnsi" w:cstheme="minorBidi"/>
           <w:noProof/>
+          <w:color w:val="auto"/>
+          <w:kern w:val="2"/>
+          <w:szCs w:val="24"/>
+          <w:lang w:val="en-IN" w:eastAsia="en-IN"/>
+          <w14:ligatures w14:val="standardContextual"/>
         </w:rPr>
       </w:pPr>
-      <w:hyperlink w:anchor="_Toc241587854" w:history="1">
+      <w:hyperlink w:anchor="_Toc241614224" w:history="1">
         <w:r>
           <w:rPr>
             <w:rStyle w:val="Hyperlink"/>
@@ -470,7 +488,7 @@
             <w:noProof/>
             <w:webHidden/>
           </w:rPr>
-          <w:instrText xml:space="preserve"> PAGEREF _Toc241587854 \h </w:instrText>
+          <w:instrText xml:space="preserve"> PAGEREF _Toc241614224 \h </w:instrText>
         </w:r>
         <w:r>
           <w:rPr>
@@ -508,10 +526,16 @@
           <w:tab w:val="right" w:leader="dot" w:pos="9019"/>
         </w:tabs>
         <w:rPr>
+          <w:rFonts w:asciiTheme="minorHAnsi" w:eastAsiaTheme="minorEastAsia" w:hAnsiTheme="minorHAnsi" w:cstheme="minorBidi"/>
           <w:noProof/>
+          <w:color w:val="auto"/>
+          <w:kern w:val="2"/>
+          <w:szCs w:val="24"/>
+          <w:lang w:val="en-IN" w:eastAsia="en-IN"/>
+          <w14:ligatures w14:val="standardContextual"/>
         </w:rPr>
       </w:pPr>
-      <w:hyperlink w:anchor="_Toc241587855" w:history="1">
+      <w:hyperlink w:anchor="_Toc241614225" w:history="1">
         <w:r>
           <w:rPr>
             <w:rStyle w:val="Hyperlink"/>
@@ -538,7 +562,7 @@
             <w:noProof/>
             <w:webHidden/>
           </w:rPr>
-          <w:instrText xml:space="preserve"> PAGEREF _Toc241587855 \h </w:instrText>
+          <w:instrText xml:space="preserve"> PAGEREF _Toc241614225 \h </w:instrText>
         </w:r>
         <w:r>
           <w:rPr>
@@ -576,10 +600,16 @@
           <w:tab w:val="right" w:leader="dot" w:pos="9019"/>
         </w:tabs>
         <w:rPr>
+          <w:rFonts w:asciiTheme="minorHAnsi" w:eastAsiaTheme="minorEastAsia" w:hAnsiTheme="minorHAnsi" w:cstheme="minorBidi"/>
           <w:noProof/>
+          <w:color w:val="auto"/>
+          <w:kern w:val="2"/>
+          <w:szCs w:val="24"/>
+          <w:lang w:val="en-IN" w:eastAsia="en-IN"/>
+          <w14:ligatures w14:val="standardContextual"/>
         </w:rPr>
       </w:pPr>
-      <w:hyperlink w:anchor="_Toc241587856" w:history="1">
+      <w:hyperlink w:anchor="_Toc241614226" w:history="1">
         <w:r>
           <w:rPr>
             <w:rStyle w:val="Hyperlink"/>
@@ -606,7 +636,7 @@
             <w:noProof/>
             <w:webHidden/>
           </w:rPr>
-          <w:instrText xml:space="preserve"> PAGEREF _Toc241587856 \h </w:instrText>
+          <w:instrText xml:space="preserve"> PAGEREF _Toc241614226 \h </w:instrText>
         </w:r>
         <w:r>
           <w:rPr>
@@ -626,7 +656,7 @@
             <w:noProof/>
             <w:webHidden/>
           </w:rPr>
-          <w:t>6</w:t>
+          <w:t>5</w:t>
         </w:r>
         <w:r>
           <w:rPr>
@@ -644,10 +674,16 @@
           <w:tab w:val="right" w:leader="dot" w:pos="9019"/>
         </w:tabs>
         <w:rPr>
+          <w:rFonts w:asciiTheme="minorHAnsi" w:eastAsiaTheme="minorEastAsia" w:hAnsiTheme="minorHAnsi" w:cstheme="minorBidi"/>
           <w:noProof/>
+          <w:color w:val="auto"/>
+          <w:kern w:val="2"/>
+          <w:szCs w:val="24"/>
+          <w:lang w:val="en-IN" w:eastAsia="en-IN"/>
+          <w14:ligatures w14:val="standardContextual"/>
         </w:rPr>
       </w:pPr>
-      <w:hyperlink w:anchor="_Toc241587857" w:history="1">
+      <w:hyperlink w:anchor="_Toc241614227" w:history="1">
         <w:r>
           <w:rPr>
             <w:rStyle w:val="Hyperlink"/>
@@ -674,7 +710,7 @@
             <w:noProof/>
             <w:webHidden/>
           </w:rPr>
-          <w:instrText xml:space="preserve"> PAGEREF _Toc241587857 \h </w:instrText>
+          <w:instrText xml:space="preserve"> PAGEREF _Toc241614227 \h </w:instrText>
         </w:r>
         <w:r>
           <w:rPr>
@@ -712,10 +748,16 @@
           <w:tab w:val="right" w:leader="dot" w:pos="9019"/>
         </w:tabs>
         <w:rPr>
+          <w:rFonts w:asciiTheme="minorHAnsi" w:eastAsiaTheme="minorEastAsia" w:hAnsiTheme="minorHAnsi" w:cstheme="minorBidi"/>
           <w:noProof/>
+          <w:color w:val="auto"/>
+          <w:kern w:val="2"/>
+          <w:szCs w:val="24"/>
+          <w:lang w:val="en-IN" w:eastAsia="en-IN"/>
+          <w14:ligatures w14:val="standardContextual"/>
         </w:rPr>
       </w:pPr>
-      <w:hyperlink w:anchor="_Toc241587858" w:history="1">
+      <w:hyperlink w:anchor="_Toc241614228" w:history="1">
         <w:r>
           <w:rPr>
             <w:rStyle w:val="Hyperlink"/>
@@ -742,7 +784,7 @@
             <w:noProof/>
             <w:webHidden/>
           </w:rPr>
-          <w:instrText xml:space="preserve"> PAGEREF _Toc241587858 \h </w:instrText>
+          <w:instrText xml:space="preserve"> PAGEREF _Toc241614228 \h </w:instrText>
         </w:r>
         <w:r>
           <w:rPr>
@@ -762,7 +804,7 @@
             <w:noProof/>
             <w:webHidden/>
           </w:rPr>
-          <w:t>7</w:t>
+          <w:t>6</w:t>
         </w:r>
         <w:r>
           <w:rPr>
@@ -780,10 +822,16 @@
           <w:tab w:val="right" w:leader="dot" w:pos="9019"/>
         </w:tabs>
         <w:rPr>
+          <w:rFonts w:asciiTheme="minorHAnsi" w:eastAsiaTheme="minorEastAsia" w:hAnsiTheme="minorHAnsi" w:cstheme="minorBidi"/>
           <w:noProof/>
+          <w:color w:val="auto"/>
+          <w:kern w:val="2"/>
+          <w:szCs w:val="24"/>
+          <w:lang w:val="en-IN" w:eastAsia="en-IN"/>
+          <w14:ligatures w14:val="standardContextual"/>
         </w:rPr>
       </w:pPr>
-      <w:hyperlink w:anchor="_Toc241587859" w:history="1">
+      <w:hyperlink w:anchor="_Toc241614229" w:history="1">
         <w:r>
           <w:rPr>
             <w:rStyle w:val="Hyperlink"/>
@@ -810,7 +858,7 @@
             <w:noProof/>
             <w:webHidden/>
           </w:rPr>
-          <w:instrText xml:space="preserve"> PAGEREF _Toc241587859 \h </w:instrText>
+          <w:instrText xml:space="preserve"> PAGEREF _Toc241614229 \h </w:instrText>
         </w:r>
         <w:r>
           <w:rPr>
@@ -830,7 +878,7 @@
             <w:noProof/>
             <w:webHidden/>
           </w:rPr>
-          <w:t>7</w:t>
+          <w:t>6</w:t>
         </w:r>
         <w:r>
           <w:rPr>
@@ -848,10 +896,16 @@
           <w:tab w:val="right" w:leader="dot" w:pos="9019"/>
         </w:tabs>
         <w:rPr>
+          <w:rFonts w:asciiTheme="minorHAnsi" w:eastAsiaTheme="minorEastAsia" w:hAnsiTheme="minorHAnsi" w:cstheme="minorBidi"/>
           <w:noProof/>
+          <w:color w:val="auto"/>
+          <w:kern w:val="2"/>
+          <w:szCs w:val="24"/>
+          <w:lang w:val="en-IN" w:eastAsia="en-IN"/>
+          <w14:ligatures w14:val="standardContextual"/>
         </w:rPr>
       </w:pPr>
-      <w:hyperlink w:anchor="_Toc241587860" w:history="1">
+      <w:hyperlink w:anchor="_Toc241614230" w:history="1">
         <w:r>
           <w:rPr>
             <w:rStyle w:val="Hyperlink"/>
@@ -878,7 +932,7 @@
             <w:noProof/>
             <w:webHidden/>
           </w:rPr>
-          <w:instrText xml:space="preserve"> PAGEREF _Toc241587860 \h </w:instrText>
+          <w:instrText xml:space="preserve"> PAGEREF _Toc241614230 \h </w:instrText>
         </w:r>
         <w:r>
           <w:rPr>
@@ -898,7 +952,7 @@
             <w:noProof/>
             <w:webHidden/>
           </w:rPr>
-          <w:t>7</w:t>
+          <w:t>6</w:t>
         </w:r>
         <w:r>
           <w:rPr>
@@ -916,10 +970,16 @@
           <w:tab w:val="right" w:leader="dot" w:pos="9019"/>
         </w:tabs>
         <w:rPr>
+          <w:rFonts w:asciiTheme="minorHAnsi" w:eastAsiaTheme="minorEastAsia" w:hAnsiTheme="minorHAnsi" w:cstheme="minorBidi"/>
           <w:noProof/>
+          <w:color w:val="auto"/>
+          <w:kern w:val="2"/>
+          <w:szCs w:val="24"/>
+          <w:lang w:val="en-IN" w:eastAsia="en-IN"/>
+          <w14:ligatures w14:val="standardContextual"/>
         </w:rPr>
       </w:pPr>
-      <w:hyperlink w:anchor="_Toc241587861" w:history="1">
+      <w:hyperlink w:anchor="_Toc241614231" w:history="1">
         <w:r>
           <w:rPr>
             <w:rStyle w:val="Hyperlink"/>
@@ -946,7 +1006,7 @@
             <w:noProof/>
             <w:webHidden/>
           </w:rPr>
-          <w:instrText xml:space="preserve"> PAGEREF _Toc241587861 \h </w:instrText>
+          <w:instrText xml:space="preserve"> PAGEREF _Toc241614231 \h </w:instrText>
         </w:r>
         <w:r>
           <w:rPr>
@@ -966,7 +1026,7 @@
             <w:noProof/>
             <w:webHidden/>
           </w:rPr>
-          <w:t>8</w:t>
+          <w:t>7</w:t>
         </w:r>
         <w:r>
           <w:rPr>
@@ -984,10 +1044,16 @@
           <w:tab w:val="right" w:leader="dot" w:pos="9019"/>
         </w:tabs>
         <w:rPr>
+          <w:rFonts w:asciiTheme="minorHAnsi" w:eastAsiaTheme="minorEastAsia" w:hAnsiTheme="minorHAnsi" w:cstheme="minorBidi"/>
           <w:noProof/>
+          <w:color w:val="auto"/>
+          <w:kern w:val="2"/>
+          <w:szCs w:val="24"/>
+          <w:lang w:val="en-IN" w:eastAsia="en-IN"/>
+          <w14:ligatures w14:val="standardContextual"/>
         </w:rPr>
       </w:pPr>
-      <w:hyperlink w:anchor="_Toc241587862" w:history="1">
+      <w:hyperlink w:anchor="_Toc241614232" w:history="1">
         <w:r>
           <w:rPr>
             <w:rStyle w:val="Hyperlink"/>
@@ -1014,7 +1080,7 @@
             <w:noProof/>
             <w:webHidden/>
           </w:rPr>
-          <w:instrText xml:space="preserve"> PAGEREF _Toc241587862 \h </w:instrText>
+          <w:instrText xml:space="preserve"> PAGEREF _Toc241614232 \h </w:instrText>
         </w:r>
         <w:r>
           <w:rPr>
@@ -1034,7 +1100,7 @@
             <w:noProof/>
             <w:webHidden/>
           </w:rPr>
-          <w:t>9</w:t>
+          <w:t>8</w:t>
         </w:r>
         <w:r>
           <w:rPr>
@@ -1052,10 +1118,16 @@
           <w:tab w:val="right" w:leader="dot" w:pos="9019"/>
         </w:tabs>
         <w:rPr>
+          <w:rFonts w:asciiTheme="minorHAnsi" w:eastAsiaTheme="minorEastAsia" w:hAnsiTheme="minorHAnsi" w:cstheme="minorBidi"/>
           <w:noProof/>
+          <w:color w:val="auto"/>
+          <w:kern w:val="2"/>
+          <w:szCs w:val="24"/>
+          <w:lang w:val="en-IN" w:eastAsia="en-IN"/>
+          <w14:ligatures w14:val="standardContextual"/>
         </w:rPr>
       </w:pPr>
-      <w:hyperlink w:anchor="_Toc241587863" w:history="1">
+      <w:hyperlink w:anchor="_Toc241614233" w:history="1">
         <w:r>
           <w:rPr>
             <w:rStyle w:val="Hyperlink"/>
@@ -1082,7 +1154,7 @@
             <w:noProof/>
             <w:webHidden/>
           </w:rPr>
-          <w:instrText xml:space="preserve"> PAGEREF _Toc241587863 \h </w:instrText>
+          <w:instrText xml:space="preserve"> PAGEREF _Toc241614233 \h </w:instrText>
         </w:r>
         <w:r>
           <w:rPr>
@@ -1102,7 +1174,7 @@
             <w:noProof/>
             <w:webHidden/>
           </w:rPr>
-          <w:t>10</w:t>
+          <w:t>8</w:t>
         </w:r>
         <w:r>
           <w:rPr>
@@ -1120,10 +1192,16 @@
           <w:tab w:val="right" w:leader="dot" w:pos="9019"/>
         </w:tabs>
         <w:rPr>
+          <w:rFonts w:asciiTheme="minorHAnsi" w:eastAsiaTheme="minorEastAsia" w:hAnsiTheme="minorHAnsi" w:cstheme="minorBidi"/>
           <w:noProof/>
+          <w:color w:val="auto"/>
+          <w:kern w:val="2"/>
+          <w:szCs w:val="24"/>
+          <w:lang w:val="en-IN" w:eastAsia="en-IN"/>
+          <w14:ligatures w14:val="standardContextual"/>
         </w:rPr>
       </w:pPr>
-      <w:hyperlink w:anchor="_Toc241587864" w:history="1">
+      <w:hyperlink w:anchor="_Toc241614234" w:history="1">
         <w:r>
           <w:rPr>
             <w:rStyle w:val="Hyperlink"/>
@@ -1150,7 +1228,7 @@
             <w:noProof/>
             <w:webHidden/>
           </w:rPr>
-          <w:instrText xml:space="preserve"> PAGEREF _Toc241587864 \h </w:instrText>
+          <w:instrText xml:space="preserve"> PAGEREF _Toc241614234 \h </w:instrText>
         </w:r>
         <w:r>
           <w:rPr>
@@ -1170,7 +1248,7 @@
             <w:noProof/>
             <w:webHidden/>
           </w:rPr>
-          <w:t>10</w:t>
+          <w:t>9</w:t>
         </w:r>
         <w:r>
           <w:rPr>
@@ -1188,10 +1266,16 @@
           <w:tab w:val="right" w:leader="dot" w:pos="9019"/>
         </w:tabs>
         <w:rPr>
+          <w:rFonts w:asciiTheme="minorHAnsi" w:eastAsiaTheme="minorEastAsia" w:hAnsiTheme="minorHAnsi" w:cstheme="minorBidi"/>
           <w:noProof/>
+          <w:color w:val="auto"/>
+          <w:kern w:val="2"/>
+          <w:szCs w:val="24"/>
+          <w:lang w:val="en-IN" w:eastAsia="en-IN"/>
+          <w14:ligatures w14:val="standardContextual"/>
         </w:rPr>
       </w:pPr>
-      <w:hyperlink w:anchor="_Toc241587865" w:history="1">
+      <w:hyperlink w:anchor="_Toc241614235" w:history="1">
         <w:r>
           <w:rPr>
             <w:rStyle w:val="Hyperlink"/>
@@ -1218,7 +1302,7 @@
             <w:noProof/>
             <w:webHidden/>
           </w:rPr>
-          <w:instrText xml:space="preserve"> PAGEREF _Toc241587865 \h </w:instrText>
+          <w:instrText xml:space="preserve"> PAGEREF _Toc241614235 \h </w:instrText>
         </w:r>
         <w:r>
           <w:rPr>
@@ -1238,7 +1322,7 @@
             <w:noProof/>
             <w:webHidden/>
           </w:rPr>
-          <w:t>10</w:t>
+          <w:t>9</w:t>
         </w:r>
         <w:r>
           <w:rPr>
@@ -1256,10 +1340,16 @@
           <w:tab w:val="right" w:leader="dot" w:pos="9019"/>
         </w:tabs>
         <w:rPr>
+          <w:rFonts w:asciiTheme="minorHAnsi" w:eastAsiaTheme="minorEastAsia" w:hAnsiTheme="minorHAnsi" w:cstheme="minorBidi"/>
           <w:noProof/>
+          <w:color w:val="auto"/>
+          <w:kern w:val="2"/>
+          <w:szCs w:val="24"/>
+          <w:lang w:val="en-IN" w:eastAsia="en-IN"/>
+          <w14:ligatures w14:val="standardContextual"/>
         </w:rPr>
       </w:pPr>
-      <w:hyperlink w:anchor="_Toc241587866" w:history="1">
+      <w:hyperlink w:anchor="_Toc241614236" w:history="1">
         <w:r>
           <w:rPr>
             <w:rStyle w:val="Hyperlink"/>
@@ -1286,7 +1376,7 @@
             <w:noProof/>
             <w:webHidden/>
           </w:rPr>
-          <w:instrText xml:space="preserve"> PAGEREF _Toc241587866 \h </w:instrText>
+          <w:instrText xml:space="preserve"> PAGEREF _Toc241614236 \h </w:instrText>
         </w:r>
         <w:r>
           <w:rPr>
@@ -1306,7 +1396,7 @@
             <w:noProof/>
             <w:webHidden/>
           </w:rPr>
-          <w:t>11</w:t>
+          <w:t>9</w:t>
         </w:r>
         <w:r>
           <w:rPr>
@@ -1324,10 +1414,16 @@
           <w:tab w:val="right" w:leader="dot" w:pos="9019"/>
         </w:tabs>
         <w:rPr>
+          <w:rFonts w:asciiTheme="minorHAnsi" w:eastAsiaTheme="minorEastAsia" w:hAnsiTheme="minorHAnsi" w:cstheme="minorBidi"/>
           <w:noProof/>
+          <w:color w:val="auto"/>
+          <w:kern w:val="2"/>
+          <w:szCs w:val="24"/>
+          <w:lang w:val="en-IN" w:eastAsia="en-IN"/>
+          <w14:ligatures w14:val="standardContextual"/>
         </w:rPr>
       </w:pPr>
-      <w:hyperlink w:anchor="_Toc241587867" w:history="1">
+      <w:hyperlink w:anchor="_Toc241614237" w:history="1">
         <w:r>
           <w:rPr>
             <w:rStyle w:val="Hyperlink"/>
@@ -1354,7 +1450,7 @@
             <w:noProof/>
             <w:webHidden/>
           </w:rPr>
-          <w:instrText xml:space="preserve"> PAGEREF _Toc241587867 \h </w:instrText>
+          <w:instrText xml:space="preserve"> PAGEREF _Toc241614237 \h </w:instrText>
         </w:r>
         <w:r>
           <w:rPr>
@@ -1374,7 +1470,7 @@
             <w:noProof/>
             <w:webHidden/>
           </w:rPr>
-          <w:t>12</w:t>
+          <w:t>10</w:t>
         </w:r>
         <w:r>
           <w:rPr>
@@ -1392,10 +1488,16 @@
           <w:tab w:val="right" w:leader="dot" w:pos="9019"/>
         </w:tabs>
         <w:rPr>
+          <w:rFonts w:asciiTheme="minorHAnsi" w:eastAsiaTheme="minorEastAsia" w:hAnsiTheme="minorHAnsi" w:cstheme="minorBidi"/>
           <w:noProof/>
+          <w:color w:val="auto"/>
+          <w:kern w:val="2"/>
+          <w:szCs w:val="24"/>
+          <w:lang w:val="en-IN" w:eastAsia="en-IN"/>
+          <w14:ligatures w14:val="standardContextual"/>
         </w:rPr>
       </w:pPr>
-      <w:hyperlink w:anchor="_Toc241587868" w:history="1">
+      <w:hyperlink w:anchor="_Toc241614238" w:history="1">
         <w:r>
           <w:rPr>
             <w:rStyle w:val="Hyperlink"/>
@@ -1422,7 +1524,7 @@
             <w:noProof/>
             <w:webHidden/>
           </w:rPr>
-          <w:instrText xml:space="preserve"> PAGEREF _Toc241587868 \h </w:instrText>
+          <w:instrText xml:space="preserve"> PAGEREF _Toc241614238 \h </w:instrText>
         </w:r>
         <w:r>
           <w:rPr>
@@ -1442,7 +1544,7 @@
             <w:noProof/>
             <w:webHidden/>
           </w:rPr>
-          <w:t>13</w:t>
+          <w:t>10</w:t>
         </w:r>
         <w:r>
           <w:rPr>
@@ -1460,10 +1562,16 @@
           <w:tab w:val="right" w:leader="dot" w:pos="9019"/>
         </w:tabs>
         <w:rPr>
+          <w:rFonts w:asciiTheme="minorHAnsi" w:eastAsiaTheme="minorEastAsia" w:hAnsiTheme="minorHAnsi" w:cstheme="minorBidi"/>
           <w:noProof/>
+          <w:color w:val="auto"/>
+          <w:kern w:val="2"/>
+          <w:szCs w:val="24"/>
+          <w:lang w:val="en-IN" w:eastAsia="en-IN"/>
+          <w14:ligatures w14:val="standardContextual"/>
         </w:rPr>
       </w:pPr>
-      <w:hyperlink w:anchor="_Toc241587869" w:history="1">
+      <w:hyperlink w:anchor="_Toc241614239" w:history="1">
         <w:r>
           <w:rPr>
             <w:rStyle w:val="Hyperlink"/>
@@ -1490,7 +1598,7 @@
             <w:noProof/>
             <w:webHidden/>
           </w:rPr>
-          <w:instrText xml:space="preserve"> PAGEREF _Toc241587869 \h </w:instrText>
+          <w:instrText xml:space="preserve"> PAGEREF _Toc241614239 \h </w:instrText>
         </w:r>
         <w:r>
           <w:rPr>
@@ -1510,7 +1618,7 @@
             <w:noProof/>
             <w:webHidden/>
           </w:rPr>
-          <w:t>15</w:t>
+          <w:t>11</w:t>
         </w:r>
         <w:r>
           <w:rPr>
@@ -1528,10 +1636,16 @@
           <w:tab w:val="right" w:leader="dot" w:pos="9019"/>
         </w:tabs>
         <w:rPr>
+          <w:rFonts w:asciiTheme="minorHAnsi" w:eastAsiaTheme="minorEastAsia" w:hAnsiTheme="minorHAnsi" w:cstheme="minorBidi"/>
           <w:noProof/>
+          <w:color w:val="auto"/>
+          <w:kern w:val="2"/>
+          <w:szCs w:val="24"/>
+          <w:lang w:val="en-IN" w:eastAsia="en-IN"/>
+          <w14:ligatures w14:val="standardContextual"/>
         </w:rPr>
       </w:pPr>
-      <w:hyperlink w:anchor="_Toc241587870" w:history="1">
+      <w:hyperlink w:anchor="_Toc241614240" w:history="1">
         <w:r>
           <w:rPr>
             <w:rStyle w:val="Hyperlink"/>
@@ -1558,7 +1672,7 @@
             <w:noProof/>
             <w:webHidden/>
           </w:rPr>
-          <w:instrText xml:space="preserve"> PAGEREF _Toc241587870 \h </w:instrText>
+          <w:instrText xml:space="preserve"> PAGEREF _Toc241614240 \h </w:instrText>
         </w:r>
         <w:r>
           <w:rPr>
@@ -1578,7 +1692,7 @@
             <w:noProof/>
             <w:webHidden/>
           </w:rPr>
-          <w:t>15</w:t>
+          <w:t>12</w:t>
         </w:r>
         <w:r>
           <w:rPr>
@@ -1596,10 +1710,16 @@
           <w:tab w:val="right" w:leader="dot" w:pos="9019"/>
         </w:tabs>
         <w:rPr>
+          <w:rFonts w:asciiTheme="minorHAnsi" w:eastAsiaTheme="minorEastAsia" w:hAnsiTheme="minorHAnsi" w:cstheme="minorBidi"/>
           <w:noProof/>
+          <w:color w:val="auto"/>
+          <w:kern w:val="2"/>
+          <w:szCs w:val="24"/>
+          <w:lang w:val="en-IN" w:eastAsia="en-IN"/>
+          <w14:ligatures w14:val="standardContextual"/>
         </w:rPr>
       </w:pPr>
-      <w:hyperlink w:anchor="_Toc241587871" w:history="1">
+      <w:hyperlink w:anchor="_Toc241614241" w:history="1">
         <w:r>
           <w:rPr>
             <w:rStyle w:val="Hyperlink"/>
@@ -1626,7 +1746,7 @@
             <w:noProof/>
             <w:webHidden/>
           </w:rPr>
-          <w:instrText xml:space="preserve"> PAGEREF _Toc241587871 \h </w:instrText>
+          <w:instrText xml:space="preserve"> PAGEREF _Toc241614241 \h </w:instrText>
         </w:r>
         <w:r>
           <w:rPr>
@@ -1646,7 +1766,7 @@
             <w:noProof/>
             <w:webHidden/>
           </w:rPr>
-          <w:t>16</w:t>
+          <w:t>12</w:t>
         </w:r>
         <w:r>
           <w:rPr>
@@ -1664,10 +1784,16 @@
           <w:tab w:val="right" w:leader="dot" w:pos="9019"/>
         </w:tabs>
         <w:rPr>
+          <w:rFonts w:asciiTheme="minorHAnsi" w:eastAsiaTheme="minorEastAsia" w:hAnsiTheme="minorHAnsi" w:cstheme="minorBidi"/>
           <w:noProof/>
+          <w:color w:val="auto"/>
+          <w:kern w:val="2"/>
+          <w:szCs w:val="24"/>
+          <w:lang w:val="en-IN" w:eastAsia="en-IN"/>
+          <w14:ligatures w14:val="standardContextual"/>
         </w:rPr>
       </w:pPr>
-      <w:hyperlink w:anchor="_Toc241587872" w:history="1">
+      <w:hyperlink w:anchor="_Toc241614242" w:history="1">
         <w:r>
           <w:rPr>
             <w:rStyle w:val="Hyperlink"/>
@@ -1694,7 +1820,7 @@
             <w:noProof/>
             <w:webHidden/>
           </w:rPr>
-          <w:instrText xml:space="preserve"> PAGEREF _Toc241587872 \h </w:instrText>
+          <w:instrText xml:space="preserve"> PAGEREF _Toc241614242 \h </w:instrText>
         </w:r>
         <w:r>
           <w:rPr>
@@ -1714,7 +1840,7 @@
             <w:noProof/>
             <w:webHidden/>
           </w:rPr>
-          <w:t>16</w:t>
+          <w:t>13</w:t>
         </w:r>
         <w:r>
           <w:rPr>
@@ -1732,10 +1858,16 @@
           <w:tab w:val="right" w:leader="dot" w:pos="9019"/>
         </w:tabs>
         <w:rPr>
+          <w:rFonts w:asciiTheme="minorHAnsi" w:eastAsiaTheme="minorEastAsia" w:hAnsiTheme="minorHAnsi" w:cstheme="minorBidi"/>
           <w:noProof/>
+          <w:color w:val="auto"/>
+          <w:kern w:val="2"/>
+          <w:szCs w:val="24"/>
+          <w:lang w:val="en-IN" w:eastAsia="en-IN"/>
+          <w14:ligatures w14:val="standardContextual"/>
         </w:rPr>
       </w:pPr>
-      <w:hyperlink w:anchor="_Toc241587873" w:history="1">
+      <w:hyperlink w:anchor="_Toc241614243" w:history="1">
         <w:r>
           <w:rPr>
             <w:rStyle w:val="Hyperlink"/>
@@ -1762,7 +1894,7 @@
             <w:noProof/>
             <w:webHidden/>
           </w:rPr>
-          <w:instrText xml:space="preserve"> PAGEREF _Toc241587873 \h </w:instrText>
+          <w:instrText xml:space="preserve"> PAGEREF _Toc241614243 \h </w:instrText>
         </w:r>
         <w:r>
           <w:rPr>
@@ -1782,7 +1914,7 @@
             <w:noProof/>
             <w:webHidden/>
           </w:rPr>
-          <w:t>16</w:t>
+          <w:t>13</w:t>
         </w:r>
         <w:r>
           <w:rPr>
@@ -1800,10 +1932,16 @@
           <w:tab w:val="right" w:leader="dot" w:pos="9019"/>
         </w:tabs>
         <w:rPr>
+          <w:rFonts w:asciiTheme="minorHAnsi" w:eastAsiaTheme="minorEastAsia" w:hAnsiTheme="minorHAnsi" w:cstheme="minorBidi"/>
           <w:noProof/>
+          <w:color w:val="auto"/>
+          <w:kern w:val="2"/>
+          <w:szCs w:val="24"/>
+          <w:lang w:val="en-IN" w:eastAsia="en-IN"/>
+          <w14:ligatures w14:val="standardContextual"/>
         </w:rPr>
       </w:pPr>
-      <w:hyperlink w:anchor="_Toc241587874" w:history="1">
+      <w:hyperlink w:anchor="_Toc241614244" w:history="1">
         <w:r>
           <w:rPr>
             <w:rStyle w:val="Hyperlink"/>
@@ -1830,7 +1968,7 @@
             <w:noProof/>
             <w:webHidden/>
           </w:rPr>
-          <w:instrText xml:space="preserve"> PAGEREF _Toc241587874 \h </w:instrText>
+          <w:instrText xml:space="preserve"> PAGEREF _Toc241614244 \h </w:instrText>
         </w:r>
         <w:r>
           <w:rPr>
@@ -1850,7 +1988,7 @@
             <w:noProof/>
             <w:webHidden/>
           </w:rPr>
-          <w:t>19</w:t>
+          <w:t>14</w:t>
         </w:r>
         <w:r>
           <w:rPr>
@@ -1868,10 +2006,16 @@
           <w:tab w:val="right" w:leader="dot" w:pos="9019"/>
         </w:tabs>
         <w:rPr>
+          <w:rFonts w:asciiTheme="minorHAnsi" w:eastAsiaTheme="minorEastAsia" w:hAnsiTheme="minorHAnsi" w:cstheme="minorBidi"/>
           <w:noProof/>
+          <w:color w:val="auto"/>
+          <w:kern w:val="2"/>
+          <w:szCs w:val="24"/>
+          <w:lang w:val="en-IN" w:eastAsia="en-IN"/>
+          <w14:ligatures w14:val="standardContextual"/>
         </w:rPr>
       </w:pPr>
-      <w:hyperlink w:anchor="_Toc241587875" w:history="1">
+      <w:hyperlink w:anchor="_Toc241614245" w:history="1">
         <w:r>
           <w:rPr>
             <w:rStyle w:val="Hyperlink"/>
@@ -1898,7 +2042,7 @@
             <w:noProof/>
             <w:webHidden/>
           </w:rPr>
-          <w:instrText xml:space="preserve"> PAGEREF _Toc241587875 \h </w:instrText>
+          <w:instrText xml:space="preserve"> PAGEREF _Toc241614245 \h </w:instrText>
         </w:r>
         <w:r>
           <w:rPr>
@@ -1918,7 +2062,7 @@
             <w:noProof/>
             <w:webHidden/>
           </w:rPr>
-          <w:t>20</w:t>
+          <w:t>14</w:t>
         </w:r>
         <w:r>
           <w:rPr>
@@ -1936,10 +2080,16 @@
           <w:tab w:val="right" w:leader="dot" w:pos="9019"/>
         </w:tabs>
         <w:rPr>
+          <w:rFonts w:asciiTheme="minorHAnsi" w:eastAsiaTheme="minorEastAsia" w:hAnsiTheme="minorHAnsi" w:cstheme="minorBidi"/>
           <w:noProof/>
+          <w:color w:val="auto"/>
+          <w:kern w:val="2"/>
+          <w:szCs w:val="24"/>
+          <w:lang w:val="en-IN" w:eastAsia="en-IN"/>
+          <w14:ligatures w14:val="standardContextual"/>
         </w:rPr>
       </w:pPr>
-      <w:hyperlink w:anchor="_Toc241587876" w:history="1">
+      <w:hyperlink w:anchor="_Toc241614246" w:history="1">
         <w:r>
           <w:rPr>
             <w:rStyle w:val="Hyperlink"/>
@@ -1966,7 +2116,7 @@
             <w:noProof/>
             <w:webHidden/>
           </w:rPr>
-          <w:instrText xml:space="preserve"> PAGEREF _Toc241587876 \h </w:instrText>
+          <w:instrText xml:space="preserve"> PAGEREF _Toc241614246 \h </w:instrText>
         </w:r>
         <w:r>
           <w:rPr>
@@ -1986,7 +2136,7 @@
             <w:noProof/>
             <w:webHidden/>
           </w:rPr>
-          <w:t>20</w:t>
+          <w:t>15</w:t>
         </w:r>
         <w:r>
           <w:rPr>
@@ -2004,10 +2154,16 @@
           <w:tab w:val="right" w:leader="dot" w:pos="9019"/>
         </w:tabs>
         <w:rPr>
+          <w:rFonts w:asciiTheme="minorHAnsi" w:eastAsiaTheme="minorEastAsia" w:hAnsiTheme="minorHAnsi" w:cstheme="minorBidi"/>
           <w:noProof/>
+          <w:color w:val="auto"/>
+          <w:kern w:val="2"/>
+          <w:szCs w:val="24"/>
+          <w:lang w:val="en-IN" w:eastAsia="en-IN"/>
+          <w14:ligatures w14:val="standardContextual"/>
         </w:rPr>
       </w:pPr>
-      <w:hyperlink w:anchor="_Toc241587877" w:history="1">
+      <w:hyperlink w:anchor="_Toc241614247" w:history="1">
         <w:r>
           <w:rPr>
             <w:rStyle w:val="Hyperlink"/>
@@ -2034,7 +2190,7 @@
             <w:noProof/>
             <w:webHidden/>
           </w:rPr>
-          <w:instrText xml:space="preserve"> PAGEREF _Toc241587877 \h </w:instrText>
+          <w:instrText xml:space="preserve"> PAGEREF _Toc241614247 \h </w:instrText>
         </w:r>
         <w:r>
           <w:rPr>
@@ -2054,7 +2210,7 @@
             <w:noProof/>
             <w:webHidden/>
           </w:rPr>
-          <w:t>21</w:t>
+          <w:t>15</w:t>
         </w:r>
         <w:r>
           <w:rPr>
@@ -2072,10 +2228,16 @@
           <w:tab w:val="right" w:leader="dot" w:pos="9019"/>
         </w:tabs>
         <w:rPr>
+          <w:rFonts w:asciiTheme="minorHAnsi" w:eastAsiaTheme="minorEastAsia" w:hAnsiTheme="minorHAnsi" w:cstheme="minorBidi"/>
           <w:noProof/>
+          <w:color w:val="auto"/>
+          <w:kern w:val="2"/>
+          <w:szCs w:val="24"/>
+          <w:lang w:val="en-IN" w:eastAsia="en-IN"/>
+          <w14:ligatures w14:val="standardContextual"/>
         </w:rPr>
       </w:pPr>
-      <w:hyperlink w:anchor="_Toc241587878" w:history="1">
+      <w:hyperlink w:anchor="_Toc241614248" w:history="1">
         <w:r>
           <w:rPr>
             <w:rStyle w:val="Hyperlink"/>
@@ -2102,7 +2264,7 @@
             <w:noProof/>
             <w:webHidden/>
           </w:rPr>
-          <w:instrText xml:space="preserve"> PAGEREF _Toc241587878 \h </w:instrText>
+          <w:instrText xml:space="preserve"> PAGEREF _Toc241614248 \h </w:instrText>
         </w:r>
         <w:r>
           <w:rPr>
@@ -2122,7 +2284,7 @@
             <w:noProof/>
             <w:webHidden/>
           </w:rPr>
-          <w:t>22</w:t>
+          <w:t>16</w:t>
         </w:r>
         <w:r>
           <w:rPr>
@@ -2140,10 +2302,16 @@
           <w:tab w:val="right" w:leader="dot" w:pos="9019"/>
         </w:tabs>
         <w:rPr>
+          <w:rFonts w:asciiTheme="minorHAnsi" w:eastAsiaTheme="minorEastAsia" w:hAnsiTheme="minorHAnsi" w:cstheme="minorBidi"/>
           <w:noProof/>
+          <w:color w:val="auto"/>
+          <w:kern w:val="2"/>
+          <w:szCs w:val="24"/>
+          <w:lang w:val="en-IN" w:eastAsia="en-IN"/>
+          <w14:ligatures w14:val="standardContextual"/>
         </w:rPr>
       </w:pPr>
-      <w:hyperlink w:anchor="_Toc241587879" w:history="1">
+      <w:hyperlink w:anchor="_Toc241614249" w:history="1">
         <w:r>
           <w:rPr>
             <w:rStyle w:val="Hyperlink"/>
@@ -2170,7 +2338,7 @@
             <w:noProof/>
             <w:webHidden/>
           </w:rPr>
-          <w:instrText xml:space="preserve"> PAGEREF _Toc241587879 \h </w:instrText>
+          <w:instrText xml:space="preserve"> PAGEREF _Toc241614249 \h </w:instrText>
         </w:r>
         <w:r>
           <w:rPr>
@@ -2190,7 +2358,7 @@
             <w:noProof/>
             <w:webHidden/>
           </w:rPr>
-          <w:t>22</w:t>
+          <w:t>16</w:t>
         </w:r>
         <w:r>
           <w:rPr>
@@ -2208,10 +2376,16 @@
           <w:tab w:val="right" w:leader="dot" w:pos="9019"/>
         </w:tabs>
         <w:rPr>
+          <w:rFonts w:asciiTheme="minorHAnsi" w:eastAsiaTheme="minorEastAsia" w:hAnsiTheme="minorHAnsi" w:cstheme="minorBidi"/>
           <w:noProof/>
+          <w:color w:val="auto"/>
+          <w:kern w:val="2"/>
+          <w:szCs w:val="24"/>
+          <w:lang w:val="en-IN" w:eastAsia="en-IN"/>
+          <w14:ligatures w14:val="standardContextual"/>
         </w:rPr>
       </w:pPr>
-      <w:hyperlink w:anchor="_Toc241587880" w:history="1">
+      <w:hyperlink w:anchor="_Toc241614250" w:history="1">
         <w:r>
           <w:rPr>
             <w:rStyle w:val="Hyperlink"/>
@@ -2238,7 +2412,7 @@
             <w:noProof/>
             <w:webHidden/>
           </w:rPr>
-          <w:instrText xml:space="preserve"> PAGEREF _Toc241587880 \h </w:instrText>
+          <w:instrText xml:space="preserve"> PAGEREF _Toc241614250 \h </w:instrText>
         </w:r>
         <w:r>
           <w:rPr>
@@ -2258,7 +2432,7 @@
             <w:noProof/>
             <w:webHidden/>
           </w:rPr>
-          <w:t>22</w:t>
+          <w:t>17</w:t>
         </w:r>
         <w:r>
           <w:rPr>
@@ -2276,10 +2450,16 @@
           <w:tab w:val="right" w:leader="dot" w:pos="9019"/>
         </w:tabs>
         <w:rPr>
+          <w:rFonts w:asciiTheme="minorHAnsi" w:eastAsiaTheme="minorEastAsia" w:hAnsiTheme="minorHAnsi" w:cstheme="minorBidi"/>
           <w:noProof/>
+          <w:color w:val="auto"/>
+          <w:kern w:val="2"/>
+          <w:szCs w:val="24"/>
+          <w:lang w:val="en-IN" w:eastAsia="en-IN"/>
+          <w14:ligatures w14:val="standardContextual"/>
         </w:rPr>
       </w:pPr>
-      <w:hyperlink w:anchor="_Toc241587881" w:history="1">
+      <w:hyperlink w:anchor="_Toc241614251" w:history="1">
         <w:r>
           <w:rPr>
             <w:rStyle w:val="Hyperlink"/>
@@ -2306,7 +2486,7 @@
             <w:noProof/>
             <w:webHidden/>
           </w:rPr>
-          <w:instrText xml:space="preserve"> PAGEREF _Toc241587881 \h </w:instrText>
+          <w:instrText xml:space="preserve"> PAGEREF _Toc241614251 \h </w:instrText>
         </w:r>
         <w:r>
           <w:rPr>
@@ -2326,7 +2506,7 @@
             <w:noProof/>
             <w:webHidden/>
           </w:rPr>
-          <w:t>23</w:t>
+          <w:t>17</w:t>
         </w:r>
         <w:r>
           <w:rPr>
@@ -2344,10 +2524,16 @@
           <w:tab w:val="right" w:leader="dot" w:pos="9019"/>
         </w:tabs>
         <w:rPr>
+          <w:rFonts w:asciiTheme="minorHAnsi" w:eastAsiaTheme="minorEastAsia" w:hAnsiTheme="minorHAnsi" w:cstheme="minorBidi"/>
           <w:noProof/>
+          <w:color w:val="auto"/>
+          <w:kern w:val="2"/>
+          <w:szCs w:val="24"/>
+          <w:lang w:val="en-IN" w:eastAsia="en-IN"/>
+          <w14:ligatures w14:val="standardContextual"/>
         </w:rPr>
       </w:pPr>
-      <w:hyperlink w:anchor="_Toc241587882" w:history="1">
+      <w:hyperlink w:anchor="_Toc241614252" w:history="1">
         <w:r>
           <w:rPr>
             <w:rStyle w:val="Hyperlink"/>
@@ -2374,7 +2560,7 @@
             <w:noProof/>
             <w:webHidden/>
           </w:rPr>
-          <w:instrText xml:space="preserve"> PAGEREF _Toc241587882 \h </w:instrText>
+          <w:instrText xml:space="preserve"> PAGEREF _Toc241614252 \h </w:instrText>
         </w:r>
         <w:r>
           <w:rPr>
@@ -2394,7 +2580,7 @@
             <w:noProof/>
             <w:webHidden/>
           </w:rPr>
-          <w:t>23</w:t>
+          <w:t>17</w:t>
         </w:r>
         <w:r>
           <w:rPr>
@@ -2412,10 +2598,16 @@
           <w:tab w:val="right" w:leader="dot" w:pos="9019"/>
         </w:tabs>
         <w:rPr>
+          <w:rFonts w:asciiTheme="minorHAnsi" w:eastAsiaTheme="minorEastAsia" w:hAnsiTheme="minorHAnsi" w:cstheme="minorBidi"/>
           <w:noProof/>
+          <w:color w:val="auto"/>
+          <w:kern w:val="2"/>
+          <w:szCs w:val="24"/>
+          <w:lang w:val="en-IN" w:eastAsia="en-IN"/>
+          <w14:ligatures w14:val="standardContextual"/>
         </w:rPr>
       </w:pPr>
-      <w:hyperlink w:anchor="_Toc241587883" w:history="1">
+      <w:hyperlink w:anchor="_Toc241614253" w:history="1">
         <w:r>
           <w:rPr>
             <w:rStyle w:val="Hyperlink"/>
@@ -2442,7 +2634,7 @@
             <w:noProof/>
             <w:webHidden/>
           </w:rPr>
-          <w:instrText xml:space="preserve"> PAGEREF _Toc241587883 \h </w:instrText>
+          <w:instrText xml:space="preserve"> PAGEREF _Toc241614253 \h </w:instrText>
         </w:r>
         <w:r>
           <w:rPr>
@@ -2462,7 +2654,7 @@
             <w:noProof/>
             <w:webHidden/>
           </w:rPr>
-          <w:t>23</w:t>
+          <w:t>17</w:t>
         </w:r>
         <w:r>
           <w:rPr>
@@ -2480,10 +2672,16 @@
           <w:tab w:val="right" w:leader="dot" w:pos="9019"/>
         </w:tabs>
         <w:rPr>
+          <w:rFonts w:asciiTheme="minorHAnsi" w:eastAsiaTheme="minorEastAsia" w:hAnsiTheme="minorHAnsi" w:cstheme="minorBidi"/>
           <w:noProof/>
+          <w:color w:val="auto"/>
+          <w:kern w:val="2"/>
+          <w:szCs w:val="24"/>
+          <w:lang w:val="en-IN" w:eastAsia="en-IN"/>
+          <w14:ligatures w14:val="standardContextual"/>
         </w:rPr>
       </w:pPr>
-      <w:hyperlink w:anchor="_Toc241587884" w:history="1">
+      <w:hyperlink w:anchor="_Toc241614254" w:history="1">
         <w:r>
           <w:rPr>
             <w:rStyle w:val="Hyperlink"/>
@@ -2510,7 +2708,7 @@
             <w:noProof/>
             <w:webHidden/>
           </w:rPr>
-          <w:instrText xml:space="preserve"> PAGEREF _Toc241587884 \h </w:instrText>
+          <w:instrText xml:space="preserve"> PAGEREF _Toc241614254 \h </w:instrText>
         </w:r>
         <w:r>
           <w:rPr>
@@ -2530,7 +2728,7 @@
             <w:noProof/>
             <w:webHidden/>
           </w:rPr>
-          <w:t>24</w:t>
+          <w:t>18</w:t>
         </w:r>
         <w:r>
           <w:rPr>
@@ -2548,10 +2746,16 @@
           <w:tab w:val="right" w:leader="dot" w:pos="9019"/>
         </w:tabs>
         <w:rPr>
+          <w:rFonts w:asciiTheme="minorHAnsi" w:eastAsiaTheme="minorEastAsia" w:hAnsiTheme="minorHAnsi" w:cstheme="minorBidi"/>
           <w:noProof/>
+          <w:color w:val="auto"/>
+          <w:kern w:val="2"/>
+          <w:szCs w:val="24"/>
+          <w:lang w:val="en-IN" w:eastAsia="en-IN"/>
+          <w14:ligatures w14:val="standardContextual"/>
         </w:rPr>
       </w:pPr>
-      <w:hyperlink w:anchor="_Toc241587885" w:history="1">
+      <w:hyperlink w:anchor="_Toc241614255" w:history="1">
         <w:r>
           <w:rPr>
             <w:rStyle w:val="Hyperlink"/>
@@ -2578,7 +2782,7 @@
             <w:noProof/>
             <w:webHidden/>
           </w:rPr>
-          <w:instrText xml:space="preserve"> PAGEREF _Toc241587885 \h </w:instrText>
+          <w:instrText xml:space="preserve"> PAGEREF _Toc241614255 \h </w:instrText>
         </w:r>
         <w:r>
           <w:rPr>
@@ -2598,7 +2802,7 @@
             <w:noProof/>
             <w:webHidden/>
           </w:rPr>
-          <w:t>24</w:t>
+          <w:t>18</w:t>
         </w:r>
         <w:r>
           <w:rPr>
@@ -2616,10 +2820,16 @@
           <w:tab w:val="right" w:leader="dot" w:pos="9019"/>
         </w:tabs>
         <w:rPr>
+          <w:rFonts w:asciiTheme="minorHAnsi" w:eastAsiaTheme="minorEastAsia" w:hAnsiTheme="minorHAnsi" w:cstheme="minorBidi"/>
           <w:noProof/>
+          <w:color w:val="auto"/>
+          <w:kern w:val="2"/>
+          <w:szCs w:val="24"/>
+          <w:lang w:val="en-IN" w:eastAsia="en-IN"/>
+          <w14:ligatures w14:val="standardContextual"/>
         </w:rPr>
       </w:pPr>
-      <w:hyperlink w:anchor="_Toc241587886" w:history="1">
+      <w:hyperlink w:anchor="_Toc241614256" w:history="1">
         <w:r>
           <w:rPr>
             <w:rStyle w:val="Hyperlink"/>
@@ -2646,7 +2856,7 @@
             <w:noProof/>
             <w:webHidden/>
           </w:rPr>
-          <w:instrText xml:space="preserve"> PAGEREF _Toc241587886 \h </w:instrText>
+          <w:instrText xml:space="preserve"> PAGEREF _Toc241614256 \h </w:instrText>
         </w:r>
         <w:r>
           <w:rPr>
@@ -2666,7 +2876,7 @@
             <w:noProof/>
             <w:webHidden/>
           </w:rPr>
-          <w:t>25</w:t>
+          <w:t>19</w:t>
         </w:r>
         <w:r>
           <w:rPr>
@@ -2694,7 +2904,7 @@
       <w:pPr>
         <w:pStyle w:val="Heading1"/>
       </w:pPr>
-      <w:bookmarkStart w:id="0" w:name="_Toc241587852"/>
+      <w:bookmarkStart w:id="0" w:name="_Toc241614222"/>
       <w:r>
         <w:lastRenderedPageBreak/>
         <w:t>Case details</w:t>
@@ -2928,7 +3138,7 @@
               <w:rPr>
                 <w:sz w:val="20"/>
               </w:rPr>
-              <w:t>CSFCL-IA2-2026-005-EV01, the logical image evidence/acis-portal/, 7 files</w:t>
+              <w:t>CSFCL-IA2-2026-005-EV01, the reconstructed seven-file application dataset at evidence/acis-portal/</w:t>
             </w:r>
           </w:p>
         </w:tc>
@@ -3103,14 +3313,14 @@
     <w:p/>
     <w:p>
       <w:r>
-        <w:t>Section 1 tells the case. Section 2 covers how we examined a rebuilt copy of the server. Section 3 works through the thirteen activities on the IA2 activity sheet. Section 4 assesses the same facts under Indian law. The final findings, limitations and sources follow. The full demonstration is in the video presentation.</w:t>
+        <w:t>Section 1 tells the case. Section 2 covers how we examined a reconstructed seven-file application dataset. Section 3 works through the thirteen activities on the IA2 activity sheet. Section 4 assesses the same facts under Indian law. The final findings, limitations and sources follow. The full demonstration is in the video presentation.</w:t>
       </w:r>
     </w:p>
     <w:p>
       <w:pPr>
         <w:pStyle w:val="Heading1"/>
       </w:pPr>
-      <w:bookmarkStart w:id="1" w:name="_Toc241587853"/>
+      <w:bookmarkStart w:id="1" w:name="_Toc241614223"/>
       <w:r>
         <w:t>1. The case: the Equifax breach of 2017</w:t>
       </w:r>
@@ -3120,7 +3330,7 @@
       <w:pPr>
         <w:pStyle w:val="Heading2"/>
       </w:pPr>
-      <w:bookmarkStart w:id="2" w:name="_Toc241587854"/>
+      <w:bookmarkStart w:id="2" w:name="_Toc241614224"/>
       <w:r>
         <w:t>1.1 Who Equifax is</w:t>
       </w:r>
@@ -3135,7 +3345,7 @@
       <w:pPr>
         <w:pStyle w:val="Heading2"/>
       </w:pPr>
-      <w:bookmarkStart w:id="3" w:name="_Toc241587855"/>
+      <w:bookmarkStart w:id="3" w:name="_Toc241614225"/>
       <w:r>
         <w:t>1.2 How the attack unfolded</w:t>
       </w:r>
@@ -3148,15 +3358,7 @@
     </w:p>
     <w:p>
       <w:r>
-        <w:t xml:space="preserve">On 7 March 2017 the Apache team announced a flaw in Struts, CVE-2017-5638, and released a fixed version the same day. The flaw was in the part that handles file uploads. A web request carries a header called Content-Type that says what kind of data is attached. If that header was malformed, Struts tried to run it as a command instead of reading it as text. </w:t>
-      </w:r>
-      <w:proofErr w:type="gramStart"/>
-      <w:r>
-        <w:t>So</w:t>
-      </w:r>
-      <w:proofErr w:type="gramEnd"/>
-      <w:r>
-        <w:t xml:space="preserve"> anyone on the internet could put a command in that header and the server would run it, with no account and no password. That is remote code execution, the worst kind of flaw, and it scored 9.8 out of 10 on the standard severity scale.</w:t>
+        <w:t>On 7 March 2017 the Apache team announced a flaw in Struts, CVE-2017-5638, and released a fixed version the same day. The flaw was in the part that handles file uploads. A web request carries a header called Content-Type that says what kind of data is attached. If that header was malformed, Struts tried to run it as a command instead of reading it as text. So anyone on the internet could put a command in that header and the server would run it, with no account and no password. That is remote code execution, the worst kind of flaw, and it scored 9.8 out of 10 on the standard severity scale.</w:t>
       </w:r>
     </w:p>
     <w:p>
@@ -3867,7 +4069,7 @@
       <w:pPr>
         <w:pStyle w:val="Heading2"/>
       </w:pPr>
-      <w:bookmarkStart w:id="4" w:name="_Toc241587856"/>
+      <w:bookmarkStart w:id="4" w:name="_Toc241614226"/>
       <w:r>
         <w:t>1.3 Why it was not stopped</w:t>
       </w:r>
@@ -4157,7 +4359,7 @@
       <w:pPr>
         <w:pStyle w:val="Heading2"/>
       </w:pPr>
-      <w:bookmarkStart w:id="5" w:name="_Toc241587857"/>
+      <w:bookmarkStart w:id="5" w:name="_Toc241614227"/>
       <w:r>
         <w:t>1.4 What was taken</w:t>
       </w:r>
@@ -4165,14 +4367,14 @@
     </w:p>
     <w:p>
       <w:r>
-        <w:t>Equifax first announced about 143 million affected US consumers on 7 September 2017 and later revised the total to about 147 million. Equifax's May 2018 statement gives approximate US figures: names and dates of birth 146.6 million each, Social Security numbers 145.5 million, addresses 99 million, driver's licence numbers 17.6 million, payment card numbers 209,000. The same person appears in several categories, so the figures are not added. Dispute documents for about 182,000 consumers were also taken. Outside the US, GAO counted nearly one million people in 2018; the UK regulator later found up to 13.8 million UK records accessed, and about 19,000 Canadians were affected. The company later paid a US settlement of 575 to 700 million dollars, was fined by UK regulators, and spent about 1.5 billion dollars on security. The chief information officer, chief security officer and chief executive all left within weeks.</w:t>
+        <w:t>Equifax first announced about 143 million affected US consumers on 7 September 2017 and later revised the total to about 147 million. Equifax's May 2018 statement gives approximate US figures: names and dates of birth 146.6 million each, Social Security numbers 145.5 million, addresses 99 million, driver's licence numbers 17.6 million, payment card numbers 209,000. The same person appears in several categories, so the figures are not added. Dispute documents for about 182,000 consumers were also taken. Outside the US, GAO counted nearly one million people in 2018; the UK regulator later found up to 13.8 million UK records accessed, and about 19,000 Canadians were affected. The company agreed in 2019 to a US settlement of at least 575 million dollars, potentially 700 million dollars, was fined by UK regulators, and spent about 1.5 billion dollars on security. The chief information officer, chief security officer and chief executive all left within weeks.</w:t>
       </w:r>
     </w:p>
     <w:p>
       <w:pPr>
         <w:pStyle w:val="Heading2"/>
       </w:pPr>
-      <w:bookmarkStart w:id="6" w:name="_Toc241587858"/>
+      <w:bookmarkStart w:id="6" w:name="_Toc241614228"/>
       <w:r>
         <w:t>1.5 The question this report asks</w:t>
       </w:r>
@@ -4187,7 +4389,7 @@
       <w:pPr>
         <w:pStyle w:val="Heading1"/>
       </w:pPr>
-      <w:bookmarkStart w:id="7" w:name="_Toc241587859"/>
+      <w:bookmarkStart w:id="7" w:name="_Toc241614229"/>
       <w:r>
         <w:t>2. Methodology</w:t>
       </w:r>
@@ -4197,7 +4399,7 @@
       <w:pPr>
         <w:pStyle w:val="Heading2"/>
       </w:pPr>
-      <w:bookmarkStart w:id="8" w:name="_Toc241587860"/>
+      <w:bookmarkStart w:id="8" w:name="_Toc241614230"/>
       <w:r>
         <w:t>2.1 Tool and evidence</w:t>
       </w:r>
@@ -4507,16 +4709,8 @@
               <w:rPr>
                 <w:sz w:val="20"/>
               </w:rPr>
-              <w:t>config</w:t>
-            </w:r>
-            <w:proofErr w:type="gramStart"/>
-            <w:r>
-              <w:rPr>
-                <w:sz w:val="20"/>
-              </w:rPr>
-              <w:t>/.env</w:t>
-            </w:r>
-            <w:proofErr w:type="gramEnd"/>
+              <w:t>config/.env</w:t>
+            </w:r>
           </w:p>
         </w:tc>
         <w:tc>
@@ -4573,7 +4767,7 @@
               <w:rPr>
                 <w:sz w:val="20"/>
               </w:rPr>
-              <w:t>Instructions for building the server, which run it as root</w:t>
+              <w:t>Instructions for building the server, which set root as the execution user</w:t>
             </w:r>
           </w:p>
         </w:tc>
@@ -4589,7 +4783,7 @@
       <w:pPr>
         <w:pStyle w:val="Heading2"/>
       </w:pPr>
-      <w:bookmarkStart w:id="9" w:name="_Toc241587861"/>
+      <w:bookmarkStart w:id="9" w:name="_Toc241614231"/>
       <w:r>
         <w:t>2.2 The examination</w:t>
       </w:r>
@@ -4686,7 +4880,14 @@
         <w:rPr>
           <w:sz w:val="22"/>
         </w:rPr>
-        <w:t>unzip -p evidence/acis-portal/lib/struts2-core-2.5.10.jar META-INF/maven/org.apache.struts/struts2-core/pom.properties</w:t>
+        <w:t>unzip -p evidence/acis-portal/lib/struts2-core-2.5.10.jar \</w:t>
+      </w:r>
+      <w:r>
+        <w:rPr>
+          <w:sz w:val="22"/>
+        </w:rPr>
+        <w:br/>
+        <w:t xml:space="preserve">  META-INF/maven/org.apache.struts/struts2-core/pom.properties</w:t>
       </w:r>
     </w:p>
     <w:p>
@@ -4700,21 +4901,7 @@
         <w:rPr>
           <w:sz w:val="22"/>
         </w:rPr>
-        <w:t>grep -E "\(secrets</w:t>
-      </w:r>
-      <w:proofErr w:type="gramStart"/>
-      <w:r>
-        <w:rPr>
-          <w:sz w:val="22"/>
-        </w:rPr>
-        <w:t>\)$</w:t>
-      </w:r>
-      <w:proofErr w:type="gramEnd"/>
-      <w:r>
-        <w:rPr>
-          <w:sz w:val="22"/>
-        </w:rPr>
-        <w:t>|^(CRITICAL|HIGH|MEDIUM|LOW): " output/latest/03-secrets.txt</w:t>
+        <w:t>grep -E "\(secrets\)$|^(CRITICAL|HIGH|MEDIUM|LOW): " output/latest/03-secrets.txt</w:t>
       </w:r>
     </w:p>
     <w:p>
@@ -4779,7 +4966,7 @@
     </w:p>
     <w:p>
       <w:r>
-        <w:t>Two scans need --offline-scan because Trivy otherwise contacts Maven Central, which rate-limits and can stop the scan. The JAR is read with trivy rootfs, because trivy fs only reads dependency lists such as pom.xml and returns nothing for a compiled .jar.</w:t>
+        <w:t>Two scans need --offline-scan because Trivy otherwise contacts Maven Central, which rate-limits and can stop the scan. The JAR is read with trivy rootfs, because trivy fs only reads dependency lists such as pom.xml and returns nothing for a compiled .jar. The committed results in output/ were produced in a Linux environment; the screenshots in section 3 were captured on macOS, where sha256sum -c is written shasum -a 256 -c. The script detects the platform, and the computation is the same either way.</w:t>
       </w:r>
     </w:p>
     <w:p>
@@ -4847,7 +5034,7 @@
       <w:pPr>
         <w:pStyle w:val="Heading2"/>
       </w:pPr>
-      <w:bookmarkStart w:id="10" w:name="_Toc241587862"/>
+      <w:bookmarkStart w:id="10" w:name="_Toc241614232"/>
       <w:r>
         <w:t>2.3 Evidence log and chain of custody</w:t>
       </w:r>
@@ -5125,7 +5312,7 @@
       <w:pPr>
         <w:pStyle w:val="Heading2"/>
       </w:pPr>
-      <w:bookmarkStart w:id="11" w:name="_Toc241587863"/>
+      <w:bookmarkStart w:id="11" w:name="_Toc241614233"/>
       <w:r>
         <w:t>2.4 Evidence and assumptions</w:t>
       </w:r>
@@ -5232,21 +5419,7 @@
               <w:rPr>
                 <w:sz w:val="20"/>
               </w:rPr>
-              <w:t xml:space="preserve">Evidence: </w:t>
-            </w:r>
-            <w:proofErr w:type="gramStart"/>
-            <w:r>
-              <w:rPr>
-                <w:sz w:val="20"/>
-              </w:rPr>
-              <w:t>pom.properties</w:t>
-            </w:r>
-            <w:proofErr w:type="gramEnd"/>
-            <w:r>
-              <w:rPr>
-                <w:sz w:val="20"/>
-              </w:rPr>
-              <w:t xml:space="preserve"> inside the JAR, and the SHA-1 match with Maven Central</w:t>
+              <w:t>Evidence: pom.properties inside the JAR, and the SHA-1 match with Maven Central</w:t>
             </w:r>
           </w:p>
         </w:tc>
@@ -5312,7 +5485,7 @@
               <w:rPr>
                 <w:sz w:val="20"/>
               </w:rPr>
-              <w:t>The application runs as root and keeps credentials in plain text</w:t>
+              <w:t>The Dockerfile specifies root as the container execution user (execution not tested), and the config files keep credentials in plain text</w:t>
             </w:r>
           </w:p>
         </w:tc>
@@ -5423,7 +5596,7 @@
       <w:pPr>
         <w:pStyle w:val="Heading1"/>
       </w:pPr>
-      <w:bookmarkStart w:id="12" w:name="_Toc241587864"/>
+      <w:bookmarkStart w:id="12" w:name="_Toc241614234"/>
       <w:r>
         <w:lastRenderedPageBreak/>
         <w:t>3. Findings: the thirteen activities</w:t>
@@ -5434,7 +5607,7 @@
       <w:pPr>
         <w:pStyle w:val="Heading2"/>
       </w:pPr>
-      <w:bookmarkStart w:id="13" w:name="_Toc241587865"/>
+      <w:bookmarkStart w:id="13" w:name="_Toc241614235"/>
       <w:r>
         <w:t>Activity 1: evidence identification</w:t>
       </w:r>
@@ -5445,7 +5618,7 @@
         <w:jc w:val="left"/>
       </w:pPr>
       <w:r>
-        <w:t>A logical image (a copy of files and folders, not a whole disk) of 7 files at evidence/acis-portal/, about 1.6 MB, most of it the 1,594,816-byte Struts library. There is no container file such as E01 or raw dd. The SHA-256 of the evidence hash list is e3833f1be425fb980ab7071aaa3ca109ef6c57979e0a70ef7f569b141da2ce26.</w:t>
+        <w:t>A reconstructed seven-file application dataset at evidence/acis-portal/ (selected files, not a whole-disk image), about 1.6 MB, most of it the 1,594,816-byte Struts library. There is no container file such as E01 or raw dd. The SHA-256 of the evidence hash list is e3833f1be425fb980ab7071aaa3ca109ef6c57979e0a70ef7f569b141da2ce26.</w:t>
       </w:r>
     </w:p>
     <w:p>
@@ -5516,7 +5689,7 @@
         <w:t>What type of image is it?</w:t>
       </w:r>
       <w:r>
-        <w:t xml:space="preserve"> A logical image; it holds current files but no unallocated space, so no deleted data. </w:t>
+        <w:t xml:space="preserve"> Strictly none: this is a reconstructed set of seven application files, not an acquired disk image. It holds current files only, with no unallocated space and so no deleted data. </w:t>
       </w:r>
       <w:r>
         <w:rPr>
@@ -5541,7 +5714,7 @@
       <w:pPr>
         <w:pStyle w:val="Heading2"/>
       </w:pPr>
-      <w:bookmarkStart w:id="14" w:name="_Toc241587866"/>
+      <w:bookmarkStart w:id="14" w:name="_Toc241614236"/>
       <w:r>
         <w:t>Activity 2: hash verification</w:t>
       </w:r>
@@ -5917,16 +6090,8 @@
               <w:rPr>
                 <w:sz w:val="20"/>
               </w:rPr>
-              <w:t>config</w:t>
-            </w:r>
-            <w:proofErr w:type="gramStart"/>
-            <w:r>
-              <w:rPr>
-                <w:sz w:val="20"/>
-              </w:rPr>
-              <w:t>/.env</w:t>
-            </w:r>
-            <w:proofErr w:type="gramEnd"/>
+              <w:t>config/.env</w:t>
+            </w:r>
           </w:p>
         </w:tc>
         <w:tc>
@@ -6287,7 +6452,7 @@
         <w:t>What is a hash?</w:t>
       </w:r>
       <w:r>
-        <w:t xml:space="preserve"> A 64-character fingerprint of a file's contents. </w:t>
+        <w:t xml:space="preserve"> A fixed-length fingerprint of a file's contents; a SHA-256 hash is 64 hexadecimal characters, while the SHA-1 used for the Maven Central check is 40. </w:t>
       </w:r>
       <w:r>
         <w:rPr>
@@ -6296,15 +6461,7 @@
         <w:t>Why does it matter?</w:t>
       </w:r>
       <w:r>
-        <w:t xml:space="preserve"> Changing </w:t>
-      </w:r>
-      <w:proofErr w:type="gramStart"/>
-      <w:r>
-        <w:t>one bit</w:t>
-      </w:r>
-      <w:proofErr w:type="gramEnd"/>
-      <w:r>
-        <w:t xml:space="preserve"> changes about half the hash, so tampering shows. </w:t>
+        <w:t xml:space="preserve"> Changing one bit changes about half the hash, so tampering shows. </w:t>
       </w:r>
       <w:r>
         <w:rPr>
@@ -6320,7 +6477,7 @@
       <w:pPr>
         <w:pStyle w:val="Heading2"/>
       </w:pPr>
-      <w:bookmarkStart w:id="15" w:name="_Toc241587867"/>
+      <w:bookmarkStart w:id="15" w:name="_Toc241614237"/>
       <w:r>
         <w:t>Activity 3: creating the case</w:t>
       </w:r>
@@ -6335,7 +6492,7 @@
       <w:pPr>
         <w:pStyle w:val="Heading2"/>
       </w:pPr>
-      <w:bookmarkStart w:id="16" w:name="_Toc241587868"/>
+      <w:bookmarkStart w:id="16" w:name="_Toc241614238"/>
       <w:r>
         <w:t>Activity 4: file system examination</w:t>
       </w:r>
@@ -6343,7 +6500,7 @@
     </w:p>
     <w:p>
       <w:r>
-        <w:t>A logical copy of one application has no partitions, operating-system folders, user profiles or Recycle Bin. Its data is in lib/ (the Struts library) and config/ (three settings files and a private key).</w:t>
+        <w:t>A reconstructed set of seven application files has no partitions, operating-system folders, user profiles or Recycle Bin. Its data is in lib/ (the Struts library) and config/ (three settings files and a private key).</w:t>
       </w:r>
     </w:p>
     <w:p>
@@ -6806,7 +6963,7 @@
         <w:t>Which file system?</w:t>
       </w:r>
       <w:r>
-        <w:t xml:space="preserve"> None recorded; it is a logical copy. The real ACIS ran on Solaris. </w:t>
+        <w:t xml:space="preserve"> None recorded; this is a reconstructed set of files, not a disk image. The real ACIS ran on Solaris. </w:t>
       </w:r>
       <w:r>
         <w:rPr>
@@ -6815,15 +6972,7 @@
         <w:t>Which OS?</w:t>
       </w:r>
       <w:r>
-        <w:t xml:space="preserve"> The Dockerfile builds on </w:t>
-      </w:r>
-      <w:proofErr w:type="gramStart"/>
-      <w:r>
-        <w:t>tomcat:latest</w:t>
-      </w:r>
-      <w:proofErr w:type="gramEnd"/>
-      <w:r>
-        <w:t xml:space="preserve">, a Linux image. </w:t>
+        <w:t xml:space="preserve"> The Dockerfile builds on tomcat:latest, a Linux image. </w:t>
       </w:r>
       <w:r>
         <w:rPr>
@@ -6832,14 +6981,14 @@
         <w:t>How many user accounts?</w:t>
       </w:r>
       <w:r>
-        <w:t xml:space="preserve"> One system account, root, plus four database accounts (Activity 5).</w:t>
+        <w:t xml:space="preserve"> One configured execution account (root) in the Dockerfile, plus four database accounts (Activity 5).</w:t>
       </w:r>
     </w:p>
     <w:p>
       <w:pPr>
         <w:pStyle w:val="Heading2"/>
       </w:pPr>
-      <w:bookmarkStart w:id="17" w:name="_Toc241587869"/>
+      <w:bookmarkStart w:id="17" w:name="_Toc241614239"/>
       <w:r>
         <w:t>Activity 5: user accounts</w:t>
       </w:r>
@@ -6984,7 +7133,7 @@
               <w:rPr>
                 <w:sz w:val="20"/>
               </w:rPr>
-              <w:t>The application runs with full system control</w:t>
+              <w:t>Configured container execution user; host-level privileges were not established</w:t>
             </w:r>
           </w:p>
         </w:tc>
@@ -7022,19 +7171,11 @@
               <w:spacing w:after="40"/>
               <w:jc w:val="left"/>
             </w:pPr>
-            <w:proofErr w:type="gramStart"/>
-            <w:r>
-              <w:rPr>
-                <w:sz w:val="20"/>
-              </w:rPr>
-              <w:t>database.properties</w:t>
-            </w:r>
-            <w:proofErr w:type="gramEnd"/>
-            <w:r>
-              <w:rPr>
-                <w:sz w:val="20"/>
-              </w:rPr>
-              <w:t xml:space="preserve"> lines 8, 10</w:t>
+            <w:r>
+              <w:rPr>
+                <w:sz w:val="20"/>
+              </w:rPr>
+              <w:t>database.properties lines 8, 10</w:t>
             </w:r>
           </w:p>
         </w:tc>
@@ -7088,19 +7229,11 @@
               <w:spacing w:after="40"/>
               <w:jc w:val="left"/>
             </w:pPr>
-            <w:proofErr w:type="gramStart"/>
-            <w:r>
-              <w:rPr>
-                <w:sz w:val="20"/>
-              </w:rPr>
-              <w:t>database.properties</w:t>
-            </w:r>
-            <w:proofErr w:type="gramEnd"/>
-            <w:r>
-              <w:rPr>
-                <w:sz w:val="20"/>
-              </w:rPr>
-              <w:t xml:space="preserve"> lines 14, 16</w:t>
+            <w:r>
+              <w:rPr>
+                <w:sz w:val="20"/>
+              </w:rPr>
+              <w:t>database.properties lines 14, 16</w:t>
             </w:r>
           </w:p>
         </w:tc>
@@ -7129,7 +7262,6 @@
         <w:rPr>
           <w:i/>
         </w:rPr>
-        <w:lastRenderedPageBreak/>
         <w:t>Primary user?</w:t>
       </w:r>
       <w:r>
@@ -7158,7 +7290,7 @@
       <w:pPr>
         <w:pStyle w:val="Heading2"/>
       </w:pPr>
-      <w:bookmarkStart w:id="18" w:name="_Toc241587870"/>
+      <w:bookmarkStart w:id="18" w:name="_Toc241614240"/>
       <w:r>
         <w:t>Activity 6: deleted files</w:t>
       </w:r>
@@ -7206,7 +7338,6 @@
               <w:spacing w:after="40"/>
               <w:jc w:val="left"/>
             </w:pPr>
-            <w:proofErr w:type="gramStart"/>
             <w:r>
               <w:rPr>
                 <w:b/>
@@ -7214,7 +7345,6 @@
               </w:rPr>
               <w:t>S.No</w:t>
             </w:r>
-            <w:proofErr w:type="gramEnd"/>
           </w:p>
         </w:tc>
         <w:tc>
@@ -7384,7 +7514,7 @@
       <w:pPr>
         <w:pStyle w:val="Heading2"/>
       </w:pPr>
-      <w:bookmarkStart w:id="19" w:name="_Toc241587871"/>
+      <w:bookmarkStart w:id="19" w:name="_Toc241614241"/>
       <w:r>
         <w:t>Activity 7: metadata examination</w:t>
       </w:r>
@@ -7392,7 +7522,7 @@
     </w:p>
     <w:p>
       <w:r>
-        <w:t>The evidence has no photographs, so we read the metadata inside the JAR, which does the same job.</w:t>
+        <w:t>No photographs were supplied. JAR metadata was examined as an application-artifact metadata exercise; photograph or EXIF analysis was not performed.</w:t>
       </w:r>
     </w:p>
     <w:tbl>
@@ -7576,19 +7706,11 @@
               <w:spacing w:after="40"/>
               <w:jc w:val="left"/>
             </w:pPr>
-            <w:proofErr w:type="gramStart"/>
-            <w:r>
-              <w:rPr>
-                <w:sz w:val="20"/>
-              </w:rPr>
-              <w:t>org.apache</w:t>
-            </w:r>
-            <w:proofErr w:type="gramEnd"/>
-            <w:r>
-              <w:rPr>
-                <w:sz w:val="20"/>
-              </w:rPr>
-              <w:t>.struts, struts2-core, version 2.5.10</w:t>
+            <w:r>
+              <w:rPr>
+                <w:sz w:val="20"/>
+              </w:rPr>
+              <w:t>org.apache.struts, struts2-core, version 2.5.10</w:t>
             </w:r>
           </w:p>
         </w:tc>
@@ -7731,8 +7853,9 @@
       <w:pPr>
         <w:pStyle w:val="Heading2"/>
       </w:pPr>
-      <w:bookmarkStart w:id="20" w:name="_Toc241587872"/>
+      <w:bookmarkStart w:id="20" w:name="_Toc241614242"/>
       <w:r>
+        <w:lastRenderedPageBreak/>
         <w:t>Activity 8: browser activity</w:t>
       </w:r>
       <w:bookmarkEnd w:id="20"/>
@@ -7745,14 +7868,7 @@
         <w:rPr>
           <w:i/>
         </w:rPr>
-        <w:t xml:space="preserve">Which sites </w:t>
-      </w:r>
-      <w:r>
-        <w:rPr>
-          <w:i/>
-        </w:rPr>
-        <w:lastRenderedPageBreak/>
-        <w:t>were visited?</w:t>
+        <w:t>Which sites were visited?</w:t>
       </w:r>
       <w:r>
         <w:t xml:space="preserve"> None can be identified from this dataset. </w:t>
@@ -7780,7 +7896,7 @@
       <w:pPr>
         <w:pStyle w:val="Heading2"/>
       </w:pPr>
-      <w:bookmarkStart w:id="21" w:name="_Toc241587873"/>
+      <w:bookmarkStart w:id="21" w:name="_Toc241614243"/>
       <w:r>
         <w:t>Activity 9: keyword search</w:t>
       </w:r>
@@ -7791,15 +7907,7 @@
         <w:keepNext/>
       </w:pPr>
       <w:r>
-        <w:t xml:space="preserve">Searching the evidence for the sheet's eight keywords, password gave the most: four database passwords in </w:t>
-      </w:r>
-      <w:proofErr w:type="gramStart"/>
-      <w:r>
-        <w:t>database.properties</w:t>
-      </w:r>
-      <w:proofErr w:type="gramEnd"/>
-      <w:r>
-        <w:t xml:space="preserve"> (lines 9, 11, 15, 17), plus the same password in the Dockerfile. secret and backup matched the session secret, AWS keys and the private key; confidential, customer and salary matched nothing. A keyword only finds words, so we also ran Trivy's secret scanner with two custom rules, which found 11 secrets in 4 files, 9 critical:</w:t>
+        <w:t>Searching the evidence for the sheet's eight keywords, password gave the most: four database passwords in database.properties (lines 9, 11, 15, 17), plus the same password in the Dockerfile. secret and backup matched the session secret, AWS keys and the private key; confidential, customer and salary matched nothing. A keyword only finds words, so we also ran Trivy's secret scanner with two custom rules, which found 11 secrets in 4 files, 9 critical:</w:t>
       </w:r>
     </w:p>
     <w:tbl>
@@ -7943,21 +8051,7 @@
               <w:rPr>
                 <w:sz w:val="20"/>
               </w:rPr>
-              <w:t>config</w:t>
-            </w:r>
-            <w:proofErr w:type="gramStart"/>
-            <w:r>
-              <w:rPr>
-                <w:sz w:val="20"/>
-              </w:rPr>
-              <w:t>/.env</w:t>
-            </w:r>
-            <w:proofErr w:type="gramEnd"/>
-            <w:r>
-              <w:rPr>
-                <w:sz w:val="20"/>
-              </w:rPr>
-              <w:t>:4</w:t>
+              <w:t>config/.env:4</w:t>
             </w:r>
           </w:p>
         </w:tc>
@@ -8035,21 +8129,7 @@
               <w:rPr>
                 <w:sz w:val="20"/>
               </w:rPr>
-              <w:t>config</w:t>
-            </w:r>
-            <w:proofErr w:type="gramStart"/>
-            <w:r>
-              <w:rPr>
-                <w:sz w:val="20"/>
-              </w:rPr>
-              <w:t>/.env</w:t>
-            </w:r>
-            <w:proofErr w:type="gramEnd"/>
-            <w:r>
-              <w:rPr>
-                <w:sz w:val="20"/>
-              </w:rPr>
-              <w:t>:3</w:t>
+              <w:t>config/.env:3</w:t>
             </w:r>
           </w:p>
         </w:tc>
@@ -8929,7 +9009,7 @@
       <w:pPr>
         <w:pStyle w:val="Heading2"/>
       </w:pPr>
-      <w:bookmarkStart w:id="22" w:name="_Toc241587874"/>
+      <w:bookmarkStart w:id="22" w:name="_Toc241614244"/>
       <w:r>
         <w:t>Activity 10: file signatures and configuration</w:t>
       </w:r>
@@ -8937,15 +9017,7 @@
     </w:p>
     <w:p>
       <w:r>
-        <w:t xml:space="preserve">Every file's first bytes matched its extension: the JAR is a ZIP (50 4B 03 04), </w:t>
-      </w:r>
-      <w:proofErr w:type="gramStart"/>
-      <w:r>
-        <w:t>the .pem</w:t>
-      </w:r>
-      <w:proofErr w:type="gramEnd"/>
-      <w:r>
-        <w:t xml:space="preserve"> an RSA key, pom.xml is XML, the rest text. No file was disguised. aws-credentials and Dockerfile have no extension, yet hold sensitive data; Trivy scans by content, so it read them anyway. </w:t>
+        <w:t xml:space="preserve">Every file's first bytes matched its extension: the JAR is a ZIP (50 4B 03 04), the .pem an RSA key, pom.xml is XML, the rest text. No file was disguised. aws-credentials and Dockerfile have no extension, yet hold sensitive data; Trivy scans by content, so it read them anyway. </w:t>
       </w:r>
       <w:r>
         <w:rPr>
@@ -9369,19 +9441,11 @@
               <w:spacing w:after="40"/>
               <w:jc w:val="left"/>
             </w:pPr>
-            <w:proofErr w:type="gramStart"/>
-            <w:r>
-              <w:rPr>
-                <w:sz w:val="20"/>
-              </w:rPr>
-              <w:t>':latest</w:t>
-            </w:r>
-            <w:proofErr w:type="gramEnd"/>
-            <w:r>
-              <w:rPr>
-                <w:sz w:val="20"/>
-              </w:rPr>
-              <w:t>' tag used</w:t>
+            <w:r>
+              <w:rPr>
+                <w:sz w:val="20"/>
+              </w:rPr>
+              <w:t>':latest' tag used</w:t>
             </w:r>
           </w:p>
         </w:tc>
@@ -9526,7 +9590,7 @@
       <w:pPr>
         <w:pStyle w:val="Heading2"/>
       </w:pPr>
-      <w:bookmarkStart w:id="23" w:name="_Toc241587875"/>
+      <w:bookmarkStart w:id="23" w:name="_Toc241614245"/>
       <w:r>
         <w:t>Activity 11: timeline</w:t>
       </w:r>
@@ -9534,15 +9598,7 @@
     </w:p>
     <w:p>
       <w:r>
-        <w:t>Two dates come from our evidence: the JAR was built 27 January 2017 (</w:t>
-      </w:r>
-      <w:proofErr w:type="gramStart"/>
-      <w:r>
-        <w:t>pom.properties</w:t>
-      </w:r>
-      <w:proofErr w:type="gramEnd"/>
-      <w:r>
-        <w:t xml:space="preserve">), and the CVE record is dated 11 March 2017 (scan output). The rest come from the case record: flaw announced and fixed 7 March, intrusion 13 May, attack spotted 29 July, portal down 30 July, breach announced 7 September. In order: library built, flaw announced and fixed, intrusion 67 days later, 76 days undetected, certificate renewed, attack spotted, portal down, breach disclosed. </w:t>
+        <w:t xml:space="preserve">Two dates come from our evidence: the JAR was built 27 January 2017 (pom.properties), and the CVE record is dated 11 March 2017 (scan output). The rest come from the case record: flaw announced and fixed 7 March, intrusion 13 May, attack spotted 29 July, portal down 30 July, breach announced 7 September. In order: library built, flaw announced and fixed, intrusion 67 days later, 76 days undetected, certificate renewed, attack spotted, portal down, breach disclosed. </w:t>
       </w:r>
       <w:r>
         <w:rPr>
@@ -9562,7 +9618,7 @@
       <w:pPr>
         <w:pStyle w:val="Heading2"/>
       </w:pPr>
-      <w:bookmarkStart w:id="24" w:name="_Toc241587876"/>
+      <w:bookmarkStart w:id="24" w:name="_Toc241614246"/>
       <w:r>
         <w:t>Activity 12: correlating the evidence</w:t>
       </w:r>
@@ -9741,7 +9797,7 @@
               <w:rPr>
                 <w:sz w:val="20"/>
               </w:rPr>
-              <w:t>Remote code execution as root, with credentials on disk: one way in becomes access to every database those passwords open</w:t>
+              <w:t>These findings illustrate a potential attack chain involving vulnerable software, a configured root user and exposed example credentials. Exploitation and database access were not tested.</w:t>
             </w:r>
           </w:p>
         </w:tc>
@@ -9763,7 +9819,7 @@
       <w:pPr>
         <w:pStyle w:val="Heading2"/>
       </w:pPr>
-      <w:bookmarkStart w:id="25" w:name="_Toc241587877"/>
+      <w:bookmarkStart w:id="25" w:name="_Toc241614247"/>
       <w:r>
         <w:t>Activity 13: evidence tagging and exported hashes</w:t>
       </w:r>
@@ -10300,16 +10356,8 @@
               <w:rPr>
                 <w:sz w:val="20"/>
               </w:rPr>
-              <w:t>config</w:t>
-            </w:r>
-            <w:proofErr w:type="gramStart"/>
-            <w:r>
-              <w:rPr>
-                <w:sz w:val="20"/>
-              </w:rPr>
-              <w:t>/.env</w:t>
-            </w:r>
-            <w:proofErr w:type="gramEnd"/>
+              <w:t>config/.env</w:t>
+            </w:r>
           </w:p>
         </w:tc>
         <w:tc>
@@ -10430,6 +10478,7 @@
         <w:keepNext/>
       </w:pPr>
       <w:r>
+        <w:lastRenderedPageBreak/>
         <w:t>The SHA-256 hashes of every file the examination exported, so they can be checked later with sha256sum -c:</w:t>
       </w:r>
     </w:p>
@@ -10516,16 +10565,8 @@
               <w:rPr>
                 <w:sz w:val="20"/>
               </w:rPr>
-              <w:t>01-rootfs-</w:t>
-            </w:r>
-            <w:proofErr w:type="gramStart"/>
-            <w:r>
-              <w:rPr>
-                <w:sz w:val="20"/>
-              </w:rPr>
-              <w:t>vulnerabilities.json</w:t>
-            </w:r>
-            <w:proofErr w:type="gramEnd"/>
+              <w:t>01-rootfs-vulnerabilities.json</w:t>
+            </w:r>
           </w:p>
         </w:tc>
         <w:tc>
@@ -10608,16 +10649,8 @@
               <w:rPr>
                 <w:sz w:val="20"/>
               </w:rPr>
-              <w:t>02-manifest-</w:t>
-            </w:r>
-            <w:proofErr w:type="gramStart"/>
-            <w:r>
-              <w:rPr>
-                <w:sz w:val="20"/>
-              </w:rPr>
-              <w:t>vulnerabilities.json</w:t>
-            </w:r>
-            <w:proofErr w:type="gramEnd"/>
+              <w:t>02-manifest-vulnerabilities.json</w:t>
+            </w:r>
           </w:p>
         </w:tc>
         <w:tc>
@@ -10700,16 +10733,8 @@
               <w:rPr>
                 <w:sz w:val="20"/>
               </w:rPr>
-              <w:t>03-</w:t>
-            </w:r>
-            <w:proofErr w:type="gramStart"/>
-            <w:r>
-              <w:rPr>
-                <w:sz w:val="20"/>
-              </w:rPr>
-              <w:t>secrets.json</w:t>
-            </w:r>
-            <w:proofErr w:type="gramEnd"/>
+              <w:t>03-secrets.json</w:t>
+            </w:r>
           </w:p>
         </w:tc>
         <w:tc>
@@ -10792,16 +10817,8 @@
               <w:rPr>
                 <w:sz w:val="20"/>
               </w:rPr>
-              <w:t>04-</w:t>
-            </w:r>
-            <w:proofErr w:type="gramStart"/>
-            <w:r>
-              <w:rPr>
-                <w:sz w:val="20"/>
-              </w:rPr>
-              <w:t>misconfigurations.json</w:t>
-            </w:r>
-            <w:proofErr w:type="gramEnd"/>
+              <w:t>04-misconfigurations.json</w:t>
+            </w:r>
           </w:p>
         </w:tc>
         <w:tc>
@@ -10884,16 +10901,8 @@
               <w:rPr>
                 <w:sz w:val="20"/>
               </w:rPr>
-              <w:t>05-sbom-</w:t>
-            </w:r>
-            <w:proofErr w:type="gramStart"/>
-            <w:r>
-              <w:rPr>
-                <w:sz w:val="20"/>
-              </w:rPr>
-              <w:t>cyclonedx.json</w:t>
-            </w:r>
-            <w:proofErr w:type="gramEnd"/>
+              <w:t>05-sbom-cyclonedx.json</w:t>
+            </w:r>
           </w:p>
         </w:tc>
         <w:tc>
@@ -11009,7 +11018,6 @@
         <w:rPr>
           <w:noProof/>
         </w:rPr>
-        <w:lastRenderedPageBreak/>
         <w:drawing>
           <wp:inline distT="0" distB="0" distL="0" distR="0" wp14:anchorId="4856E347" wp14:editId="485A01F8">
             <wp:extent cx="5486400" cy="1765189"/>
@@ -11064,7 +11072,7 @@
       <w:pPr>
         <w:pStyle w:val="Heading1"/>
       </w:pPr>
-      <w:bookmarkStart w:id="26" w:name="_Toc241587878"/>
+      <w:bookmarkStart w:id="26" w:name="_Toc241614248"/>
       <w:r>
         <w:t>4. The same facts under Indian law</w:t>
       </w:r>
@@ -11079,7 +11087,7 @@
       <w:pPr>
         <w:pStyle w:val="Heading2"/>
       </w:pPr>
-      <w:bookmarkStart w:id="27" w:name="_Toc241587879"/>
+      <w:bookmarkStart w:id="27" w:name="_Toc241614249"/>
       <w:r>
         <w:t>4.1 Why Indian law applies</w:t>
       </w:r>
@@ -11094,8 +11102,9 @@
       <w:pPr>
         <w:pStyle w:val="Heading2"/>
       </w:pPr>
-      <w:bookmarkStart w:id="28" w:name="_Toc241587880"/>
+      <w:bookmarkStart w:id="28" w:name="_Toc241614250"/>
       <w:r>
+        <w:lastRenderedPageBreak/>
         <w:t>4.2 Law in force now</w:t>
       </w:r>
       <w:bookmarkEnd w:id="28"/>
@@ -11309,7 +11318,7 @@
               <w:rPr>
                 <w:sz w:val="20"/>
               </w:rPr>
-              <w:t>IT Act s.43, 66, 66C</w:t>
+              <w:t>IT Act ss.66, 66C and s.43</w:t>
             </w:r>
           </w:p>
         </w:tc>
@@ -11327,7 +11336,7 @@
               <w:rPr>
                 <w:sz w:val="20"/>
               </w:rPr>
-              <w:t>Cover the attackers: unauthorised access and identity theft, up to three years in prison</w:t>
+              <w:t>Sections 66 and 66C are offences covering dishonest unauthorised access and identity theft, punishable by up to three years in prison. Section 43 is civil: it gives the victim compensation and carries no imprisonment</w:t>
             </w:r>
           </w:p>
         </w:tc>
@@ -11383,7 +11392,7 @@
       <w:pPr>
         <w:pStyle w:val="Heading2"/>
       </w:pPr>
-      <w:bookmarkStart w:id="29" w:name="_Toc241587881"/>
+      <w:bookmarkStart w:id="29" w:name="_Toc241614251"/>
       <w:r>
         <w:t>4.3 From 13 May 2027: the DPDP Act</w:t>
       </w:r>
@@ -11435,7 +11444,6 @@
                 <w:b/>
                 <w:sz w:val="20"/>
               </w:rPr>
-              <w:lastRenderedPageBreak/>
               <w:t>Provision</w:t>
             </w:r>
           </w:p>
@@ -11607,7 +11615,7 @@
       <w:pPr>
         <w:pStyle w:val="Heading2"/>
       </w:pPr>
-      <w:bookmarkStart w:id="30" w:name="_Toc241587882"/>
+      <w:bookmarkStart w:id="30" w:name="_Toc241614252"/>
       <w:r>
         <w:t>4.4 Reporting and logging deadlines</w:t>
       </w:r>
@@ -11653,7 +11661,7 @@
                 <w:b/>
                 <w:sz w:val="20"/>
               </w:rPr>
-              <w:t>The law expects</w:t>
+              <w:t>Indian law would require (hypothetical)</w:t>
             </w:r>
           </w:p>
         </w:tc>
@@ -11672,7 +11680,7 @@
                 <w:b/>
                 <w:sz w:val="20"/>
               </w:rPr>
-              <w:t>Equifax did</w:t>
+              <w:t>What Equifax actually did (US, 2017)</w:t>
             </w:r>
           </w:p>
         </w:tc>
@@ -11696,7 +11704,7 @@
               <w:rPr>
                 <w:sz w:val="20"/>
               </w:rPr>
-              <w:t>CERT-In: report within 6 hours of noticing</w:t>
+              <w:t>CERT-In: covered entities report a cyber incident within 6 hours</w:t>
             </w:r>
           </w:p>
         </w:tc>
@@ -11714,7 +11722,7 @@
               <w:rPr>
                 <w:sz w:val="20"/>
               </w:rPr>
-              <w:t>Told the FBI after 4 days, the public after 40 days</w:t>
+              <w:t>Reported to the FBI after 4 days and the public after 40 days; different actions from a CERT-In filing, which did not apply in the US in 2017</w:t>
             </w:r>
           </w:p>
         </w:tc>
@@ -11807,7 +11815,7 @@
       <w:pPr>
         <w:pStyle w:val="Heading2"/>
       </w:pPr>
-      <w:bookmarkStart w:id="31" w:name="_Toc241587883"/>
+      <w:bookmarkStart w:id="31" w:name="_Toc241614253"/>
       <w:r>
         <w:t>4.5 Using this evidence in an Indian court</w:t>
       </w:r>
@@ -11815,14 +11823,18 @@
     </w:p>
     <w:p>
       <w:r>
-        <w:t>The examination's output would be electronic records, admissible under section 63 of the Bharatiya Sakshya Adhiniyam, 2023 (in force since 1 July 2024). It requires a certificate with the record, signed by the person in charge and by an expert, giving the hash value of each record and the algorithm (SHA1, SHA256 or MD5). Our SHA-256 values are what that certificate would carry, and the matching before-and-after hashes are what let an expert sign it.</w:t>
+        <w:t xml:space="preserve">The examination's output would be electronic records, admissible under section 63 of the Bharatiya Sakshya Adhiniyam, 2023 (in force since 1 July 2024). It requires a certificate with </w:t>
+      </w:r>
+      <w:r>
+        <w:lastRenderedPageBreak/>
+        <w:t>the record, signed by the person in charge and by an expert, giving the hash value of each record and the algorithm (SHA1, SHA256 or MD5). Our SHA-256 values are what that certificate would carry. SHA-256 hashes support evidence-integrity verification; admissibility requires compliance with the applicable electronic-evidence provisions, including the relevant certificate requirements, and matching hashes alone do not establish admissibility.</w:t>
       </w:r>
     </w:p>
     <w:p>
       <w:pPr>
         <w:pStyle w:val="Heading1"/>
       </w:pPr>
-      <w:bookmarkStart w:id="32" w:name="_Toc241587884"/>
+      <w:bookmarkStart w:id="32" w:name="_Toc241614254"/>
       <w:r>
         <w:t>5. Final findings and conclusion</w:t>
       </w:r>
@@ -11929,21 +11941,7 @@
               <w:rPr>
                 <w:sz w:val="20"/>
               </w:rPr>
-              <w:t>Linux (</w:t>
-            </w:r>
-            <w:proofErr w:type="gramStart"/>
-            <w:r>
-              <w:rPr>
-                <w:sz w:val="20"/>
-              </w:rPr>
-              <w:t>tomcat:latest</w:t>
-            </w:r>
-            <w:proofErr w:type="gramEnd"/>
-            <w:r>
-              <w:rPr>
-                <w:sz w:val="20"/>
-              </w:rPr>
-              <w:t>); the real ACIS ran on Solaris</w:t>
+              <w:t>Linux (tomcat:latest); the real ACIS ran on Solaris</w:t>
             </w:r>
           </w:p>
         </w:tc>
@@ -11985,7 +11983,7 @@
               <w:rPr>
                 <w:sz w:val="20"/>
               </w:rPr>
-              <w:t>None recorded; a logical copy</w:t>
+              <w:t>None recorded; a reconstructed set of files</w:t>
             </w:r>
           </w:p>
         </w:tc>
@@ -12027,7 +12025,7 @@
               <w:rPr>
                 <w:sz w:val="20"/>
               </w:rPr>
-              <w:t>root (Dockerfile line 6)</w:t>
+              <w:t>Human user not identified; Dockerfile sets root (line 6)</w:t>
             </w:r>
           </w:p>
         </w:tc>
@@ -12111,7 +12109,7 @@
               <w:rPr>
                 <w:sz w:val="20"/>
               </w:rPr>
-              <w:t>None recoverable from a logical image</w:t>
+              <w:t>Recovery not performed: no unallocated space or deleted-file artifacts in this dataset</w:t>
             </w:r>
           </w:p>
         </w:tc>
@@ -12153,7 +12151,7 @@
               <w:rPr>
                 <w:sz w:val="20"/>
               </w:rPr>
-              <w:t>Not applicable to a web server</w:t>
+              <w:t>Not assessed: no browser artifacts were supplied</w:t>
             </w:r>
           </w:p>
         </w:tc>
@@ -12370,18 +12368,14 @@
     <w:p/>
     <w:p>
       <w:r>
-        <w:t xml:space="preserve">Based on the examination of the forensic image, the evidence indicates that the rebuilt dispute portal contains struts2-core 2.5.10, a genuine Apache release built on 27 January 2017, carrying CVE-2017-5638 at CVSS 9.8. The Dockerfile specifies root as the execution user, and the config files store four database passwords, two cloud key pairs, a private key </w:t>
-      </w:r>
-      <w:r>
-        <w:lastRenderedPageBreak/>
-        <w:t>and a token in plain text. None of the 7 files changed during the examination. Counting only flaws public on 13 May 2017, the library has 2, and 1 of them is critical: CVE-2017-5638, the flaw the attackers used. This shows the flaw was public and identifiable before the intrusion. The evidence does not show whether Equifax scanned for it or would have acted on the result.</w:t>
+        <w:t>Based on the examination of the reconstructed seven-file application dataset, the evidence indicates that the rebuilt dispute portal contains struts2-core 2.5.10, a genuine Apache release built on 27 January 2017, carrying CVE-2017-5638 at CVSS 9.8. The Dockerfile specifies root as the execution user, and the config files store four database passwords, two cloud key pairs, a private key and a token in plain text. None of the 7 files changed during the examination. Counting only flaws public on 13 May 2017, the library has 2, and 1 of them is critical: CVE-2017-5638, the flaw the attackers used. This shows the flaw was public and identifiable before the intrusion. The evidence does not show whether Equifax scanned for it or would have acted on the result. The full evidence set, scripts and outputs are in the case repository: https://github.com/Yashvi2874/csfcl-ia2-equifax-trivy-forensics.</w:t>
       </w:r>
     </w:p>
     <w:p>
       <w:pPr>
         <w:pStyle w:val="Heading1"/>
       </w:pPr>
-      <w:bookmarkStart w:id="33" w:name="_Toc241587885"/>
+      <w:bookmarkStart w:id="33" w:name="_Toc241614255"/>
       <w:r>
         <w:t>6. Limitations</w:t>
       </w:r>
@@ -12396,8 +12390,9 @@
       <w:pPr>
         <w:pStyle w:val="Heading1"/>
       </w:pPr>
-      <w:bookmarkStart w:id="34" w:name="_Toc241587886"/>
+      <w:bookmarkStart w:id="34" w:name="_Toc241614256"/>
       <w:r>
+        <w:lastRenderedPageBreak/>
         <w:t>7. Sources</w:t>
       </w:r>
       <w:bookmarkEnd w:id="34"/>
@@ -12501,7 +12496,7 @@
         <w:pStyle w:val="ListBullet"/>
       </w:pPr>
       <w:r>
-        <w:t xml:space="preserve">The Digital Personal Data Protection Act, 2023; the DPDP Rules, 2025 (G.S.R. 846(E)); and the commencement notification (G.S.R. 843(E), 13 November 2025, which sets a phased commencement including an eighteen-month phase). </w:t>
+        <w:t xml:space="preserve">The Digital Personal Data Protection Act, 2023. </w:t>
       </w:r>
       <w:hyperlink r:id="rId25" w:history="1">
         <w:r>
@@ -12513,6 +12508,22 @@
       </w:hyperlink>
       <w:r>
         <w:t xml:space="preserve"> </w:t>
+      </w:r>
+    </w:p>
+    <w:p>
+      <w:pPr>
+        <w:pStyle w:val="ListBullet"/>
+      </w:pPr>
+      <w:r>
+        <w:t>The Digital Personal Data Protection Rules, 2025 (G.S.R. 846(E)), notified 13 November 2025. Ministry of Electronics and Information Technology, Gazette of India.</w:t>
+      </w:r>
+    </w:p>
+    <w:p>
+      <w:pPr>
+        <w:pStyle w:val="ListBullet"/>
+      </w:pPr>
+      <w:r>
+        <w:t>Commencement notification G.S.R. 843(E), 13 November 2025, setting a phased commencement of the DPDP Act that includes an eighteen-month phase. Ministry of Electronics and Information Technology, Gazette of India.</w:t>
       </w:r>
     </w:p>
     <w:p>
@@ -12543,9 +12554,12 @@
       </w:r>
     </w:p>
     <w:sectPr>
-      <w:headerReference w:type="default" r:id="rId27"/>
-      <w:footerReference w:type="default" r:id="rId28"/>
-      <w:footerReference w:type="first" r:id="rId29"/>
+      <w:headerReference w:type="even" r:id="rId27"/>
+      <w:headerReference w:type="default" r:id="rId28"/>
+      <w:footerReference w:type="even" r:id="rId29"/>
+      <w:footerReference w:type="default" r:id="rId30"/>
+      <w:headerReference w:type="first" r:id="rId31"/>
+      <w:footerReference w:type="first" r:id="rId32"/>
       <w:pgSz w:w="11909" w:h="16834"/>
       <w:pgMar w:top="1440" w:right="1440" w:bottom="1440" w:left="1440" w:header="720" w:footer="720" w:gutter="0"/>
       <w:cols w:space="720"/>
@@ -12582,6 +12596,16 @@
 </file>
 
 <file path=word/footer1.xml><?xml version="1.0" encoding="utf-8"?>
+<w:ftr xmlns:wpc="http://schemas.microsoft.com/office/word/2010/wordprocessingCanvas" xmlns:cx="http://schemas.microsoft.com/office/drawing/2014/chartex" xmlns:cx1="http://schemas.microsoft.com/office/drawing/2015/9/8/chartex" xmlns:cx2="http://schemas.microsoft.com/office/drawing/2015/10/21/chartex" xmlns:cx3="http://schemas.microsoft.com/office/drawing/2016/5/9/chartex" xmlns:cx4="http://schemas.microsoft.com/office/drawing/2016/5/10/chartex" xmlns:cx5="http://schemas.microsoft.com/office/drawing/2016/5/11/chartex" xmlns:cx6="http://schemas.microsoft.com/office/drawing/2016/5/12/chartex" xmlns:cx7="http://schemas.microsoft.com/office/drawing/2016/5/13/chartex" xmlns:cx8="http://schemas.microsoft.com/office/drawing/2016/5/14/chartex" xmlns:mc="http://schemas.openxmlformats.org/markup-compatibility/2006" xmlns:aink="http://schemas.microsoft.com/office/drawing/2016/ink" xmlns:am3d="http://schemas.microsoft.com/office/drawing/2017/model3d" xmlns:o="urn:schemas-microsoft-com:office:office" xmlns:oel="http://schemas.microsoft.com/office/2019/extlst" xmlns:r="http://schemas.openxmlformats.org/officeDocument/2006/relationships" xmlns:m="http://schemas.openxmlformats.org/officeDocument/2006/math" xmlns:v="urn:schemas-microsoft-com:vml" xmlns:wp14="http://schemas.microsoft.com/office/word/2010/wordprocessingDrawing" xmlns:wp="http://schemas.openxmlformats.org/drawingml/2006/wordprocessingDrawing" xmlns:w10="urn:schemas-microsoft-com:office:word" xmlns:w="http://schemas.openxmlformats.org/wordprocessingml/2006/main" xmlns:w14="http://schemas.microsoft.com/office/word/2010/wordml" xmlns:w15="http://schemas.microsoft.com/office/word/2012/wordml" xmlns:w16cex="http://schemas.microsoft.com/office/word/2018/wordml/cex" xmlns:w16cid="http://schemas.microsoft.com/office/word/2016/wordml/cid" xmlns:w16="http://schemas.microsoft.com/office/word/2018/wordml" xmlns:w16du="http://schemas.microsoft.com/office/word/2023/wordml/word16du" xmlns:w16sdtdh="http://schemas.microsoft.com/office/word/2020/wordml/sdtdatahash" xmlns:w16sdtfl="http://schemas.microsoft.com/office/word/2024/wordml/sdtformatlock" xmlns:w16se="http://schemas.microsoft.com/office/word/2015/wordml/symex" xmlns:wpg="http://schemas.microsoft.com/office/word/2010/wordprocessingGroup" xmlns:wpi="http://schemas.microsoft.com/office/word/2010/wordprocessingInk" xmlns:wne="http://schemas.microsoft.com/office/word/2006/wordml" xmlns:wps="http://schemas.microsoft.com/office/word/2010/wordprocessingShape" mc:Ignorable="w14 w15 w16se w16cid w16 w16cex w16sdtdh w16sdtfl w16du wp14">
+  <w:p>
+    <w:pPr>
+      <w:pStyle w:val="Footer"/>
+    </w:pPr>
+  </w:p>
+</w:ftr>
+</file>
+
+<file path=word/footer2.xml><?xml version="1.0" encoding="utf-8"?>
 <w:ftr xmlns:wpc="http://schemas.microsoft.com/office/word/2010/wordprocessingCanvas" xmlns:cx="http://schemas.microsoft.com/office/drawing/2014/chartex" xmlns:cx1="http://schemas.microsoft.com/office/drawing/2015/9/8/chartex" xmlns:cx2="http://schemas.microsoft.com/office/drawing/2015/10/21/chartex" xmlns:cx3="http://schemas.microsoft.com/office/drawing/2016/5/9/chartex" xmlns:cx4="http://schemas.microsoft.com/office/drawing/2016/5/10/chartex" xmlns:cx5="http://schemas.microsoft.com/office/drawing/2016/5/11/chartex" xmlns:cx6="http://schemas.microsoft.com/office/drawing/2016/5/12/chartex" xmlns:cx7="http://schemas.microsoft.com/office/drawing/2016/5/13/chartex" xmlns:cx8="http://schemas.microsoft.com/office/drawing/2016/5/14/chartex" xmlns:mc="http://schemas.openxmlformats.org/markup-compatibility/2006" xmlns:aink="http://schemas.microsoft.com/office/drawing/2016/ink" xmlns:am3d="http://schemas.microsoft.com/office/drawing/2017/model3d" xmlns:o="urn:schemas-microsoft-com:office:office" xmlns:oel="http://schemas.microsoft.com/office/2019/extlst" xmlns:r="http://schemas.openxmlformats.org/officeDocument/2006/relationships" xmlns:m="http://schemas.openxmlformats.org/officeDocument/2006/math" xmlns:v="urn:schemas-microsoft-com:vml" xmlns:wp14="http://schemas.microsoft.com/office/word/2010/wordprocessingDrawing" xmlns:wp="http://schemas.openxmlformats.org/drawingml/2006/wordprocessingDrawing" xmlns:w10="urn:schemas-microsoft-com:office:word" xmlns:w="http://schemas.openxmlformats.org/wordprocessingml/2006/main" xmlns:w14="http://schemas.microsoft.com/office/word/2010/wordml" xmlns:w15="http://schemas.microsoft.com/office/word/2012/wordml" xmlns:w16cex="http://schemas.microsoft.com/office/word/2018/wordml/cex" xmlns:w16cid="http://schemas.microsoft.com/office/word/2016/wordml/cid" xmlns:w16="http://schemas.microsoft.com/office/word/2018/wordml" xmlns:w16du="http://schemas.microsoft.com/office/word/2023/wordml/word16du" xmlns:w16sdtdh="http://schemas.microsoft.com/office/word/2020/wordml/sdtdatahash" xmlns:w16sdtfl="http://schemas.microsoft.com/office/word/2024/wordml/sdtformatlock" xmlns:w16se="http://schemas.microsoft.com/office/word/2015/wordml/symex" xmlns:wpg="http://schemas.microsoft.com/office/word/2010/wordprocessingGroup" xmlns:wpi="http://schemas.microsoft.com/office/word/2010/wordprocessingInk" xmlns:wne="http://schemas.microsoft.com/office/word/2006/wordml" xmlns:wps="http://schemas.microsoft.com/office/word/2010/wordprocessingShape" mc:Ignorable="w14 w15 w16se w16cid w16 w16cex w16sdtdh w16sdtfl w16du wp14">
   <w:p>
     <w:pPr>
@@ -12676,7 +12700,7 @@
 </w:ftr>
 </file>
 
-<file path=word/footer2.xml><?xml version="1.0" encoding="utf-8"?>
+<file path=word/footer3.xml><?xml version="1.0" encoding="utf-8"?>
 <w:ftr xmlns:wpc="http://schemas.microsoft.com/office/word/2010/wordprocessingCanvas" xmlns:cx="http://schemas.microsoft.com/office/drawing/2014/chartex" xmlns:cx1="http://schemas.microsoft.com/office/drawing/2015/9/8/chartex" xmlns:cx2="http://schemas.microsoft.com/office/drawing/2015/10/21/chartex" xmlns:cx3="http://schemas.microsoft.com/office/drawing/2016/5/9/chartex" xmlns:cx4="http://schemas.microsoft.com/office/drawing/2016/5/10/chartex" xmlns:cx5="http://schemas.microsoft.com/office/drawing/2016/5/11/chartex" xmlns:cx6="http://schemas.microsoft.com/office/drawing/2016/5/12/chartex" xmlns:cx7="http://schemas.microsoft.com/office/drawing/2016/5/13/chartex" xmlns:cx8="http://schemas.microsoft.com/office/drawing/2016/5/14/chartex" xmlns:mc="http://schemas.openxmlformats.org/markup-compatibility/2006" xmlns:aink="http://schemas.microsoft.com/office/drawing/2016/ink" xmlns:am3d="http://schemas.microsoft.com/office/drawing/2017/model3d" xmlns:o="urn:schemas-microsoft-com:office:office" xmlns:oel="http://schemas.microsoft.com/office/2019/extlst" xmlns:r="http://schemas.openxmlformats.org/officeDocument/2006/relationships" xmlns:m="http://schemas.openxmlformats.org/officeDocument/2006/math" xmlns:v="urn:schemas-microsoft-com:vml" xmlns:wp14="http://schemas.microsoft.com/office/word/2010/wordprocessingDrawing" xmlns:wp="http://schemas.openxmlformats.org/drawingml/2006/wordprocessingDrawing" xmlns:w10="urn:schemas-microsoft-com:office:word" xmlns:w="http://schemas.openxmlformats.org/wordprocessingml/2006/main" xmlns:w14="http://schemas.microsoft.com/office/word/2010/wordml" xmlns:w15="http://schemas.microsoft.com/office/word/2012/wordml" xmlns:w16cex="http://schemas.microsoft.com/office/word/2018/wordml/cex" xmlns:w16cid="http://schemas.microsoft.com/office/word/2016/wordml/cid" xmlns:w16="http://schemas.microsoft.com/office/word/2018/wordml" xmlns:w16du="http://schemas.microsoft.com/office/word/2023/wordml/word16du" xmlns:w16sdtdh="http://schemas.microsoft.com/office/word/2020/wordml/sdtdatahash" xmlns:w16sdtfl="http://schemas.microsoft.com/office/word/2024/wordml/sdtformatlock" xmlns:w16se="http://schemas.microsoft.com/office/word/2015/wordml/symex" xmlns:wpg="http://schemas.microsoft.com/office/word/2010/wordprocessingGroup" xmlns:wpi="http://schemas.microsoft.com/office/word/2010/wordprocessingInk" xmlns:wne="http://schemas.microsoft.com/office/word/2006/wordml" xmlns:wps="http://schemas.microsoft.com/office/word/2010/wordprocessingShape" mc:Ignorable="w14 w15 w16se w16cid w16 w16cex w16sdtdh w16sdtfl w16du wp14">
   <w:p>
     <w:pPr>
@@ -12757,6 +12781,16 @@
   <w:p>
     <w:pPr>
       <w:pStyle w:val="Header"/>
+    </w:pPr>
+  </w:p>
+</w:hdr>
+</file>
+
+<file path=word/header2.xml><?xml version="1.0" encoding="utf-8"?>
+<w:hdr xmlns:wpc="http://schemas.microsoft.com/office/word/2010/wordprocessingCanvas" xmlns:cx="http://schemas.microsoft.com/office/drawing/2014/chartex" xmlns:cx1="http://schemas.microsoft.com/office/drawing/2015/9/8/chartex" xmlns:cx2="http://schemas.microsoft.com/office/drawing/2015/10/21/chartex" xmlns:cx3="http://schemas.microsoft.com/office/drawing/2016/5/9/chartex" xmlns:cx4="http://schemas.microsoft.com/office/drawing/2016/5/10/chartex" xmlns:cx5="http://schemas.microsoft.com/office/drawing/2016/5/11/chartex" xmlns:cx6="http://schemas.microsoft.com/office/drawing/2016/5/12/chartex" xmlns:cx7="http://schemas.microsoft.com/office/drawing/2016/5/13/chartex" xmlns:cx8="http://schemas.microsoft.com/office/drawing/2016/5/14/chartex" xmlns:mc="http://schemas.openxmlformats.org/markup-compatibility/2006" xmlns:aink="http://schemas.microsoft.com/office/drawing/2016/ink" xmlns:am3d="http://schemas.microsoft.com/office/drawing/2017/model3d" xmlns:o="urn:schemas-microsoft-com:office:office" xmlns:oel="http://schemas.microsoft.com/office/2019/extlst" xmlns:r="http://schemas.openxmlformats.org/officeDocument/2006/relationships" xmlns:m="http://schemas.openxmlformats.org/officeDocument/2006/math" xmlns:v="urn:schemas-microsoft-com:vml" xmlns:wp14="http://schemas.microsoft.com/office/word/2010/wordprocessingDrawing" xmlns:wp="http://schemas.openxmlformats.org/drawingml/2006/wordprocessingDrawing" xmlns:w10="urn:schemas-microsoft-com:office:word" xmlns:w="http://schemas.openxmlformats.org/wordprocessingml/2006/main" xmlns:w14="http://schemas.microsoft.com/office/word/2010/wordml" xmlns:w15="http://schemas.microsoft.com/office/word/2012/wordml" xmlns:w16cex="http://schemas.microsoft.com/office/word/2018/wordml/cex" xmlns:w16cid="http://schemas.microsoft.com/office/word/2016/wordml/cid" xmlns:w16="http://schemas.microsoft.com/office/word/2018/wordml" xmlns:w16du="http://schemas.microsoft.com/office/word/2023/wordml/word16du" xmlns:w16sdtdh="http://schemas.microsoft.com/office/word/2020/wordml/sdtdatahash" xmlns:w16sdtfl="http://schemas.microsoft.com/office/word/2024/wordml/sdtformatlock" xmlns:w16se="http://schemas.microsoft.com/office/word/2015/wordml/symex" xmlns:wpg="http://schemas.microsoft.com/office/word/2010/wordprocessingGroup" xmlns:wpi="http://schemas.microsoft.com/office/word/2010/wordprocessingInk" xmlns:wne="http://schemas.microsoft.com/office/word/2006/wordml" xmlns:wps="http://schemas.microsoft.com/office/word/2010/wordprocessingShape" mc:Ignorable="w14 w15 w16se w16cid w16 w16cex w16sdtdh w16sdtfl w16du wp14">
+  <w:p>
+    <w:pPr>
+      <w:pStyle w:val="Header"/>
       <w:jc w:val="center"/>
     </w:pPr>
     <w:r>
@@ -12804,6 +12838,16 @@
     <w:pPr>
       <w:pStyle w:val="Header"/>
       <w:jc w:val="center"/>
+    </w:pPr>
+  </w:p>
+</w:hdr>
+</file>
+
+<file path=word/header3.xml><?xml version="1.0" encoding="utf-8"?>
+<w:hdr xmlns:wpc="http://schemas.microsoft.com/office/word/2010/wordprocessingCanvas" xmlns:cx="http://schemas.microsoft.com/office/drawing/2014/chartex" xmlns:cx1="http://schemas.microsoft.com/office/drawing/2015/9/8/chartex" xmlns:cx2="http://schemas.microsoft.com/office/drawing/2015/10/21/chartex" xmlns:cx3="http://schemas.microsoft.com/office/drawing/2016/5/9/chartex" xmlns:cx4="http://schemas.microsoft.com/office/drawing/2016/5/10/chartex" xmlns:cx5="http://schemas.microsoft.com/office/drawing/2016/5/11/chartex" xmlns:cx6="http://schemas.microsoft.com/office/drawing/2016/5/12/chartex" xmlns:cx7="http://schemas.microsoft.com/office/drawing/2016/5/13/chartex" xmlns:cx8="http://schemas.microsoft.com/office/drawing/2016/5/14/chartex" xmlns:mc="http://schemas.openxmlformats.org/markup-compatibility/2006" xmlns:aink="http://schemas.microsoft.com/office/drawing/2016/ink" xmlns:am3d="http://schemas.microsoft.com/office/drawing/2017/model3d" xmlns:o="urn:schemas-microsoft-com:office:office" xmlns:oel="http://schemas.microsoft.com/office/2019/extlst" xmlns:r="http://schemas.openxmlformats.org/officeDocument/2006/relationships" xmlns:m="http://schemas.openxmlformats.org/officeDocument/2006/math" xmlns:v="urn:schemas-microsoft-com:vml" xmlns:wp14="http://schemas.microsoft.com/office/word/2010/wordprocessingDrawing" xmlns:wp="http://schemas.openxmlformats.org/drawingml/2006/wordprocessingDrawing" xmlns:w10="urn:schemas-microsoft-com:office:word" xmlns:w="http://schemas.openxmlformats.org/wordprocessingml/2006/main" xmlns:w14="http://schemas.microsoft.com/office/word/2010/wordml" xmlns:w15="http://schemas.microsoft.com/office/word/2012/wordml" xmlns:w16cex="http://schemas.microsoft.com/office/word/2018/wordml/cex" xmlns:w16cid="http://schemas.microsoft.com/office/word/2016/wordml/cid" xmlns:w16="http://schemas.microsoft.com/office/word/2018/wordml" xmlns:w16du="http://schemas.microsoft.com/office/word/2023/wordml/word16du" xmlns:w16sdtdh="http://schemas.microsoft.com/office/word/2020/wordml/sdtdatahash" xmlns:w16sdtfl="http://schemas.microsoft.com/office/word/2024/wordml/sdtformatlock" xmlns:w16se="http://schemas.microsoft.com/office/word/2015/wordml/symex" xmlns:wpg="http://schemas.microsoft.com/office/word/2010/wordprocessingGroup" xmlns:wpi="http://schemas.microsoft.com/office/word/2010/wordprocessingInk" xmlns:wne="http://schemas.microsoft.com/office/word/2006/wordml" xmlns:wps="http://schemas.microsoft.com/office/word/2010/wordprocessingShape" mc:Ignorable="w14 w15 w16se w16cid w16 w16cex w16sdtdh w16sdtfl w16du wp14">
+  <w:p>
+    <w:pPr>
+      <w:pStyle w:val="Header"/>
     </w:pPr>
   </w:p>
 </w:hdr>

</xml_diff>